<commit_message>
Added Introduction and Requirements Specification (Functional Requirements & Non-Functional Requirements)
</commit_message>
<xml_diff>
--- a/BIT 216 Assignment 1 (Task 2).docx
+++ b/BIT 216 Assignment 1 (Task 2).docx
@@ -39,18 +39,7 @@
           <w:sz w:val="28"/>
           <w:szCs w:val="28"/>
         </w:rPr>
-        <w:t>Assignment 1 – T</w:t>
-      </w:r>
-      <w:bookmarkStart w:id="0" w:name="_GoBack"/>
-      <w:bookmarkEnd w:id="0"/>
-      <w:r>
-        <w:rPr>
-          <w:b/>
-          <w:bCs/>
-          <w:sz w:val="28"/>
-          <w:szCs w:val="28"/>
-        </w:rPr>
-        <w:t>ask 2</w:t>
+        <w:t>Assignment 1 – Task 2</w:t>
       </w:r>
     </w:p>
     <w:p>
@@ -203,6 +192,3109 @@
     </w:p>
     <w:p/>
     <w:p/>
+    <w:p/>
+    <w:p/>
+    <w:p/>
+    <w:p/>
+    <w:p/>
+    <w:p/>
+    <w:p/>
+    <w:p/>
+    <w:p/>
+    <w:p/>
+    <w:p/>
+    <w:p/>
+    <w:p/>
+    <w:p/>
+    <w:p/>
+    <w:p/>
+    <w:p/>
+    <w:p/>
+    <w:p/>
+    <w:p/>
+    <w:p/>
+    <w:p/>
+    <w:p/>
+    <w:p/>
+    <w:p/>
+    <w:p/>
+    <w:p>
+      <w:pPr>
+        <w:pStyle w:val="Heading1"/>
+        <w:spacing w:before="240" w:after="120"/>
+      </w:pPr>
+      <w:r>
+        <w:t>1.0  Introduction</w:t>
+      </w:r>
+    </w:p>
+    <w:p>
+      <w:pPr>
+        <w:spacing w:after="120" w:line="360" w:lineRule="auto"/>
+        <w:jc w:val="both"/>
+      </w:pPr>
+      <w:r>
+        <w:t>Here's a condensed version that maintains the main points and is still fit for an academic paper:---Food waste is an escalating global problem mainly due to improper management of household food inventory, overlooking food expiry dates, and minimal chances for food donations (Food and Agriculture Organization [FAO], 2019).</w:t>
+      </w:r>
+    </w:p>
+    <w:p>
+      <w:pPr>
+        <w:spacing w:after="120" w:line="360" w:lineRule="auto"/>
+        <w:jc w:val="both"/>
+      </w:pPr>
+      <w:r>
+        <w:t>In Malaysia, daily food wastage is about 16,688 tonnes, with a large share coming from homes (Solid Waste and Public Cleansing Management Corporation [SWCorp], 2021). Besides contributing to climate change by raising greenhouse gas levels, food waste also leads to unnecessary economic losses.SavePlate is an internet-based software aimed at cutting down household food waste by combining features like managing inventory smartly, sending expiry alerts, meal planning, donating food, and providing waste analytics.</w:t>
+      </w:r>
+    </w:p>
+    <w:p>
+      <w:pPr>
+        <w:spacing w:after="120" w:line="360" w:lineRule="auto"/>
+        <w:jc w:val="both"/>
+      </w:pPr>
+      <w:r>
+        <w:t>The program, which offers users instant food monitoring and helpful suggestions, acts as an aid for households to get better at food handling while also promoting local sharing (Pressman &amp; Maxim, 2020).This paper sets out the Requirements Specification and Design Document for the SavePlate project, the second submission of BIT 216 Assignment 1.</w:t>
+      </w:r>
+    </w:p>
+    <w:p>
+      <w:pPr>
+        <w:spacing w:after="120" w:line="360" w:lineRule="auto"/>
+        <w:jc w:val="both"/>
+      </w:pPr>
+      <w:r>
+        <w:t>It details both the system's function and performance requirements, user stories together with acceptance criteria and tasks, and principal design artefacts like the deployment diagram, Entity Relationship Diagram (ERD), site map, data dictionary, and high-fidelity wireframes.</w:t>
+      </w:r>
+    </w:p>
+    <w:p>
+      <w:pPr>
+        <w:spacing w:after="120" w:line="360" w:lineRule="auto"/>
+        <w:jc w:val="both"/>
+      </w:pPr>
+      <w:r>
+        <w:t>Collectively, these artefacts be the basis for the SavePlate system's development (Sommerville, 2016).The paper is arranged like this: Section 2 introduces the requirements specification, Section 3 discusses the user story models, Section 4 is the design specification and diagrams, and Section 5 wraps up the report before the references.</w:t>
+      </w:r>
+    </w:p>
+    <w:p>
+      <w:pPr>
+        <w:pStyle w:val="Heading1"/>
+        <w:spacing w:before="240" w:after="120"/>
+      </w:pPr>
+      <w:bookmarkStart w:id="0" w:name="_heading=h.9kz80l9m3f15" w:colFirst="0" w:colLast="0"/>
+      <w:bookmarkEnd w:id="0"/>
+    </w:p>
+    <w:p>
+      <w:pPr>
+        <w:pStyle w:val="Heading1"/>
+        <w:spacing w:before="240" w:after="120"/>
+      </w:pPr>
+      <w:bookmarkStart w:id="1" w:name="_heading=h.5632s9teglr" w:colFirst="0" w:colLast="0"/>
+      <w:bookmarkEnd w:id="1"/>
+      <w:r>
+        <w:t>2.0  Requirements Specification</w:t>
+      </w:r>
+    </w:p>
+    <w:p>
+      <w:pPr>
+        <w:pStyle w:val="Heading2"/>
+        <w:spacing w:before="200" w:after="100"/>
+      </w:pPr>
+      <w:bookmarkStart w:id="2" w:name="_heading=h.vaeqxc92yup6" w:colFirst="0" w:colLast="0"/>
+      <w:bookmarkEnd w:id="2"/>
+      <w:r>
+        <w:t>2.1  Functional Requirements</w:t>
+      </w:r>
+    </w:p>
+    <w:p>
+      <w:pPr>
+        <w:spacing w:after="120" w:line="360" w:lineRule="auto"/>
+        <w:jc w:val="both"/>
+      </w:pPr>
+      <w:r>
+        <w:t>Functional requirements are the features, behaviours and interactions that a system should be able to carry out (Pressman &amp; Maxim, 2020). The table below lists the functional requirements for SavePlate, which have been identified based on six use cases set out in the common case study. The requirements are ordered as the MoS</w:t>
+      </w:r>
+      <w:bookmarkStart w:id="3" w:name="_GoBack"/>
+      <w:bookmarkEnd w:id="3"/>
+      <w:r>
+        <w:t>CoW prioritisation method (Agile Business Consortium, 2014).</w:t>
+      </w:r>
+    </w:p>
+    <w:tbl>
+      <w:tblPr>
+        <w:tblW w:w="9026" w:type="dxa"/>
+        <w:tblBorders>
+          <w:top w:val="single" w:sz="4" w:space="0" w:color="000000"/>
+          <w:left w:val="single" w:sz="4" w:space="0" w:color="000000"/>
+          <w:bottom w:val="single" w:sz="4" w:space="0" w:color="000000"/>
+          <w:right w:val="single" w:sz="4" w:space="0" w:color="000000"/>
+          <w:insideH w:val="single" w:sz="4" w:space="0" w:color="000000"/>
+          <w:insideV w:val="single" w:sz="4" w:space="0" w:color="000000"/>
+        </w:tblBorders>
+        <w:tblLayout w:type="fixed"/>
+        <w:tblLook w:val="0000" w:firstRow="0" w:lastRow="0" w:firstColumn="0" w:lastColumn="0" w:noHBand="0" w:noVBand="0"/>
+      </w:tblPr>
+      <w:tblGrid>
+        <w:gridCol w:w="1000"/>
+        <w:gridCol w:w="3500"/>
+        <w:gridCol w:w="2000"/>
+        <w:gridCol w:w="2526"/>
+      </w:tblGrid>
+      <w:tr>
+        <w:tc>
+          <w:tcPr>
+            <w:tcW w:w="1000" w:type="dxa"/>
+            <w:tcBorders>
+              <w:top w:val="single" w:sz="4" w:space="0" w:color="000000"/>
+              <w:left w:val="single" w:sz="4" w:space="0" w:color="000000"/>
+              <w:bottom w:val="single" w:sz="4" w:space="0" w:color="000000"/>
+              <w:right w:val="single" w:sz="4" w:space="0" w:color="000000"/>
+            </w:tcBorders>
+            <w:tcMar>
+              <w:top w:w="80" w:type="dxa"/>
+              <w:left w:w="120" w:type="dxa"/>
+              <w:bottom w:w="80" w:type="dxa"/>
+              <w:right w:w="120" w:type="dxa"/>
+            </w:tcMar>
+          </w:tcPr>
+          <w:p>
+            <w:pPr>
+              <w:spacing w:line="320" w:lineRule="auto"/>
+            </w:pPr>
+            <w:r>
+              <w:rPr>
+                <w:b/>
+                <w:bCs/>
+              </w:rPr>
+              <w:t>ID</w:t>
+            </w:r>
+          </w:p>
+        </w:tc>
+        <w:tc>
+          <w:tcPr>
+            <w:tcW w:w="3500" w:type="dxa"/>
+            <w:tcBorders>
+              <w:top w:val="single" w:sz="4" w:space="0" w:color="000000"/>
+              <w:left w:val="single" w:sz="4" w:space="0" w:color="000000"/>
+              <w:bottom w:val="single" w:sz="4" w:space="0" w:color="000000"/>
+              <w:right w:val="single" w:sz="4" w:space="0" w:color="000000"/>
+            </w:tcBorders>
+            <w:tcMar>
+              <w:top w:w="80" w:type="dxa"/>
+              <w:left w:w="120" w:type="dxa"/>
+              <w:bottom w:w="80" w:type="dxa"/>
+              <w:right w:w="120" w:type="dxa"/>
+            </w:tcMar>
+          </w:tcPr>
+          <w:p>
+            <w:pPr>
+              <w:spacing w:line="320" w:lineRule="auto"/>
+            </w:pPr>
+            <w:r>
+              <w:rPr>
+                <w:b/>
+                <w:bCs/>
+              </w:rPr>
+              <w:t>Functional Requirement</w:t>
+            </w:r>
+          </w:p>
+        </w:tc>
+        <w:tc>
+          <w:tcPr>
+            <w:tcW w:w="2000" w:type="dxa"/>
+            <w:tcBorders>
+              <w:top w:val="single" w:sz="4" w:space="0" w:color="000000"/>
+              <w:left w:val="single" w:sz="4" w:space="0" w:color="000000"/>
+              <w:bottom w:val="single" w:sz="4" w:space="0" w:color="000000"/>
+              <w:right w:val="single" w:sz="4" w:space="0" w:color="000000"/>
+            </w:tcBorders>
+            <w:tcMar>
+              <w:top w:w="80" w:type="dxa"/>
+              <w:left w:w="120" w:type="dxa"/>
+              <w:bottom w:w="80" w:type="dxa"/>
+              <w:right w:w="120" w:type="dxa"/>
+            </w:tcMar>
+          </w:tcPr>
+          <w:p>
+            <w:pPr>
+              <w:spacing w:line="320" w:lineRule="auto"/>
+            </w:pPr>
+            <w:r>
+              <w:rPr>
+                <w:b/>
+                <w:bCs/>
+              </w:rPr>
+              <w:t>Use Case(s)</w:t>
+            </w:r>
+          </w:p>
+        </w:tc>
+        <w:tc>
+          <w:tcPr>
+            <w:tcW w:w="2526" w:type="dxa"/>
+            <w:tcBorders>
+              <w:top w:val="single" w:sz="4" w:space="0" w:color="000000"/>
+              <w:left w:val="single" w:sz="4" w:space="0" w:color="000000"/>
+              <w:bottom w:val="single" w:sz="4" w:space="0" w:color="000000"/>
+              <w:right w:val="single" w:sz="4" w:space="0" w:color="000000"/>
+            </w:tcBorders>
+            <w:tcMar>
+              <w:top w:w="80" w:type="dxa"/>
+              <w:left w:w="120" w:type="dxa"/>
+              <w:bottom w:w="80" w:type="dxa"/>
+              <w:right w:w="120" w:type="dxa"/>
+            </w:tcMar>
+          </w:tcPr>
+          <w:p>
+            <w:pPr>
+              <w:spacing w:line="320" w:lineRule="auto"/>
+            </w:pPr>
+            <w:r>
+              <w:rPr>
+                <w:b/>
+                <w:bCs/>
+              </w:rPr>
+              <w:t>Priority</w:t>
+            </w:r>
+          </w:p>
+        </w:tc>
+      </w:tr>
+      <w:tr>
+        <w:tc>
+          <w:tcPr>
+            <w:tcW w:w="1000" w:type="dxa"/>
+            <w:tcBorders>
+              <w:top w:val="single" w:sz="4" w:space="0" w:color="000000"/>
+              <w:left w:val="single" w:sz="4" w:space="0" w:color="000000"/>
+              <w:bottom w:val="single" w:sz="4" w:space="0" w:color="000000"/>
+              <w:right w:val="single" w:sz="4" w:space="0" w:color="000000"/>
+            </w:tcBorders>
+            <w:tcMar>
+              <w:top w:w="80" w:type="dxa"/>
+              <w:left w:w="120" w:type="dxa"/>
+              <w:bottom w:w="80" w:type="dxa"/>
+              <w:right w:w="120" w:type="dxa"/>
+            </w:tcMar>
+          </w:tcPr>
+          <w:p>
+            <w:pPr>
+              <w:spacing w:line="320" w:lineRule="auto"/>
+            </w:pPr>
+            <w:r>
+              <w:t>FR01</w:t>
+            </w:r>
+          </w:p>
+        </w:tc>
+        <w:tc>
+          <w:tcPr>
+            <w:tcW w:w="3500" w:type="dxa"/>
+            <w:tcBorders>
+              <w:top w:val="single" w:sz="4" w:space="0" w:color="000000"/>
+              <w:left w:val="single" w:sz="4" w:space="0" w:color="000000"/>
+              <w:bottom w:val="single" w:sz="4" w:space="0" w:color="000000"/>
+              <w:right w:val="single" w:sz="4" w:space="0" w:color="000000"/>
+            </w:tcBorders>
+            <w:tcMar>
+              <w:top w:w="80" w:type="dxa"/>
+              <w:left w:w="120" w:type="dxa"/>
+              <w:bottom w:w="80" w:type="dxa"/>
+              <w:right w:w="120" w:type="dxa"/>
+            </w:tcMar>
+          </w:tcPr>
+          <w:p>
+            <w:pPr>
+              <w:spacing w:line="320" w:lineRule="auto"/>
+            </w:pPr>
+            <w:r>
+              <w:t>By entering their full name, email address, password, and optional household size, new users will be able to register on the system.</w:t>
+            </w:r>
+          </w:p>
+        </w:tc>
+        <w:tc>
+          <w:tcPr>
+            <w:tcW w:w="2000" w:type="dxa"/>
+            <w:tcBorders>
+              <w:top w:val="single" w:sz="4" w:space="0" w:color="000000"/>
+              <w:left w:val="single" w:sz="4" w:space="0" w:color="000000"/>
+              <w:bottom w:val="single" w:sz="4" w:space="0" w:color="000000"/>
+              <w:right w:val="single" w:sz="4" w:space="0" w:color="000000"/>
+            </w:tcBorders>
+            <w:tcMar>
+              <w:top w:w="80" w:type="dxa"/>
+              <w:left w:w="120" w:type="dxa"/>
+              <w:bottom w:w="80" w:type="dxa"/>
+              <w:right w:w="120" w:type="dxa"/>
+            </w:tcMar>
+          </w:tcPr>
+          <w:p>
+            <w:pPr>
+              <w:spacing w:line="320" w:lineRule="auto"/>
+            </w:pPr>
+            <w:r>
+              <w:t>UC1</w:t>
+            </w:r>
+          </w:p>
+        </w:tc>
+        <w:tc>
+          <w:tcPr>
+            <w:tcW w:w="2526" w:type="dxa"/>
+            <w:tcBorders>
+              <w:top w:val="single" w:sz="4" w:space="0" w:color="000000"/>
+              <w:left w:val="single" w:sz="4" w:space="0" w:color="000000"/>
+              <w:bottom w:val="single" w:sz="4" w:space="0" w:color="000000"/>
+              <w:right w:val="single" w:sz="4" w:space="0" w:color="000000"/>
+            </w:tcBorders>
+            <w:tcMar>
+              <w:top w:w="80" w:type="dxa"/>
+              <w:left w:w="120" w:type="dxa"/>
+              <w:bottom w:w="80" w:type="dxa"/>
+              <w:right w:w="120" w:type="dxa"/>
+            </w:tcMar>
+          </w:tcPr>
+          <w:p>
+            <w:pPr>
+              <w:spacing w:line="320" w:lineRule="auto"/>
+            </w:pPr>
+            <w:r>
+              <w:t>Must Have</w:t>
+            </w:r>
+          </w:p>
+        </w:tc>
+      </w:tr>
+      <w:tr>
+        <w:tc>
+          <w:tcPr>
+            <w:tcW w:w="1000" w:type="dxa"/>
+            <w:tcBorders>
+              <w:top w:val="single" w:sz="4" w:space="0" w:color="000000"/>
+              <w:left w:val="single" w:sz="4" w:space="0" w:color="000000"/>
+              <w:bottom w:val="single" w:sz="4" w:space="0" w:color="000000"/>
+              <w:right w:val="single" w:sz="4" w:space="0" w:color="000000"/>
+            </w:tcBorders>
+            <w:tcMar>
+              <w:top w:w="80" w:type="dxa"/>
+              <w:left w:w="120" w:type="dxa"/>
+              <w:bottom w:w="80" w:type="dxa"/>
+              <w:right w:w="120" w:type="dxa"/>
+            </w:tcMar>
+          </w:tcPr>
+          <w:p>
+            <w:pPr>
+              <w:spacing w:line="320" w:lineRule="auto"/>
+            </w:pPr>
+            <w:r>
+              <w:t>FR02</w:t>
+            </w:r>
+          </w:p>
+        </w:tc>
+        <w:tc>
+          <w:tcPr>
+            <w:tcW w:w="3500" w:type="dxa"/>
+            <w:tcBorders>
+              <w:top w:val="single" w:sz="4" w:space="0" w:color="000000"/>
+              <w:left w:val="single" w:sz="4" w:space="0" w:color="000000"/>
+              <w:bottom w:val="single" w:sz="4" w:space="0" w:color="000000"/>
+              <w:right w:val="single" w:sz="4" w:space="0" w:color="000000"/>
+            </w:tcBorders>
+            <w:tcMar>
+              <w:top w:w="80" w:type="dxa"/>
+              <w:left w:w="120" w:type="dxa"/>
+              <w:bottom w:w="80" w:type="dxa"/>
+              <w:right w:w="120" w:type="dxa"/>
+            </w:tcMar>
+          </w:tcPr>
+          <w:p>
+            <w:pPr>
+              <w:spacing w:line="320" w:lineRule="auto"/>
+            </w:pPr>
+            <w:r>
+              <w:t>To verify a new user's email address and activate their account, the system will send a six-digit email verification code.</w:t>
+            </w:r>
+          </w:p>
+        </w:tc>
+        <w:tc>
+          <w:tcPr>
+            <w:tcW w:w="2000" w:type="dxa"/>
+            <w:tcBorders>
+              <w:top w:val="single" w:sz="4" w:space="0" w:color="000000"/>
+              <w:left w:val="single" w:sz="4" w:space="0" w:color="000000"/>
+              <w:bottom w:val="single" w:sz="4" w:space="0" w:color="000000"/>
+              <w:right w:val="single" w:sz="4" w:space="0" w:color="000000"/>
+            </w:tcBorders>
+            <w:tcMar>
+              <w:top w:w="80" w:type="dxa"/>
+              <w:left w:w="120" w:type="dxa"/>
+              <w:bottom w:w="80" w:type="dxa"/>
+              <w:right w:w="120" w:type="dxa"/>
+            </w:tcMar>
+          </w:tcPr>
+          <w:p>
+            <w:pPr>
+              <w:spacing w:line="320" w:lineRule="auto"/>
+            </w:pPr>
+            <w:r>
+              <w:t>UC1</w:t>
+            </w:r>
+          </w:p>
+        </w:tc>
+        <w:tc>
+          <w:tcPr>
+            <w:tcW w:w="2526" w:type="dxa"/>
+            <w:tcBorders>
+              <w:top w:val="single" w:sz="4" w:space="0" w:color="000000"/>
+              <w:left w:val="single" w:sz="4" w:space="0" w:color="000000"/>
+              <w:bottom w:val="single" w:sz="4" w:space="0" w:color="000000"/>
+              <w:right w:val="single" w:sz="4" w:space="0" w:color="000000"/>
+            </w:tcBorders>
+            <w:tcMar>
+              <w:top w:w="80" w:type="dxa"/>
+              <w:left w:w="120" w:type="dxa"/>
+              <w:bottom w:w="80" w:type="dxa"/>
+              <w:right w:w="120" w:type="dxa"/>
+            </w:tcMar>
+          </w:tcPr>
+          <w:p>
+            <w:pPr>
+              <w:spacing w:line="320" w:lineRule="auto"/>
+            </w:pPr>
+            <w:r>
+              <w:t>Must Have</w:t>
+            </w:r>
+          </w:p>
+        </w:tc>
+      </w:tr>
+      <w:tr>
+        <w:tc>
+          <w:tcPr>
+            <w:tcW w:w="1000" w:type="dxa"/>
+            <w:tcBorders>
+              <w:top w:val="single" w:sz="4" w:space="0" w:color="000000"/>
+              <w:left w:val="single" w:sz="4" w:space="0" w:color="000000"/>
+              <w:bottom w:val="single" w:sz="4" w:space="0" w:color="000000"/>
+              <w:right w:val="single" w:sz="4" w:space="0" w:color="000000"/>
+            </w:tcBorders>
+            <w:tcMar>
+              <w:top w:w="80" w:type="dxa"/>
+              <w:left w:w="120" w:type="dxa"/>
+              <w:bottom w:w="80" w:type="dxa"/>
+              <w:right w:w="120" w:type="dxa"/>
+            </w:tcMar>
+          </w:tcPr>
+          <w:p>
+            <w:pPr>
+              <w:spacing w:line="320" w:lineRule="auto"/>
+            </w:pPr>
+            <w:r>
+              <w:t>FR03</w:t>
+            </w:r>
+          </w:p>
+        </w:tc>
+        <w:tc>
+          <w:tcPr>
+            <w:tcW w:w="3500" w:type="dxa"/>
+            <w:tcBorders>
+              <w:top w:val="single" w:sz="4" w:space="0" w:color="000000"/>
+              <w:left w:val="single" w:sz="4" w:space="0" w:color="000000"/>
+              <w:bottom w:val="single" w:sz="4" w:space="0" w:color="000000"/>
+              <w:right w:val="single" w:sz="4" w:space="0" w:color="000000"/>
+            </w:tcBorders>
+            <w:tcMar>
+              <w:top w:w="80" w:type="dxa"/>
+              <w:left w:w="120" w:type="dxa"/>
+              <w:bottom w:w="80" w:type="dxa"/>
+              <w:right w:w="120" w:type="dxa"/>
+            </w:tcMar>
+          </w:tcPr>
+          <w:p>
+            <w:pPr>
+              <w:spacing w:line="320" w:lineRule="auto"/>
+            </w:pPr>
+            <w:r>
+              <w:t>During login, the system must allow two-factor authentication (2FA) through email verification.</w:t>
+            </w:r>
+          </w:p>
+        </w:tc>
+        <w:tc>
+          <w:tcPr>
+            <w:tcW w:w="2000" w:type="dxa"/>
+            <w:tcBorders>
+              <w:top w:val="single" w:sz="4" w:space="0" w:color="000000"/>
+              <w:left w:val="single" w:sz="4" w:space="0" w:color="000000"/>
+              <w:bottom w:val="single" w:sz="4" w:space="0" w:color="000000"/>
+              <w:right w:val="single" w:sz="4" w:space="0" w:color="000000"/>
+            </w:tcBorders>
+            <w:tcMar>
+              <w:top w:w="80" w:type="dxa"/>
+              <w:left w:w="120" w:type="dxa"/>
+              <w:bottom w:w="80" w:type="dxa"/>
+              <w:right w:w="120" w:type="dxa"/>
+            </w:tcMar>
+          </w:tcPr>
+          <w:p>
+            <w:pPr>
+              <w:spacing w:line="320" w:lineRule="auto"/>
+            </w:pPr>
+            <w:r>
+              <w:t>UC1</w:t>
+            </w:r>
+          </w:p>
+        </w:tc>
+        <w:tc>
+          <w:tcPr>
+            <w:tcW w:w="2526" w:type="dxa"/>
+            <w:tcBorders>
+              <w:top w:val="single" w:sz="4" w:space="0" w:color="000000"/>
+              <w:left w:val="single" w:sz="4" w:space="0" w:color="000000"/>
+              <w:bottom w:val="single" w:sz="4" w:space="0" w:color="000000"/>
+              <w:right w:val="single" w:sz="4" w:space="0" w:color="000000"/>
+            </w:tcBorders>
+            <w:tcMar>
+              <w:top w:w="80" w:type="dxa"/>
+              <w:left w:w="120" w:type="dxa"/>
+              <w:bottom w:w="80" w:type="dxa"/>
+              <w:right w:w="120" w:type="dxa"/>
+            </w:tcMar>
+          </w:tcPr>
+          <w:p>
+            <w:pPr>
+              <w:spacing w:line="320" w:lineRule="auto"/>
+            </w:pPr>
+            <w:r>
+              <w:t>Must Have</w:t>
+            </w:r>
+          </w:p>
+        </w:tc>
+      </w:tr>
+      <w:tr>
+        <w:tc>
+          <w:tcPr>
+            <w:tcW w:w="1000" w:type="dxa"/>
+            <w:tcBorders>
+              <w:top w:val="single" w:sz="4" w:space="0" w:color="000000"/>
+              <w:left w:val="single" w:sz="4" w:space="0" w:color="000000"/>
+              <w:bottom w:val="single" w:sz="4" w:space="0" w:color="000000"/>
+              <w:right w:val="single" w:sz="4" w:space="0" w:color="000000"/>
+            </w:tcBorders>
+            <w:tcMar>
+              <w:top w:w="80" w:type="dxa"/>
+              <w:left w:w="120" w:type="dxa"/>
+              <w:bottom w:w="80" w:type="dxa"/>
+              <w:right w:w="120" w:type="dxa"/>
+            </w:tcMar>
+          </w:tcPr>
+          <w:p>
+            <w:pPr>
+              <w:spacing w:line="320" w:lineRule="auto"/>
+            </w:pPr>
+            <w:r>
+              <w:t>FR04</w:t>
+            </w:r>
+          </w:p>
+        </w:tc>
+        <w:tc>
+          <w:tcPr>
+            <w:tcW w:w="3500" w:type="dxa"/>
+            <w:tcBorders>
+              <w:top w:val="single" w:sz="4" w:space="0" w:color="000000"/>
+              <w:left w:val="single" w:sz="4" w:space="0" w:color="000000"/>
+              <w:bottom w:val="single" w:sz="4" w:space="0" w:color="000000"/>
+              <w:right w:val="single" w:sz="4" w:space="0" w:color="000000"/>
+            </w:tcBorders>
+            <w:tcMar>
+              <w:top w:w="80" w:type="dxa"/>
+              <w:left w:w="120" w:type="dxa"/>
+              <w:bottom w:w="80" w:type="dxa"/>
+              <w:right w:w="120" w:type="dxa"/>
+            </w:tcMar>
+          </w:tcPr>
+          <w:p>
+            <w:pPr>
+              <w:spacing w:line="320" w:lineRule="auto"/>
+            </w:pPr>
+            <w:r>
+              <w:t>Authenticated users will be able to add food items, together with their name, amount, expiration date, category, and storage location, to their inventory.</w:t>
+            </w:r>
+          </w:p>
+        </w:tc>
+        <w:tc>
+          <w:tcPr>
+            <w:tcW w:w="2000" w:type="dxa"/>
+            <w:tcBorders>
+              <w:top w:val="single" w:sz="4" w:space="0" w:color="000000"/>
+              <w:left w:val="single" w:sz="4" w:space="0" w:color="000000"/>
+              <w:bottom w:val="single" w:sz="4" w:space="0" w:color="000000"/>
+              <w:right w:val="single" w:sz="4" w:space="0" w:color="000000"/>
+            </w:tcBorders>
+            <w:tcMar>
+              <w:top w:w="80" w:type="dxa"/>
+              <w:left w:w="120" w:type="dxa"/>
+              <w:bottom w:w="80" w:type="dxa"/>
+              <w:right w:w="120" w:type="dxa"/>
+            </w:tcMar>
+          </w:tcPr>
+          <w:p>
+            <w:pPr>
+              <w:spacing w:line="320" w:lineRule="auto"/>
+            </w:pPr>
+            <w:r>
+              <w:t>UC2</w:t>
+            </w:r>
+          </w:p>
+        </w:tc>
+        <w:tc>
+          <w:tcPr>
+            <w:tcW w:w="2526" w:type="dxa"/>
+            <w:tcBorders>
+              <w:top w:val="single" w:sz="4" w:space="0" w:color="000000"/>
+              <w:left w:val="single" w:sz="4" w:space="0" w:color="000000"/>
+              <w:bottom w:val="single" w:sz="4" w:space="0" w:color="000000"/>
+              <w:right w:val="single" w:sz="4" w:space="0" w:color="000000"/>
+            </w:tcBorders>
+            <w:tcMar>
+              <w:top w:w="80" w:type="dxa"/>
+              <w:left w:w="120" w:type="dxa"/>
+              <w:bottom w:w="80" w:type="dxa"/>
+              <w:right w:w="120" w:type="dxa"/>
+            </w:tcMar>
+          </w:tcPr>
+          <w:p>
+            <w:pPr>
+              <w:spacing w:line="320" w:lineRule="auto"/>
+            </w:pPr>
+            <w:r>
+              <w:t>Must Have</w:t>
+            </w:r>
+          </w:p>
+        </w:tc>
+      </w:tr>
+      <w:tr>
+        <w:tc>
+          <w:tcPr>
+            <w:tcW w:w="1000" w:type="dxa"/>
+            <w:tcBorders>
+              <w:top w:val="single" w:sz="4" w:space="0" w:color="000000"/>
+              <w:left w:val="single" w:sz="4" w:space="0" w:color="000000"/>
+              <w:bottom w:val="single" w:sz="4" w:space="0" w:color="000000"/>
+              <w:right w:val="single" w:sz="4" w:space="0" w:color="000000"/>
+            </w:tcBorders>
+            <w:tcMar>
+              <w:top w:w="80" w:type="dxa"/>
+              <w:left w:w="120" w:type="dxa"/>
+              <w:bottom w:w="80" w:type="dxa"/>
+              <w:right w:w="120" w:type="dxa"/>
+            </w:tcMar>
+          </w:tcPr>
+          <w:p>
+            <w:pPr>
+              <w:spacing w:line="320" w:lineRule="auto"/>
+            </w:pPr>
+            <w:r>
+              <w:t>FR05</w:t>
+            </w:r>
+          </w:p>
+        </w:tc>
+        <w:tc>
+          <w:tcPr>
+            <w:tcW w:w="3500" w:type="dxa"/>
+            <w:tcBorders>
+              <w:top w:val="single" w:sz="4" w:space="0" w:color="000000"/>
+              <w:left w:val="single" w:sz="4" w:space="0" w:color="000000"/>
+              <w:bottom w:val="single" w:sz="4" w:space="0" w:color="000000"/>
+              <w:right w:val="single" w:sz="4" w:space="0" w:color="000000"/>
+            </w:tcBorders>
+            <w:tcMar>
+              <w:top w:w="80" w:type="dxa"/>
+              <w:left w:w="120" w:type="dxa"/>
+              <w:bottom w:w="80" w:type="dxa"/>
+              <w:right w:w="120" w:type="dxa"/>
+            </w:tcMar>
+          </w:tcPr>
+          <w:p>
+            <w:pPr>
+              <w:spacing w:line="320" w:lineRule="auto"/>
+            </w:pPr>
+            <w:r>
+              <w:t>Users will be able to update, remove, and mark food items in their inventory as consumed.</w:t>
+            </w:r>
+          </w:p>
+        </w:tc>
+        <w:tc>
+          <w:tcPr>
+            <w:tcW w:w="2000" w:type="dxa"/>
+            <w:tcBorders>
+              <w:top w:val="single" w:sz="4" w:space="0" w:color="000000"/>
+              <w:left w:val="single" w:sz="4" w:space="0" w:color="000000"/>
+              <w:bottom w:val="single" w:sz="4" w:space="0" w:color="000000"/>
+              <w:right w:val="single" w:sz="4" w:space="0" w:color="000000"/>
+            </w:tcBorders>
+            <w:tcMar>
+              <w:top w:w="80" w:type="dxa"/>
+              <w:left w:w="120" w:type="dxa"/>
+              <w:bottom w:w="80" w:type="dxa"/>
+              <w:right w:w="120" w:type="dxa"/>
+            </w:tcMar>
+          </w:tcPr>
+          <w:p>
+            <w:pPr>
+              <w:spacing w:line="320" w:lineRule="auto"/>
+            </w:pPr>
+            <w:r>
+              <w:t>UC2</w:t>
+            </w:r>
+          </w:p>
+        </w:tc>
+        <w:tc>
+          <w:tcPr>
+            <w:tcW w:w="2526" w:type="dxa"/>
+            <w:tcBorders>
+              <w:top w:val="single" w:sz="4" w:space="0" w:color="000000"/>
+              <w:left w:val="single" w:sz="4" w:space="0" w:color="000000"/>
+              <w:bottom w:val="single" w:sz="4" w:space="0" w:color="000000"/>
+              <w:right w:val="single" w:sz="4" w:space="0" w:color="000000"/>
+            </w:tcBorders>
+            <w:tcMar>
+              <w:top w:w="80" w:type="dxa"/>
+              <w:left w:w="120" w:type="dxa"/>
+              <w:bottom w:w="80" w:type="dxa"/>
+              <w:right w:w="120" w:type="dxa"/>
+            </w:tcMar>
+          </w:tcPr>
+          <w:p>
+            <w:pPr>
+              <w:spacing w:line="320" w:lineRule="auto"/>
+            </w:pPr>
+            <w:r>
+              <w:t>Must Have</w:t>
+            </w:r>
+          </w:p>
+        </w:tc>
+      </w:tr>
+      <w:tr>
+        <w:tc>
+          <w:tcPr>
+            <w:tcW w:w="1000" w:type="dxa"/>
+            <w:tcBorders>
+              <w:top w:val="single" w:sz="4" w:space="0" w:color="000000"/>
+              <w:left w:val="single" w:sz="4" w:space="0" w:color="000000"/>
+              <w:bottom w:val="single" w:sz="4" w:space="0" w:color="000000"/>
+              <w:right w:val="single" w:sz="4" w:space="0" w:color="000000"/>
+            </w:tcBorders>
+            <w:tcMar>
+              <w:top w:w="80" w:type="dxa"/>
+              <w:left w:w="120" w:type="dxa"/>
+              <w:bottom w:w="80" w:type="dxa"/>
+              <w:right w:w="120" w:type="dxa"/>
+            </w:tcMar>
+          </w:tcPr>
+          <w:p>
+            <w:pPr>
+              <w:spacing w:line="320" w:lineRule="auto"/>
+            </w:pPr>
+            <w:r>
+              <w:t>FR06</w:t>
+            </w:r>
+          </w:p>
+        </w:tc>
+        <w:tc>
+          <w:tcPr>
+            <w:tcW w:w="3500" w:type="dxa"/>
+            <w:tcBorders>
+              <w:top w:val="single" w:sz="4" w:space="0" w:color="000000"/>
+              <w:left w:val="single" w:sz="4" w:space="0" w:color="000000"/>
+              <w:bottom w:val="single" w:sz="4" w:space="0" w:color="000000"/>
+              <w:right w:val="single" w:sz="4" w:space="0" w:color="000000"/>
+            </w:tcBorders>
+            <w:tcMar>
+              <w:top w:w="80" w:type="dxa"/>
+              <w:left w:w="120" w:type="dxa"/>
+              <w:bottom w:w="80" w:type="dxa"/>
+              <w:right w:w="120" w:type="dxa"/>
+            </w:tcMar>
+          </w:tcPr>
+          <w:p>
+            <w:pPr>
+              <w:spacing w:line="320" w:lineRule="auto"/>
+            </w:pPr>
+            <w:r>
+              <w:t>Users will be able to transform inventory goods into donation listings with a pickup location and availability information using the system.</w:t>
+            </w:r>
+          </w:p>
+        </w:tc>
+        <w:tc>
+          <w:tcPr>
+            <w:tcW w:w="2000" w:type="dxa"/>
+            <w:tcBorders>
+              <w:top w:val="single" w:sz="4" w:space="0" w:color="000000"/>
+              <w:left w:val="single" w:sz="4" w:space="0" w:color="000000"/>
+              <w:bottom w:val="single" w:sz="4" w:space="0" w:color="000000"/>
+              <w:right w:val="single" w:sz="4" w:space="0" w:color="000000"/>
+            </w:tcBorders>
+            <w:tcMar>
+              <w:top w:w="80" w:type="dxa"/>
+              <w:left w:w="120" w:type="dxa"/>
+              <w:bottom w:w="80" w:type="dxa"/>
+              <w:right w:w="120" w:type="dxa"/>
+            </w:tcMar>
+          </w:tcPr>
+          <w:p>
+            <w:pPr>
+              <w:spacing w:line="320" w:lineRule="auto"/>
+            </w:pPr>
+            <w:r>
+              <w:t>UC2</w:t>
+            </w:r>
+          </w:p>
+        </w:tc>
+        <w:tc>
+          <w:tcPr>
+            <w:tcW w:w="2526" w:type="dxa"/>
+            <w:tcBorders>
+              <w:top w:val="single" w:sz="4" w:space="0" w:color="000000"/>
+              <w:left w:val="single" w:sz="4" w:space="0" w:color="000000"/>
+              <w:bottom w:val="single" w:sz="4" w:space="0" w:color="000000"/>
+              <w:right w:val="single" w:sz="4" w:space="0" w:color="000000"/>
+            </w:tcBorders>
+            <w:tcMar>
+              <w:top w:w="80" w:type="dxa"/>
+              <w:left w:w="120" w:type="dxa"/>
+              <w:bottom w:w="80" w:type="dxa"/>
+              <w:right w:w="120" w:type="dxa"/>
+            </w:tcMar>
+          </w:tcPr>
+          <w:p>
+            <w:pPr>
+              <w:spacing w:line="320" w:lineRule="auto"/>
+            </w:pPr>
+            <w:r>
+              <w:t>Must Have</w:t>
+            </w:r>
+          </w:p>
+        </w:tc>
+      </w:tr>
+      <w:tr>
+        <w:tc>
+          <w:tcPr>
+            <w:tcW w:w="1000" w:type="dxa"/>
+            <w:tcBorders>
+              <w:top w:val="single" w:sz="4" w:space="0" w:color="000000"/>
+              <w:left w:val="single" w:sz="4" w:space="0" w:color="000000"/>
+              <w:bottom w:val="single" w:sz="4" w:space="0" w:color="000000"/>
+              <w:right w:val="single" w:sz="4" w:space="0" w:color="000000"/>
+            </w:tcBorders>
+            <w:tcMar>
+              <w:top w:w="80" w:type="dxa"/>
+              <w:left w:w="120" w:type="dxa"/>
+              <w:bottom w:w="80" w:type="dxa"/>
+              <w:right w:w="120" w:type="dxa"/>
+            </w:tcMar>
+          </w:tcPr>
+          <w:p>
+            <w:pPr>
+              <w:spacing w:line="320" w:lineRule="auto"/>
+            </w:pPr>
+            <w:r>
+              <w:t>FR07</w:t>
+            </w:r>
+          </w:p>
+        </w:tc>
+        <w:tc>
+          <w:tcPr>
+            <w:tcW w:w="3500" w:type="dxa"/>
+            <w:tcBorders>
+              <w:top w:val="single" w:sz="4" w:space="0" w:color="000000"/>
+              <w:left w:val="single" w:sz="4" w:space="0" w:color="000000"/>
+              <w:bottom w:val="single" w:sz="4" w:space="0" w:color="000000"/>
+              <w:right w:val="single" w:sz="4" w:space="0" w:color="000000"/>
+            </w:tcBorders>
+            <w:tcMar>
+              <w:top w:w="80" w:type="dxa"/>
+              <w:left w:w="120" w:type="dxa"/>
+              <w:bottom w:w="80" w:type="dxa"/>
+              <w:right w:w="120" w:type="dxa"/>
+            </w:tcMar>
+          </w:tcPr>
+          <w:p>
+            <w:pPr>
+              <w:spacing w:line="320" w:lineRule="auto"/>
+            </w:pPr>
+            <w:r>
+              <w:t>Users will be able to peruse available donation postings categorized by storage type, category, and expiration date.</w:t>
+            </w:r>
+          </w:p>
+        </w:tc>
+        <w:tc>
+          <w:tcPr>
+            <w:tcW w:w="2000" w:type="dxa"/>
+            <w:tcBorders>
+              <w:top w:val="single" w:sz="4" w:space="0" w:color="000000"/>
+              <w:left w:val="single" w:sz="4" w:space="0" w:color="000000"/>
+              <w:bottom w:val="single" w:sz="4" w:space="0" w:color="000000"/>
+              <w:right w:val="single" w:sz="4" w:space="0" w:color="000000"/>
+            </w:tcBorders>
+            <w:tcMar>
+              <w:top w:w="80" w:type="dxa"/>
+              <w:left w:w="120" w:type="dxa"/>
+              <w:bottom w:w="80" w:type="dxa"/>
+              <w:right w:w="120" w:type="dxa"/>
+            </w:tcMar>
+          </w:tcPr>
+          <w:p>
+            <w:pPr>
+              <w:spacing w:line="320" w:lineRule="auto"/>
+            </w:pPr>
+            <w:r>
+              <w:t>UC3</w:t>
+            </w:r>
+          </w:p>
+        </w:tc>
+        <w:tc>
+          <w:tcPr>
+            <w:tcW w:w="2526" w:type="dxa"/>
+            <w:tcBorders>
+              <w:top w:val="single" w:sz="4" w:space="0" w:color="000000"/>
+              <w:left w:val="single" w:sz="4" w:space="0" w:color="000000"/>
+              <w:bottom w:val="single" w:sz="4" w:space="0" w:color="000000"/>
+              <w:right w:val="single" w:sz="4" w:space="0" w:color="000000"/>
+            </w:tcBorders>
+            <w:tcMar>
+              <w:top w:w="80" w:type="dxa"/>
+              <w:left w:w="120" w:type="dxa"/>
+              <w:bottom w:w="80" w:type="dxa"/>
+              <w:right w:w="120" w:type="dxa"/>
+            </w:tcMar>
+          </w:tcPr>
+          <w:p>
+            <w:pPr>
+              <w:spacing w:line="320" w:lineRule="auto"/>
+            </w:pPr>
+            <w:r>
+              <w:t>Must Have</w:t>
+            </w:r>
+          </w:p>
+        </w:tc>
+      </w:tr>
+      <w:tr>
+        <w:tc>
+          <w:tcPr>
+            <w:tcW w:w="1000" w:type="dxa"/>
+            <w:tcBorders>
+              <w:top w:val="single" w:sz="4" w:space="0" w:color="000000"/>
+              <w:left w:val="single" w:sz="4" w:space="0" w:color="000000"/>
+              <w:bottom w:val="single" w:sz="4" w:space="0" w:color="000000"/>
+              <w:right w:val="single" w:sz="4" w:space="0" w:color="000000"/>
+            </w:tcBorders>
+            <w:tcMar>
+              <w:top w:w="80" w:type="dxa"/>
+              <w:left w:w="120" w:type="dxa"/>
+              <w:bottom w:w="80" w:type="dxa"/>
+              <w:right w:w="120" w:type="dxa"/>
+            </w:tcMar>
+          </w:tcPr>
+          <w:p>
+            <w:pPr>
+              <w:spacing w:line="320" w:lineRule="auto"/>
+            </w:pPr>
+            <w:r>
+              <w:t>FR08</w:t>
+            </w:r>
+          </w:p>
+        </w:tc>
+        <w:tc>
+          <w:tcPr>
+            <w:tcW w:w="3500" w:type="dxa"/>
+            <w:tcBorders>
+              <w:top w:val="single" w:sz="4" w:space="0" w:color="000000"/>
+              <w:left w:val="single" w:sz="4" w:space="0" w:color="000000"/>
+              <w:bottom w:val="single" w:sz="4" w:space="0" w:color="000000"/>
+              <w:right w:val="single" w:sz="4" w:space="0" w:color="000000"/>
+            </w:tcBorders>
+            <w:tcMar>
+              <w:top w:w="80" w:type="dxa"/>
+              <w:left w:w="120" w:type="dxa"/>
+              <w:bottom w:w="80" w:type="dxa"/>
+              <w:right w:w="120" w:type="dxa"/>
+            </w:tcMar>
+          </w:tcPr>
+          <w:p>
+            <w:pPr>
+              <w:spacing w:line="320" w:lineRule="auto"/>
+            </w:pPr>
+            <w:r>
+              <w:t>Users will be able to claim a donation listing through the system and get a confirmation message.</w:t>
+            </w:r>
+          </w:p>
+        </w:tc>
+        <w:tc>
+          <w:tcPr>
+            <w:tcW w:w="2000" w:type="dxa"/>
+            <w:tcBorders>
+              <w:top w:val="single" w:sz="4" w:space="0" w:color="000000"/>
+              <w:left w:val="single" w:sz="4" w:space="0" w:color="000000"/>
+              <w:bottom w:val="single" w:sz="4" w:space="0" w:color="000000"/>
+              <w:right w:val="single" w:sz="4" w:space="0" w:color="000000"/>
+            </w:tcBorders>
+            <w:tcMar>
+              <w:top w:w="80" w:type="dxa"/>
+              <w:left w:w="120" w:type="dxa"/>
+              <w:bottom w:w="80" w:type="dxa"/>
+              <w:right w:w="120" w:type="dxa"/>
+            </w:tcMar>
+          </w:tcPr>
+          <w:p>
+            <w:pPr>
+              <w:spacing w:line="320" w:lineRule="auto"/>
+            </w:pPr>
+            <w:r>
+              <w:t>UC3</w:t>
+            </w:r>
+          </w:p>
+        </w:tc>
+        <w:tc>
+          <w:tcPr>
+            <w:tcW w:w="2526" w:type="dxa"/>
+            <w:tcBorders>
+              <w:top w:val="single" w:sz="4" w:space="0" w:color="000000"/>
+              <w:left w:val="single" w:sz="4" w:space="0" w:color="000000"/>
+              <w:bottom w:val="single" w:sz="4" w:space="0" w:color="000000"/>
+              <w:right w:val="single" w:sz="4" w:space="0" w:color="000000"/>
+            </w:tcBorders>
+            <w:tcMar>
+              <w:top w:w="80" w:type="dxa"/>
+              <w:left w:w="120" w:type="dxa"/>
+              <w:bottom w:w="80" w:type="dxa"/>
+              <w:right w:w="120" w:type="dxa"/>
+            </w:tcMar>
+          </w:tcPr>
+          <w:p>
+            <w:pPr>
+              <w:spacing w:line="320" w:lineRule="auto"/>
+            </w:pPr>
+            <w:r>
+              <w:t>Must Have</w:t>
+            </w:r>
+          </w:p>
+        </w:tc>
+      </w:tr>
+      <w:tr>
+        <w:tc>
+          <w:tcPr>
+            <w:tcW w:w="1000" w:type="dxa"/>
+            <w:tcBorders>
+              <w:top w:val="single" w:sz="4" w:space="0" w:color="000000"/>
+              <w:left w:val="single" w:sz="4" w:space="0" w:color="000000"/>
+              <w:bottom w:val="single" w:sz="4" w:space="0" w:color="000000"/>
+              <w:right w:val="single" w:sz="4" w:space="0" w:color="000000"/>
+            </w:tcBorders>
+            <w:tcMar>
+              <w:top w:w="80" w:type="dxa"/>
+              <w:left w:w="120" w:type="dxa"/>
+              <w:bottom w:w="80" w:type="dxa"/>
+              <w:right w:w="120" w:type="dxa"/>
+            </w:tcMar>
+          </w:tcPr>
+          <w:p>
+            <w:pPr>
+              <w:spacing w:line="320" w:lineRule="auto"/>
+            </w:pPr>
+            <w:r>
+              <w:t>FR09</w:t>
+            </w:r>
+          </w:p>
+        </w:tc>
+        <w:tc>
+          <w:tcPr>
+            <w:tcW w:w="3500" w:type="dxa"/>
+            <w:tcBorders>
+              <w:top w:val="single" w:sz="4" w:space="0" w:color="000000"/>
+              <w:left w:val="single" w:sz="4" w:space="0" w:color="000000"/>
+              <w:bottom w:val="single" w:sz="4" w:space="0" w:color="000000"/>
+              <w:right w:val="single" w:sz="4" w:space="0" w:color="000000"/>
+            </w:tcBorders>
+            <w:tcMar>
+              <w:top w:w="80" w:type="dxa"/>
+              <w:left w:w="120" w:type="dxa"/>
+              <w:bottom w:w="80" w:type="dxa"/>
+              <w:right w:w="120" w:type="dxa"/>
+            </w:tcMar>
+          </w:tcPr>
+          <w:p>
+            <w:pPr>
+              <w:spacing w:line="320" w:lineRule="auto"/>
+            </w:pPr>
+            <w:r>
+              <w:t>Visual food analytics reports that display the overall amount of food saved, items donated, and trends over customizable time periods will be produced by the system.</w:t>
+            </w:r>
+          </w:p>
+        </w:tc>
+        <w:tc>
+          <w:tcPr>
+            <w:tcW w:w="2000" w:type="dxa"/>
+            <w:tcBorders>
+              <w:top w:val="single" w:sz="4" w:space="0" w:color="000000"/>
+              <w:left w:val="single" w:sz="4" w:space="0" w:color="000000"/>
+              <w:bottom w:val="single" w:sz="4" w:space="0" w:color="000000"/>
+              <w:right w:val="single" w:sz="4" w:space="0" w:color="000000"/>
+            </w:tcBorders>
+            <w:tcMar>
+              <w:top w:w="80" w:type="dxa"/>
+              <w:left w:w="120" w:type="dxa"/>
+              <w:bottom w:w="80" w:type="dxa"/>
+              <w:right w:w="120" w:type="dxa"/>
+            </w:tcMar>
+          </w:tcPr>
+          <w:p>
+            <w:pPr>
+              <w:spacing w:line="320" w:lineRule="auto"/>
+            </w:pPr>
+            <w:r>
+              <w:t>UC4</w:t>
+            </w:r>
+          </w:p>
+        </w:tc>
+        <w:tc>
+          <w:tcPr>
+            <w:tcW w:w="2526" w:type="dxa"/>
+            <w:tcBorders>
+              <w:top w:val="single" w:sz="4" w:space="0" w:color="000000"/>
+              <w:left w:val="single" w:sz="4" w:space="0" w:color="000000"/>
+              <w:bottom w:val="single" w:sz="4" w:space="0" w:color="000000"/>
+              <w:right w:val="single" w:sz="4" w:space="0" w:color="000000"/>
+            </w:tcBorders>
+            <w:tcMar>
+              <w:top w:w="80" w:type="dxa"/>
+              <w:left w:w="120" w:type="dxa"/>
+              <w:bottom w:w="80" w:type="dxa"/>
+              <w:right w:w="120" w:type="dxa"/>
+            </w:tcMar>
+          </w:tcPr>
+          <w:p>
+            <w:pPr>
+              <w:spacing w:line="320" w:lineRule="auto"/>
+            </w:pPr>
+            <w:r>
+              <w:t>Should Have</w:t>
+            </w:r>
+          </w:p>
+        </w:tc>
+      </w:tr>
+      <w:tr>
+        <w:tc>
+          <w:tcPr>
+            <w:tcW w:w="1000" w:type="dxa"/>
+            <w:tcBorders>
+              <w:top w:val="single" w:sz="4" w:space="0" w:color="000000"/>
+              <w:left w:val="single" w:sz="4" w:space="0" w:color="000000"/>
+              <w:bottom w:val="single" w:sz="4" w:space="0" w:color="000000"/>
+              <w:right w:val="single" w:sz="4" w:space="0" w:color="000000"/>
+            </w:tcBorders>
+            <w:tcMar>
+              <w:top w:w="80" w:type="dxa"/>
+              <w:left w:w="120" w:type="dxa"/>
+              <w:bottom w:w="80" w:type="dxa"/>
+              <w:right w:w="120" w:type="dxa"/>
+            </w:tcMar>
+          </w:tcPr>
+          <w:p>
+            <w:pPr>
+              <w:spacing w:line="320" w:lineRule="auto"/>
+            </w:pPr>
+            <w:r>
+              <w:t>FR10</w:t>
+            </w:r>
+          </w:p>
+        </w:tc>
+        <w:tc>
+          <w:tcPr>
+            <w:tcW w:w="3500" w:type="dxa"/>
+            <w:tcBorders>
+              <w:top w:val="single" w:sz="4" w:space="0" w:color="000000"/>
+              <w:left w:val="single" w:sz="4" w:space="0" w:color="000000"/>
+              <w:bottom w:val="single" w:sz="4" w:space="0" w:color="000000"/>
+              <w:right w:val="single" w:sz="4" w:space="0" w:color="000000"/>
+            </w:tcBorders>
+            <w:tcMar>
+              <w:top w:w="80" w:type="dxa"/>
+              <w:left w:w="120" w:type="dxa"/>
+              <w:bottom w:w="80" w:type="dxa"/>
+              <w:right w:w="120" w:type="dxa"/>
+            </w:tcMar>
+          </w:tcPr>
+          <w:p>
+            <w:pPr>
+              <w:spacing w:line="320" w:lineRule="auto"/>
+            </w:pPr>
+            <w:r>
+              <w:t>In the analytics dashboard, the system will show progress indicators and category breakdowns.</w:t>
+            </w:r>
+          </w:p>
+        </w:tc>
+        <w:tc>
+          <w:tcPr>
+            <w:tcW w:w="2000" w:type="dxa"/>
+            <w:tcBorders>
+              <w:top w:val="single" w:sz="4" w:space="0" w:color="000000"/>
+              <w:left w:val="single" w:sz="4" w:space="0" w:color="000000"/>
+              <w:bottom w:val="single" w:sz="4" w:space="0" w:color="000000"/>
+              <w:right w:val="single" w:sz="4" w:space="0" w:color="000000"/>
+            </w:tcBorders>
+            <w:tcMar>
+              <w:top w:w="80" w:type="dxa"/>
+              <w:left w:w="120" w:type="dxa"/>
+              <w:bottom w:w="80" w:type="dxa"/>
+              <w:right w:w="120" w:type="dxa"/>
+            </w:tcMar>
+          </w:tcPr>
+          <w:p>
+            <w:pPr>
+              <w:spacing w:line="320" w:lineRule="auto"/>
+            </w:pPr>
+            <w:r>
+              <w:t>UC4</w:t>
+            </w:r>
+          </w:p>
+        </w:tc>
+        <w:tc>
+          <w:tcPr>
+            <w:tcW w:w="2526" w:type="dxa"/>
+            <w:tcBorders>
+              <w:top w:val="single" w:sz="4" w:space="0" w:color="000000"/>
+              <w:left w:val="single" w:sz="4" w:space="0" w:color="000000"/>
+              <w:bottom w:val="single" w:sz="4" w:space="0" w:color="000000"/>
+              <w:right w:val="single" w:sz="4" w:space="0" w:color="000000"/>
+            </w:tcBorders>
+            <w:tcMar>
+              <w:top w:w="80" w:type="dxa"/>
+              <w:left w:w="120" w:type="dxa"/>
+              <w:bottom w:w="80" w:type="dxa"/>
+              <w:right w:w="120" w:type="dxa"/>
+            </w:tcMar>
+          </w:tcPr>
+          <w:p>
+            <w:pPr>
+              <w:spacing w:line="320" w:lineRule="auto"/>
+            </w:pPr>
+            <w:r>
+              <w:t>Should Have</w:t>
+            </w:r>
+          </w:p>
+        </w:tc>
+      </w:tr>
+      <w:tr>
+        <w:tc>
+          <w:tcPr>
+            <w:tcW w:w="1000" w:type="dxa"/>
+            <w:tcBorders>
+              <w:top w:val="single" w:sz="4" w:space="0" w:color="000000"/>
+              <w:left w:val="single" w:sz="4" w:space="0" w:color="000000"/>
+              <w:bottom w:val="single" w:sz="4" w:space="0" w:color="000000"/>
+              <w:right w:val="single" w:sz="4" w:space="0" w:color="000000"/>
+            </w:tcBorders>
+            <w:tcMar>
+              <w:top w:w="80" w:type="dxa"/>
+              <w:left w:w="120" w:type="dxa"/>
+              <w:bottom w:w="80" w:type="dxa"/>
+              <w:right w:w="120" w:type="dxa"/>
+            </w:tcMar>
+          </w:tcPr>
+          <w:p>
+            <w:pPr>
+              <w:spacing w:line="320" w:lineRule="auto"/>
+            </w:pPr>
+            <w:r>
+              <w:t>FR11</w:t>
+            </w:r>
+          </w:p>
+        </w:tc>
+        <w:tc>
+          <w:tcPr>
+            <w:tcW w:w="3500" w:type="dxa"/>
+            <w:tcBorders>
+              <w:top w:val="single" w:sz="4" w:space="0" w:color="000000"/>
+              <w:left w:val="single" w:sz="4" w:space="0" w:color="000000"/>
+              <w:bottom w:val="single" w:sz="4" w:space="0" w:color="000000"/>
+              <w:right w:val="single" w:sz="4" w:space="0" w:color="000000"/>
+            </w:tcBorders>
+            <w:tcMar>
+              <w:top w:w="80" w:type="dxa"/>
+              <w:left w:w="120" w:type="dxa"/>
+              <w:bottom w:w="80" w:type="dxa"/>
+              <w:right w:w="120" w:type="dxa"/>
+            </w:tcMar>
+          </w:tcPr>
+          <w:p>
+            <w:pPr>
+              <w:spacing w:line="320" w:lineRule="auto"/>
+            </w:pPr>
+            <w:r>
+              <w:t>48 hours prior to the expiration date of an inventory item, the system will automatically send out notifications.</w:t>
+            </w:r>
+          </w:p>
+        </w:tc>
+        <w:tc>
+          <w:tcPr>
+            <w:tcW w:w="2000" w:type="dxa"/>
+            <w:tcBorders>
+              <w:top w:val="single" w:sz="4" w:space="0" w:color="000000"/>
+              <w:left w:val="single" w:sz="4" w:space="0" w:color="000000"/>
+              <w:bottom w:val="single" w:sz="4" w:space="0" w:color="000000"/>
+              <w:right w:val="single" w:sz="4" w:space="0" w:color="000000"/>
+            </w:tcBorders>
+            <w:tcMar>
+              <w:top w:w="80" w:type="dxa"/>
+              <w:left w:w="120" w:type="dxa"/>
+              <w:bottom w:w="80" w:type="dxa"/>
+              <w:right w:w="120" w:type="dxa"/>
+            </w:tcMar>
+          </w:tcPr>
+          <w:p>
+            <w:pPr>
+              <w:spacing w:line="320" w:lineRule="auto"/>
+            </w:pPr>
+            <w:r>
+              <w:t>UC5</w:t>
+            </w:r>
+          </w:p>
+        </w:tc>
+        <w:tc>
+          <w:tcPr>
+            <w:tcW w:w="2526" w:type="dxa"/>
+            <w:tcBorders>
+              <w:top w:val="single" w:sz="4" w:space="0" w:color="000000"/>
+              <w:left w:val="single" w:sz="4" w:space="0" w:color="000000"/>
+              <w:bottom w:val="single" w:sz="4" w:space="0" w:color="000000"/>
+              <w:right w:val="single" w:sz="4" w:space="0" w:color="000000"/>
+            </w:tcBorders>
+            <w:tcMar>
+              <w:top w:w="80" w:type="dxa"/>
+              <w:left w:w="120" w:type="dxa"/>
+              <w:bottom w:w="80" w:type="dxa"/>
+              <w:right w:w="120" w:type="dxa"/>
+            </w:tcMar>
+          </w:tcPr>
+          <w:p>
+            <w:pPr>
+              <w:spacing w:line="320" w:lineRule="auto"/>
+            </w:pPr>
+            <w:r>
+              <w:t>Must Have</w:t>
+            </w:r>
+          </w:p>
+        </w:tc>
+      </w:tr>
+      <w:tr>
+        <w:tc>
+          <w:tcPr>
+            <w:tcW w:w="1000" w:type="dxa"/>
+            <w:tcBorders>
+              <w:top w:val="single" w:sz="4" w:space="0" w:color="000000"/>
+              <w:left w:val="single" w:sz="4" w:space="0" w:color="000000"/>
+              <w:bottom w:val="single" w:sz="4" w:space="0" w:color="000000"/>
+              <w:right w:val="single" w:sz="4" w:space="0" w:color="000000"/>
+            </w:tcBorders>
+            <w:tcMar>
+              <w:top w:w="80" w:type="dxa"/>
+              <w:left w:w="120" w:type="dxa"/>
+              <w:bottom w:w="80" w:type="dxa"/>
+              <w:right w:w="120" w:type="dxa"/>
+            </w:tcMar>
+          </w:tcPr>
+          <w:p>
+            <w:pPr>
+              <w:spacing w:line="320" w:lineRule="auto"/>
+            </w:pPr>
+            <w:r>
+              <w:t>FR12</w:t>
+            </w:r>
+          </w:p>
+        </w:tc>
+        <w:tc>
+          <w:tcPr>
+            <w:tcW w:w="3500" w:type="dxa"/>
+            <w:tcBorders>
+              <w:top w:val="single" w:sz="4" w:space="0" w:color="000000"/>
+              <w:left w:val="single" w:sz="4" w:space="0" w:color="000000"/>
+              <w:bottom w:val="single" w:sz="4" w:space="0" w:color="000000"/>
+              <w:right w:val="single" w:sz="4" w:space="0" w:color="000000"/>
+            </w:tcBorders>
+            <w:tcMar>
+              <w:top w:w="80" w:type="dxa"/>
+              <w:left w:w="120" w:type="dxa"/>
+              <w:bottom w:w="80" w:type="dxa"/>
+              <w:right w:w="120" w:type="dxa"/>
+            </w:tcMar>
+          </w:tcPr>
+          <w:p>
+            <w:pPr>
+              <w:spacing w:line="320" w:lineRule="auto"/>
+            </w:pPr>
+            <w:r>
+              <w:t>When a user's donation listing is claimed, the system will let them know.</w:t>
+            </w:r>
+          </w:p>
+        </w:tc>
+        <w:tc>
+          <w:tcPr>
+            <w:tcW w:w="2000" w:type="dxa"/>
+            <w:tcBorders>
+              <w:top w:val="single" w:sz="4" w:space="0" w:color="000000"/>
+              <w:left w:val="single" w:sz="4" w:space="0" w:color="000000"/>
+              <w:bottom w:val="single" w:sz="4" w:space="0" w:color="000000"/>
+              <w:right w:val="single" w:sz="4" w:space="0" w:color="000000"/>
+            </w:tcBorders>
+            <w:tcMar>
+              <w:top w:w="80" w:type="dxa"/>
+              <w:left w:w="120" w:type="dxa"/>
+              <w:bottom w:w="80" w:type="dxa"/>
+              <w:right w:w="120" w:type="dxa"/>
+            </w:tcMar>
+          </w:tcPr>
+          <w:p>
+            <w:pPr>
+              <w:spacing w:line="320" w:lineRule="auto"/>
+            </w:pPr>
+            <w:r>
+              <w:t>UC5</w:t>
+            </w:r>
+          </w:p>
+        </w:tc>
+        <w:tc>
+          <w:tcPr>
+            <w:tcW w:w="2526" w:type="dxa"/>
+            <w:tcBorders>
+              <w:top w:val="single" w:sz="4" w:space="0" w:color="000000"/>
+              <w:left w:val="single" w:sz="4" w:space="0" w:color="000000"/>
+              <w:bottom w:val="single" w:sz="4" w:space="0" w:color="000000"/>
+              <w:right w:val="single" w:sz="4" w:space="0" w:color="000000"/>
+            </w:tcBorders>
+            <w:tcMar>
+              <w:top w:w="80" w:type="dxa"/>
+              <w:left w:w="120" w:type="dxa"/>
+              <w:bottom w:w="80" w:type="dxa"/>
+              <w:right w:w="120" w:type="dxa"/>
+            </w:tcMar>
+          </w:tcPr>
+          <w:p>
+            <w:pPr>
+              <w:spacing w:line="320" w:lineRule="auto"/>
+            </w:pPr>
+            <w:r>
+              <w:t>Must Have</w:t>
+            </w:r>
+          </w:p>
+        </w:tc>
+      </w:tr>
+      <w:tr>
+        <w:tc>
+          <w:tcPr>
+            <w:tcW w:w="1000" w:type="dxa"/>
+            <w:tcBorders>
+              <w:top w:val="single" w:sz="4" w:space="0" w:color="000000"/>
+              <w:left w:val="single" w:sz="4" w:space="0" w:color="000000"/>
+              <w:bottom w:val="single" w:sz="4" w:space="0" w:color="000000"/>
+              <w:right w:val="single" w:sz="4" w:space="0" w:color="000000"/>
+            </w:tcBorders>
+            <w:tcMar>
+              <w:top w:w="80" w:type="dxa"/>
+              <w:left w:w="120" w:type="dxa"/>
+              <w:bottom w:w="80" w:type="dxa"/>
+              <w:right w:w="120" w:type="dxa"/>
+            </w:tcMar>
+          </w:tcPr>
+          <w:p>
+            <w:pPr>
+              <w:spacing w:line="320" w:lineRule="auto"/>
+            </w:pPr>
+            <w:r>
+              <w:t>FR13</w:t>
+            </w:r>
+          </w:p>
+        </w:tc>
+        <w:tc>
+          <w:tcPr>
+            <w:tcW w:w="3500" w:type="dxa"/>
+            <w:tcBorders>
+              <w:top w:val="single" w:sz="4" w:space="0" w:color="000000"/>
+              <w:left w:val="single" w:sz="4" w:space="0" w:color="000000"/>
+              <w:bottom w:val="single" w:sz="4" w:space="0" w:color="000000"/>
+              <w:right w:val="single" w:sz="4" w:space="0" w:color="000000"/>
+            </w:tcBorders>
+            <w:tcMar>
+              <w:top w:w="80" w:type="dxa"/>
+              <w:left w:w="120" w:type="dxa"/>
+              <w:bottom w:w="80" w:type="dxa"/>
+              <w:right w:w="120" w:type="dxa"/>
+            </w:tcMar>
+          </w:tcPr>
+          <w:p>
+            <w:pPr>
+              <w:spacing w:line="320" w:lineRule="auto"/>
+            </w:pPr>
+            <w:r>
+              <w:t>Users will be able to examine a complete notification history and designate certain alerts as read by the system.</w:t>
+            </w:r>
+          </w:p>
+        </w:tc>
+        <w:tc>
+          <w:tcPr>
+            <w:tcW w:w="2000" w:type="dxa"/>
+            <w:tcBorders>
+              <w:top w:val="single" w:sz="4" w:space="0" w:color="000000"/>
+              <w:left w:val="single" w:sz="4" w:space="0" w:color="000000"/>
+              <w:bottom w:val="single" w:sz="4" w:space="0" w:color="000000"/>
+              <w:right w:val="single" w:sz="4" w:space="0" w:color="000000"/>
+            </w:tcBorders>
+            <w:tcMar>
+              <w:top w:w="80" w:type="dxa"/>
+              <w:left w:w="120" w:type="dxa"/>
+              <w:bottom w:w="80" w:type="dxa"/>
+              <w:right w:w="120" w:type="dxa"/>
+            </w:tcMar>
+          </w:tcPr>
+          <w:p>
+            <w:pPr>
+              <w:spacing w:line="320" w:lineRule="auto"/>
+            </w:pPr>
+            <w:r>
+              <w:t>UC5</w:t>
+            </w:r>
+          </w:p>
+        </w:tc>
+        <w:tc>
+          <w:tcPr>
+            <w:tcW w:w="2526" w:type="dxa"/>
+            <w:tcBorders>
+              <w:top w:val="single" w:sz="4" w:space="0" w:color="000000"/>
+              <w:left w:val="single" w:sz="4" w:space="0" w:color="000000"/>
+              <w:bottom w:val="single" w:sz="4" w:space="0" w:color="000000"/>
+              <w:right w:val="single" w:sz="4" w:space="0" w:color="000000"/>
+            </w:tcBorders>
+            <w:tcMar>
+              <w:top w:w="80" w:type="dxa"/>
+              <w:left w:w="120" w:type="dxa"/>
+              <w:bottom w:w="80" w:type="dxa"/>
+              <w:right w:w="120" w:type="dxa"/>
+            </w:tcMar>
+          </w:tcPr>
+          <w:p>
+            <w:pPr>
+              <w:spacing w:line="320" w:lineRule="auto"/>
+            </w:pPr>
+            <w:r>
+              <w:t>Should Have</w:t>
+            </w:r>
+          </w:p>
+        </w:tc>
+      </w:tr>
+      <w:tr>
+        <w:tc>
+          <w:tcPr>
+            <w:tcW w:w="1000" w:type="dxa"/>
+            <w:tcBorders>
+              <w:top w:val="single" w:sz="4" w:space="0" w:color="000000"/>
+              <w:left w:val="single" w:sz="4" w:space="0" w:color="000000"/>
+              <w:bottom w:val="single" w:sz="4" w:space="0" w:color="000000"/>
+              <w:right w:val="single" w:sz="4" w:space="0" w:color="000000"/>
+            </w:tcBorders>
+            <w:tcMar>
+              <w:top w:w="80" w:type="dxa"/>
+              <w:left w:w="120" w:type="dxa"/>
+              <w:bottom w:w="80" w:type="dxa"/>
+              <w:right w:w="120" w:type="dxa"/>
+            </w:tcMar>
+          </w:tcPr>
+          <w:p>
+            <w:pPr>
+              <w:spacing w:line="320" w:lineRule="auto"/>
+            </w:pPr>
+            <w:r>
+              <w:t>FR14</w:t>
+            </w:r>
+          </w:p>
+        </w:tc>
+        <w:tc>
+          <w:tcPr>
+            <w:tcW w:w="3500" w:type="dxa"/>
+            <w:tcBorders>
+              <w:top w:val="single" w:sz="4" w:space="0" w:color="000000"/>
+              <w:left w:val="single" w:sz="4" w:space="0" w:color="000000"/>
+              <w:bottom w:val="single" w:sz="4" w:space="0" w:color="000000"/>
+              <w:right w:val="single" w:sz="4" w:space="0" w:color="000000"/>
+            </w:tcBorders>
+            <w:tcMar>
+              <w:top w:w="80" w:type="dxa"/>
+              <w:left w:w="120" w:type="dxa"/>
+              <w:bottom w:w="80" w:type="dxa"/>
+              <w:right w:w="120" w:type="dxa"/>
+            </w:tcMar>
+          </w:tcPr>
+          <w:p>
+            <w:pPr>
+              <w:spacing w:line="320" w:lineRule="auto"/>
+            </w:pPr>
+            <w:r>
+              <w:t>Users will be able to schedule meals for breakfast, lunch, dinner, and snack times using the system's weekly calendar view.</w:t>
+            </w:r>
+          </w:p>
+        </w:tc>
+        <w:tc>
+          <w:tcPr>
+            <w:tcW w:w="2000" w:type="dxa"/>
+            <w:tcBorders>
+              <w:top w:val="single" w:sz="4" w:space="0" w:color="000000"/>
+              <w:left w:val="single" w:sz="4" w:space="0" w:color="000000"/>
+              <w:bottom w:val="single" w:sz="4" w:space="0" w:color="000000"/>
+              <w:right w:val="single" w:sz="4" w:space="0" w:color="000000"/>
+            </w:tcBorders>
+            <w:tcMar>
+              <w:top w:w="80" w:type="dxa"/>
+              <w:left w:w="120" w:type="dxa"/>
+              <w:bottom w:w="80" w:type="dxa"/>
+              <w:right w:w="120" w:type="dxa"/>
+            </w:tcMar>
+          </w:tcPr>
+          <w:p>
+            <w:pPr>
+              <w:spacing w:line="320" w:lineRule="auto"/>
+            </w:pPr>
+            <w:r>
+              <w:t>UC6</w:t>
+            </w:r>
+          </w:p>
+        </w:tc>
+        <w:tc>
+          <w:tcPr>
+            <w:tcW w:w="2526" w:type="dxa"/>
+            <w:tcBorders>
+              <w:top w:val="single" w:sz="4" w:space="0" w:color="000000"/>
+              <w:left w:val="single" w:sz="4" w:space="0" w:color="000000"/>
+              <w:bottom w:val="single" w:sz="4" w:space="0" w:color="000000"/>
+              <w:right w:val="single" w:sz="4" w:space="0" w:color="000000"/>
+            </w:tcBorders>
+            <w:tcMar>
+              <w:top w:w="80" w:type="dxa"/>
+              <w:left w:w="120" w:type="dxa"/>
+              <w:bottom w:w="80" w:type="dxa"/>
+              <w:right w:w="120" w:type="dxa"/>
+            </w:tcMar>
+          </w:tcPr>
+          <w:p>
+            <w:pPr>
+              <w:spacing w:line="320" w:lineRule="auto"/>
+            </w:pPr>
+            <w:r>
+              <w:t>Should Have</w:t>
+            </w:r>
+          </w:p>
+        </w:tc>
+      </w:tr>
+      <w:tr>
+        <w:tc>
+          <w:tcPr>
+            <w:tcW w:w="1000" w:type="dxa"/>
+            <w:tcBorders>
+              <w:top w:val="single" w:sz="4" w:space="0" w:color="000000"/>
+              <w:left w:val="single" w:sz="4" w:space="0" w:color="000000"/>
+              <w:bottom w:val="single" w:sz="4" w:space="0" w:color="000000"/>
+              <w:right w:val="single" w:sz="4" w:space="0" w:color="000000"/>
+            </w:tcBorders>
+            <w:tcMar>
+              <w:top w:w="80" w:type="dxa"/>
+              <w:left w:w="120" w:type="dxa"/>
+              <w:bottom w:w="80" w:type="dxa"/>
+              <w:right w:w="120" w:type="dxa"/>
+            </w:tcMar>
+          </w:tcPr>
+          <w:p>
+            <w:pPr>
+              <w:spacing w:line="320" w:lineRule="auto"/>
+            </w:pPr>
+            <w:r>
+              <w:t>FR15</w:t>
+            </w:r>
+          </w:p>
+        </w:tc>
+        <w:tc>
+          <w:tcPr>
+            <w:tcW w:w="3500" w:type="dxa"/>
+            <w:tcBorders>
+              <w:top w:val="single" w:sz="4" w:space="0" w:color="000000"/>
+              <w:left w:val="single" w:sz="4" w:space="0" w:color="000000"/>
+              <w:bottom w:val="single" w:sz="4" w:space="0" w:color="000000"/>
+              <w:right w:val="single" w:sz="4" w:space="0" w:color="000000"/>
+            </w:tcBorders>
+            <w:tcMar>
+              <w:top w:w="80" w:type="dxa"/>
+              <w:left w:w="120" w:type="dxa"/>
+              <w:bottom w:w="80" w:type="dxa"/>
+              <w:right w:w="120" w:type="dxa"/>
+            </w:tcMar>
+          </w:tcPr>
+          <w:p>
+            <w:pPr>
+              <w:spacing w:line="320" w:lineRule="auto"/>
+            </w:pPr>
+            <w:r>
+              <w:t>Based on inventory goods that are about to expire, the algorithm will recommend recipes.</w:t>
+            </w:r>
+          </w:p>
+        </w:tc>
+        <w:tc>
+          <w:tcPr>
+            <w:tcW w:w="2000" w:type="dxa"/>
+            <w:tcBorders>
+              <w:top w:val="single" w:sz="4" w:space="0" w:color="000000"/>
+              <w:left w:val="single" w:sz="4" w:space="0" w:color="000000"/>
+              <w:bottom w:val="single" w:sz="4" w:space="0" w:color="000000"/>
+              <w:right w:val="single" w:sz="4" w:space="0" w:color="000000"/>
+            </w:tcBorders>
+            <w:tcMar>
+              <w:top w:w="80" w:type="dxa"/>
+              <w:left w:w="120" w:type="dxa"/>
+              <w:bottom w:w="80" w:type="dxa"/>
+              <w:right w:w="120" w:type="dxa"/>
+            </w:tcMar>
+          </w:tcPr>
+          <w:p>
+            <w:pPr>
+              <w:spacing w:line="320" w:lineRule="auto"/>
+            </w:pPr>
+            <w:r>
+              <w:t>UC6</w:t>
+            </w:r>
+          </w:p>
+        </w:tc>
+        <w:tc>
+          <w:tcPr>
+            <w:tcW w:w="2526" w:type="dxa"/>
+            <w:tcBorders>
+              <w:top w:val="single" w:sz="4" w:space="0" w:color="000000"/>
+              <w:left w:val="single" w:sz="4" w:space="0" w:color="000000"/>
+              <w:bottom w:val="single" w:sz="4" w:space="0" w:color="000000"/>
+              <w:right w:val="single" w:sz="4" w:space="0" w:color="000000"/>
+            </w:tcBorders>
+            <w:tcMar>
+              <w:top w:w="80" w:type="dxa"/>
+              <w:left w:w="120" w:type="dxa"/>
+              <w:bottom w:w="80" w:type="dxa"/>
+              <w:right w:w="120" w:type="dxa"/>
+            </w:tcMar>
+          </w:tcPr>
+          <w:p>
+            <w:pPr>
+              <w:spacing w:line="320" w:lineRule="auto"/>
+            </w:pPr>
+            <w:r>
+              <w:t>Should Have</w:t>
+            </w:r>
+          </w:p>
+        </w:tc>
+      </w:tr>
+      <w:tr>
+        <w:tc>
+          <w:tcPr>
+            <w:tcW w:w="1000" w:type="dxa"/>
+            <w:tcBorders>
+              <w:top w:val="single" w:sz="4" w:space="0" w:color="000000"/>
+              <w:left w:val="single" w:sz="4" w:space="0" w:color="000000"/>
+              <w:bottom w:val="single" w:sz="4" w:space="0" w:color="000000"/>
+              <w:right w:val="single" w:sz="4" w:space="0" w:color="000000"/>
+            </w:tcBorders>
+            <w:tcMar>
+              <w:top w:w="80" w:type="dxa"/>
+              <w:left w:w="120" w:type="dxa"/>
+              <w:bottom w:w="80" w:type="dxa"/>
+              <w:right w:w="120" w:type="dxa"/>
+            </w:tcMar>
+          </w:tcPr>
+          <w:p>
+            <w:pPr>
+              <w:spacing w:line="320" w:lineRule="auto"/>
+            </w:pPr>
+            <w:r>
+              <w:t>FR16</w:t>
+            </w:r>
+          </w:p>
+        </w:tc>
+        <w:tc>
+          <w:tcPr>
+            <w:tcW w:w="3500" w:type="dxa"/>
+            <w:tcBorders>
+              <w:top w:val="single" w:sz="4" w:space="0" w:color="000000"/>
+              <w:left w:val="single" w:sz="4" w:space="0" w:color="000000"/>
+              <w:bottom w:val="single" w:sz="4" w:space="0" w:color="000000"/>
+              <w:right w:val="single" w:sz="4" w:space="0" w:color="000000"/>
+            </w:tcBorders>
+            <w:tcMar>
+              <w:top w:w="80" w:type="dxa"/>
+              <w:left w:w="120" w:type="dxa"/>
+              <w:bottom w:w="80" w:type="dxa"/>
+              <w:right w:w="120" w:type="dxa"/>
+            </w:tcMar>
+          </w:tcPr>
+          <w:p>
+            <w:pPr>
+              <w:spacing w:line="320" w:lineRule="auto"/>
+            </w:pPr>
+            <w:r>
+              <w:t>When a weekly meal plan is confirmed, the system will schedule meal reminders and reserve inventory quantities.</w:t>
+            </w:r>
+          </w:p>
+        </w:tc>
+        <w:tc>
+          <w:tcPr>
+            <w:tcW w:w="2000" w:type="dxa"/>
+            <w:tcBorders>
+              <w:top w:val="single" w:sz="4" w:space="0" w:color="000000"/>
+              <w:left w:val="single" w:sz="4" w:space="0" w:color="000000"/>
+              <w:bottom w:val="single" w:sz="4" w:space="0" w:color="000000"/>
+              <w:right w:val="single" w:sz="4" w:space="0" w:color="000000"/>
+            </w:tcBorders>
+            <w:tcMar>
+              <w:top w:w="80" w:type="dxa"/>
+              <w:left w:w="120" w:type="dxa"/>
+              <w:bottom w:w="80" w:type="dxa"/>
+              <w:right w:w="120" w:type="dxa"/>
+            </w:tcMar>
+          </w:tcPr>
+          <w:p>
+            <w:pPr>
+              <w:spacing w:line="320" w:lineRule="auto"/>
+            </w:pPr>
+            <w:r>
+              <w:t>UC6</w:t>
+            </w:r>
+          </w:p>
+        </w:tc>
+        <w:tc>
+          <w:tcPr>
+            <w:tcW w:w="2526" w:type="dxa"/>
+            <w:tcBorders>
+              <w:top w:val="single" w:sz="4" w:space="0" w:color="000000"/>
+              <w:left w:val="single" w:sz="4" w:space="0" w:color="000000"/>
+              <w:bottom w:val="single" w:sz="4" w:space="0" w:color="000000"/>
+              <w:right w:val="single" w:sz="4" w:space="0" w:color="000000"/>
+            </w:tcBorders>
+            <w:tcMar>
+              <w:top w:w="80" w:type="dxa"/>
+              <w:left w:w="120" w:type="dxa"/>
+              <w:bottom w:w="80" w:type="dxa"/>
+              <w:right w:w="120" w:type="dxa"/>
+            </w:tcMar>
+          </w:tcPr>
+          <w:p>
+            <w:pPr>
+              <w:spacing w:line="320" w:lineRule="auto"/>
+            </w:pPr>
+            <w:r>
+              <w:t>Could Have</w:t>
+            </w:r>
+          </w:p>
+        </w:tc>
+      </w:tr>
+      <w:tr>
+        <w:tc>
+          <w:tcPr>
+            <w:tcW w:w="1000" w:type="dxa"/>
+            <w:tcBorders>
+              <w:top w:val="single" w:sz="4" w:space="0" w:color="000000"/>
+              <w:left w:val="single" w:sz="4" w:space="0" w:color="000000"/>
+              <w:bottom w:val="single" w:sz="4" w:space="0" w:color="000000"/>
+              <w:right w:val="single" w:sz="4" w:space="0" w:color="000000"/>
+            </w:tcBorders>
+            <w:tcMar>
+              <w:top w:w="80" w:type="dxa"/>
+              <w:left w:w="120" w:type="dxa"/>
+              <w:bottom w:w="80" w:type="dxa"/>
+              <w:right w:w="120" w:type="dxa"/>
+            </w:tcMar>
+          </w:tcPr>
+          <w:p>
+            <w:pPr>
+              <w:spacing w:line="320" w:lineRule="auto"/>
+            </w:pPr>
+            <w:r>
+              <w:t>FR17</w:t>
+            </w:r>
+          </w:p>
+        </w:tc>
+        <w:tc>
+          <w:tcPr>
+            <w:tcW w:w="3500" w:type="dxa"/>
+            <w:tcBorders>
+              <w:top w:val="single" w:sz="4" w:space="0" w:color="000000"/>
+              <w:left w:val="single" w:sz="4" w:space="0" w:color="000000"/>
+              <w:bottom w:val="single" w:sz="4" w:space="0" w:color="000000"/>
+              <w:right w:val="single" w:sz="4" w:space="0" w:color="000000"/>
+            </w:tcBorders>
+            <w:tcMar>
+              <w:top w:w="80" w:type="dxa"/>
+              <w:left w:w="120" w:type="dxa"/>
+              <w:bottom w:w="80" w:type="dxa"/>
+              <w:right w:w="120" w:type="dxa"/>
+            </w:tcMar>
+          </w:tcPr>
+          <w:p>
+            <w:pPr>
+              <w:spacing w:line="320" w:lineRule="auto"/>
+            </w:pPr>
+            <w:r>
+              <w:t>Users will be able to adjust privacy settings on the system, such as changing the display of public or private donation listings.</w:t>
+            </w:r>
+          </w:p>
+        </w:tc>
+        <w:tc>
+          <w:tcPr>
+            <w:tcW w:w="2000" w:type="dxa"/>
+            <w:tcBorders>
+              <w:top w:val="single" w:sz="4" w:space="0" w:color="000000"/>
+              <w:left w:val="single" w:sz="4" w:space="0" w:color="000000"/>
+              <w:bottom w:val="single" w:sz="4" w:space="0" w:color="000000"/>
+              <w:right w:val="single" w:sz="4" w:space="0" w:color="000000"/>
+            </w:tcBorders>
+            <w:tcMar>
+              <w:top w:w="80" w:type="dxa"/>
+              <w:left w:w="120" w:type="dxa"/>
+              <w:bottom w:w="80" w:type="dxa"/>
+              <w:right w:w="120" w:type="dxa"/>
+            </w:tcMar>
+          </w:tcPr>
+          <w:p>
+            <w:pPr>
+              <w:spacing w:line="320" w:lineRule="auto"/>
+            </w:pPr>
+            <w:r>
+              <w:t>UC1</w:t>
+            </w:r>
+          </w:p>
+        </w:tc>
+        <w:tc>
+          <w:tcPr>
+            <w:tcW w:w="2526" w:type="dxa"/>
+            <w:tcBorders>
+              <w:top w:val="single" w:sz="4" w:space="0" w:color="000000"/>
+              <w:left w:val="single" w:sz="4" w:space="0" w:color="000000"/>
+              <w:bottom w:val="single" w:sz="4" w:space="0" w:color="000000"/>
+              <w:right w:val="single" w:sz="4" w:space="0" w:color="000000"/>
+            </w:tcBorders>
+            <w:tcMar>
+              <w:top w:w="80" w:type="dxa"/>
+              <w:left w:w="120" w:type="dxa"/>
+              <w:bottom w:w="80" w:type="dxa"/>
+              <w:right w:w="120" w:type="dxa"/>
+            </w:tcMar>
+          </w:tcPr>
+          <w:p>
+            <w:pPr>
+              <w:spacing w:line="320" w:lineRule="auto"/>
+            </w:pPr>
+            <w:r>
+              <w:t>Should Have</w:t>
+            </w:r>
+          </w:p>
+        </w:tc>
+      </w:tr>
+      <w:tr>
+        <w:tc>
+          <w:tcPr>
+            <w:tcW w:w="1000" w:type="dxa"/>
+            <w:tcBorders>
+              <w:top w:val="single" w:sz="4" w:space="0" w:color="000000"/>
+              <w:left w:val="single" w:sz="4" w:space="0" w:color="000000"/>
+              <w:bottom w:val="single" w:sz="4" w:space="0" w:color="000000"/>
+              <w:right w:val="single" w:sz="4" w:space="0" w:color="000000"/>
+            </w:tcBorders>
+            <w:tcMar>
+              <w:top w:w="80" w:type="dxa"/>
+              <w:left w:w="120" w:type="dxa"/>
+              <w:bottom w:w="80" w:type="dxa"/>
+              <w:right w:w="120" w:type="dxa"/>
+            </w:tcMar>
+          </w:tcPr>
+          <w:p>
+            <w:pPr>
+              <w:spacing w:line="320" w:lineRule="auto"/>
+            </w:pPr>
+            <w:r>
+              <w:t>FR18</w:t>
+            </w:r>
+          </w:p>
+        </w:tc>
+        <w:tc>
+          <w:tcPr>
+            <w:tcW w:w="3500" w:type="dxa"/>
+            <w:tcBorders>
+              <w:top w:val="single" w:sz="4" w:space="0" w:color="000000"/>
+              <w:left w:val="single" w:sz="4" w:space="0" w:color="000000"/>
+              <w:bottom w:val="single" w:sz="4" w:space="0" w:color="000000"/>
+              <w:right w:val="single" w:sz="4" w:space="0" w:color="000000"/>
+            </w:tcBorders>
+            <w:tcMar>
+              <w:top w:w="80" w:type="dxa"/>
+              <w:left w:w="120" w:type="dxa"/>
+              <w:bottom w:w="80" w:type="dxa"/>
+              <w:right w:w="120" w:type="dxa"/>
+            </w:tcMar>
+          </w:tcPr>
+          <w:p>
+            <w:pPr>
+              <w:spacing w:line="320" w:lineRule="auto"/>
+            </w:pPr>
+            <w:r>
+              <w:t>From the account settings dashboard, users will be able to modify their account password and profile details.</w:t>
+            </w:r>
+          </w:p>
+        </w:tc>
+        <w:tc>
+          <w:tcPr>
+            <w:tcW w:w="2000" w:type="dxa"/>
+            <w:tcBorders>
+              <w:top w:val="single" w:sz="4" w:space="0" w:color="000000"/>
+              <w:left w:val="single" w:sz="4" w:space="0" w:color="000000"/>
+              <w:bottom w:val="single" w:sz="4" w:space="0" w:color="000000"/>
+              <w:right w:val="single" w:sz="4" w:space="0" w:color="000000"/>
+            </w:tcBorders>
+            <w:tcMar>
+              <w:top w:w="80" w:type="dxa"/>
+              <w:left w:w="120" w:type="dxa"/>
+              <w:bottom w:w="80" w:type="dxa"/>
+              <w:right w:w="120" w:type="dxa"/>
+            </w:tcMar>
+          </w:tcPr>
+          <w:p>
+            <w:pPr>
+              <w:spacing w:line="320" w:lineRule="auto"/>
+            </w:pPr>
+            <w:r>
+              <w:t>UC1</w:t>
+            </w:r>
+          </w:p>
+        </w:tc>
+        <w:tc>
+          <w:tcPr>
+            <w:tcW w:w="2526" w:type="dxa"/>
+            <w:tcBorders>
+              <w:top w:val="single" w:sz="4" w:space="0" w:color="000000"/>
+              <w:left w:val="single" w:sz="4" w:space="0" w:color="000000"/>
+              <w:bottom w:val="single" w:sz="4" w:space="0" w:color="000000"/>
+              <w:right w:val="single" w:sz="4" w:space="0" w:color="000000"/>
+            </w:tcBorders>
+            <w:tcMar>
+              <w:top w:w="80" w:type="dxa"/>
+              <w:left w:w="120" w:type="dxa"/>
+              <w:bottom w:w="80" w:type="dxa"/>
+              <w:right w:w="120" w:type="dxa"/>
+            </w:tcMar>
+          </w:tcPr>
+          <w:p>
+            <w:pPr>
+              <w:spacing w:line="320" w:lineRule="auto"/>
+            </w:pPr>
+            <w:r>
+              <w:t>Must Have</w:t>
+            </w:r>
+          </w:p>
+        </w:tc>
+      </w:tr>
+    </w:tbl>
+    <w:p>
+      <w:pPr>
+        <w:spacing w:before="60" w:after="120"/>
+        <w:jc w:val="center"/>
+      </w:pPr>
+      <w:r>
+        <w:t>Table 1: Functional Requirements</w:t>
+      </w:r>
+    </w:p>
+    <w:p>
+      <w:pPr>
+        <w:spacing w:line="360" w:lineRule="auto"/>
+      </w:pPr>
+    </w:p>
+    <w:p>
+      <w:pPr>
+        <w:pStyle w:val="Heading2"/>
+        <w:spacing w:before="200" w:after="100"/>
+      </w:pPr>
+      <w:bookmarkStart w:id="4" w:name="_heading=h.px27ofghanb6" w:colFirst="0" w:colLast="0"/>
+      <w:bookmarkEnd w:id="4"/>
+      <w:r>
+        <w:t>2.2  Non-Functional Requirements</w:t>
+      </w:r>
+    </w:p>
+    <w:p>
+      <w:pPr>
+        <w:spacing w:after="120" w:line="360" w:lineRule="auto"/>
+        <w:jc w:val="both"/>
+      </w:pPr>
+      <w:r>
+        <w:t>Non-functional requirements (NFRs) refer to the quality attributes and constraints affecting system behavior only, not specific functions (Sommerville, 2016). They control how well the system works and are, for sure, the main reasons that users get satisfied, the system is secure, and it's easy to take care of.</w:t>
+      </w:r>
+    </w:p>
+    <w:tbl>
+      <w:tblPr>
+        <w:tblW w:w="9026" w:type="dxa"/>
+        <w:tblBorders>
+          <w:top w:val="single" w:sz="4" w:space="0" w:color="000000"/>
+          <w:left w:val="single" w:sz="4" w:space="0" w:color="000000"/>
+          <w:bottom w:val="single" w:sz="4" w:space="0" w:color="000000"/>
+          <w:right w:val="single" w:sz="4" w:space="0" w:color="000000"/>
+          <w:insideH w:val="single" w:sz="4" w:space="0" w:color="000000"/>
+          <w:insideV w:val="single" w:sz="4" w:space="0" w:color="000000"/>
+        </w:tblBorders>
+        <w:tblLayout w:type="fixed"/>
+        <w:tblLook w:val="0000" w:firstRow="0" w:lastRow="0" w:firstColumn="0" w:lastColumn="0" w:noHBand="0" w:noVBand="0"/>
+      </w:tblPr>
+      <w:tblGrid>
+        <w:gridCol w:w="888"/>
+        <w:gridCol w:w="1597"/>
+        <w:gridCol w:w="4098"/>
+        <w:gridCol w:w="2443"/>
+      </w:tblGrid>
+      <w:tr>
+        <w:tc>
+          <w:tcPr>
+            <w:tcW w:w="888" w:type="dxa"/>
+            <w:tcBorders>
+              <w:top w:val="single" w:sz="4" w:space="0" w:color="000000"/>
+              <w:left w:val="single" w:sz="4" w:space="0" w:color="000000"/>
+              <w:bottom w:val="single" w:sz="4" w:space="0" w:color="000000"/>
+              <w:right w:val="single" w:sz="4" w:space="0" w:color="000000"/>
+            </w:tcBorders>
+            <w:tcMar>
+              <w:top w:w="80" w:type="dxa"/>
+              <w:left w:w="120" w:type="dxa"/>
+              <w:bottom w:w="80" w:type="dxa"/>
+              <w:right w:w="120" w:type="dxa"/>
+            </w:tcMar>
+          </w:tcPr>
+          <w:p>
+            <w:pPr>
+              <w:spacing w:line="320" w:lineRule="auto"/>
+            </w:pPr>
+            <w:r>
+              <w:rPr>
+                <w:b/>
+                <w:bCs/>
+              </w:rPr>
+              <w:t>ID</w:t>
+            </w:r>
+          </w:p>
+        </w:tc>
+        <w:tc>
+          <w:tcPr>
+            <w:tcW w:w="1597" w:type="dxa"/>
+            <w:tcBorders>
+              <w:top w:val="single" w:sz="4" w:space="0" w:color="000000"/>
+              <w:left w:val="single" w:sz="4" w:space="0" w:color="000000"/>
+              <w:bottom w:val="single" w:sz="4" w:space="0" w:color="000000"/>
+              <w:right w:val="single" w:sz="4" w:space="0" w:color="000000"/>
+            </w:tcBorders>
+            <w:tcMar>
+              <w:top w:w="80" w:type="dxa"/>
+              <w:left w:w="120" w:type="dxa"/>
+              <w:bottom w:w="80" w:type="dxa"/>
+              <w:right w:w="120" w:type="dxa"/>
+            </w:tcMar>
+          </w:tcPr>
+          <w:p>
+            <w:pPr>
+              <w:spacing w:line="320" w:lineRule="auto"/>
+            </w:pPr>
+            <w:r>
+              <w:rPr>
+                <w:b/>
+                <w:bCs/>
+              </w:rPr>
+              <w:t>Category</w:t>
+            </w:r>
+          </w:p>
+        </w:tc>
+        <w:tc>
+          <w:tcPr>
+            <w:tcW w:w="4098" w:type="dxa"/>
+            <w:tcBorders>
+              <w:top w:val="single" w:sz="4" w:space="0" w:color="000000"/>
+              <w:left w:val="single" w:sz="4" w:space="0" w:color="000000"/>
+              <w:bottom w:val="single" w:sz="4" w:space="0" w:color="000000"/>
+              <w:right w:val="single" w:sz="4" w:space="0" w:color="000000"/>
+            </w:tcBorders>
+            <w:tcMar>
+              <w:top w:w="80" w:type="dxa"/>
+              <w:left w:w="120" w:type="dxa"/>
+              <w:bottom w:w="80" w:type="dxa"/>
+              <w:right w:w="120" w:type="dxa"/>
+            </w:tcMar>
+          </w:tcPr>
+          <w:p>
+            <w:pPr>
+              <w:spacing w:line="320" w:lineRule="auto"/>
+            </w:pPr>
+            <w:r>
+              <w:rPr>
+                <w:b/>
+                <w:bCs/>
+              </w:rPr>
+              <w:t>Non-Functional Requirement</w:t>
+            </w:r>
+          </w:p>
+        </w:tc>
+        <w:tc>
+          <w:tcPr>
+            <w:tcW w:w="2443" w:type="dxa"/>
+            <w:tcBorders>
+              <w:top w:val="single" w:sz="4" w:space="0" w:color="000000"/>
+              <w:left w:val="single" w:sz="4" w:space="0" w:color="000000"/>
+              <w:bottom w:val="single" w:sz="4" w:space="0" w:color="000000"/>
+              <w:right w:val="single" w:sz="4" w:space="0" w:color="000000"/>
+            </w:tcBorders>
+            <w:tcMar>
+              <w:top w:w="80" w:type="dxa"/>
+              <w:left w:w="120" w:type="dxa"/>
+              <w:bottom w:w="80" w:type="dxa"/>
+              <w:right w:w="120" w:type="dxa"/>
+            </w:tcMar>
+          </w:tcPr>
+          <w:p>
+            <w:pPr>
+              <w:spacing w:line="320" w:lineRule="auto"/>
+            </w:pPr>
+            <w:r>
+              <w:rPr>
+                <w:b/>
+                <w:bCs/>
+              </w:rPr>
+              <w:t>Rationale</w:t>
+            </w:r>
+          </w:p>
+        </w:tc>
+      </w:tr>
+      <w:tr>
+        <w:tc>
+          <w:tcPr>
+            <w:tcW w:w="888" w:type="dxa"/>
+            <w:tcBorders>
+              <w:top w:val="single" w:sz="4" w:space="0" w:color="000000"/>
+              <w:left w:val="single" w:sz="4" w:space="0" w:color="000000"/>
+              <w:bottom w:val="single" w:sz="4" w:space="0" w:color="000000"/>
+              <w:right w:val="single" w:sz="4" w:space="0" w:color="000000"/>
+            </w:tcBorders>
+            <w:tcMar>
+              <w:top w:w="80" w:type="dxa"/>
+              <w:left w:w="120" w:type="dxa"/>
+              <w:bottom w:w="80" w:type="dxa"/>
+              <w:right w:w="120" w:type="dxa"/>
+            </w:tcMar>
+          </w:tcPr>
+          <w:p>
+            <w:pPr>
+              <w:spacing w:line="320" w:lineRule="auto"/>
+            </w:pPr>
+            <w:r>
+              <w:t>NFR01</w:t>
+            </w:r>
+          </w:p>
+        </w:tc>
+        <w:tc>
+          <w:tcPr>
+            <w:tcW w:w="1597" w:type="dxa"/>
+            <w:tcBorders>
+              <w:top w:val="single" w:sz="4" w:space="0" w:color="000000"/>
+              <w:left w:val="single" w:sz="4" w:space="0" w:color="000000"/>
+              <w:bottom w:val="single" w:sz="4" w:space="0" w:color="000000"/>
+              <w:right w:val="single" w:sz="4" w:space="0" w:color="000000"/>
+            </w:tcBorders>
+            <w:tcMar>
+              <w:top w:w="80" w:type="dxa"/>
+              <w:left w:w="120" w:type="dxa"/>
+              <w:bottom w:w="80" w:type="dxa"/>
+              <w:right w:w="120" w:type="dxa"/>
+            </w:tcMar>
+          </w:tcPr>
+          <w:p>
+            <w:pPr>
+              <w:spacing w:line="320" w:lineRule="auto"/>
+            </w:pPr>
+            <w:r>
+              <w:t>Performance</w:t>
+            </w:r>
+          </w:p>
+        </w:tc>
+        <w:tc>
+          <w:tcPr>
+            <w:tcW w:w="4098" w:type="dxa"/>
+            <w:tcBorders>
+              <w:top w:val="single" w:sz="4" w:space="0" w:color="000000"/>
+              <w:left w:val="single" w:sz="4" w:space="0" w:color="000000"/>
+              <w:bottom w:val="single" w:sz="4" w:space="0" w:color="000000"/>
+              <w:right w:val="single" w:sz="4" w:space="0" w:color="000000"/>
+            </w:tcBorders>
+            <w:tcMar>
+              <w:top w:w="80" w:type="dxa"/>
+              <w:left w:w="120" w:type="dxa"/>
+              <w:bottom w:w="80" w:type="dxa"/>
+              <w:right w:w="120" w:type="dxa"/>
+            </w:tcMar>
+          </w:tcPr>
+          <w:p>
+            <w:pPr>
+              <w:spacing w:line="320" w:lineRule="auto"/>
+            </w:pPr>
+            <w:r>
+              <w:t>Under typical network conditions, all dashboard and inventory pages must load in less than two seconds.</w:t>
+            </w:r>
+          </w:p>
+        </w:tc>
+        <w:tc>
+          <w:tcPr>
+            <w:tcW w:w="2443" w:type="dxa"/>
+            <w:tcBorders>
+              <w:top w:val="single" w:sz="4" w:space="0" w:color="000000"/>
+              <w:left w:val="single" w:sz="4" w:space="0" w:color="000000"/>
+              <w:bottom w:val="single" w:sz="4" w:space="0" w:color="000000"/>
+              <w:right w:val="single" w:sz="4" w:space="0" w:color="000000"/>
+            </w:tcBorders>
+            <w:tcMar>
+              <w:top w:w="80" w:type="dxa"/>
+              <w:left w:w="120" w:type="dxa"/>
+              <w:bottom w:w="80" w:type="dxa"/>
+              <w:right w:w="120" w:type="dxa"/>
+            </w:tcMar>
+          </w:tcPr>
+          <w:p>
+            <w:pPr>
+              <w:spacing w:line="320" w:lineRule="auto"/>
+            </w:pPr>
+            <w:r>
+              <w:t>Ensures that every household user has a responsive user experience.</w:t>
+            </w:r>
+          </w:p>
+        </w:tc>
+      </w:tr>
+      <w:tr>
+        <w:tc>
+          <w:tcPr>
+            <w:tcW w:w="888" w:type="dxa"/>
+            <w:tcBorders>
+              <w:top w:val="single" w:sz="4" w:space="0" w:color="000000"/>
+              <w:left w:val="single" w:sz="4" w:space="0" w:color="000000"/>
+              <w:bottom w:val="single" w:sz="4" w:space="0" w:color="000000"/>
+              <w:right w:val="single" w:sz="4" w:space="0" w:color="000000"/>
+            </w:tcBorders>
+            <w:tcMar>
+              <w:top w:w="80" w:type="dxa"/>
+              <w:left w:w="120" w:type="dxa"/>
+              <w:bottom w:w="80" w:type="dxa"/>
+              <w:right w:w="120" w:type="dxa"/>
+            </w:tcMar>
+          </w:tcPr>
+          <w:p>
+            <w:pPr>
+              <w:spacing w:line="320" w:lineRule="auto"/>
+            </w:pPr>
+            <w:r>
+              <w:t>NFR02</w:t>
+            </w:r>
+          </w:p>
+        </w:tc>
+        <w:tc>
+          <w:tcPr>
+            <w:tcW w:w="1597" w:type="dxa"/>
+            <w:tcBorders>
+              <w:top w:val="single" w:sz="4" w:space="0" w:color="000000"/>
+              <w:left w:val="single" w:sz="4" w:space="0" w:color="000000"/>
+              <w:bottom w:val="single" w:sz="4" w:space="0" w:color="000000"/>
+              <w:right w:val="single" w:sz="4" w:space="0" w:color="000000"/>
+            </w:tcBorders>
+            <w:tcMar>
+              <w:top w:w="80" w:type="dxa"/>
+              <w:left w:w="120" w:type="dxa"/>
+              <w:bottom w:w="80" w:type="dxa"/>
+              <w:right w:w="120" w:type="dxa"/>
+            </w:tcMar>
+          </w:tcPr>
+          <w:p>
+            <w:pPr>
+              <w:spacing w:line="320" w:lineRule="auto"/>
+            </w:pPr>
+            <w:r>
+              <w:t>Usability</w:t>
+            </w:r>
+          </w:p>
+        </w:tc>
+        <w:tc>
+          <w:tcPr>
+            <w:tcW w:w="4098" w:type="dxa"/>
+            <w:tcBorders>
+              <w:top w:val="single" w:sz="4" w:space="0" w:color="000000"/>
+              <w:left w:val="single" w:sz="4" w:space="0" w:color="000000"/>
+              <w:bottom w:val="single" w:sz="4" w:space="0" w:color="000000"/>
+              <w:right w:val="single" w:sz="4" w:space="0" w:color="000000"/>
+            </w:tcBorders>
+            <w:tcMar>
+              <w:top w:w="80" w:type="dxa"/>
+              <w:left w:w="120" w:type="dxa"/>
+              <w:bottom w:w="80" w:type="dxa"/>
+              <w:right w:w="120" w:type="dxa"/>
+            </w:tcMar>
+          </w:tcPr>
+          <w:p>
+            <w:pPr>
+              <w:spacing w:line="320" w:lineRule="auto"/>
+            </w:pPr>
+            <w:r>
+              <w:t>For new users, the system will offer guided onboarding and unambiguous empty-state warnings.</w:t>
+            </w:r>
+          </w:p>
+        </w:tc>
+        <w:tc>
+          <w:tcPr>
+            <w:tcW w:w="2443" w:type="dxa"/>
+            <w:tcBorders>
+              <w:top w:val="single" w:sz="4" w:space="0" w:color="000000"/>
+              <w:left w:val="single" w:sz="4" w:space="0" w:color="000000"/>
+              <w:bottom w:val="single" w:sz="4" w:space="0" w:color="000000"/>
+              <w:right w:val="single" w:sz="4" w:space="0" w:color="000000"/>
+            </w:tcBorders>
+            <w:tcMar>
+              <w:top w:w="80" w:type="dxa"/>
+              <w:left w:w="120" w:type="dxa"/>
+              <w:bottom w:w="80" w:type="dxa"/>
+              <w:right w:w="120" w:type="dxa"/>
+            </w:tcMar>
+          </w:tcPr>
+          <w:p>
+            <w:pPr>
+              <w:spacing w:line="320" w:lineRule="auto"/>
+            </w:pPr>
+            <w:r>
+              <w:t>lowers user friction and helps those with poor levels of digital literacy.</w:t>
+            </w:r>
+          </w:p>
+        </w:tc>
+      </w:tr>
+      <w:tr>
+        <w:tc>
+          <w:tcPr>
+            <w:tcW w:w="888" w:type="dxa"/>
+            <w:tcBorders>
+              <w:top w:val="single" w:sz="4" w:space="0" w:color="000000"/>
+              <w:left w:val="single" w:sz="4" w:space="0" w:color="000000"/>
+              <w:bottom w:val="single" w:sz="4" w:space="0" w:color="000000"/>
+              <w:right w:val="single" w:sz="4" w:space="0" w:color="000000"/>
+            </w:tcBorders>
+            <w:tcMar>
+              <w:top w:w="80" w:type="dxa"/>
+              <w:left w:w="120" w:type="dxa"/>
+              <w:bottom w:w="80" w:type="dxa"/>
+              <w:right w:w="120" w:type="dxa"/>
+            </w:tcMar>
+          </w:tcPr>
+          <w:p>
+            <w:pPr>
+              <w:spacing w:line="320" w:lineRule="auto"/>
+            </w:pPr>
+            <w:r>
+              <w:t>NFR03</w:t>
+            </w:r>
+          </w:p>
+        </w:tc>
+        <w:tc>
+          <w:tcPr>
+            <w:tcW w:w="1597" w:type="dxa"/>
+            <w:tcBorders>
+              <w:top w:val="single" w:sz="4" w:space="0" w:color="000000"/>
+              <w:left w:val="single" w:sz="4" w:space="0" w:color="000000"/>
+              <w:bottom w:val="single" w:sz="4" w:space="0" w:color="000000"/>
+              <w:right w:val="single" w:sz="4" w:space="0" w:color="000000"/>
+            </w:tcBorders>
+            <w:tcMar>
+              <w:top w:w="80" w:type="dxa"/>
+              <w:left w:w="120" w:type="dxa"/>
+              <w:bottom w:w="80" w:type="dxa"/>
+              <w:right w:w="120" w:type="dxa"/>
+            </w:tcMar>
+          </w:tcPr>
+          <w:p>
+            <w:pPr>
+              <w:spacing w:line="320" w:lineRule="auto"/>
+            </w:pPr>
+            <w:r>
+              <w:t>Security</w:t>
+            </w:r>
+          </w:p>
+        </w:tc>
+        <w:tc>
+          <w:tcPr>
+            <w:tcW w:w="4098" w:type="dxa"/>
+            <w:tcBorders>
+              <w:top w:val="single" w:sz="4" w:space="0" w:color="000000"/>
+              <w:left w:val="single" w:sz="4" w:space="0" w:color="000000"/>
+              <w:bottom w:val="single" w:sz="4" w:space="0" w:color="000000"/>
+              <w:right w:val="single" w:sz="4" w:space="0" w:color="000000"/>
+            </w:tcBorders>
+            <w:tcMar>
+              <w:top w:w="80" w:type="dxa"/>
+              <w:left w:w="120" w:type="dxa"/>
+              <w:bottom w:w="80" w:type="dxa"/>
+              <w:right w:w="120" w:type="dxa"/>
+            </w:tcMar>
+          </w:tcPr>
+          <w:p>
+            <w:pPr>
+              <w:spacing w:line="320" w:lineRule="auto"/>
+            </w:pPr>
+            <w:r>
+              <w:t>Bcrypt hashing with a minimum work factor of 12 must be used to store all user passwords. HTTPS/TLS 1.2 or higher must be used for all data transport.</w:t>
+            </w:r>
+          </w:p>
+        </w:tc>
+        <w:tc>
+          <w:tcPr>
+            <w:tcW w:w="2443" w:type="dxa"/>
+            <w:tcBorders>
+              <w:top w:val="single" w:sz="4" w:space="0" w:color="000000"/>
+              <w:left w:val="single" w:sz="4" w:space="0" w:color="000000"/>
+              <w:bottom w:val="single" w:sz="4" w:space="0" w:color="000000"/>
+              <w:right w:val="single" w:sz="4" w:space="0" w:color="000000"/>
+            </w:tcBorders>
+            <w:tcMar>
+              <w:top w:w="80" w:type="dxa"/>
+              <w:left w:w="120" w:type="dxa"/>
+              <w:bottom w:w="80" w:type="dxa"/>
+              <w:right w:w="120" w:type="dxa"/>
+            </w:tcMar>
+          </w:tcPr>
+          <w:p>
+            <w:pPr>
+              <w:spacing w:line="320" w:lineRule="auto"/>
+            </w:pPr>
+            <w:r>
+              <w:t>prevents unwanted access to private home and account information (OWASP, 2021).</w:t>
+            </w:r>
+          </w:p>
+        </w:tc>
+      </w:tr>
+      <w:tr>
+        <w:tc>
+          <w:tcPr>
+            <w:tcW w:w="888" w:type="dxa"/>
+            <w:tcBorders>
+              <w:top w:val="single" w:sz="4" w:space="0" w:color="000000"/>
+              <w:left w:val="single" w:sz="4" w:space="0" w:color="000000"/>
+              <w:bottom w:val="single" w:sz="4" w:space="0" w:color="000000"/>
+              <w:right w:val="single" w:sz="4" w:space="0" w:color="000000"/>
+            </w:tcBorders>
+            <w:tcMar>
+              <w:top w:w="80" w:type="dxa"/>
+              <w:left w:w="120" w:type="dxa"/>
+              <w:bottom w:w="80" w:type="dxa"/>
+              <w:right w:w="120" w:type="dxa"/>
+            </w:tcMar>
+          </w:tcPr>
+          <w:p>
+            <w:pPr>
+              <w:spacing w:line="320" w:lineRule="auto"/>
+            </w:pPr>
+            <w:r>
+              <w:t>NFR04</w:t>
+            </w:r>
+          </w:p>
+        </w:tc>
+        <w:tc>
+          <w:tcPr>
+            <w:tcW w:w="1597" w:type="dxa"/>
+            <w:tcBorders>
+              <w:top w:val="single" w:sz="4" w:space="0" w:color="000000"/>
+              <w:left w:val="single" w:sz="4" w:space="0" w:color="000000"/>
+              <w:bottom w:val="single" w:sz="4" w:space="0" w:color="000000"/>
+              <w:right w:val="single" w:sz="4" w:space="0" w:color="000000"/>
+            </w:tcBorders>
+            <w:tcMar>
+              <w:top w:w="80" w:type="dxa"/>
+              <w:left w:w="120" w:type="dxa"/>
+              <w:bottom w:w="80" w:type="dxa"/>
+              <w:right w:w="120" w:type="dxa"/>
+            </w:tcMar>
+          </w:tcPr>
+          <w:p>
+            <w:pPr>
+              <w:spacing w:line="320" w:lineRule="auto"/>
+            </w:pPr>
+            <w:r>
+              <w:t>Reliability</w:t>
+            </w:r>
+          </w:p>
+        </w:tc>
+        <w:tc>
+          <w:tcPr>
+            <w:tcW w:w="4098" w:type="dxa"/>
+            <w:tcBorders>
+              <w:top w:val="single" w:sz="4" w:space="0" w:color="000000"/>
+              <w:left w:val="single" w:sz="4" w:space="0" w:color="000000"/>
+              <w:bottom w:val="single" w:sz="4" w:space="0" w:color="000000"/>
+              <w:right w:val="single" w:sz="4" w:space="0" w:color="000000"/>
+            </w:tcBorders>
+            <w:tcMar>
+              <w:top w:w="80" w:type="dxa"/>
+              <w:left w:w="120" w:type="dxa"/>
+              <w:bottom w:w="80" w:type="dxa"/>
+              <w:right w:w="120" w:type="dxa"/>
+            </w:tcMar>
+          </w:tcPr>
+          <w:p>
+            <w:pPr>
+              <w:spacing w:line="320" w:lineRule="auto"/>
+            </w:pPr>
+            <w:r>
+              <w:t>During peak hours, the system must maintain a minimum uptime of 99%. Error recovery messages must be included in all important operations.</w:t>
+            </w:r>
+          </w:p>
+        </w:tc>
+        <w:tc>
+          <w:tcPr>
+            <w:tcW w:w="2443" w:type="dxa"/>
+            <w:tcBorders>
+              <w:top w:val="single" w:sz="4" w:space="0" w:color="000000"/>
+              <w:left w:val="single" w:sz="4" w:space="0" w:color="000000"/>
+              <w:bottom w:val="single" w:sz="4" w:space="0" w:color="000000"/>
+              <w:right w:val="single" w:sz="4" w:space="0" w:color="000000"/>
+            </w:tcBorders>
+            <w:tcMar>
+              <w:top w:w="80" w:type="dxa"/>
+              <w:left w:w="120" w:type="dxa"/>
+              <w:bottom w:w="80" w:type="dxa"/>
+              <w:right w:w="120" w:type="dxa"/>
+            </w:tcMar>
+          </w:tcPr>
+          <w:p>
+            <w:pPr>
+              <w:spacing w:line="320" w:lineRule="auto"/>
+            </w:pPr>
+            <w:r>
+              <w:t>ensures that donation procedures and expiry alerts are always available.</w:t>
+            </w:r>
+          </w:p>
+        </w:tc>
+      </w:tr>
+      <w:tr>
+        <w:tc>
+          <w:tcPr>
+            <w:tcW w:w="888" w:type="dxa"/>
+            <w:tcBorders>
+              <w:top w:val="single" w:sz="4" w:space="0" w:color="000000"/>
+              <w:left w:val="single" w:sz="4" w:space="0" w:color="000000"/>
+              <w:bottom w:val="single" w:sz="4" w:space="0" w:color="000000"/>
+              <w:right w:val="single" w:sz="4" w:space="0" w:color="000000"/>
+            </w:tcBorders>
+            <w:tcMar>
+              <w:top w:w="80" w:type="dxa"/>
+              <w:left w:w="120" w:type="dxa"/>
+              <w:bottom w:w="80" w:type="dxa"/>
+              <w:right w:w="120" w:type="dxa"/>
+            </w:tcMar>
+          </w:tcPr>
+          <w:p>
+            <w:pPr>
+              <w:spacing w:line="320" w:lineRule="auto"/>
+            </w:pPr>
+            <w:r>
+              <w:t>NFR05</w:t>
+            </w:r>
+          </w:p>
+        </w:tc>
+        <w:tc>
+          <w:tcPr>
+            <w:tcW w:w="1597" w:type="dxa"/>
+            <w:tcBorders>
+              <w:top w:val="single" w:sz="4" w:space="0" w:color="000000"/>
+              <w:left w:val="single" w:sz="4" w:space="0" w:color="000000"/>
+              <w:bottom w:val="single" w:sz="4" w:space="0" w:color="000000"/>
+              <w:right w:val="single" w:sz="4" w:space="0" w:color="000000"/>
+            </w:tcBorders>
+            <w:tcMar>
+              <w:top w:w="80" w:type="dxa"/>
+              <w:left w:w="120" w:type="dxa"/>
+              <w:bottom w:w="80" w:type="dxa"/>
+              <w:right w:w="120" w:type="dxa"/>
+            </w:tcMar>
+          </w:tcPr>
+          <w:p>
+            <w:pPr>
+              <w:spacing w:line="320" w:lineRule="auto"/>
+            </w:pPr>
+            <w:r>
+              <w:t>Scalability</w:t>
+            </w:r>
+          </w:p>
+        </w:tc>
+        <w:tc>
+          <w:tcPr>
+            <w:tcW w:w="4098" w:type="dxa"/>
+            <w:tcBorders>
+              <w:top w:val="single" w:sz="4" w:space="0" w:color="000000"/>
+              <w:left w:val="single" w:sz="4" w:space="0" w:color="000000"/>
+              <w:bottom w:val="single" w:sz="4" w:space="0" w:color="000000"/>
+              <w:right w:val="single" w:sz="4" w:space="0" w:color="000000"/>
+            </w:tcBorders>
+            <w:tcMar>
+              <w:top w:w="80" w:type="dxa"/>
+              <w:left w:w="120" w:type="dxa"/>
+              <w:bottom w:w="80" w:type="dxa"/>
+              <w:right w:w="120" w:type="dxa"/>
+            </w:tcMar>
+          </w:tcPr>
+          <w:p>
+            <w:pPr>
+              <w:spacing w:line="320" w:lineRule="auto"/>
+            </w:pPr>
+            <w:r>
+              <w:t>The system architecture will be RESTful and modular, enabling the inclusion of more use cases without reorganizing the fundamental backend.</w:t>
+            </w:r>
+          </w:p>
+        </w:tc>
+        <w:tc>
+          <w:tcPr>
+            <w:tcW w:w="2443" w:type="dxa"/>
+            <w:tcBorders>
+              <w:top w:val="single" w:sz="4" w:space="0" w:color="000000"/>
+              <w:left w:val="single" w:sz="4" w:space="0" w:color="000000"/>
+              <w:bottom w:val="single" w:sz="4" w:space="0" w:color="000000"/>
+              <w:right w:val="single" w:sz="4" w:space="0" w:color="000000"/>
+            </w:tcBorders>
+            <w:tcMar>
+              <w:top w:w="80" w:type="dxa"/>
+              <w:left w:w="120" w:type="dxa"/>
+              <w:bottom w:w="80" w:type="dxa"/>
+              <w:right w:w="120" w:type="dxa"/>
+            </w:tcMar>
+          </w:tcPr>
+          <w:p>
+            <w:pPr>
+              <w:spacing w:line="320" w:lineRule="auto"/>
+            </w:pPr>
+            <w:r>
+              <w:t>encourages progressive and iterative future improvement (Beck et al., 2001).</w:t>
+            </w:r>
+          </w:p>
+        </w:tc>
+      </w:tr>
+      <w:tr>
+        <w:tc>
+          <w:tcPr>
+            <w:tcW w:w="888" w:type="dxa"/>
+            <w:tcBorders>
+              <w:top w:val="single" w:sz="4" w:space="0" w:color="000000"/>
+              <w:left w:val="single" w:sz="4" w:space="0" w:color="000000"/>
+              <w:bottom w:val="single" w:sz="4" w:space="0" w:color="000000"/>
+              <w:right w:val="single" w:sz="4" w:space="0" w:color="000000"/>
+            </w:tcBorders>
+            <w:tcMar>
+              <w:top w:w="80" w:type="dxa"/>
+              <w:left w:w="120" w:type="dxa"/>
+              <w:bottom w:w="80" w:type="dxa"/>
+              <w:right w:w="120" w:type="dxa"/>
+            </w:tcMar>
+          </w:tcPr>
+          <w:p>
+            <w:pPr>
+              <w:spacing w:line="320" w:lineRule="auto"/>
+            </w:pPr>
+            <w:r>
+              <w:t>NFR06</w:t>
+            </w:r>
+          </w:p>
+        </w:tc>
+        <w:tc>
+          <w:tcPr>
+            <w:tcW w:w="1597" w:type="dxa"/>
+            <w:tcBorders>
+              <w:top w:val="single" w:sz="4" w:space="0" w:color="000000"/>
+              <w:left w:val="single" w:sz="4" w:space="0" w:color="000000"/>
+              <w:bottom w:val="single" w:sz="4" w:space="0" w:color="000000"/>
+              <w:right w:val="single" w:sz="4" w:space="0" w:color="000000"/>
+            </w:tcBorders>
+            <w:tcMar>
+              <w:top w:w="80" w:type="dxa"/>
+              <w:left w:w="120" w:type="dxa"/>
+              <w:bottom w:w="80" w:type="dxa"/>
+              <w:right w:w="120" w:type="dxa"/>
+            </w:tcMar>
+          </w:tcPr>
+          <w:p>
+            <w:pPr>
+              <w:spacing w:line="320" w:lineRule="auto"/>
+            </w:pPr>
+            <w:r>
+              <w:t>Maintainability</w:t>
+            </w:r>
+          </w:p>
+        </w:tc>
+        <w:tc>
+          <w:tcPr>
+            <w:tcW w:w="4098" w:type="dxa"/>
+            <w:tcBorders>
+              <w:top w:val="single" w:sz="4" w:space="0" w:color="000000"/>
+              <w:left w:val="single" w:sz="4" w:space="0" w:color="000000"/>
+              <w:bottom w:val="single" w:sz="4" w:space="0" w:color="000000"/>
+              <w:right w:val="single" w:sz="4" w:space="0" w:color="000000"/>
+            </w:tcBorders>
+            <w:tcMar>
+              <w:top w:w="80" w:type="dxa"/>
+              <w:left w:w="120" w:type="dxa"/>
+              <w:bottom w:w="80" w:type="dxa"/>
+              <w:right w:w="120" w:type="dxa"/>
+            </w:tcMar>
+          </w:tcPr>
+          <w:p>
+            <w:pPr>
+              <w:spacing w:line="320" w:lineRule="auto"/>
+            </w:pPr>
+            <w:r>
+              <w:t>The codebase will have inline documentation and adhere to standard programming principles. OpenAPI/Swagger must be used to document all API routes.</w:t>
+            </w:r>
+          </w:p>
+        </w:tc>
+        <w:tc>
+          <w:tcPr>
+            <w:tcW w:w="2443" w:type="dxa"/>
+            <w:tcBorders>
+              <w:top w:val="single" w:sz="4" w:space="0" w:color="000000"/>
+              <w:left w:val="single" w:sz="4" w:space="0" w:color="000000"/>
+              <w:bottom w:val="single" w:sz="4" w:space="0" w:color="000000"/>
+              <w:right w:val="single" w:sz="4" w:space="0" w:color="000000"/>
+            </w:tcBorders>
+            <w:tcMar>
+              <w:top w:w="80" w:type="dxa"/>
+              <w:left w:w="120" w:type="dxa"/>
+              <w:bottom w:w="80" w:type="dxa"/>
+              <w:right w:w="120" w:type="dxa"/>
+            </w:tcMar>
+          </w:tcPr>
+          <w:p>
+            <w:pPr>
+              <w:spacing w:line="320" w:lineRule="auto"/>
+            </w:pPr>
+            <w:r>
+              <w:t>lowers the team's technical debt and encourages long-term upkeep.</w:t>
+            </w:r>
+          </w:p>
+        </w:tc>
+      </w:tr>
+      <w:tr>
+        <w:tc>
+          <w:tcPr>
+            <w:tcW w:w="888" w:type="dxa"/>
+            <w:tcBorders>
+              <w:top w:val="single" w:sz="4" w:space="0" w:color="000000"/>
+              <w:left w:val="single" w:sz="4" w:space="0" w:color="000000"/>
+              <w:bottom w:val="single" w:sz="4" w:space="0" w:color="000000"/>
+              <w:right w:val="single" w:sz="4" w:space="0" w:color="000000"/>
+            </w:tcBorders>
+            <w:tcMar>
+              <w:top w:w="80" w:type="dxa"/>
+              <w:left w:w="120" w:type="dxa"/>
+              <w:bottom w:w="80" w:type="dxa"/>
+              <w:right w:w="120" w:type="dxa"/>
+            </w:tcMar>
+          </w:tcPr>
+          <w:p>
+            <w:pPr>
+              <w:spacing w:line="320" w:lineRule="auto"/>
+            </w:pPr>
+            <w:r>
+              <w:t>NFR07</w:t>
+            </w:r>
+          </w:p>
+        </w:tc>
+        <w:tc>
+          <w:tcPr>
+            <w:tcW w:w="1597" w:type="dxa"/>
+            <w:tcBorders>
+              <w:top w:val="single" w:sz="4" w:space="0" w:color="000000"/>
+              <w:left w:val="single" w:sz="4" w:space="0" w:color="000000"/>
+              <w:bottom w:val="single" w:sz="4" w:space="0" w:color="000000"/>
+              <w:right w:val="single" w:sz="4" w:space="0" w:color="000000"/>
+            </w:tcBorders>
+            <w:tcMar>
+              <w:top w:w="80" w:type="dxa"/>
+              <w:left w:w="120" w:type="dxa"/>
+              <w:bottom w:w="80" w:type="dxa"/>
+              <w:right w:w="120" w:type="dxa"/>
+            </w:tcMar>
+          </w:tcPr>
+          <w:p>
+            <w:pPr>
+              <w:spacing w:line="320" w:lineRule="auto"/>
+            </w:pPr>
+            <w:r>
+              <w:t>Compatibility</w:t>
+            </w:r>
+          </w:p>
+        </w:tc>
+        <w:tc>
+          <w:tcPr>
+            <w:tcW w:w="4098" w:type="dxa"/>
+            <w:tcBorders>
+              <w:top w:val="single" w:sz="4" w:space="0" w:color="000000"/>
+              <w:left w:val="single" w:sz="4" w:space="0" w:color="000000"/>
+              <w:bottom w:val="single" w:sz="4" w:space="0" w:color="000000"/>
+              <w:right w:val="single" w:sz="4" w:space="0" w:color="000000"/>
+            </w:tcBorders>
+            <w:tcMar>
+              <w:top w:w="80" w:type="dxa"/>
+              <w:left w:w="120" w:type="dxa"/>
+              <w:bottom w:w="80" w:type="dxa"/>
+              <w:right w:w="120" w:type="dxa"/>
+            </w:tcMar>
+          </w:tcPr>
+          <w:p>
+            <w:pPr>
+              <w:spacing w:line="320" w:lineRule="auto"/>
+            </w:pPr>
+            <w:r>
+              <w:t>The web application must work well on Windows 11 with the most recent versions of Mozilla Firefox and Google Chrome.</w:t>
+            </w:r>
+          </w:p>
+        </w:tc>
+        <w:tc>
+          <w:tcPr>
+            <w:tcW w:w="2443" w:type="dxa"/>
+            <w:tcBorders>
+              <w:top w:val="single" w:sz="4" w:space="0" w:color="000000"/>
+              <w:left w:val="single" w:sz="4" w:space="0" w:color="000000"/>
+              <w:bottom w:val="single" w:sz="4" w:space="0" w:color="000000"/>
+              <w:right w:val="single" w:sz="4" w:space="0" w:color="000000"/>
+            </w:tcBorders>
+            <w:tcMar>
+              <w:top w:w="80" w:type="dxa"/>
+              <w:left w:w="120" w:type="dxa"/>
+              <w:bottom w:w="80" w:type="dxa"/>
+              <w:right w:w="120" w:type="dxa"/>
+            </w:tcMar>
+          </w:tcPr>
+          <w:p>
+            <w:pPr>
+              <w:spacing w:line="320" w:lineRule="auto"/>
+            </w:pPr>
+            <w:r>
+              <w:t>corresponds with the platform for demonstration outlined in Task 1.</w:t>
+            </w:r>
+          </w:p>
+        </w:tc>
+      </w:tr>
+      <w:tr>
+        <w:tc>
+          <w:tcPr>
+            <w:tcW w:w="888" w:type="dxa"/>
+            <w:tcBorders>
+              <w:top w:val="single" w:sz="4" w:space="0" w:color="000000"/>
+              <w:left w:val="single" w:sz="4" w:space="0" w:color="000000"/>
+              <w:bottom w:val="single" w:sz="4" w:space="0" w:color="000000"/>
+              <w:right w:val="single" w:sz="4" w:space="0" w:color="000000"/>
+            </w:tcBorders>
+            <w:tcMar>
+              <w:top w:w="80" w:type="dxa"/>
+              <w:left w:w="120" w:type="dxa"/>
+              <w:bottom w:w="80" w:type="dxa"/>
+              <w:right w:w="120" w:type="dxa"/>
+            </w:tcMar>
+          </w:tcPr>
+          <w:p>
+            <w:pPr>
+              <w:spacing w:line="320" w:lineRule="auto"/>
+            </w:pPr>
+            <w:r>
+              <w:t>NFR08</w:t>
+            </w:r>
+          </w:p>
+        </w:tc>
+        <w:tc>
+          <w:tcPr>
+            <w:tcW w:w="1597" w:type="dxa"/>
+            <w:tcBorders>
+              <w:top w:val="single" w:sz="4" w:space="0" w:color="000000"/>
+              <w:left w:val="single" w:sz="4" w:space="0" w:color="000000"/>
+              <w:bottom w:val="single" w:sz="4" w:space="0" w:color="000000"/>
+              <w:right w:val="single" w:sz="4" w:space="0" w:color="000000"/>
+            </w:tcBorders>
+            <w:tcMar>
+              <w:top w:w="80" w:type="dxa"/>
+              <w:left w:w="120" w:type="dxa"/>
+              <w:bottom w:w="80" w:type="dxa"/>
+              <w:right w:w="120" w:type="dxa"/>
+            </w:tcMar>
+          </w:tcPr>
+          <w:p>
+            <w:pPr>
+              <w:spacing w:line="320" w:lineRule="auto"/>
+            </w:pPr>
+            <w:r>
+              <w:t>Accessibility</w:t>
+            </w:r>
+          </w:p>
+        </w:tc>
+        <w:tc>
+          <w:tcPr>
+            <w:tcW w:w="4098" w:type="dxa"/>
+            <w:tcBorders>
+              <w:top w:val="single" w:sz="4" w:space="0" w:color="000000"/>
+              <w:left w:val="single" w:sz="4" w:space="0" w:color="000000"/>
+              <w:bottom w:val="single" w:sz="4" w:space="0" w:color="000000"/>
+              <w:right w:val="single" w:sz="4" w:space="0" w:color="000000"/>
+            </w:tcBorders>
+            <w:tcMar>
+              <w:top w:w="80" w:type="dxa"/>
+              <w:left w:w="120" w:type="dxa"/>
+              <w:bottom w:w="80" w:type="dxa"/>
+              <w:right w:w="120" w:type="dxa"/>
+            </w:tcMar>
+          </w:tcPr>
+          <w:p>
+            <w:pPr>
+              <w:spacing w:line="320" w:lineRule="auto"/>
+            </w:pPr>
+            <w:r>
+              <w:t>The user interface must adhere to WCAG 2.1 Level AA standards for keyboard navigability and color contrast.</w:t>
+            </w:r>
+          </w:p>
+        </w:tc>
+        <w:tc>
+          <w:tcPr>
+            <w:tcW w:w="2443" w:type="dxa"/>
+            <w:tcBorders>
+              <w:top w:val="single" w:sz="4" w:space="0" w:color="000000"/>
+              <w:left w:val="single" w:sz="4" w:space="0" w:color="000000"/>
+              <w:bottom w:val="single" w:sz="4" w:space="0" w:color="000000"/>
+              <w:right w:val="single" w:sz="4" w:space="0" w:color="000000"/>
+            </w:tcBorders>
+            <w:tcMar>
+              <w:top w:w="80" w:type="dxa"/>
+              <w:left w:w="120" w:type="dxa"/>
+              <w:bottom w:w="80" w:type="dxa"/>
+              <w:right w:w="120" w:type="dxa"/>
+            </w:tcMar>
+          </w:tcPr>
+          <w:p>
+            <w:pPr>
+              <w:spacing w:line="320" w:lineRule="auto"/>
+            </w:pPr>
+            <w:r>
+              <w:t>guarantees that users with different abilities may use the application.</w:t>
+            </w:r>
+          </w:p>
+        </w:tc>
+      </w:tr>
+    </w:tbl>
+    <w:p>
+      <w:pPr>
+        <w:spacing w:before="60" w:after="120"/>
+        <w:jc w:val="center"/>
+      </w:pPr>
+      <w:r>
+        <w:t>Table 2: Non-Functional Requirements</w:t>
+      </w:r>
+    </w:p>
+    <w:p>
+      <w:r>
+        <w:br w:type="page"/>
+      </w:r>
+    </w:p>
+    <w:p/>
     <w:sectPr>
       <w:pgSz w:w="12240" w:h="15840"/>
       <w:pgMar w:top="1440" w:right="1440" w:bottom="1440" w:left="1440" w:header="720" w:footer="720" w:gutter="0"/>
@@ -232,8 +3324,8 @@
   </w:docDefaults>
   <w:latentStyles w:defLockedState="0" w:defUIPriority="99" w:defSemiHidden="0" w:defUnhideWhenUsed="0" w:defQFormat="0" w:count="371">
     <w:lsdException w:name="Normal" w:uiPriority="0" w:qFormat="1"/>
-    <w:lsdException w:name="heading 1" w:uiPriority="9" w:qFormat="1"/>
-    <w:lsdException w:name="heading 2" w:semiHidden="1" w:uiPriority="9" w:unhideWhenUsed="1" w:qFormat="1"/>
+    <w:lsdException w:name="heading 1" w:uiPriority="0" w:qFormat="1"/>
+    <w:lsdException w:name="heading 2" w:semiHidden="1" w:uiPriority="0" w:unhideWhenUsed="1" w:qFormat="1"/>
     <w:lsdException w:name="heading 3" w:semiHidden="1" w:uiPriority="9" w:unhideWhenUsed="1" w:qFormat="1"/>
     <w:lsdException w:name="heading 4" w:semiHidden="1" w:uiPriority="9" w:unhideWhenUsed="1" w:qFormat="1"/>
     <w:lsdException w:name="heading 5" w:semiHidden="1" w:uiPriority="9" w:unhideWhenUsed="1" w:qFormat="1"/>
@@ -607,6 +3699,60 @@
     <w:name w:val="Normal"/>
     <w:qFormat/>
   </w:style>
+  <w:style w:type="paragraph" w:styleId="Heading1">
+    <w:name w:val="heading 1"/>
+    <w:basedOn w:val="Normal"/>
+    <w:next w:val="Normal"/>
+    <w:link w:val="Heading1Char"/>
+    <w:rsid w:val="0075621B"/>
+    <w:pPr>
+      <w:pBdr>
+        <w:top w:val="nil"/>
+        <w:left w:val="nil"/>
+        <w:bottom w:val="nil"/>
+        <w:right w:val="nil"/>
+        <w:between w:val="nil"/>
+      </w:pBdr>
+      <w:spacing w:before="360" w:after="240" w:line="240" w:lineRule="auto"/>
+      <w:outlineLvl w:val="0"/>
+    </w:pPr>
+    <w:rPr>
+      <w:rFonts w:ascii="Times New Roman" w:eastAsia="Times New Roman" w:hAnsi="Times New Roman" w:cs="Times New Roman"/>
+      <w:b/>
+      <w:bCs/>
+      <w:color w:val="000000"/>
+      <w:sz w:val="32"/>
+      <w:szCs w:val="32"/>
+      <w:lang w:val="en"/>
+    </w:rPr>
+  </w:style>
+  <w:style w:type="paragraph" w:styleId="Heading2">
+    <w:name w:val="heading 2"/>
+    <w:basedOn w:val="Normal"/>
+    <w:next w:val="Normal"/>
+    <w:link w:val="Heading2Char"/>
+    <w:rsid w:val="0075621B"/>
+    <w:pPr>
+      <w:pBdr>
+        <w:top w:val="nil"/>
+        <w:left w:val="nil"/>
+        <w:bottom w:val="nil"/>
+        <w:right w:val="nil"/>
+        <w:between w:val="nil"/>
+      </w:pBdr>
+      <w:spacing w:before="280" w:line="240" w:lineRule="auto"/>
+      <w:outlineLvl w:val="1"/>
+    </w:pPr>
+    <w:rPr>
+      <w:rFonts w:ascii="Times New Roman" w:eastAsia="Times New Roman" w:hAnsi="Times New Roman" w:cs="Times New Roman"/>
+      <w:b/>
+      <w:bCs/>
+      <w:color w:val="000000"/>
+      <w:sz w:val="28"/>
+      <w:szCs w:val="28"/>
+      <w:lang w:val="en"/>
+    </w:rPr>
+  </w:style>
   <w:style w:type="character" w:default="1" w:styleId="DefaultParagraphFont">
     <w:name w:val="Default Paragraph Font"/>
     <w:uiPriority w:val="1"/>
@@ -633,6 +3779,36 @@
     <w:uiPriority w:val="99"/>
     <w:semiHidden/>
     <w:unhideWhenUsed/>
+  </w:style>
+  <w:style w:type="character" w:customStyle="1" w:styleId="Heading1Char">
+    <w:name w:val="Heading 1 Char"/>
+    <w:basedOn w:val="DefaultParagraphFont"/>
+    <w:link w:val="Heading1"/>
+    <w:rsid w:val="0075621B"/>
+    <w:rPr>
+      <w:rFonts w:ascii="Times New Roman" w:eastAsia="Times New Roman" w:hAnsi="Times New Roman" w:cs="Times New Roman"/>
+      <w:b/>
+      <w:bCs/>
+      <w:color w:val="000000"/>
+      <w:sz w:val="32"/>
+      <w:szCs w:val="32"/>
+      <w:lang w:val="en"/>
+    </w:rPr>
+  </w:style>
+  <w:style w:type="character" w:customStyle="1" w:styleId="Heading2Char">
+    <w:name w:val="Heading 2 Char"/>
+    <w:basedOn w:val="DefaultParagraphFont"/>
+    <w:link w:val="Heading2"/>
+    <w:rsid w:val="0075621B"/>
+    <w:rPr>
+      <w:rFonts w:ascii="Times New Roman" w:eastAsia="Times New Roman" w:hAnsi="Times New Roman" w:cs="Times New Roman"/>
+      <w:b/>
+      <w:bCs/>
+      <w:color w:val="000000"/>
+      <w:sz w:val="28"/>
+      <w:szCs w:val="28"/>
+      <w:lang w:val="en"/>
+    </w:rPr>
   </w:style>
 </w:styles>
 </file>

</xml_diff>

<commit_message>
Added Requirements modeling - user stories
</commit_message>
<xml_diff>
--- a/BIT 216 Assignment 1 (Task 2).docx
+++ b/BIT 216 Assignment 1 (Task 2).docx
@@ -233,7 +233,7 @@
         <w:jc w:val="both"/>
       </w:pPr>
       <w:r>
-        <w:t>Here's a condensed version that maintains the main points and is still fit for an academic paper:---Food waste is an escalating global problem mainly due to improper management of household food inventory, overlooking food expiry dates, and minimal chances for food donations (Food and Agriculture Organization [FAO], 2019).</w:t>
+        <w:t>Food waste is an escalating global problem mainly due to improper management of household food inventory, overlooking food expiry dates, and minimal chances for food donations (Food and Agriculture Organization [FAO], 2019).</w:t>
       </w:r>
     </w:p>
     <w:p>
@@ -308,12 +308,7 @@
         <w:jc w:val="both"/>
       </w:pPr>
       <w:r>
-        <w:t>Functional requirements are the features, behaviours and interactions that a system should be able to carry out (Pressman &amp; Maxim, 2020). The table below lists the functional requirements for SavePlate, which have been identified based on six use cases set out in the common case study. The requirements are ordered as the MoS</w:t>
-      </w:r>
-      <w:bookmarkStart w:id="3" w:name="_GoBack"/>
-      <w:bookmarkEnd w:id="3"/>
-      <w:r>
-        <w:t>CoW prioritisation method (Agile Business Consortium, 2014).</w:t>
+        <w:t>Functional requirements are the features, behaviours and interactions that a system should be able to carry out (Pressman &amp; Maxim, 2020). The table below lists the functional requirements for SavePlate, which have been identified based on six use cases set out in the common case study. The requirements are ordered as the MoSCoW prioritisation method (Agile Business Consortium, 2014).</w:t>
       </w:r>
     </w:p>
     <w:tbl>
@@ -2310,8 +2305,8 @@
         <w:pStyle w:val="Heading2"/>
         <w:spacing w:before="200" w:after="100"/>
       </w:pPr>
-      <w:bookmarkStart w:id="4" w:name="_heading=h.px27ofghanb6" w:colFirst="0" w:colLast="0"/>
-      <w:bookmarkEnd w:id="4"/>
+      <w:bookmarkStart w:id="3" w:name="_heading=h.px27ofghanb6" w:colFirst="0" w:colLast="0"/>
+      <w:bookmarkEnd w:id="3"/>
       <w:r>
         <w:t>2.2  Non-Functional Requirements</w:t>
       </w:r>
@@ -3295,6 +3290,32 @@
       </w:r>
     </w:p>
     <w:p/>
+    <w:p>
+      <w:pPr>
+        <w:pStyle w:val="Heading1"/>
+        <w:spacing w:before="240" w:after="120"/>
+      </w:pPr>
+      <w:bookmarkStart w:id="4" w:name="_heading=h.d053yaq2p2nl" w:colFirst="0" w:colLast="0"/>
+      <w:bookmarkEnd w:id="4"/>
+      <w:r>
+        <w:t>3.0  Requirements Modelling – User Stories</w:t>
+      </w:r>
+    </w:p>
+    <w:p>
+      <w:pPr>
+        <w:spacing w:after="120" w:line="360" w:lineRule="auto"/>
+        <w:jc w:val="both"/>
+      </w:pPr>
+      <w:r>
+        <w:t>Here we introduce the requirements model for the SavePlate project. We adopted the Epic–User Story–Acceptance Criteria–Tasks structure (Cohn, 2004) to write the permalinks. Each person in the team has been given responsibility for two use cases with which to work out unique user stories. The user stories followed the classic format: Role capability result (as a [user role] I need to have [the ability to do something] so that I can [benefit]). Acceptance criteria are formulated in the Given–When–Then style of writing. Stories get labeled with MoSCoW priority levels as the guidelines of the Agile Business Consortium (2014).</w:t>
+      </w:r>
+      <w:bookmarkStart w:id="5" w:name="_GoBack"/>
+      <w:bookmarkEnd w:id="5"/>
+      <w:r>
+        <w:t xml:space="preserve"> </w:t>
+      </w:r>
+    </w:p>
+    <w:p/>
     <w:sectPr>
       <w:pgSz w:w="12240" w:h="15840"/>
       <w:pgMar w:top="1440" w:right="1440" w:bottom="1440" w:left="1440" w:header="720" w:footer="720" w:gutter="0"/>
@@ -3303,6 +3324,707 @@
     </w:sectPr>
   </w:body>
 </w:document>
+</file>
+
+<file path=word/numbering.xml><?xml version="1.0" encoding="utf-8"?>
+<w:numbering xmlns:wpc="http://schemas.microsoft.com/office/word/2010/wordprocessingCanvas" xmlns:cx="http://schemas.microsoft.com/office/drawing/2014/chartex" xmlns:mc="http://schemas.openxmlformats.org/markup-compatibility/2006" xmlns:o="urn:schemas-microsoft-com:office:office" xmlns:r="http://schemas.openxmlformats.org/officeDocument/2006/relationships" xmlns:m="http://schemas.openxmlformats.org/officeDocument/2006/math" xmlns:v="urn:schemas-microsoft-com:vml" xmlns:wp14="http://schemas.microsoft.com/office/word/2010/wordprocessingDrawing" xmlns:wp="http://schemas.openxmlformats.org/drawingml/2006/wordprocessingDrawing" xmlns:w10="urn:schemas-microsoft-com:office:word" xmlns:w="http://schemas.openxmlformats.org/wordprocessingml/2006/main" xmlns:w14="http://schemas.microsoft.com/office/word/2010/wordml" xmlns:w15="http://schemas.microsoft.com/office/word/2012/wordml" xmlns:w16se="http://schemas.microsoft.com/office/word/2015/wordml/symex" xmlns:wpg="http://schemas.microsoft.com/office/word/2010/wordprocessingGroup" xmlns:wpi="http://schemas.microsoft.com/office/word/2010/wordprocessingInk" xmlns:wne="http://schemas.microsoft.com/office/word/2006/wordml" xmlns:wps="http://schemas.microsoft.com/office/word/2010/wordprocessingShape" mc:Ignorable="w14 w15 w16se wp14">
+  <w:abstractNum w:abstractNumId="0" w15:restartNumberingAfterBreak="0">
+    <w:nsid w:val="00641E6D"/>
+    <w:multiLevelType w:val="multilevel"/>
+    <w:tmpl w:val="F9E6A49C"/>
+    <w:lvl w:ilvl="0">
+      <w:start w:val="1"/>
+      <w:numFmt w:val="decimal"/>
+      <w:lvlText w:val="%1."/>
+      <w:lvlJc w:val="left"/>
+      <w:pPr>
+        <w:ind w:left="720" w:hanging="360"/>
+      </w:pPr>
+      <w:rPr>
+        <w:u w:val="none"/>
+      </w:rPr>
+    </w:lvl>
+    <w:lvl w:ilvl="1">
+      <w:start w:val="1"/>
+      <w:numFmt w:val="lowerLetter"/>
+      <w:lvlText w:val="%2."/>
+      <w:lvlJc w:val="left"/>
+      <w:pPr>
+        <w:ind w:left="1440" w:hanging="360"/>
+      </w:pPr>
+      <w:rPr>
+        <w:u w:val="none"/>
+      </w:rPr>
+    </w:lvl>
+    <w:lvl w:ilvl="2">
+      <w:start w:val="1"/>
+      <w:numFmt w:val="lowerRoman"/>
+      <w:lvlText w:val="%3."/>
+      <w:lvlJc w:val="right"/>
+      <w:pPr>
+        <w:ind w:left="2160" w:hanging="360"/>
+      </w:pPr>
+      <w:rPr>
+        <w:u w:val="none"/>
+      </w:rPr>
+    </w:lvl>
+    <w:lvl w:ilvl="3">
+      <w:start w:val="1"/>
+      <w:numFmt w:val="decimal"/>
+      <w:lvlText w:val="%4."/>
+      <w:lvlJc w:val="left"/>
+      <w:pPr>
+        <w:ind w:left="2880" w:hanging="360"/>
+      </w:pPr>
+      <w:rPr>
+        <w:u w:val="none"/>
+      </w:rPr>
+    </w:lvl>
+    <w:lvl w:ilvl="4">
+      <w:start w:val="1"/>
+      <w:numFmt w:val="lowerLetter"/>
+      <w:lvlText w:val="%5."/>
+      <w:lvlJc w:val="left"/>
+      <w:pPr>
+        <w:ind w:left="3600" w:hanging="360"/>
+      </w:pPr>
+      <w:rPr>
+        <w:u w:val="none"/>
+      </w:rPr>
+    </w:lvl>
+    <w:lvl w:ilvl="5">
+      <w:start w:val="1"/>
+      <w:numFmt w:val="lowerRoman"/>
+      <w:lvlText w:val="%6."/>
+      <w:lvlJc w:val="right"/>
+      <w:pPr>
+        <w:ind w:left="4320" w:hanging="360"/>
+      </w:pPr>
+      <w:rPr>
+        <w:u w:val="none"/>
+      </w:rPr>
+    </w:lvl>
+    <w:lvl w:ilvl="6">
+      <w:start w:val="1"/>
+      <w:numFmt w:val="decimal"/>
+      <w:lvlText w:val="%7."/>
+      <w:lvlJc w:val="left"/>
+      <w:pPr>
+        <w:ind w:left="5040" w:hanging="360"/>
+      </w:pPr>
+      <w:rPr>
+        <w:u w:val="none"/>
+      </w:rPr>
+    </w:lvl>
+    <w:lvl w:ilvl="7">
+      <w:start w:val="1"/>
+      <w:numFmt w:val="lowerLetter"/>
+      <w:lvlText w:val="%8."/>
+      <w:lvlJc w:val="left"/>
+      <w:pPr>
+        <w:ind w:left="5760" w:hanging="360"/>
+      </w:pPr>
+      <w:rPr>
+        <w:u w:val="none"/>
+      </w:rPr>
+    </w:lvl>
+    <w:lvl w:ilvl="8">
+      <w:start w:val="1"/>
+      <w:numFmt w:val="lowerRoman"/>
+      <w:lvlText w:val="%9."/>
+      <w:lvlJc w:val="right"/>
+      <w:pPr>
+        <w:ind w:left="6480" w:hanging="360"/>
+      </w:pPr>
+      <w:rPr>
+        <w:u w:val="none"/>
+      </w:rPr>
+    </w:lvl>
+  </w:abstractNum>
+  <w:abstractNum w:abstractNumId="1" w15:restartNumberingAfterBreak="0">
+    <w:nsid w:val="0D2B648C"/>
+    <w:multiLevelType w:val="multilevel"/>
+    <w:tmpl w:val="5950AC0E"/>
+    <w:lvl w:ilvl="0">
+      <w:start w:val="1"/>
+      <w:numFmt w:val="decimal"/>
+      <w:lvlText w:val="%1."/>
+      <w:lvlJc w:val="left"/>
+      <w:pPr>
+        <w:ind w:left="720" w:hanging="360"/>
+      </w:pPr>
+      <w:rPr>
+        <w:u w:val="none"/>
+      </w:rPr>
+    </w:lvl>
+    <w:lvl w:ilvl="1">
+      <w:start w:val="1"/>
+      <w:numFmt w:val="lowerLetter"/>
+      <w:lvlText w:val="%2."/>
+      <w:lvlJc w:val="left"/>
+      <w:pPr>
+        <w:ind w:left="1440" w:hanging="360"/>
+      </w:pPr>
+      <w:rPr>
+        <w:u w:val="none"/>
+      </w:rPr>
+    </w:lvl>
+    <w:lvl w:ilvl="2">
+      <w:start w:val="1"/>
+      <w:numFmt w:val="lowerRoman"/>
+      <w:lvlText w:val="%3."/>
+      <w:lvlJc w:val="right"/>
+      <w:pPr>
+        <w:ind w:left="2160" w:hanging="360"/>
+      </w:pPr>
+      <w:rPr>
+        <w:u w:val="none"/>
+      </w:rPr>
+    </w:lvl>
+    <w:lvl w:ilvl="3">
+      <w:start w:val="1"/>
+      <w:numFmt w:val="decimal"/>
+      <w:lvlText w:val="%4."/>
+      <w:lvlJc w:val="left"/>
+      <w:pPr>
+        <w:ind w:left="2880" w:hanging="360"/>
+      </w:pPr>
+      <w:rPr>
+        <w:u w:val="none"/>
+      </w:rPr>
+    </w:lvl>
+    <w:lvl w:ilvl="4">
+      <w:start w:val="1"/>
+      <w:numFmt w:val="lowerLetter"/>
+      <w:lvlText w:val="%5."/>
+      <w:lvlJc w:val="left"/>
+      <w:pPr>
+        <w:ind w:left="3600" w:hanging="360"/>
+      </w:pPr>
+      <w:rPr>
+        <w:u w:val="none"/>
+      </w:rPr>
+    </w:lvl>
+    <w:lvl w:ilvl="5">
+      <w:start w:val="1"/>
+      <w:numFmt w:val="lowerRoman"/>
+      <w:lvlText w:val="%6."/>
+      <w:lvlJc w:val="right"/>
+      <w:pPr>
+        <w:ind w:left="4320" w:hanging="360"/>
+      </w:pPr>
+      <w:rPr>
+        <w:u w:val="none"/>
+      </w:rPr>
+    </w:lvl>
+    <w:lvl w:ilvl="6">
+      <w:start w:val="1"/>
+      <w:numFmt w:val="decimal"/>
+      <w:lvlText w:val="%7."/>
+      <w:lvlJc w:val="left"/>
+      <w:pPr>
+        <w:ind w:left="5040" w:hanging="360"/>
+      </w:pPr>
+      <w:rPr>
+        <w:u w:val="none"/>
+      </w:rPr>
+    </w:lvl>
+    <w:lvl w:ilvl="7">
+      <w:start w:val="1"/>
+      <w:numFmt w:val="lowerLetter"/>
+      <w:lvlText w:val="%8."/>
+      <w:lvlJc w:val="left"/>
+      <w:pPr>
+        <w:ind w:left="5760" w:hanging="360"/>
+      </w:pPr>
+      <w:rPr>
+        <w:u w:val="none"/>
+      </w:rPr>
+    </w:lvl>
+    <w:lvl w:ilvl="8">
+      <w:start w:val="1"/>
+      <w:numFmt w:val="lowerRoman"/>
+      <w:lvlText w:val="%9."/>
+      <w:lvlJc w:val="right"/>
+      <w:pPr>
+        <w:ind w:left="6480" w:hanging="360"/>
+      </w:pPr>
+      <w:rPr>
+        <w:u w:val="none"/>
+      </w:rPr>
+    </w:lvl>
+  </w:abstractNum>
+  <w:abstractNum w:abstractNumId="2" w15:restartNumberingAfterBreak="0">
+    <w:nsid w:val="21C94EFE"/>
+    <w:multiLevelType w:val="multilevel"/>
+    <w:tmpl w:val="3AE60A9E"/>
+    <w:lvl w:ilvl="0">
+      <w:start w:val="1"/>
+      <w:numFmt w:val="decimal"/>
+      <w:lvlText w:val="%1."/>
+      <w:lvlJc w:val="left"/>
+      <w:pPr>
+        <w:ind w:left="720" w:hanging="360"/>
+      </w:pPr>
+      <w:rPr>
+        <w:u w:val="none"/>
+      </w:rPr>
+    </w:lvl>
+    <w:lvl w:ilvl="1">
+      <w:start w:val="1"/>
+      <w:numFmt w:val="lowerLetter"/>
+      <w:lvlText w:val="%2."/>
+      <w:lvlJc w:val="left"/>
+      <w:pPr>
+        <w:ind w:left="1440" w:hanging="360"/>
+      </w:pPr>
+      <w:rPr>
+        <w:u w:val="none"/>
+      </w:rPr>
+    </w:lvl>
+    <w:lvl w:ilvl="2">
+      <w:start w:val="1"/>
+      <w:numFmt w:val="lowerRoman"/>
+      <w:lvlText w:val="%3."/>
+      <w:lvlJc w:val="right"/>
+      <w:pPr>
+        <w:ind w:left="2160" w:hanging="360"/>
+      </w:pPr>
+      <w:rPr>
+        <w:u w:val="none"/>
+      </w:rPr>
+    </w:lvl>
+    <w:lvl w:ilvl="3">
+      <w:start w:val="1"/>
+      <w:numFmt w:val="decimal"/>
+      <w:lvlText w:val="%4."/>
+      <w:lvlJc w:val="left"/>
+      <w:pPr>
+        <w:ind w:left="2880" w:hanging="360"/>
+      </w:pPr>
+      <w:rPr>
+        <w:u w:val="none"/>
+      </w:rPr>
+    </w:lvl>
+    <w:lvl w:ilvl="4">
+      <w:start w:val="1"/>
+      <w:numFmt w:val="lowerLetter"/>
+      <w:lvlText w:val="%5."/>
+      <w:lvlJc w:val="left"/>
+      <w:pPr>
+        <w:ind w:left="3600" w:hanging="360"/>
+      </w:pPr>
+      <w:rPr>
+        <w:u w:val="none"/>
+      </w:rPr>
+    </w:lvl>
+    <w:lvl w:ilvl="5">
+      <w:start w:val="1"/>
+      <w:numFmt w:val="lowerRoman"/>
+      <w:lvlText w:val="%6."/>
+      <w:lvlJc w:val="right"/>
+      <w:pPr>
+        <w:ind w:left="4320" w:hanging="360"/>
+      </w:pPr>
+      <w:rPr>
+        <w:u w:val="none"/>
+      </w:rPr>
+    </w:lvl>
+    <w:lvl w:ilvl="6">
+      <w:start w:val="1"/>
+      <w:numFmt w:val="decimal"/>
+      <w:lvlText w:val="%7."/>
+      <w:lvlJc w:val="left"/>
+      <w:pPr>
+        <w:ind w:left="5040" w:hanging="360"/>
+      </w:pPr>
+      <w:rPr>
+        <w:u w:val="none"/>
+      </w:rPr>
+    </w:lvl>
+    <w:lvl w:ilvl="7">
+      <w:start w:val="1"/>
+      <w:numFmt w:val="lowerLetter"/>
+      <w:lvlText w:val="%8."/>
+      <w:lvlJc w:val="left"/>
+      <w:pPr>
+        <w:ind w:left="5760" w:hanging="360"/>
+      </w:pPr>
+      <w:rPr>
+        <w:u w:val="none"/>
+      </w:rPr>
+    </w:lvl>
+    <w:lvl w:ilvl="8">
+      <w:start w:val="1"/>
+      <w:numFmt w:val="lowerRoman"/>
+      <w:lvlText w:val="%9."/>
+      <w:lvlJc w:val="right"/>
+      <w:pPr>
+        <w:ind w:left="6480" w:hanging="360"/>
+      </w:pPr>
+      <w:rPr>
+        <w:u w:val="none"/>
+      </w:rPr>
+    </w:lvl>
+  </w:abstractNum>
+  <w:abstractNum w:abstractNumId="3" w15:restartNumberingAfterBreak="0">
+    <w:nsid w:val="33CA0997"/>
+    <w:multiLevelType w:val="multilevel"/>
+    <w:tmpl w:val="0B5C1528"/>
+    <w:lvl w:ilvl="0">
+      <w:start w:val="1"/>
+      <w:numFmt w:val="decimal"/>
+      <w:lvlText w:val="%1."/>
+      <w:lvlJc w:val="left"/>
+      <w:pPr>
+        <w:ind w:left="720" w:hanging="360"/>
+      </w:pPr>
+      <w:rPr>
+        <w:u w:val="none"/>
+      </w:rPr>
+    </w:lvl>
+    <w:lvl w:ilvl="1">
+      <w:start w:val="1"/>
+      <w:numFmt w:val="lowerLetter"/>
+      <w:lvlText w:val="%2."/>
+      <w:lvlJc w:val="left"/>
+      <w:pPr>
+        <w:ind w:left="1440" w:hanging="360"/>
+      </w:pPr>
+      <w:rPr>
+        <w:u w:val="none"/>
+      </w:rPr>
+    </w:lvl>
+    <w:lvl w:ilvl="2">
+      <w:start w:val="1"/>
+      <w:numFmt w:val="lowerRoman"/>
+      <w:lvlText w:val="%3."/>
+      <w:lvlJc w:val="right"/>
+      <w:pPr>
+        <w:ind w:left="2160" w:hanging="360"/>
+      </w:pPr>
+      <w:rPr>
+        <w:u w:val="none"/>
+      </w:rPr>
+    </w:lvl>
+    <w:lvl w:ilvl="3">
+      <w:start w:val="1"/>
+      <w:numFmt w:val="decimal"/>
+      <w:lvlText w:val="%4."/>
+      <w:lvlJc w:val="left"/>
+      <w:pPr>
+        <w:ind w:left="2880" w:hanging="360"/>
+      </w:pPr>
+      <w:rPr>
+        <w:u w:val="none"/>
+      </w:rPr>
+    </w:lvl>
+    <w:lvl w:ilvl="4">
+      <w:start w:val="1"/>
+      <w:numFmt w:val="lowerLetter"/>
+      <w:lvlText w:val="%5."/>
+      <w:lvlJc w:val="left"/>
+      <w:pPr>
+        <w:ind w:left="3600" w:hanging="360"/>
+      </w:pPr>
+      <w:rPr>
+        <w:u w:val="none"/>
+      </w:rPr>
+    </w:lvl>
+    <w:lvl w:ilvl="5">
+      <w:start w:val="1"/>
+      <w:numFmt w:val="lowerRoman"/>
+      <w:lvlText w:val="%6."/>
+      <w:lvlJc w:val="right"/>
+      <w:pPr>
+        <w:ind w:left="4320" w:hanging="360"/>
+      </w:pPr>
+      <w:rPr>
+        <w:u w:val="none"/>
+      </w:rPr>
+    </w:lvl>
+    <w:lvl w:ilvl="6">
+      <w:start w:val="1"/>
+      <w:numFmt w:val="decimal"/>
+      <w:lvlText w:val="%7."/>
+      <w:lvlJc w:val="left"/>
+      <w:pPr>
+        <w:ind w:left="5040" w:hanging="360"/>
+      </w:pPr>
+      <w:rPr>
+        <w:u w:val="none"/>
+      </w:rPr>
+    </w:lvl>
+    <w:lvl w:ilvl="7">
+      <w:start w:val="1"/>
+      <w:numFmt w:val="lowerLetter"/>
+      <w:lvlText w:val="%8."/>
+      <w:lvlJc w:val="left"/>
+      <w:pPr>
+        <w:ind w:left="5760" w:hanging="360"/>
+      </w:pPr>
+      <w:rPr>
+        <w:u w:val="none"/>
+      </w:rPr>
+    </w:lvl>
+    <w:lvl w:ilvl="8">
+      <w:start w:val="1"/>
+      <w:numFmt w:val="lowerRoman"/>
+      <w:lvlText w:val="%9."/>
+      <w:lvlJc w:val="right"/>
+      <w:pPr>
+        <w:ind w:left="6480" w:hanging="360"/>
+      </w:pPr>
+      <w:rPr>
+        <w:u w:val="none"/>
+      </w:rPr>
+    </w:lvl>
+  </w:abstractNum>
+  <w:abstractNum w:abstractNumId="4" w15:restartNumberingAfterBreak="0">
+    <w:nsid w:val="4E6830B4"/>
+    <w:multiLevelType w:val="multilevel"/>
+    <w:tmpl w:val="5F362542"/>
+    <w:lvl w:ilvl="0">
+      <w:start w:val="1"/>
+      <w:numFmt w:val="decimal"/>
+      <w:lvlText w:val="%1."/>
+      <w:lvlJc w:val="left"/>
+      <w:pPr>
+        <w:ind w:left="720" w:hanging="360"/>
+      </w:pPr>
+      <w:rPr>
+        <w:u w:val="none"/>
+      </w:rPr>
+    </w:lvl>
+    <w:lvl w:ilvl="1">
+      <w:start w:val="1"/>
+      <w:numFmt w:val="lowerLetter"/>
+      <w:lvlText w:val="%2."/>
+      <w:lvlJc w:val="left"/>
+      <w:pPr>
+        <w:ind w:left="1440" w:hanging="360"/>
+      </w:pPr>
+      <w:rPr>
+        <w:u w:val="none"/>
+      </w:rPr>
+    </w:lvl>
+    <w:lvl w:ilvl="2">
+      <w:start w:val="1"/>
+      <w:numFmt w:val="lowerRoman"/>
+      <w:lvlText w:val="%3."/>
+      <w:lvlJc w:val="right"/>
+      <w:pPr>
+        <w:ind w:left="2160" w:hanging="360"/>
+      </w:pPr>
+      <w:rPr>
+        <w:u w:val="none"/>
+      </w:rPr>
+    </w:lvl>
+    <w:lvl w:ilvl="3">
+      <w:start w:val="1"/>
+      <w:numFmt w:val="decimal"/>
+      <w:lvlText w:val="%4."/>
+      <w:lvlJc w:val="left"/>
+      <w:pPr>
+        <w:ind w:left="2880" w:hanging="360"/>
+      </w:pPr>
+      <w:rPr>
+        <w:u w:val="none"/>
+      </w:rPr>
+    </w:lvl>
+    <w:lvl w:ilvl="4">
+      <w:start w:val="1"/>
+      <w:numFmt w:val="lowerLetter"/>
+      <w:lvlText w:val="%5."/>
+      <w:lvlJc w:val="left"/>
+      <w:pPr>
+        <w:ind w:left="3600" w:hanging="360"/>
+      </w:pPr>
+      <w:rPr>
+        <w:u w:val="none"/>
+      </w:rPr>
+    </w:lvl>
+    <w:lvl w:ilvl="5">
+      <w:start w:val="1"/>
+      <w:numFmt w:val="lowerRoman"/>
+      <w:lvlText w:val="%6."/>
+      <w:lvlJc w:val="right"/>
+      <w:pPr>
+        <w:ind w:left="4320" w:hanging="360"/>
+      </w:pPr>
+      <w:rPr>
+        <w:u w:val="none"/>
+      </w:rPr>
+    </w:lvl>
+    <w:lvl w:ilvl="6">
+      <w:start w:val="1"/>
+      <w:numFmt w:val="decimal"/>
+      <w:lvlText w:val="%7."/>
+      <w:lvlJc w:val="left"/>
+      <w:pPr>
+        <w:ind w:left="5040" w:hanging="360"/>
+      </w:pPr>
+      <w:rPr>
+        <w:u w:val="none"/>
+      </w:rPr>
+    </w:lvl>
+    <w:lvl w:ilvl="7">
+      <w:start w:val="1"/>
+      <w:numFmt w:val="lowerLetter"/>
+      <w:lvlText w:val="%8."/>
+      <w:lvlJc w:val="left"/>
+      <w:pPr>
+        <w:ind w:left="5760" w:hanging="360"/>
+      </w:pPr>
+      <w:rPr>
+        <w:u w:val="none"/>
+      </w:rPr>
+    </w:lvl>
+    <w:lvl w:ilvl="8">
+      <w:start w:val="1"/>
+      <w:numFmt w:val="lowerRoman"/>
+      <w:lvlText w:val="%9."/>
+      <w:lvlJc w:val="right"/>
+      <w:pPr>
+        <w:ind w:left="6480" w:hanging="360"/>
+      </w:pPr>
+      <w:rPr>
+        <w:u w:val="none"/>
+      </w:rPr>
+    </w:lvl>
+  </w:abstractNum>
+  <w:abstractNum w:abstractNumId="5" w15:restartNumberingAfterBreak="0">
+    <w:nsid w:val="56525030"/>
+    <w:multiLevelType w:val="multilevel"/>
+    <w:tmpl w:val="F91C3A84"/>
+    <w:lvl w:ilvl="0">
+      <w:start w:val="1"/>
+      <w:numFmt w:val="decimal"/>
+      <w:lvlText w:val="%1."/>
+      <w:lvlJc w:val="left"/>
+      <w:pPr>
+        <w:ind w:left="720" w:hanging="360"/>
+      </w:pPr>
+      <w:rPr>
+        <w:u w:val="none"/>
+      </w:rPr>
+    </w:lvl>
+    <w:lvl w:ilvl="1">
+      <w:start w:val="1"/>
+      <w:numFmt w:val="lowerLetter"/>
+      <w:lvlText w:val="%2."/>
+      <w:lvlJc w:val="left"/>
+      <w:pPr>
+        <w:ind w:left="1440" w:hanging="360"/>
+      </w:pPr>
+      <w:rPr>
+        <w:u w:val="none"/>
+      </w:rPr>
+    </w:lvl>
+    <w:lvl w:ilvl="2">
+      <w:start w:val="1"/>
+      <w:numFmt w:val="lowerRoman"/>
+      <w:lvlText w:val="%3."/>
+      <w:lvlJc w:val="right"/>
+      <w:pPr>
+        <w:ind w:left="2160" w:hanging="360"/>
+      </w:pPr>
+      <w:rPr>
+        <w:u w:val="none"/>
+      </w:rPr>
+    </w:lvl>
+    <w:lvl w:ilvl="3">
+      <w:start w:val="1"/>
+      <w:numFmt w:val="decimal"/>
+      <w:lvlText w:val="%4."/>
+      <w:lvlJc w:val="left"/>
+      <w:pPr>
+        <w:ind w:left="2880" w:hanging="360"/>
+      </w:pPr>
+      <w:rPr>
+        <w:u w:val="none"/>
+      </w:rPr>
+    </w:lvl>
+    <w:lvl w:ilvl="4">
+      <w:start w:val="1"/>
+      <w:numFmt w:val="lowerLetter"/>
+      <w:lvlText w:val="%5."/>
+      <w:lvlJc w:val="left"/>
+      <w:pPr>
+        <w:ind w:left="3600" w:hanging="360"/>
+      </w:pPr>
+      <w:rPr>
+        <w:u w:val="none"/>
+      </w:rPr>
+    </w:lvl>
+    <w:lvl w:ilvl="5">
+      <w:start w:val="1"/>
+      <w:numFmt w:val="lowerRoman"/>
+      <w:lvlText w:val="%6."/>
+      <w:lvlJc w:val="right"/>
+      <w:pPr>
+        <w:ind w:left="4320" w:hanging="360"/>
+      </w:pPr>
+      <w:rPr>
+        <w:u w:val="none"/>
+      </w:rPr>
+    </w:lvl>
+    <w:lvl w:ilvl="6">
+      <w:start w:val="1"/>
+      <w:numFmt w:val="decimal"/>
+      <w:lvlText w:val="%7."/>
+      <w:lvlJc w:val="left"/>
+      <w:pPr>
+        <w:ind w:left="5040" w:hanging="360"/>
+      </w:pPr>
+      <w:rPr>
+        <w:u w:val="none"/>
+      </w:rPr>
+    </w:lvl>
+    <w:lvl w:ilvl="7">
+      <w:start w:val="1"/>
+      <w:numFmt w:val="lowerLetter"/>
+      <w:lvlText w:val="%8."/>
+      <w:lvlJc w:val="left"/>
+      <w:pPr>
+        <w:ind w:left="5760" w:hanging="360"/>
+      </w:pPr>
+      <w:rPr>
+        <w:u w:val="none"/>
+      </w:rPr>
+    </w:lvl>
+    <w:lvl w:ilvl="8">
+      <w:start w:val="1"/>
+      <w:numFmt w:val="lowerRoman"/>
+      <w:lvlText w:val="%9."/>
+      <w:lvlJc w:val="right"/>
+      <w:pPr>
+        <w:ind w:left="6480" w:hanging="360"/>
+      </w:pPr>
+      <w:rPr>
+        <w:u w:val="none"/>
+      </w:rPr>
+    </w:lvl>
+  </w:abstractNum>
+  <w:num w:numId="1">
+    <w:abstractNumId w:val="1"/>
+  </w:num>
+  <w:num w:numId="2">
+    <w:abstractNumId w:val="3"/>
+  </w:num>
+  <w:num w:numId="3">
+    <w:abstractNumId w:val="0"/>
+  </w:num>
+  <w:num w:numId="4">
+    <w:abstractNumId w:val="4"/>
+  </w:num>
+  <w:num w:numId="5">
+    <w:abstractNumId w:val="2"/>
+  </w:num>
+  <w:num w:numId="6">
+    <w:abstractNumId w:val="5"/>
+  </w:num>
+</w:numbering>
 </file>
 
 <file path=word/styles.xml><?xml version="1.0" encoding="utf-8"?>
@@ -3753,6 +4475,29 @@
       <w:lang w:val="en"/>
     </w:rPr>
   </w:style>
+  <w:style w:type="paragraph" w:styleId="Heading3">
+    <w:name w:val="heading 3"/>
+    <w:basedOn w:val="Normal"/>
+    <w:next w:val="Normal"/>
+    <w:link w:val="Heading3Char"/>
+    <w:uiPriority w:val="9"/>
+    <w:semiHidden/>
+    <w:unhideWhenUsed/>
+    <w:qFormat/>
+    <w:rsid w:val="00C52869"/>
+    <w:pPr>
+      <w:keepNext/>
+      <w:keepLines/>
+      <w:spacing w:before="40" w:after="0"/>
+      <w:outlineLvl w:val="2"/>
+    </w:pPr>
+    <w:rPr>
+      <w:rFonts w:asciiTheme="majorHAnsi" w:eastAsiaTheme="majorEastAsia" w:hAnsiTheme="majorHAnsi" w:cstheme="majorBidi"/>
+      <w:color w:val="1F4D78" w:themeColor="accent1" w:themeShade="7F"/>
+      <w:sz w:val="24"/>
+      <w:szCs w:val="24"/>
+    </w:rPr>
+  </w:style>
   <w:style w:type="character" w:default="1" w:styleId="DefaultParagraphFont">
     <w:name w:val="Default Paragraph Font"/>
     <w:uiPriority w:val="1"/>
@@ -3808,6 +4553,20 @@
       <w:sz w:val="28"/>
       <w:szCs w:val="28"/>
       <w:lang w:val="en"/>
+    </w:rPr>
+  </w:style>
+  <w:style w:type="character" w:customStyle="1" w:styleId="Heading3Char">
+    <w:name w:val="Heading 3 Char"/>
+    <w:basedOn w:val="DefaultParagraphFont"/>
+    <w:link w:val="Heading3"/>
+    <w:uiPriority w:val="9"/>
+    <w:semiHidden/>
+    <w:rsid w:val="00C52869"/>
+    <w:rPr>
+      <w:rFonts w:asciiTheme="majorHAnsi" w:eastAsiaTheme="majorEastAsia" w:hAnsiTheme="majorHAnsi" w:cstheme="majorBidi"/>
+      <w:color w:val="1F4D78" w:themeColor="accent1" w:themeShade="7F"/>
+      <w:sz w:val="24"/>
+      <w:szCs w:val="24"/>
     </w:rPr>
   </w:style>
 </w:styles>

</xml_diff>

<commit_message>
Student A: Aaditya Chaudhary — Epic 1 (User Registration & Privacy) + Epic 2 (Food Analytics and impact Reporting) — UC1 & UC4
</commit_message>
<xml_diff>
--- a/BIT 216 Assignment 1 (Task 2).docx
+++ b/BIT 216 Assignment 1 (Task 2).docx
@@ -3310,11 +3310,2170 @@
         <w:t>Here we introduce the requirements model for the SavePlate project. We adopted the Epic–User Story–Acceptance Criteria–Tasks structure (Cohn, 2004) to write the permalinks. Each person in the team has been given responsibility for two use cases with which to work out unique user stories. The user stories followed the classic format: Role capability result (as a [user role] I need to have [the ability to do something] so that I can [benefit]). Acceptance criteria are formulated in the Given–When–Then style of writing. Stories get labeled with MoSCoW priority levels as the guidelines of the Agile Business Consortium (2014).</w:t>
       </w:r>
       <w:bookmarkStart w:id="5" w:name="_GoBack"/>
-      <w:bookmarkEnd w:id="5"/>
+    </w:p>
+    <w:p>
+      <w:pPr>
+        <w:pStyle w:val="Heading2"/>
+        <w:spacing w:before="200" w:after="100"/>
+      </w:pPr>
+      <w:bookmarkStart w:id="6" w:name="_heading=h.onivb3tnxbay" w:colFirst="0" w:colLast="0"/>
+      <w:bookmarkEnd w:id="6"/>
       <w:r>
-        <w:t xml:space="preserve"> </w:t>
+        <w:t>3.1  Student A: Aaditya Chaudhary (E2300548)</w:t>
       </w:r>
     </w:p>
+    <w:p>
+      <w:pPr>
+        <w:spacing w:after="120" w:line="360" w:lineRule="auto"/>
+        <w:jc w:val="both"/>
+      </w:pPr>
+      <w:r>
+        <w:t>Aaditya is responsible for Use Case 1 (Register Users and Privacy Settings) and Use Case 4 (Food Analytics).</w:t>
+      </w:r>
+    </w:p>
+    <w:p>
+      <w:pPr>
+        <w:pStyle w:val="Heading3"/>
+        <w:spacing w:before="160" w:after="80"/>
+      </w:pPr>
+      <w:bookmarkStart w:id="7" w:name="_heading=h.z95479jiwqjb" w:colFirst="0" w:colLast="0"/>
+      <w:bookmarkEnd w:id="7"/>
+      <w:r>
+        <w:t>[Epic 1] – User Registration and Account Privacy Management</w:t>
+      </w:r>
+    </w:p>
+    <w:p>
+      <w:pPr>
+        <w:spacing w:after="120" w:line="360" w:lineRule="auto"/>
+        <w:jc w:val="both"/>
+      </w:pPr>
+      <w:r>
+        <w:t>This epic covers every step of a new household user's SavePlate platform registration process, including email verification, setting up two-factor authentication, and configuring privacy.</w:t>
+      </w:r>
+    </w:p>
+    <w:tbl>
+      <w:tblPr>
+        <w:tblW w:w="9026" w:type="dxa"/>
+        <w:tblBorders>
+          <w:top w:val="single" w:sz="4" w:space="0" w:color="000000"/>
+          <w:left w:val="single" w:sz="4" w:space="0" w:color="000000"/>
+          <w:bottom w:val="single" w:sz="4" w:space="0" w:color="000000"/>
+          <w:right w:val="single" w:sz="4" w:space="0" w:color="000000"/>
+          <w:insideH w:val="single" w:sz="4" w:space="0" w:color="000000"/>
+          <w:insideV w:val="single" w:sz="4" w:space="0" w:color="000000"/>
+        </w:tblBorders>
+        <w:tblLayout w:type="fixed"/>
+        <w:tblLook w:val="0000" w:firstRow="0" w:lastRow="0" w:firstColumn="0" w:lastColumn="0" w:noHBand="0" w:noVBand="0"/>
+      </w:tblPr>
+      <w:tblGrid>
+        <w:gridCol w:w="2000"/>
+        <w:gridCol w:w="7026"/>
+      </w:tblGrid>
+      <w:tr>
+        <w:tc>
+          <w:tcPr>
+            <w:tcW w:w="2000" w:type="dxa"/>
+            <w:tcBorders>
+              <w:top w:val="single" w:sz="4" w:space="0" w:color="000000"/>
+              <w:left w:val="single" w:sz="4" w:space="0" w:color="000000"/>
+              <w:bottom w:val="single" w:sz="4" w:space="0" w:color="000000"/>
+              <w:right w:val="single" w:sz="4" w:space="0" w:color="000000"/>
+            </w:tcBorders>
+            <w:tcMar>
+              <w:top w:w="80" w:type="dxa"/>
+              <w:left w:w="120" w:type="dxa"/>
+              <w:bottom w:w="80" w:type="dxa"/>
+              <w:right w:w="120" w:type="dxa"/>
+            </w:tcMar>
+          </w:tcPr>
+          <w:p>
+            <w:pPr>
+              <w:spacing w:line="320" w:lineRule="auto"/>
+            </w:pPr>
+            <w:r>
+              <w:rPr>
+                <w:b/>
+                <w:bCs/>
+              </w:rPr>
+              <w:t>[User Story 1.1]</w:t>
+            </w:r>
+          </w:p>
+        </w:tc>
+        <w:tc>
+          <w:tcPr>
+            <w:tcW w:w="7026" w:type="dxa"/>
+            <w:tcBorders>
+              <w:top w:val="single" w:sz="4" w:space="0" w:color="000000"/>
+              <w:left w:val="single" w:sz="4" w:space="0" w:color="000000"/>
+              <w:bottom w:val="single" w:sz="4" w:space="0" w:color="000000"/>
+              <w:right w:val="single" w:sz="4" w:space="0" w:color="000000"/>
+            </w:tcBorders>
+            <w:tcMar>
+              <w:top w:w="80" w:type="dxa"/>
+              <w:left w:w="120" w:type="dxa"/>
+              <w:bottom w:w="80" w:type="dxa"/>
+              <w:right w:w="120" w:type="dxa"/>
+            </w:tcMar>
+          </w:tcPr>
+          <w:p>
+            <w:pPr>
+              <w:spacing w:line="320" w:lineRule="auto"/>
+            </w:pPr>
+            <w:r>
+              <w:t>To use SavePlate's food management capabilities as a new household user, I must create an account with my name, email address, and password</w:t>
+            </w:r>
+          </w:p>
+        </w:tc>
+      </w:tr>
+      <w:tr>
+        <w:tc>
+          <w:tcPr>
+            <w:tcW w:w="2000" w:type="dxa"/>
+            <w:tcBorders>
+              <w:top w:val="single" w:sz="4" w:space="0" w:color="000000"/>
+              <w:left w:val="single" w:sz="4" w:space="0" w:color="000000"/>
+              <w:bottom w:val="single" w:sz="4" w:space="0" w:color="000000"/>
+              <w:right w:val="single" w:sz="4" w:space="0" w:color="000000"/>
+            </w:tcBorders>
+            <w:tcMar>
+              <w:top w:w="80" w:type="dxa"/>
+              <w:left w:w="120" w:type="dxa"/>
+              <w:bottom w:w="80" w:type="dxa"/>
+              <w:right w:w="120" w:type="dxa"/>
+            </w:tcMar>
+          </w:tcPr>
+          <w:p>
+            <w:pPr>
+              <w:spacing w:line="320" w:lineRule="auto"/>
+            </w:pPr>
+            <w:r>
+              <w:rPr>
+                <w:b/>
+                <w:bCs/>
+              </w:rPr>
+              <w:t>Acceptance Criteria</w:t>
+            </w:r>
+          </w:p>
+        </w:tc>
+        <w:tc>
+          <w:tcPr>
+            <w:tcW w:w="7026" w:type="dxa"/>
+            <w:tcBorders>
+              <w:top w:val="single" w:sz="4" w:space="0" w:color="000000"/>
+              <w:left w:val="single" w:sz="4" w:space="0" w:color="000000"/>
+              <w:bottom w:val="single" w:sz="4" w:space="0" w:color="000000"/>
+              <w:right w:val="single" w:sz="4" w:space="0" w:color="000000"/>
+            </w:tcBorders>
+            <w:tcMar>
+              <w:top w:w="80" w:type="dxa"/>
+              <w:left w:w="120" w:type="dxa"/>
+              <w:bottom w:w="80" w:type="dxa"/>
+              <w:right w:w="120" w:type="dxa"/>
+            </w:tcMar>
+          </w:tcPr>
+          <w:p>
+            <w:pPr>
+              <w:spacing w:line="320" w:lineRule="auto"/>
+            </w:pPr>
+            <w:r>
+              <w:t>Suppose a user goes to the registration page. If he/she enters a valid full name email password, and confirm password, then the system validates the inputs, stores the data, sends a 6-digit verification code to the email, and shows the message "Registration Successful – check your email."</w:t>
+            </w:r>
+          </w:p>
+        </w:tc>
+      </w:tr>
+      <w:tr>
+        <w:tc>
+          <w:tcPr>
+            <w:tcW w:w="2000" w:type="dxa"/>
+            <w:tcBorders>
+              <w:top w:val="single" w:sz="4" w:space="0" w:color="000000"/>
+              <w:left w:val="single" w:sz="4" w:space="0" w:color="000000"/>
+              <w:bottom w:val="single" w:sz="4" w:space="0" w:color="000000"/>
+              <w:right w:val="single" w:sz="4" w:space="0" w:color="000000"/>
+            </w:tcBorders>
+            <w:tcMar>
+              <w:top w:w="80" w:type="dxa"/>
+              <w:left w:w="120" w:type="dxa"/>
+              <w:bottom w:w="80" w:type="dxa"/>
+              <w:right w:w="120" w:type="dxa"/>
+            </w:tcMar>
+          </w:tcPr>
+          <w:p>
+            <w:pPr>
+              <w:spacing w:line="320" w:lineRule="auto"/>
+            </w:pPr>
+            <w:r>
+              <w:rPr>
+                <w:b/>
+                <w:bCs/>
+              </w:rPr>
+              <w:t>MoSCoW</w:t>
+            </w:r>
+          </w:p>
+        </w:tc>
+        <w:tc>
+          <w:tcPr>
+            <w:tcW w:w="7026" w:type="dxa"/>
+            <w:tcBorders>
+              <w:top w:val="single" w:sz="4" w:space="0" w:color="000000"/>
+              <w:left w:val="single" w:sz="4" w:space="0" w:color="000000"/>
+              <w:bottom w:val="single" w:sz="4" w:space="0" w:color="000000"/>
+              <w:right w:val="single" w:sz="4" w:space="0" w:color="000000"/>
+            </w:tcBorders>
+            <w:tcMar>
+              <w:top w:w="80" w:type="dxa"/>
+              <w:left w:w="120" w:type="dxa"/>
+              <w:bottom w:w="80" w:type="dxa"/>
+              <w:right w:w="120" w:type="dxa"/>
+            </w:tcMar>
+          </w:tcPr>
+          <w:p>
+            <w:pPr>
+              <w:spacing w:line="320" w:lineRule="auto"/>
+            </w:pPr>
+            <w:r>
+              <w:t>Must Have</w:t>
+            </w:r>
+          </w:p>
+        </w:tc>
+      </w:tr>
+      <w:tr>
+        <w:tc>
+          <w:tcPr>
+            <w:tcW w:w="2000" w:type="dxa"/>
+            <w:tcBorders>
+              <w:top w:val="single" w:sz="4" w:space="0" w:color="000000"/>
+              <w:left w:val="single" w:sz="4" w:space="0" w:color="000000"/>
+              <w:bottom w:val="single" w:sz="4" w:space="0" w:color="000000"/>
+              <w:right w:val="single" w:sz="4" w:space="0" w:color="000000"/>
+            </w:tcBorders>
+            <w:tcMar>
+              <w:top w:w="80" w:type="dxa"/>
+              <w:left w:w="120" w:type="dxa"/>
+              <w:bottom w:w="80" w:type="dxa"/>
+              <w:right w:w="120" w:type="dxa"/>
+            </w:tcMar>
+          </w:tcPr>
+          <w:p>
+            <w:pPr>
+              <w:spacing w:line="320" w:lineRule="auto"/>
+            </w:pPr>
+            <w:r>
+              <w:rPr>
+                <w:b/>
+                <w:bCs/>
+              </w:rPr>
+              <w:t>Tasks</w:t>
+            </w:r>
+          </w:p>
+        </w:tc>
+        <w:tc>
+          <w:tcPr>
+            <w:tcW w:w="7026" w:type="dxa"/>
+            <w:tcBorders>
+              <w:top w:val="single" w:sz="4" w:space="0" w:color="000000"/>
+              <w:left w:val="single" w:sz="4" w:space="0" w:color="000000"/>
+              <w:bottom w:val="single" w:sz="4" w:space="0" w:color="000000"/>
+              <w:right w:val="single" w:sz="4" w:space="0" w:color="000000"/>
+            </w:tcBorders>
+            <w:tcMar>
+              <w:top w:w="80" w:type="dxa"/>
+              <w:left w:w="120" w:type="dxa"/>
+              <w:bottom w:w="80" w:type="dxa"/>
+              <w:right w:w="120" w:type="dxa"/>
+            </w:tcMar>
+          </w:tcPr>
+          <w:p>
+            <w:pPr>
+              <w:numPr>
+                <w:ilvl w:val="0"/>
+                <w:numId w:val="3"/>
+              </w:numPr>
+              <w:spacing w:after="0" w:line="320" w:lineRule="auto"/>
+            </w:pPr>
+            <w:r>
+              <w:t>Design the UI of the registration form in Figma</w:t>
+            </w:r>
+          </w:p>
+          <w:p>
+            <w:pPr>
+              <w:numPr>
+                <w:ilvl w:val="0"/>
+                <w:numId w:val="3"/>
+              </w:numPr>
+              <w:spacing w:after="0" w:line="320" w:lineRule="auto"/>
+            </w:pPr>
+            <w:r>
+              <w:t>Client-side validation in code (check email format, password strength)</w:t>
+            </w:r>
+          </w:p>
+          <w:p>
+            <w:pPr>
+              <w:numPr>
+                <w:ilvl w:val="0"/>
+                <w:numId w:val="3"/>
+              </w:numPr>
+              <w:spacing w:after="0" w:line="320" w:lineRule="auto"/>
+            </w:pPr>
+            <w:r>
+              <w:t>Develop backend endpoint POST /api/auth/register</w:t>
+            </w:r>
+          </w:p>
+          <w:p>
+            <w:pPr>
+              <w:numPr>
+                <w:ilvl w:val="0"/>
+                <w:numId w:val="3"/>
+              </w:numPr>
+              <w:spacing w:after="0" w:line="320" w:lineRule="auto"/>
+            </w:pPr>
+            <w:r>
+              <w:t>Implement bcrypt for password hashing (work factor 12)</w:t>
+            </w:r>
+          </w:p>
+          <w:p>
+            <w:pPr>
+              <w:numPr>
+                <w:ilvl w:val="0"/>
+                <w:numId w:val="3"/>
+              </w:numPr>
+              <w:spacing w:after="0" w:line="320" w:lineRule="auto"/>
+            </w:pPr>
+            <w:r>
+              <w:t>Connect with SMTP email service for sending verification code</w:t>
+            </w:r>
+          </w:p>
+          <w:p>
+            <w:pPr>
+              <w:numPr>
+                <w:ilvl w:val="0"/>
+                <w:numId w:val="3"/>
+              </w:numPr>
+              <w:spacing w:after="0" w:line="320" w:lineRule="auto"/>
+            </w:pPr>
+            <w:r>
+              <w:t>Create unit tests for the registration controller</w:t>
+            </w:r>
+          </w:p>
+        </w:tc>
+      </w:tr>
+      <w:tr>
+        <w:tc>
+          <w:tcPr>
+            <w:tcW w:w="2000" w:type="dxa"/>
+            <w:tcBorders>
+              <w:top w:val="single" w:sz="4" w:space="0" w:color="000000"/>
+              <w:left w:val="single" w:sz="4" w:space="0" w:color="000000"/>
+              <w:bottom w:val="single" w:sz="4" w:space="0" w:color="000000"/>
+              <w:right w:val="single" w:sz="4" w:space="0" w:color="000000"/>
+            </w:tcBorders>
+            <w:tcMar>
+              <w:top w:w="80" w:type="dxa"/>
+              <w:left w:w="120" w:type="dxa"/>
+              <w:bottom w:w="80" w:type="dxa"/>
+              <w:right w:w="120" w:type="dxa"/>
+            </w:tcMar>
+          </w:tcPr>
+          <w:p>
+            <w:pPr>
+              <w:spacing w:line="320" w:lineRule="auto"/>
+            </w:pPr>
+            <w:r>
+              <w:rPr>
+                <w:b/>
+                <w:bCs/>
+              </w:rPr>
+              <w:t>Test Cases</w:t>
+            </w:r>
+          </w:p>
+        </w:tc>
+        <w:tc>
+          <w:tcPr>
+            <w:tcW w:w="7026" w:type="dxa"/>
+            <w:tcBorders>
+              <w:top w:val="single" w:sz="4" w:space="0" w:color="000000"/>
+              <w:left w:val="single" w:sz="4" w:space="0" w:color="000000"/>
+              <w:bottom w:val="single" w:sz="4" w:space="0" w:color="000000"/>
+              <w:right w:val="single" w:sz="4" w:space="0" w:color="000000"/>
+            </w:tcBorders>
+            <w:tcMar>
+              <w:top w:w="80" w:type="dxa"/>
+              <w:left w:w="120" w:type="dxa"/>
+              <w:bottom w:w="80" w:type="dxa"/>
+              <w:right w:w="120" w:type="dxa"/>
+            </w:tcMar>
+          </w:tcPr>
+          <w:p>
+            <w:pPr>
+              <w:spacing w:line="320" w:lineRule="auto"/>
+            </w:pPr>
+            <w:r>
+              <w:t>to be completed in Assignment 2</w:t>
+            </w:r>
+          </w:p>
+        </w:tc>
+      </w:tr>
+    </w:tbl>
+    <w:p>
+      <w:pPr>
+        <w:spacing w:line="360" w:lineRule="auto"/>
+      </w:pPr>
+    </w:p>
+    <w:tbl>
+      <w:tblPr>
+        <w:tblW w:w="9026" w:type="dxa"/>
+        <w:tblBorders>
+          <w:top w:val="single" w:sz="4" w:space="0" w:color="000000"/>
+          <w:left w:val="single" w:sz="4" w:space="0" w:color="000000"/>
+          <w:bottom w:val="single" w:sz="4" w:space="0" w:color="000000"/>
+          <w:right w:val="single" w:sz="4" w:space="0" w:color="000000"/>
+          <w:insideH w:val="single" w:sz="4" w:space="0" w:color="000000"/>
+          <w:insideV w:val="single" w:sz="4" w:space="0" w:color="000000"/>
+        </w:tblBorders>
+        <w:tblLayout w:type="fixed"/>
+        <w:tblLook w:val="0000" w:firstRow="0" w:lastRow="0" w:firstColumn="0" w:lastColumn="0" w:noHBand="0" w:noVBand="0"/>
+      </w:tblPr>
+      <w:tblGrid>
+        <w:gridCol w:w="2000"/>
+        <w:gridCol w:w="7026"/>
+      </w:tblGrid>
+      <w:tr>
+        <w:tc>
+          <w:tcPr>
+            <w:tcW w:w="2000" w:type="dxa"/>
+            <w:tcBorders>
+              <w:top w:val="single" w:sz="4" w:space="0" w:color="000000"/>
+              <w:left w:val="single" w:sz="4" w:space="0" w:color="000000"/>
+              <w:bottom w:val="single" w:sz="4" w:space="0" w:color="000000"/>
+              <w:right w:val="single" w:sz="4" w:space="0" w:color="000000"/>
+            </w:tcBorders>
+            <w:tcMar>
+              <w:top w:w="80" w:type="dxa"/>
+              <w:left w:w="120" w:type="dxa"/>
+              <w:bottom w:w="80" w:type="dxa"/>
+              <w:right w:w="120" w:type="dxa"/>
+            </w:tcMar>
+          </w:tcPr>
+          <w:p>
+            <w:pPr>
+              <w:spacing w:line="320" w:lineRule="auto"/>
+            </w:pPr>
+            <w:r>
+              <w:rPr>
+                <w:b/>
+                <w:bCs/>
+              </w:rPr>
+              <w:t>[User Story 1.2]</w:t>
+            </w:r>
+          </w:p>
+        </w:tc>
+        <w:tc>
+          <w:tcPr>
+            <w:tcW w:w="7026" w:type="dxa"/>
+            <w:tcBorders>
+              <w:top w:val="single" w:sz="4" w:space="0" w:color="000000"/>
+              <w:left w:val="single" w:sz="4" w:space="0" w:color="000000"/>
+              <w:bottom w:val="single" w:sz="4" w:space="0" w:color="000000"/>
+              <w:right w:val="single" w:sz="4" w:space="0" w:color="000000"/>
+            </w:tcBorders>
+            <w:tcMar>
+              <w:top w:w="80" w:type="dxa"/>
+              <w:left w:w="120" w:type="dxa"/>
+              <w:bottom w:w="80" w:type="dxa"/>
+              <w:right w:w="120" w:type="dxa"/>
+            </w:tcMar>
+          </w:tcPr>
+          <w:p>
+            <w:pPr>
+              <w:spacing w:line="320" w:lineRule="auto"/>
+            </w:pPr>
+            <w:r>
+              <w:t>In order to prevent unwanted access to my account, I must implement two-factor authentication (2FA) by email verification as a registered user.</w:t>
+            </w:r>
+          </w:p>
+        </w:tc>
+      </w:tr>
+      <w:tr>
+        <w:tc>
+          <w:tcPr>
+            <w:tcW w:w="2000" w:type="dxa"/>
+            <w:tcBorders>
+              <w:top w:val="single" w:sz="4" w:space="0" w:color="000000"/>
+              <w:left w:val="single" w:sz="4" w:space="0" w:color="000000"/>
+              <w:bottom w:val="single" w:sz="4" w:space="0" w:color="000000"/>
+              <w:right w:val="single" w:sz="4" w:space="0" w:color="000000"/>
+            </w:tcBorders>
+            <w:tcMar>
+              <w:top w:w="80" w:type="dxa"/>
+              <w:left w:w="120" w:type="dxa"/>
+              <w:bottom w:w="80" w:type="dxa"/>
+              <w:right w:w="120" w:type="dxa"/>
+            </w:tcMar>
+          </w:tcPr>
+          <w:p>
+            <w:pPr>
+              <w:spacing w:line="320" w:lineRule="auto"/>
+            </w:pPr>
+            <w:r>
+              <w:rPr>
+                <w:b/>
+                <w:bCs/>
+              </w:rPr>
+              <w:t>Acceptance Criteria</w:t>
+            </w:r>
+          </w:p>
+        </w:tc>
+        <w:tc>
+          <w:tcPr>
+            <w:tcW w:w="7026" w:type="dxa"/>
+            <w:tcBorders>
+              <w:top w:val="single" w:sz="4" w:space="0" w:color="000000"/>
+              <w:left w:val="single" w:sz="4" w:space="0" w:color="000000"/>
+              <w:bottom w:val="single" w:sz="4" w:space="0" w:color="000000"/>
+              <w:right w:val="single" w:sz="4" w:space="0" w:color="000000"/>
+            </w:tcBorders>
+            <w:tcMar>
+              <w:top w:w="80" w:type="dxa"/>
+              <w:left w:w="120" w:type="dxa"/>
+              <w:bottom w:w="80" w:type="dxa"/>
+              <w:right w:w="120" w:type="dxa"/>
+            </w:tcMar>
+          </w:tcPr>
+          <w:p>
+            <w:pPr>
+              <w:spacing w:line="320" w:lineRule="auto"/>
+            </w:pPr>
+            <w:r>
+              <w:t>The system sends a test verification code to the user's email once they have registered an account, visit to account security settings, toggle 2FA on, and confirm with their password. If the verification is successful, the system remembers the 2FA option and shows a confirmation toast.</w:t>
+            </w:r>
+          </w:p>
+        </w:tc>
+      </w:tr>
+      <w:tr>
+        <w:tc>
+          <w:tcPr>
+            <w:tcW w:w="2000" w:type="dxa"/>
+            <w:tcBorders>
+              <w:top w:val="single" w:sz="4" w:space="0" w:color="000000"/>
+              <w:left w:val="single" w:sz="4" w:space="0" w:color="000000"/>
+              <w:bottom w:val="single" w:sz="4" w:space="0" w:color="000000"/>
+              <w:right w:val="single" w:sz="4" w:space="0" w:color="000000"/>
+            </w:tcBorders>
+            <w:tcMar>
+              <w:top w:w="80" w:type="dxa"/>
+              <w:left w:w="120" w:type="dxa"/>
+              <w:bottom w:w="80" w:type="dxa"/>
+              <w:right w:w="120" w:type="dxa"/>
+            </w:tcMar>
+          </w:tcPr>
+          <w:p>
+            <w:pPr>
+              <w:spacing w:line="320" w:lineRule="auto"/>
+            </w:pPr>
+            <w:r>
+              <w:rPr>
+                <w:b/>
+                <w:bCs/>
+              </w:rPr>
+              <w:t>MoSCoW</w:t>
+            </w:r>
+          </w:p>
+        </w:tc>
+        <w:tc>
+          <w:tcPr>
+            <w:tcW w:w="7026" w:type="dxa"/>
+            <w:tcBorders>
+              <w:top w:val="single" w:sz="4" w:space="0" w:color="000000"/>
+              <w:left w:val="single" w:sz="4" w:space="0" w:color="000000"/>
+              <w:bottom w:val="single" w:sz="4" w:space="0" w:color="000000"/>
+              <w:right w:val="single" w:sz="4" w:space="0" w:color="000000"/>
+            </w:tcBorders>
+            <w:tcMar>
+              <w:top w:w="80" w:type="dxa"/>
+              <w:left w:w="120" w:type="dxa"/>
+              <w:bottom w:w="80" w:type="dxa"/>
+              <w:right w:w="120" w:type="dxa"/>
+            </w:tcMar>
+          </w:tcPr>
+          <w:p>
+            <w:pPr>
+              <w:spacing w:line="320" w:lineRule="auto"/>
+            </w:pPr>
+            <w:r>
+              <w:t>Must Have</w:t>
+            </w:r>
+          </w:p>
+        </w:tc>
+      </w:tr>
+      <w:tr>
+        <w:tc>
+          <w:tcPr>
+            <w:tcW w:w="2000" w:type="dxa"/>
+            <w:tcBorders>
+              <w:top w:val="single" w:sz="4" w:space="0" w:color="000000"/>
+              <w:left w:val="single" w:sz="4" w:space="0" w:color="000000"/>
+              <w:bottom w:val="single" w:sz="4" w:space="0" w:color="000000"/>
+              <w:right w:val="single" w:sz="4" w:space="0" w:color="000000"/>
+            </w:tcBorders>
+            <w:tcMar>
+              <w:top w:w="80" w:type="dxa"/>
+              <w:left w:w="120" w:type="dxa"/>
+              <w:bottom w:w="80" w:type="dxa"/>
+              <w:right w:w="120" w:type="dxa"/>
+            </w:tcMar>
+          </w:tcPr>
+          <w:p>
+            <w:pPr>
+              <w:spacing w:line="320" w:lineRule="auto"/>
+            </w:pPr>
+            <w:r>
+              <w:rPr>
+                <w:b/>
+                <w:bCs/>
+              </w:rPr>
+              <w:t>Tasks</w:t>
+            </w:r>
+          </w:p>
+        </w:tc>
+        <w:tc>
+          <w:tcPr>
+            <w:tcW w:w="7026" w:type="dxa"/>
+            <w:tcBorders>
+              <w:top w:val="single" w:sz="4" w:space="0" w:color="000000"/>
+              <w:left w:val="single" w:sz="4" w:space="0" w:color="000000"/>
+              <w:bottom w:val="single" w:sz="4" w:space="0" w:color="000000"/>
+              <w:right w:val="single" w:sz="4" w:space="0" w:color="000000"/>
+            </w:tcBorders>
+            <w:tcMar>
+              <w:top w:w="80" w:type="dxa"/>
+              <w:left w:w="120" w:type="dxa"/>
+              <w:bottom w:w="80" w:type="dxa"/>
+              <w:right w:w="120" w:type="dxa"/>
+            </w:tcMar>
+          </w:tcPr>
+          <w:p>
+            <w:pPr>
+              <w:numPr>
+                <w:ilvl w:val="0"/>
+                <w:numId w:val="2"/>
+              </w:numPr>
+              <w:spacing w:after="0" w:line="320" w:lineRule="auto"/>
+            </w:pPr>
+            <w:r>
+              <w:t xml:space="preserve">Design 2FA toggle and OTP input UI </w:t>
+            </w:r>
+          </w:p>
+          <w:p>
+            <w:pPr>
+              <w:numPr>
+                <w:ilvl w:val="0"/>
+                <w:numId w:val="2"/>
+              </w:numPr>
+              <w:spacing w:after="0" w:line="320" w:lineRule="auto"/>
+            </w:pPr>
+            <w:r>
+              <w:t xml:space="preserve">Create PATCH /api/auth/2fa endpoint </w:t>
+            </w:r>
+          </w:p>
+          <w:p>
+            <w:pPr>
+              <w:numPr>
+                <w:ilvl w:val="0"/>
+                <w:numId w:val="2"/>
+              </w:numPr>
+              <w:spacing w:after="0" w:line="320" w:lineRule="auto"/>
+            </w:pPr>
+            <w:r>
+              <w:t xml:space="preserve">Implement OTP generation and expiry (10 minutes) </w:t>
+            </w:r>
+          </w:p>
+          <w:p>
+            <w:pPr>
+              <w:numPr>
+                <w:ilvl w:val="0"/>
+                <w:numId w:val="2"/>
+              </w:numPr>
+              <w:spacing w:after="0" w:line="320" w:lineRule="auto"/>
+            </w:pPr>
+            <w:r>
+              <w:t xml:space="preserve">Store 2FA preference in users table </w:t>
+            </w:r>
+          </w:p>
+          <w:p>
+            <w:pPr>
+              <w:numPr>
+                <w:ilvl w:val="0"/>
+                <w:numId w:val="2"/>
+              </w:numPr>
+              <w:spacing w:after="0" w:line="320" w:lineRule="auto"/>
+            </w:pPr>
+            <w:r>
+              <w:t xml:space="preserve">Implement 2FA check during login flow </w:t>
+            </w:r>
+          </w:p>
+          <w:p>
+            <w:pPr>
+              <w:numPr>
+                <w:ilvl w:val="0"/>
+                <w:numId w:val="2"/>
+              </w:numPr>
+              <w:spacing w:after="0" w:line="320" w:lineRule="auto"/>
+            </w:pPr>
+            <w:r>
+              <w:t>Write integration tests for 2FA activation and login</w:t>
+            </w:r>
+          </w:p>
+        </w:tc>
+      </w:tr>
+      <w:tr>
+        <w:tc>
+          <w:tcPr>
+            <w:tcW w:w="2000" w:type="dxa"/>
+            <w:tcBorders>
+              <w:top w:val="single" w:sz="4" w:space="0" w:color="000000"/>
+              <w:left w:val="single" w:sz="4" w:space="0" w:color="000000"/>
+              <w:bottom w:val="single" w:sz="4" w:space="0" w:color="000000"/>
+              <w:right w:val="single" w:sz="4" w:space="0" w:color="000000"/>
+            </w:tcBorders>
+            <w:tcMar>
+              <w:top w:w="80" w:type="dxa"/>
+              <w:left w:w="120" w:type="dxa"/>
+              <w:bottom w:w="80" w:type="dxa"/>
+              <w:right w:w="120" w:type="dxa"/>
+            </w:tcMar>
+          </w:tcPr>
+          <w:p>
+            <w:pPr>
+              <w:spacing w:line="320" w:lineRule="auto"/>
+            </w:pPr>
+            <w:r>
+              <w:rPr>
+                <w:b/>
+                <w:bCs/>
+              </w:rPr>
+              <w:t>Test Cases</w:t>
+            </w:r>
+          </w:p>
+        </w:tc>
+        <w:tc>
+          <w:tcPr>
+            <w:tcW w:w="7026" w:type="dxa"/>
+            <w:tcBorders>
+              <w:top w:val="single" w:sz="4" w:space="0" w:color="000000"/>
+              <w:left w:val="single" w:sz="4" w:space="0" w:color="000000"/>
+              <w:bottom w:val="single" w:sz="4" w:space="0" w:color="000000"/>
+              <w:right w:val="single" w:sz="4" w:space="0" w:color="000000"/>
+            </w:tcBorders>
+            <w:tcMar>
+              <w:top w:w="80" w:type="dxa"/>
+              <w:left w:w="120" w:type="dxa"/>
+              <w:bottom w:w="80" w:type="dxa"/>
+              <w:right w:w="120" w:type="dxa"/>
+            </w:tcMar>
+          </w:tcPr>
+          <w:p>
+            <w:pPr>
+              <w:spacing w:line="320" w:lineRule="auto"/>
+            </w:pPr>
+            <w:r>
+              <w:t>to be completed in Assignment 2</w:t>
+            </w:r>
+          </w:p>
+        </w:tc>
+      </w:tr>
+    </w:tbl>
+    <w:p>
+      <w:pPr>
+        <w:spacing w:line="360" w:lineRule="auto"/>
+      </w:pPr>
+    </w:p>
+    <w:tbl>
+      <w:tblPr>
+        <w:tblW w:w="9026" w:type="dxa"/>
+        <w:tblBorders>
+          <w:top w:val="single" w:sz="4" w:space="0" w:color="000000"/>
+          <w:left w:val="single" w:sz="4" w:space="0" w:color="000000"/>
+          <w:bottom w:val="single" w:sz="4" w:space="0" w:color="000000"/>
+          <w:right w:val="single" w:sz="4" w:space="0" w:color="000000"/>
+          <w:insideH w:val="single" w:sz="4" w:space="0" w:color="000000"/>
+          <w:insideV w:val="single" w:sz="4" w:space="0" w:color="000000"/>
+        </w:tblBorders>
+        <w:tblLayout w:type="fixed"/>
+        <w:tblLook w:val="0000" w:firstRow="0" w:lastRow="0" w:firstColumn="0" w:lastColumn="0" w:noHBand="0" w:noVBand="0"/>
+      </w:tblPr>
+      <w:tblGrid>
+        <w:gridCol w:w="2000"/>
+        <w:gridCol w:w="7026"/>
+      </w:tblGrid>
+      <w:tr>
+        <w:tc>
+          <w:tcPr>
+            <w:tcW w:w="2000" w:type="dxa"/>
+            <w:tcBorders>
+              <w:top w:val="single" w:sz="4" w:space="0" w:color="000000"/>
+              <w:left w:val="single" w:sz="4" w:space="0" w:color="000000"/>
+              <w:bottom w:val="single" w:sz="4" w:space="0" w:color="000000"/>
+              <w:right w:val="single" w:sz="4" w:space="0" w:color="000000"/>
+            </w:tcBorders>
+            <w:tcMar>
+              <w:top w:w="80" w:type="dxa"/>
+              <w:left w:w="120" w:type="dxa"/>
+              <w:bottom w:w="80" w:type="dxa"/>
+              <w:right w:w="120" w:type="dxa"/>
+            </w:tcMar>
+          </w:tcPr>
+          <w:p>
+            <w:pPr>
+              <w:spacing w:line="320" w:lineRule="auto"/>
+            </w:pPr>
+            <w:r>
+              <w:rPr>
+                <w:b/>
+                <w:bCs/>
+              </w:rPr>
+              <w:t>[User Story 1.3 – Should]</w:t>
+            </w:r>
+          </w:p>
+        </w:tc>
+        <w:tc>
+          <w:tcPr>
+            <w:tcW w:w="7026" w:type="dxa"/>
+            <w:tcBorders>
+              <w:top w:val="single" w:sz="4" w:space="0" w:color="000000"/>
+              <w:left w:val="single" w:sz="4" w:space="0" w:color="000000"/>
+              <w:bottom w:val="single" w:sz="4" w:space="0" w:color="000000"/>
+              <w:right w:val="single" w:sz="4" w:space="0" w:color="000000"/>
+            </w:tcBorders>
+            <w:tcMar>
+              <w:top w:w="80" w:type="dxa"/>
+              <w:left w:w="120" w:type="dxa"/>
+              <w:bottom w:w="80" w:type="dxa"/>
+              <w:right w:w="120" w:type="dxa"/>
+            </w:tcMar>
+          </w:tcPr>
+          <w:p>
+            <w:pPr>
+              <w:spacing w:line="320" w:lineRule="auto"/>
+            </w:pPr>
+            <w:r>
+              <w:t>In order to manage who can see the food items I put for donation, I must set up my donation listing visibility (public or private) as a registered user.</w:t>
+            </w:r>
+          </w:p>
+        </w:tc>
+      </w:tr>
+      <w:tr>
+        <w:tc>
+          <w:tcPr>
+            <w:tcW w:w="2000" w:type="dxa"/>
+            <w:tcBorders>
+              <w:top w:val="single" w:sz="4" w:space="0" w:color="000000"/>
+              <w:left w:val="single" w:sz="4" w:space="0" w:color="000000"/>
+              <w:bottom w:val="single" w:sz="4" w:space="0" w:color="000000"/>
+              <w:right w:val="single" w:sz="4" w:space="0" w:color="000000"/>
+            </w:tcBorders>
+            <w:tcMar>
+              <w:top w:w="80" w:type="dxa"/>
+              <w:left w:w="120" w:type="dxa"/>
+              <w:bottom w:w="80" w:type="dxa"/>
+              <w:right w:w="120" w:type="dxa"/>
+            </w:tcMar>
+          </w:tcPr>
+          <w:p>
+            <w:pPr>
+              <w:spacing w:line="320" w:lineRule="auto"/>
+            </w:pPr>
+            <w:r>
+              <w:rPr>
+                <w:b/>
+                <w:bCs/>
+              </w:rPr>
+              <w:t>Acceptance Criteria</w:t>
+            </w:r>
+          </w:p>
+        </w:tc>
+        <w:tc>
+          <w:tcPr>
+            <w:tcW w:w="7026" w:type="dxa"/>
+            <w:tcBorders>
+              <w:top w:val="single" w:sz="4" w:space="0" w:color="000000"/>
+              <w:left w:val="single" w:sz="4" w:space="0" w:color="000000"/>
+              <w:bottom w:val="single" w:sz="4" w:space="0" w:color="000000"/>
+              <w:right w:val="single" w:sz="4" w:space="0" w:color="000000"/>
+            </w:tcBorders>
+            <w:tcMar>
+              <w:top w:w="80" w:type="dxa"/>
+              <w:left w:w="120" w:type="dxa"/>
+              <w:bottom w:w="80" w:type="dxa"/>
+              <w:right w:w="120" w:type="dxa"/>
+            </w:tcMar>
+          </w:tcPr>
+          <w:p>
+            <w:pPr>
+              <w:spacing w:line="320" w:lineRule="auto"/>
+            </w:pPr>
+            <w:r>
+              <w:t>When a user switches donation visibility between Public and Private Listings while on the Privacy Preferences screen, the system instantly stores the preference and applies it to all subsequent donation listings that the user creates.</w:t>
+            </w:r>
+          </w:p>
+        </w:tc>
+      </w:tr>
+      <w:tr>
+        <w:tc>
+          <w:tcPr>
+            <w:tcW w:w="2000" w:type="dxa"/>
+            <w:tcBorders>
+              <w:top w:val="single" w:sz="4" w:space="0" w:color="000000"/>
+              <w:left w:val="single" w:sz="4" w:space="0" w:color="000000"/>
+              <w:bottom w:val="single" w:sz="4" w:space="0" w:color="000000"/>
+              <w:right w:val="single" w:sz="4" w:space="0" w:color="000000"/>
+            </w:tcBorders>
+            <w:tcMar>
+              <w:top w:w="80" w:type="dxa"/>
+              <w:left w:w="120" w:type="dxa"/>
+              <w:bottom w:w="80" w:type="dxa"/>
+              <w:right w:w="120" w:type="dxa"/>
+            </w:tcMar>
+          </w:tcPr>
+          <w:p>
+            <w:pPr>
+              <w:spacing w:line="320" w:lineRule="auto"/>
+            </w:pPr>
+            <w:r>
+              <w:rPr>
+                <w:b/>
+                <w:bCs/>
+              </w:rPr>
+              <w:t>MoSCoW</w:t>
+            </w:r>
+          </w:p>
+        </w:tc>
+        <w:tc>
+          <w:tcPr>
+            <w:tcW w:w="7026" w:type="dxa"/>
+            <w:tcBorders>
+              <w:top w:val="single" w:sz="4" w:space="0" w:color="000000"/>
+              <w:left w:val="single" w:sz="4" w:space="0" w:color="000000"/>
+              <w:bottom w:val="single" w:sz="4" w:space="0" w:color="000000"/>
+              <w:right w:val="single" w:sz="4" w:space="0" w:color="000000"/>
+            </w:tcBorders>
+            <w:tcMar>
+              <w:top w:w="80" w:type="dxa"/>
+              <w:left w:w="120" w:type="dxa"/>
+              <w:bottom w:w="80" w:type="dxa"/>
+              <w:right w:w="120" w:type="dxa"/>
+            </w:tcMar>
+          </w:tcPr>
+          <w:p>
+            <w:pPr>
+              <w:spacing w:line="320" w:lineRule="auto"/>
+            </w:pPr>
+            <w:r>
+              <w:t>Should Have</w:t>
+            </w:r>
+          </w:p>
+        </w:tc>
+      </w:tr>
+      <w:tr>
+        <w:tc>
+          <w:tcPr>
+            <w:tcW w:w="2000" w:type="dxa"/>
+            <w:tcBorders>
+              <w:top w:val="single" w:sz="4" w:space="0" w:color="000000"/>
+              <w:left w:val="single" w:sz="4" w:space="0" w:color="000000"/>
+              <w:bottom w:val="single" w:sz="4" w:space="0" w:color="000000"/>
+              <w:right w:val="single" w:sz="4" w:space="0" w:color="000000"/>
+            </w:tcBorders>
+            <w:tcMar>
+              <w:top w:w="80" w:type="dxa"/>
+              <w:left w:w="120" w:type="dxa"/>
+              <w:bottom w:w="80" w:type="dxa"/>
+              <w:right w:w="120" w:type="dxa"/>
+            </w:tcMar>
+          </w:tcPr>
+          <w:p>
+            <w:pPr>
+              <w:spacing w:line="320" w:lineRule="auto"/>
+            </w:pPr>
+            <w:r>
+              <w:rPr>
+                <w:b/>
+                <w:bCs/>
+              </w:rPr>
+              <w:t>Tasks</w:t>
+            </w:r>
+          </w:p>
+        </w:tc>
+        <w:tc>
+          <w:tcPr>
+            <w:tcW w:w="7026" w:type="dxa"/>
+            <w:tcBorders>
+              <w:top w:val="single" w:sz="4" w:space="0" w:color="000000"/>
+              <w:left w:val="single" w:sz="4" w:space="0" w:color="000000"/>
+              <w:bottom w:val="single" w:sz="4" w:space="0" w:color="000000"/>
+              <w:right w:val="single" w:sz="4" w:space="0" w:color="000000"/>
+            </w:tcBorders>
+            <w:tcMar>
+              <w:top w:w="80" w:type="dxa"/>
+              <w:left w:w="120" w:type="dxa"/>
+              <w:bottom w:w="80" w:type="dxa"/>
+              <w:right w:w="120" w:type="dxa"/>
+            </w:tcMar>
+          </w:tcPr>
+          <w:p>
+            <w:pPr>
+              <w:numPr>
+                <w:ilvl w:val="0"/>
+                <w:numId w:val="1"/>
+              </w:numPr>
+              <w:spacing w:after="0" w:line="320" w:lineRule="auto"/>
+            </w:pPr>
+            <w:r>
+              <w:t>Create a Privacy Preferences UI component</w:t>
+            </w:r>
+          </w:p>
+          <w:p>
+            <w:pPr>
+              <w:numPr>
+                <w:ilvl w:val="0"/>
+                <w:numId w:val="1"/>
+              </w:numPr>
+              <w:spacing w:after="0" w:line="320" w:lineRule="auto"/>
+            </w:pPr>
+            <w:r>
+              <w:t>Architect PATCH /api/user/privacy capability</w:t>
+            </w:r>
+          </w:p>
+          <w:p>
+            <w:pPr>
+              <w:numPr>
+                <w:ilvl w:val="0"/>
+                <w:numId w:val="1"/>
+              </w:numPr>
+              <w:spacing w:after="0" w:line="320" w:lineRule="auto"/>
+            </w:pPr>
+            <w:r>
+              <w:t>Adjust donation record query to fetch only the user's visibility level data</w:t>
+            </w:r>
+          </w:p>
+          <w:p>
+            <w:pPr>
+              <w:numPr>
+                <w:ilvl w:val="0"/>
+                <w:numId w:val="1"/>
+              </w:numPr>
+              <w:spacing w:after="0" w:line="320" w:lineRule="auto"/>
+            </w:pPr>
+            <w:r>
+              <w:t>Construct unit testing coverage for the privacy filter algorithm</w:t>
+            </w:r>
+          </w:p>
+        </w:tc>
+      </w:tr>
+      <w:tr>
+        <w:tc>
+          <w:tcPr>
+            <w:tcW w:w="2000" w:type="dxa"/>
+            <w:tcBorders>
+              <w:top w:val="single" w:sz="4" w:space="0" w:color="000000"/>
+              <w:left w:val="single" w:sz="4" w:space="0" w:color="000000"/>
+              <w:bottom w:val="single" w:sz="4" w:space="0" w:color="000000"/>
+              <w:right w:val="single" w:sz="4" w:space="0" w:color="000000"/>
+            </w:tcBorders>
+            <w:tcMar>
+              <w:top w:w="80" w:type="dxa"/>
+              <w:left w:w="120" w:type="dxa"/>
+              <w:bottom w:w="80" w:type="dxa"/>
+              <w:right w:w="120" w:type="dxa"/>
+            </w:tcMar>
+          </w:tcPr>
+          <w:p>
+            <w:pPr>
+              <w:spacing w:line="320" w:lineRule="auto"/>
+            </w:pPr>
+            <w:r>
+              <w:rPr>
+                <w:b/>
+                <w:bCs/>
+              </w:rPr>
+              <w:t>Test Cases</w:t>
+            </w:r>
+          </w:p>
+        </w:tc>
+        <w:tc>
+          <w:tcPr>
+            <w:tcW w:w="7026" w:type="dxa"/>
+            <w:tcBorders>
+              <w:top w:val="single" w:sz="4" w:space="0" w:color="000000"/>
+              <w:left w:val="single" w:sz="4" w:space="0" w:color="000000"/>
+              <w:bottom w:val="single" w:sz="4" w:space="0" w:color="000000"/>
+              <w:right w:val="single" w:sz="4" w:space="0" w:color="000000"/>
+            </w:tcBorders>
+            <w:tcMar>
+              <w:top w:w="80" w:type="dxa"/>
+              <w:left w:w="120" w:type="dxa"/>
+              <w:bottom w:w="80" w:type="dxa"/>
+              <w:right w:w="120" w:type="dxa"/>
+            </w:tcMar>
+          </w:tcPr>
+          <w:p>
+            <w:pPr>
+              <w:spacing w:line="320" w:lineRule="auto"/>
+            </w:pPr>
+            <w:r>
+              <w:t>to be completed in Assignment 2</w:t>
+            </w:r>
+          </w:p>
+        </w:tc>
+      </w:tr>
+    </w:tbl>
+    <w:p>
+      <w:pPr>
+        <w:spacing w:line="360" w:lineRule="auto"/>
+      </w:pPr>
+    </w:p>
+    <w:tbl>
+      <w:tblPr>
+        <w:tblW w:w="9026" w:type="dxa"/>
+        <w:tblBorders>
+          <w:top w:val="single" w:sz="4" w:space="0" w:color="000000"/>
+          <w:left w:val="single" w:sz="4" w:space="0" w:color="000000"/>
+          <w:bottom w:val="single" w:sz="4" w:space="0" w:color="000000"/>
+          <w:right w:val="single" w:sz="4" w:space="0" w:color="000000"/>
+          <w:insideH w:val="single" w:sz="4" w:space="0" w:color="000000"/>
+          <w:insideV w:val="single" w:sz="4" w:space="0" w:color="000000"/>
+        </w:tblBorders>
+        <w:tblLayout w:type="fixed"/>
+        <w:tblLook w:val="0000" w:firstRow="0" w:lastRow="0" w:firstColumn="0" w:lastColumn="0" w:noHBand="0" w:noVBand="0"/>
+      </w:tblPr>
+      <w:tblGrid>
+        <w:gridCol w:w="2000"/>
+        <w:gridCol w:w="7026"/>
+      </w:tblGrid>
+      <w:tr>
+        <w:tc>
+          <w:tcPr>
+            <w:tcW w:w="2000" w:type="dxa"/>
+            <w:tcBorders>
+              <w:top w:val="single" w:sz="4" w:space="0" w:color="000000"/>
+              <w:left w:val="single" w:sz="4" w:space="0" w:color="000000"/>
+              <w:bottom w:val="single" w:sz="4" w:space="0" w:color="000000"/>
+              <w:right w:val="single" w:sz="4" w:space="0" w:color="000000"/>
+            </w:tcBorders>
+            <w:tcMar>
+              <w:top w:w="80" w:type="dxa"/>
+              <w:left w:w="120" w:type="dxa"/>
+              <w:bottom w:w="80" w:type="dxa"/>
+              <w:right w:w="120" w:type="dxa"/>
+            </w:tcMar>
+          </w:tcPr>
+          <w:p>
+            <w:pPr>
+              <w:spacing w:line="320" w:lineRule="auto"/>
+            </w:pPr>
+            <w:r>
+              <w:rPr>
+                <w:b/>
+                <w:bCs/>
+              </w:rPr>
+              <w:t>[User Story 1.4 – Could]</w:t>
+            </w:r>
+          </w:p>
+        </w:tc>
+        <w:tc>
+          <w:tcPr>
+            <w:tcW w:w="7026" w:type="dxa"/>
+            <w:tcBorders>
+              <w:top w:val="single" w:sz="4" w:space="0" w:color="000000"/>
+              <w:left w:val="single" w:sz="4" w:space="0" w:color="000000"/>
+              <w:bottom w:val="single" w:sz="4" w:space="0" w:color="000000"/>
+              <w:right w:val="single" w:sz="4" w:space="0" w:color="000000"/>
+            </w:tcBorders>
+            <w:tcMar>
+              <w:top w:w="80" w:type="dxa"/>
+              <w:left w:w="120" w:type="dxa"/>
+              <w:bottom w:w="80" w:type="dxa"/>
+              <w:right w:w="120" w:type="dxa"/>
+            </w:tcMar>
+          </w:tcPr>
+          <w:p>
+            <w:pPr>
+              <w:spacing w:line="320" w:lineRule="auto"/>
+            </w:pPr>
+            <w:r>
+              <w:t>After registering, I could receive a customized welcome email with a quick-start guide to help me rapidly grasp how to use the site.</w:t>
+            </w:r>
+          </w:p>
+        </w:tc>
+      </w:tr>
+      <w:tr>
+        <w:tc>
+          <w:tcPr>
+            <w:tcW w:w="2000" w:type="dxa"/>
+            <w:tcBorders>
+              <w:top w:val="single" w:sz="4" w:space="0" w:color="000000"/>
+              <w:left w:val="single" w:sz="4" w:space="0" w:color="000000"/>
+              <w:bottom w:val="single" w:sz="4" w:space="0" w:color="000000"/>
+              <w:right w:val="single" w:sz="4" w:space="0" w:color="000000"/>
+            </w:tcBorders>
+            <w:tcMar>
+              <w:top w:w="80" w:type="dxa"/>
+              <w:left w:w="120" w:type="dxa"/>
+              <w:bottom w:w="80" w:type="dxa"/>
+              <w:right w:w="120" w:type="dxa"/>
+            </w:tcMar>
+          </w:tcPr>
+          <w:p>
+            <w:pPr>
+              <w:spacing w:line="320" w:lineRule="auto"/>
+            </w:pPr>
+            <w:r>
+              <w:rPr>
+                <w:b/>
+                <w:bCs/>
+              </w:rPr>
+              <w:t>Acceptance Criteria</w:t>
+            </w:r>
+          </w:p>
+        </w:tc>
+        <w:tc>
+          <w:tcPr>
+            <w:tcW w:w="7026" w:type="dxa"/>
+            <w:tcBorders>
+              <w:top w:val="single" w:sz="4" w:space="0" w:color="000000"/>
+              <w:left w:val="single" w:sz="4" w:space="0" w:color="000000"/>
+              <w:bottom w:val="single" w:sz="4" w:space="0" w:color="000000"/>
+              <w:right w:val="single" w:sz="4" w:space="0" w:color="000000"/>
+            </w:tcBorders>
+            <w:tcMar>
+              <w:top w:w="80" w:type="dxa"/>
+              <w:left w:w="120" w:type="dxa"/>
+              <w:bottom w:w="80" w:type="dxa"/>
+              <w:right w:w="120" w:type="dxa"/>
+            </w:tcMar>
+          </w:tcPr>
+          <w:p>
+            <w:pPr>
+              <w:spacing w:line="320" w:lineRule="auto"/>
+            </w:pPr>
+            <w:r>
+              <w:t>Once the user has verified their email and activated their account, the system will automatically send a well-formatted welcome email with a quick overview of features and a link to the dashboard.</w:t>
+            </w:r>
+          </w:p>
+        </w:tc>
+      </w:tr>
+      <w:tr>
+        <w:tc>
+          <w:tcPr>
+            <w:tcW w:w="2000" w:type="dxa"/>
+            <w:tcBorders>
+              <w:top w:val="single" w:sz="4" w:space="0" w:color="000000"/>
+              <w:left w:val="single" w:sz="4" w:space="0" w:color="000000"/>
+              <w:bottom w:val="single" w:sz="4" w:space="0" w:color="000000"/>
+              <w:right w:val="single" w:sz="4" w:space="0" w:color="000000"/>
+            </w:tcBorders>
+            <w:tcMar>
+              <w:top w:w="80" w:type="dxa"/>
+              <w:left w:w="120" w:type="dxa"/>
+              <w:bottom w:w="80" w:type="dxa"/>
+              <w:right w:w="120" w:type="dxa"/>
+            </w:tcMar>
+          </w:tcPr>
+          <w:p>
+            <w:pPr>
+              <w:spacing w:line="320" w:lineRule="auto"/>
+            </w:pPr>
+            <w:r>
+              <w:rPr>
+                <w:b/>
+                <w:bCs/>
+              </w:rPr>
+              <w:t>MoSCoW</w:t>
+            </w:r>
+          </w:p>
+        </w:tc>
+        <w:tc>
+          <w:tcPr>
+            <w:tcW w:w="7026" w:type="dxa"/>
+            <w:tcBorders>
+              <w:top w:val="single" w:sz="4" w:space="0" w:color="000000"/>
+              <w:left w:val="single" w:sz="4" w:space="0" w:color="000000"/>
+              <w:bottom w:val="single" w:sz="4" w:space="0" w:color="000000"/>
+              <w:right w:val="single" w:sz="4" w:space="0" w:color="000000"/>
+            </w:tcBorders>
+            <w:tcMar>
+              <w:top w:w="80" w:type="dxa"/>
+              <w:left w:w="120" w:type="dxa"/>
+              <w:bottom w:w="80" w:type="dxa"/>
+              <w:right w:w="120" w:type="dxa"/>
+            </w:tcMar>
+          </w:tcPr>
+          <w:p>
+            <w:pPr>
+              <w:spacing w:line="320" w:lineRule="auto"/>
+            </w:pPr>
+            <w:r>
+              <w:t>Could Have</w:t>
+            </w:r>
+          </w:p>
+        </w:tc>
+      </w:tr>
+      <w:tr>
+        <w:tc>
+          <w:tcPr>
+            <w:tcW w:w="2000" w:type="dxa"/>
+            <w:tcBorders>
+              <w:top w:val="single" w:sz="4" w:space="0" w:color="000000"/>
+              <w:left w:val="single" w:sz="4" w:space="0" w:color="000000"/>
+              <w:bottom w:val="single" w:sz="4" w:space="0" w:color="000000"/>
+              <w:right w:val="single" w:sz="4" w:space="0" w:color="000000"/>
+            </w:tcBorders>
+            <w:tcMar>
+              <w:top w:w="80" w:type="dxa"/>
+              <w:left w:w="120" w:type="dxa"/>
+              <w:bottom w:w="80" w:type="dxa"/>
+              <w:right w:w="120" w:type="dxa"/>
+            </w:tcMar>
+          </w:tcPr>
+          <w:p>
+            <w:pPr>
+              <w:spacing w:line="320" w:lineRule="auto"/>
+            </w:pPr>
+            <w:r>
+              <w:rPr>
+                <w:b/>
+                <w:bCs/>
+              </w:rPr>
+              <w:t>Tasks</w:t>
+            </w:r>
+          </w:p>
+        </w:tc>
+        <w:tc>
+          <w:tcPr>
+            <w:tcW w:w="7026" w:type="dxa"/>
+            <w:tcBorders>
+              <w:top w:val="single" w:sz="4" w:space="0" w:color="000000"/>
+              <w:left w:val="single" w:sz="4" w:space="0" w:color="000000"/>
+              <w:bottom w:val="single" w:sz="4" w:space="0" w:color="000000"/>
+              <w:right w:val="single" w:sz="4" w:space="0" w:color="000000"/>
+            </w:tcBorders>
+            <w:tcMar>
+              <w:top w:w="80" w:type="dxa"/>
+              <w:left w:w="120" w:type="dxa"/>
+              <w:bottom w:w="80" w:type="dxa"/>
+              <w:right w:w="120" w:type="dxa"/>
+            </w:tcMar>
+          </w:tcPr>
+          <w:p>
+            <w:pPr>
+              <w:numPr>
+                <w:ilvl w:val="0"/>
+                <w:numId w:val="5"/>
+              </w:numPr>
+              <w:spacing w:after="0" w:line="320" w:lineRule="auto"/>
+            </w:pPr>
+            <w:r>
+              <w:t xml:space="preserve">Create an HTML template for a welcome email. </w:t>
+            </w:r>
+          </w:p>
+          <w:p>
+            <w:pPr>
+              <w:numPr>
+                <w:ilvl w:val="0"/>
+                <w:numId w:val="5"/>
+              </w:numPr>
+              <w:spacing w:after="0" w:line="320" w:lineRule="auto"/>
+            </w:pPr>
+            <w:r>
+              <w:t xml:space="preserve">Include an email dispatch trigger for the event of account activation. </w:t>
+            </w:r>
+          </w:p>
+          <w:p>
+            <w:pPr>
+              <w:numPr>
+                <w:ilvl w:val="0"/>
+                <w:numId w:val="5"/>
+              </w:numPr>
+              <w:spacing w:after="0" w:line="320" w:lineRule="auto"/>
+            </w:pPr>
+            <w:r>
+              <w:t xml:space="preserve">Verify delivery using the main email clients </w:t>
+            </w:r>
+          </w:p>
+        </w:tc>
+      </w:tr>
+      <w:tr>
+        <w:tc>
+          <w:tcPr>
+            <w:tcW w:w="2000" w:type="dxa"/>
+            <w:tcBorders>
+              <w:top w:val="single" w:sz="4" w:space="0" w:color="000000"/>
+              <w:left w:val="single" w:sz="4" w:space="0" w:color="000000"/>
+              <w:bottom w:val="single" w:sz="4" w:space="0" w:color="000000"/>
+              <w:right w:val="single" w:sz="4" w:space="0" w:color="000000"/>
+            </w:tcBorders>
+            <w:tcMar>
+              <w:top w:w="80" w:type="dxa"/>
+              <w:left w:w="120" w:type="dxa"/>
+              <w:bottom w:w="80" w:type="dxa"/>
+              <w:right w:w="120" w:type="dxa"/>
+            </w:tcMar>
+          </w:tcPr>
+          <w:p>
+            <w:pPr>
+              <w:spacing w:line="320" w:lineRule="auto"/>
+            </w:pPr>
+            <w:r>
+              <w:rPr>
+                <w:b/>
+                <w:bCs/>
+              </w:rPr>
+              <w:t>Test Cases</w:t>
+            </w:r>
+          </w:p>
+        </w:tc>
+        <w:tc>
+          <w:tcPr>
+            <w:tcW w:w="7026" w:type="dxa"/>
+            <w:tcBorders>
+              <w:top w:val="single" w:sz="4" w:space="0" w:color="000000"/>
+              <w:left w:val="single" w:sz="4" w:space="0" w:color="000000"/>
+              <w:bottom w:val="single" w:sz="4" w:space="0" w:color="000000"/>
+              <w:right w:val="single" w:sz="4" w:space="0" w:color="000000"/>
+            </w:tcBorders>
+            <w:tcMar>
+              <w:top w:w="80" w:type="dxa"/>
+              <w:left w:w="120" w:type="dxa"/>
+              <w:bottom w:w="80" w:type="dxa"/>
+              <w:right w:w="120" w:type="dxa"/>
+            </w:tcMar>
+          </w:tcPr>
+          <w:p>
+            <w:pPr>
+              <w:spacing w:line="320" w:lineRule="auto"/>
+            </w:pPr>
+            <w:r>
+              <w:t>to be completed in Assignment 2</w:t>
+            </w:r>
+          </w:p>
+        </w:tc>
+      </w:tr>
+    </w:tbl>
+    <w:p>
+      <w:pPr>
+        <w:spacing w:line="360" w:lineRule="auto"/>
+      </w:pPr>
+    </w:p>
+    <w:p>
+      <w:pPr>
+        <w:pStyle w:val="Heading3"/>
+        <w:spacing w:before="160" w:after="80"/>
+      </w:pPr>
+      <w:bookmarkStart w:id="8" w:name="_heading=h.58to6wsib549" w:colFirst="0" w:colLast="0"/>
+      <w:bookmarkEnd w:id="8"/>
+      <w:r>
+        <w:t>[Epic 2] – Food Analytics and Impact Reporting</w:t>
+      </w:r>
+    </w:p>
+    <w:p>
+      <w:pPr>
+        <w:spacing w:after="120" w:line="360" w:lineRule="auto"/>
+        <w:jc w:val="both"/>
+      </w:pPr>
+      <w:r>
+        <w:t xml:space="preserve">This article discusses SavePlate's analytics tools, which enable customers to monitor their food-saving impact over time via reports and visual dashboards. </w:t>
+      </w:r>
+    </w:p>
+    <w:tbl>
+      <w:tblPr>
+        <w:tblW w:w="9026" w:type="dxa"/>
+        <w:tblBorders>
+          <w:top w:val="single" w:sz="4" w:space="0" w:color="000000"/>
+          <w:left w:val="single" w:sz="4" w:space="0" w:color="000000"/>
+          <w:bottom w:val="single" w:sz="4" w:space="0" w:color="000000"/>
+          <w:right w:val="single" w:sz="4" w:space="0" w:color="000000"/>
+          <w:insideH w:val="single" w:sz="4" w:space="0" w:color="000000"/>
+          <w:insideV w:val="single" w:sz="4" w:space="0" w:color="000000"/>
+        </w:tblBorders>
+        <w:tblLayout w:type="fixed"/>
+        <w:tblLook w:val="0000" w:firstRow="0" w:lastRow="0" w:firstColumn="0" w:lastColumn="0" w:noHBand="0" w:noVBand="0"/>
+      </w:tblPr>
+      <w:tblGrid>
+        <w:gridCol w:w="2000"/>
+        <w:gridCol w:w="7026"/>
+      </w:tblGrid>
+      <w:tr>
+        <w:tc>
+          <w:tcPr>
+            <w:tcW w:w="2000" w:type="dxa"/>
+            <w:tcBorders>
+              <w:top w:val="single" w:sz="4" w:space="0" w:color="000000"/>
+              <w:left w:val="single" w:sz="4" w:space="0" w:color="000000"/>
+              <w:bottom w:val="single" w:sz="4" w:space="0" w:color="000000"/>
+              <w:right w:val="single" w:sz="4" w:space="0" w:color="000000"/>
+            </w:tcBorders>
+            <w:tcMar>
+              <w:top w:w="80" w:type="dxa"/>
+              <w:left w:w="120" w:type="dxa"/>
+              <w:bottom w:w="80" w:type="dxa"/>
+              <w:right w:w="120" w:type="dxa"/>
+            </w:tcMar>
+          </w:tcPr>
+          <w:p>
+            <w:pPr>
+              <w:spacing w:line="320" w:lineRule="auto"/>
+            </w:pPr>
+            <w:r>
+              <w:rPr>
+                <w:b/>
+                <w:bCs/>
+              </w:rPr>
+              <w:t>[User Story 2.1]</w:t>
+            </w:r>
+          </w:p>
+        </w:tc>
+        <w:tc>
+          <w:tcPr>
+            <w:tcW w:w="7026" w:type="dxa"/>
+            <w:tcBorders>
+              <w:top w:val="single" w:sz="4" w:space="0" w:color="000000"/>
+              <w:left w:val="single" w:sz="4" w:space="0" w:color="000000"/>
+              <w:bottom w:val="single" w:sz="4" w:space="0" w:color="000000"/>
+              <w:right w:val="single" w:sz="4" w:space="0" w:color="000000"/>
+            </w:tcBorders>
+            <w:tcMar>
+              <w:top w:w="80" w:type="dxa"/>
+              <w:left w:w="120" w:type="dxa"/>
+              <w:bottom w:w="80" w:type="dxa"/>
+              <w:right w:w="120" w:type="dxa"/>
+            </w:tcMar>
+          </w:tcPr>
+          <w:p>
+            <w:pPr>
+              <w:spacing w:line="320" w:lineRule="auto"/>
+            </w:pPr>
+            <w:r>
+              <w:t>Being a registered user, I want to see a visual dashboard highlighting the overall quantity of food saved and donated by me, to be able to keep track of my individual efforts in lowering waste.</w:t>
+            </w:r>
+          </w:p>
+        </w:tc>
+      </w:tr>
+      <w:tr>
+        <w:tc>
+          <w:tcPr>
+            <w:tcW w:w="2000" w:type="dxa"/>
+            <w:tcBorders>
+              <w:top w:val="single" w:sz="4" w:space="0" w:color="000000"/>
+              <w:left w:val="single" w:sz="4" w:space="0" w:color="000000"/>
+              <w:bottom w:val="single" w:sz="4" w:space="0" w:color="000000"/>
+              <w:right w:val="single" w:sz="4" w:space="0" w:color="000000"/>
+            </w:tcBorders>
+            <w:tcMar>
+              <w:top w:w="80" w:type="dxa"/>
+              <w:left w:w="120" w:type="dxa"/>
+              <w:bottom w:w="80" w:type="dxa"/>
+              <w:right w:w="120" w:type="dxa"/>
+            </w:tcMar>
+          </w:tcPr>
+          <w:p>
+            <w:pPr>
+              <w:spacing w:line="320" w:lineRule="auto"/>
+            </w:pPr>
+            <w:r>
+              <w:rPr>
+                <w:b/>
+                <w:bCs/>
+              </w:rPr>
+              <w:t>Acceptance Criteria</w:t>
+            </w:r>
+          </w:p>
+        </w:tc>
+        <w:tc>
+          <w:tcPr>
+            <w:tcW w:w="7026" w:type="dxa"/>
+            <w:tcBorders>
+              <w:top w:val="single" w:sz="4" w:space="0" w:color="000000"/>
+              <w:left w:val="single" w:sz="4" w:space="0" w:color="000000"/>
+              <w:bottom w:val="single" w:sz="4" w:space="0" w:color="000000"/>
+              <w:right w:val="single" w:sz="4" w:space="0" w:color="000000"/>
+            </w:tcBorders>
+            <w:tcMar>
+              <w:top w:w="80" w:type="dxa"/>
+              <w:left w:w="120" w:type="dxa"/>
+              <w:bottom w:w="80" w:type="dxa"/>
+              <w:right w:w="120" w:type="dxa"/>
+            </w:tcMar>
+          </w:tcPr>
+          <w:p>
+            <w:pPr>
+              <w:spacing w:line="320" w:lineRule="auto"/>
+            </w:pPr>
+            <w:r>
+              <w:t>Imagine a user going to the Analytics section, and the page loads, then the system will fetch all the inventory and donation records that the user had logged and will show total food saved (kg), number of donations made, items processed and the percentage of waste prevented as summary cards, together with monthly bar charts and category pie charts.</w:t>
+            </w:r>
+          </w:p>
+        </w:tc>
+      </w:tr>
+      <w:tr>
+        <w:tc>
+          <w:tcPr>
+            <w:tcW w:w="2000" w:type="dxa"/>
+            <w:tcBorders>
+              <w:top w:val="single" w:sz="4" w:space="0" w:color="000000"/>
+              <w:left w:val="single" w:sz="4" w:space="0" w:color="000000"/>
+              <w:bottom w:val="single" w:sz="4" w:space="0" w:color="000000"/>
+              <w:right w:val="single" w:sz="4" w:space="0" w:color="000000"/>
+            </w:tcBorders>
+            <w:tcMar>
+              <w:top w:w="80" w:type="dxa"/>
+              <w:left w:w="120" w:type="dxa"/>
+              <w:bottom w:w="80" w:type="dxa"/>
+              <w:right w:w="120" w:type="dxa"/>
+            </w:tcMar>
+          </w:tcPr>
+          <w:p>
+            <w:pPr>
+              <w:spacing w:line="320" w:lineRule="auto"/>
+            </w:pPr>
+            <w:r>
+              <w:rPr>
+                <w:b/>
+                <w:bCs/>
+              </w:rPr>
+              <w:t>MoSCoW</w:t>
+            </w:r>
+          </w:p>
+        </w:tc>
+        <w:tc>
+          <w:tcPr>
+            <w:tcW w:w="7026" w:type="dxa"/>
+            <w:tcBorders>
+              <w:top w:val="single" w:sz="4" w:space="0" w:color="000000"/>
+              <w:left w:val="single" w:sz="4" w:space="0" w:color="000000"/>
+              <w:bottom w:val="single" w:sz="4" w:space="0" w:color="000000"/>
+              <w:right w:val="single" w:sz="4" w:space="0" w:color="000000"/>
+            </w:tcBorders>
+            <w:tcMar>
+              <w:top w:w="80" w:type="dxa"/>
+              <w:left w:w="120" w:type="dxa"/>
+              <w:bottom w:w="80" w:type="dxa"/>
+              <w:right w:w="120" w:type="dxa"/>
+            </w:tcMar>
+          </w:tcPr>
+          <w:p>
+            <w:pPr>
+              <w:spacing w:line="320" w:lineRule="auto"/>
+            </w:pPr>
+            <w:r>
+              <w:t>Should Have</w:t>
+            </w:r>
+          </w:p>
+        </w:tc>
+      </w:tr>
+      <w:tr>
+        <w:tc>
+          <w:tcPr>
+            <w:tcW w:w="2000" w:type="dxa"/>
+            <w:tcBorders>
+              <w:top w:val="single" w:sz="4" w:space="0" w:color="000000"/>
+              <w:left w:val="single" w:sz="4" w:space="0" w:color="000000"/>
+              <w:bottom w:val="single" w:sz="4" w:space="0" w:color="000000"/>
+              <w:right w:val="single" w:sz="4" w:space="0" w:color="000000"/>
+            </w:tcBorders>
+            <w:tcMar>
+              <w:top w:w="80" w:type="dxa"/>
+              <w:left w:w="120" w:type="dxa"/>
+              <w:bottom w:w="80" w:type="dxa"/>
+              <w:right w:w="120" w:type="dxa"/>
+            </w:tcMar>
+          </w:tcPr>
+          <w:p>
+            <w:pPr>
+              <w:spacing w:line="320" w:lineRule="auto"/>
+            </w:pPr>
+            <w:r>
+              <w:rPr>
+                <w:b/>
+                <w:bCs/>
+              </w:rPr>
+              <w:t>Tasks</w:t>
+            </w:r>
+          </w:p>
+        </w:tc>
+        <w:tc>
+          <w:tcPr>
+            <w:tcW w:w="7026" w:type="dxa"/>
+            <w:tcBorders>
+              <w:top w:val="single" w:sz="4" w:space="0" w:color="000000"/>
+              <w:left w:val="single" w:sz="4" w:space="0" w:color="000000"/>
+              <w:bottom w:val="single" w:sz="4" w:space="0" w:color="000000"/>
+              <w:right w:val="single" w:sz="4" w:space="0" w:color="000000"/>
+            </w:tcBorders>
+            <w:tcMar>
+              <w:top w:w="80" w:type="dxa"/>
+              <w:left w:w="120" w:type="dxa"/>
+              <w:bottom w:w="80" w:type="dxa"/>
+              <w:right w:w="120" w:type="dxa"/>
+            </w:tcMar>
+          </w:tcPr>
+          <w:p>
+            <w:pPr>
+              <w:numPr>
+                <w:ilvl w:val="0"/>
+                <w:numId w:val="6"/>
+              </w:numPr>
+              <w:spacing w:after="0" w:line="320" w:lineRule="auto"/>
+            </w:pPr>
+            <w:r>
+              <w:t xml:space="preserve">In Figma design the layout of an analytics dashboard </w:t>
+            </w:r>
+          </w:p>
+          <w:p>
+            <w:pPr>
+              <w:numPr>
+                <w:ilvl w:val="0"/>
+                <w:numId w:val="6"/>
+              </w:numPr>
+              <w:spacing w:after="0" w:line="320" w:lineRule="auto"/>
+            </w:pPr>
+            <w:r>
+              <w:t xml:space="preserve">Build a GET /api/analytics endpoint to gather inventory and donation data  Add date range filtering capability (last 30 days, last 6 months, all time) </w:t>
+            </w:r>
+          </w:p>
+          <w:p>
+            <w:pPr>
+              <w:numPr>
+                <w:ilvl w:val="0"/>
+                <w:numId w:val="6"/>
+              </w:numPr>
+              <w:spacing w:after="0" w:line="320" w:lineRule="auto"/>
+            </w:pPr>
+            <w:r>
+              <w:t xml:space="preserve">Bring in Recharts or Chart.js to do bar and pie charts </w:t>
+            </w:r>
+          </w:p>
+          <w:p>
+            <w:pPr>
+              <w:numPr>
+                <w:ilvl w:val="0"/>
+                <w:numId w:val="6"/>
+              </w:numPr>
+              <w:spacing w:after="0" w:line="320" w:lineRule="auto"/>
+            </w:pPr>
+            <w:r>
+              <w:t>Create unit tests for the aggregation code</w:t>
+            </w:r>
+          </w:p>
+        </w:tc>
+      </w:tr>
+      <w:tr>
+        <w:tc>
+          <w:tcPr>
+            <w:tcW w:w="2000" w:type="dxa"/>
+            <w:tcBorders>
+              <w:top w:val="single" w:sz="4" w:space="0" w:color="000000"/>
+              <w:left w:val="single" w:sz="4" w:space="0" w:color="000000"/>
+              <w:bottom w:val="single" w:sz="4" w:space="0" w:color="000000"/>
+              <w:right w:val="single" w:sz="4" w:space="0" w:color="000000"/>
+            </w:tcBorders>
+            <w:tcMar>
+              <w:top w:w="80" w:type="dxa"/>
+              <w:left w:w="120" w:type="dxa"/>
+              <w:bottom w:w="80" w:type="dxa"/>
+              <w:right w:w="120" w:type="dxa"/>
+            </w:tcMar>
+          </w:tcPr>
+          <w:p>
+            <w:pPr>
+              <w:spacing w:line="320" w:lineRule="auto"/>
+            </w:pPr>
+            <w:r>
+              <w:rPr>
+                <w:b/>
+                <w:bCs/>
+              </w:rPr>
+              <w:t>Test Cases</w:t>
+            </w:r>
+          </w:p>
+        </w:tc>
+        <w:tc>
+          <w:tcPr>
+            <w:tcW w:w="7026" w:type="dxa"/>
+            <w:tcBorders>
+              <w:top w:val="single" w:sz="4" w:space="0" w:color="000000"/>
+              <w:left w:val="single" w:sz="4" w:space="0" w:color="000000"/>
+              <w:bottom w:val="single" w:sz="4" w:space="0" w:color="000000"/>
+              <w:right w:val="single" w:sz="4" w:space="0" w:color="000000"/>
+            </w:tcBorders>
+            <w:tcMar>
+              <w:top w:w="80" w:type="dxa"/>
+              <w:left w:w="120" w:type="dxa"/>
+              <w:bottom w:w="80" w:type="dxa"/>
+              <w:right w:w="120" w:type="dxa"/>
+            </w:tcMar>
+          </w:tcPr>
+          <w:p>
+            <w:pPr>
+              <w:spacing w:line="320" w:lineRule="auto"/>
+            </w:pPr>
+            <w:r>
+              <w:t>[Leave Blank – to be completed in Assignment 2]</w:t>
+            </w:r>
+          </w:p>
+        </w:tc>
+      </w:tr>
+    </w:tbl>
+    <w:p>
+      <w:pPr>
+        <w:spacing w:line="360" w:lineRule="auto"/>
+      </w:pPr>
+    </w:p>
+    <w:tbl>
+      <w:tblPr>
+        <w:tblW w:w="9026" w:type="dxa"/>
+        <w:tblBorders>
+          <w:top w:val="single" w:sz="4" w:space="0" w:color="000000"/>
+          <w:left w:val="single" w:sz="4" w:space="0" w:color="000000"/>
+          <w:bottom w:val="single" w:sz="4" w:space="0" w:color="000000"/>
+          <w:right w:val="single" w:sz="4" w:space="0" w:color="000000"/>
+          <w:insideH w:val="single" w:sz="4" w:space="0" w:color="000000"/>
+          <w:insideV w:val="single" w:sz="4" w:space="0" w:color="000000"/>
+        </w:tblBorders>
+        <w:tblLayout w:type="fixed"/>
+        <w:tblLook w:val="0000" w:firstRow="0" w:lastRow="0" w:firstColumn="0" w:lastColumn="0" w:noHBand="0" w:noVBand="0"/>
+      </w:tblPr>
+      <w:tblGrid>
+        <w:gridCol w:w="2000"/>
+        <w:gridCol w:w="7026"/>
+      </w:tblGrid>
+      <w:tr>
+        <w:tc>
+          <w:tcPr>
+            <w:tcW w:w="2000" w:type="dxa"/>
+            <w:tcBorders>
+              <w:top w:val="single" w:sz="4" w:space="0" w:color="000000"/>
+              <w:left w:val="single" w:sz="4" w:space="0" w:color="000000"/>
+              <w:bottom w:val="single" w:sz="4" w:space="0" w:color="000000"/>
+              <w:right w:val="single" w:sz="4" w:space="0" w:color="000000"/>
+            </w:tcBorders>
+            <w:tcMar>
+              <w:top w:w="80" w:type="dxa"/>
+              <w:left w:w="120" w:type="dxa"/>
+              <w:bottom w:w="80" w:type="dxa"/>
+              <w:right w:w="120" w:type="dxa"/>
+            </w:tcMar>
+          </w:tcPr>
+          <w:p>
+            <w:pPr>
+              <w:spacing w:line="320" w:lineRule="auto"/>
+            </w:pPr>
+            <w:r>
+              <w:rPr>
+                <w:b/>
+                <w:bCs/>
+              </w:rPr>
+              <w:t>[User Story 2.2]</w:t>
+            </w:r>
+          </w:p>
+        </w:tc>
+        <w:tc>
+          <w:tcPr>
+            <w:tcW w:w="7026" w:type="dxa"/>
+            <w:tcBorders>
+              <w:top w:val="single" w:sz="4" w:space="0" w:color="000000"/>
+              <w:left w:val="single" w:sz="4" w:space="0" w:color="000000"/>
+              <w:bottom w:val="single" w:sz="4" w:space="0" w:color="000000"/>
+              <w:right w:val="single" w:sz="4" w:space="0" w:color="000000"/>
+            </w:tcBorders>
+            <w:tcMar>
+              <w:top w:w="80" w:type="dxa"/>
+              <w:left w:w="120" w:type="dxa"/>
+              <w:bottom w:w="80" w:type="dxa"/>
+              <w:right w:w="120" w:type="dxa"/>
+            </w:tcMar>
+          </w:tcPr>
+          <w:p>
+            <w:pPr>
+              <w:spacing w:line="320" w:lineRule="auto"/>
+            </w:pPr>
+            <w:r>
+              <w:t>Since I have registered myself as a user, I want to use the filter of category and date range in my analytics, so that I will be able to understand the deeper insights of my food management behavior.</w:t>
+            </w:r>
+          </w:p>
+        </w:tc>
+      </w:tr>
+      <w:tr>
+        <w:tc>
+          <w:tcPr>
+            <w:tcW w:w="2000" w:type="dxa"/>
+            <w:tcBorders>
+              <w:top w:val="single" w:sz="4" w:space="0" w:color="000000"/>
+              <w:left w:val="single" w:sz="4" w:space="0" w:color="000000"/>
+              <w:bottom w:val="single" w:sz="4" w:space="0" w:color="000000"/>
+              <w:right w:val="single" w:sz="4" w:space="0" w:color="000000"/>
+            </w:tcBorders>
+            <w:tcMar>
+              <w:top w:w="80" w:type="dxa"/>
+              <w:left w:w="120" w:type="dxa"/>
+              <w:bottom w:w="80" w:type="dxa"/>
+              <w:right w:w="120" w:type="dxa"/>
+            </w:tcMar>
+          </w:tcPr>
+          <w:p>
+            <w:pPr>
+              <w:spacing w:line="320" w:lineRule="auto"/>
+            </w:pPr>
+            <w:r>
+              <w:rPr>
+                <w:b/>
+                <w:bCs/>
+              </w:rPr>
+              <w:t>Acceptance Criteria</w:t>
+            </w:r>
+          </w:p>
+        </w:tc>
+        <w:tc>
+          <w:tcPr>
+            <w:tcW w:w="7026" w:type="dxa"/>
+            <w:tcBorders>
+              <w:top w:val="single" w:sz="4" w:space="0" w:color="000000"/>
+              <w:left w:val="single" w:sz="4" w:space="0" w:color="000000"/>
+              <w:bottom w:val="single" w:sz="4" w:space="0" w:color="000000"/>
+              <w:right w:val="single" w:sz="4" w:space="0" w:color="000000"/>
+            </w:tcBorders>
+            <w:tcMar>
+              <w:top w:w="80" w:type="dxa"/>
+              <w:left w:w="120" w:type="dxa"/>
+              <w:bottom w:w="80" w:type="dxa"/>
+              <w:right w:w="120" w:type="dxa"/>
+            </w:tcMar>
+          </w:tcPr>
+          <w:p>
+            <w:pPr>
+              <w:spacing w:line="320" w:lineRule="auto"/>
+            </w:pPr>
+            <w:r>
+              <w:t xml:space="preserve">When a user chooses a category filter (like "Dairy" or "Frozen") and a period range (like "Last 30 days") while viewing the analytics dashboard, All charts and summary statistics are updated by the system to only show the subset of filtered data. </w:t>
+            </w:r>
+          </w:p>
+        </w:tc>
+      </w:tr>
+      <w:tr>
+        <w:tc>
+          <w:tcPr>
+            <w:tcW w:w="2000" w:type="dxa"/>
+            <w:tcBorders>
+              <w:top w:val="single" w:sz="4" w:space="0" w:color="000000"/>
+              <w:left w:val="single" w:sz="4" w:space="0" w:color="000000"/>
+              <w:bottom w:val="single" w:sz="4" w:space="0" w:color="000000"/>
+              <w:right w:val="single" w:sz="4" w:space="0" w:color="000000"/>
+            </w:tcBorders>
+            <w:tcMar>
+              <w:top w:w="80" w:type="dxa"/>
+              <w:left w:w="120" w:type="dxa"/>
+              <w:bottom w:w="80" w:type="dxa"/>
+              <w:right w:w="120" w:type="dxa"/>
+            </w:tcMar>
+          </w:tcPr>
+          <w:p>
+            <w:pPr>
+              <w:spacing w:line="320" w:lineRule="auto"/>
+            </w:pPr>
+            <w:r>
+              <w:rPr>
+                <w:b/>
+                <w:bCs/>
+              </w:rPr>
+              <w:t>MoSCoW</w:t>
+            </w:r>
+          </w:p>
+        </w:tc>
+        <w:tc>
+          <w:tcPr>
+            <w:tcW w:w="7026" w:type="dxa"/>
+            <w:tcBorders>
+              <w:top w:val="single" w:sz="4" w:space="0" w:color="000000"/>
+              <w:left w:val="single" w:sz="4" w:space="0" w:color="000000"/>
+              <w:bottom w:val="single" w:sz="4" w:space="0" w:color="000000"/>
+              <w:right w:val="single" w:sz="4" w:space="0" w:color="000000"/>
+            </w:tcBorders>
+            <w:tcMar>
+              <w:top w:w="80" w:type="dxa"/>
+              <w:left w:w="120" w:type="dxa"/>
+              <w:bottom w:w="80" w:type="dxa"/>
+              <w:right w:w="120" w:type="dxa"/>
+            </w:tcMar>
+          </w:tcPr>
+          <w:p>
+            <w:pPr>
+              <w:spacing w:line="320" w:lineRule="auto"/>
+            </w:pPr>
+            <w:r>
+              <w:t>Should Have</w:t>
+            </w:r>
+          </w:p>
+        </w:tc>
+      </w:tr>
+      <w:tr>
+        <w:tc>
+          <w:tcPr>
+            <w:tcW w:w="2000" w:type="dxa"/>
+            <w:tcBorders>
+              <w:top w:val="single" w:sz="4" w:space="0" w:color="000000"/>
+              <w:left w:val="single" w:sz="4" w:space="0" w:color="000000"/>
+              <w:bottom w:val="single" w:sz="4" w:space="0" w:color="000000"/>
+              <w:right w:val="single" w:sz="4" w:space="0" w:color="000000"/>
+            </w:tcBorders>
+            <w:tcMar>
+              <w:top w:w="80" w:type="dxa"/>
+              <w:left w:w="120" w:type="dxa"/>
+              <w:bottom w:w="80" w:type="dxa"/>
+              <w:right w:w="120" w:type="dxa"/>
+            </w:tcMar>
+          </w:tcPr>
+          <w:p>
+            <w:pPr>
+              <w:spacing w:line="320" w:lineRule="auto"/>
+            </w:pPr>
+            <w:r>
+              <w:rPr>
+                <w:b/>
+                <w:bCs/>
+              </w:rPr>
+              <w:t>Tasks</w:t>
+            </w:r>
+          </w:p>
+        </w:tc>
+        <w:tc>
+          <w:tcPr>
+            <w:tcW w:w="7026" w:type="dxa"/>
+            <w:tcBorders>
+              <w:top w:val="single" w:sz="4" w:space="0" w:color="000000"/>
+              <w:left w:val="single" w:sz="4" w:space="0" w:color="000000"/>
+              <w:bottom w:val="single" w:sz="4" w:space="0" w:color="000000"/>
+              <w:right w:val="single" w:sz="4" w:space="0" w:color="000000"/>
+            </w:tcBorders>
+            <w:tcMar>
+              <w:top w:w="80" w:type="dxa"/>
+              <w:left w:w="120" w:type="dxa"/>
+              <w:bottom w:w="80" w:type="dxa"/>
+              <w:right w:w="120" w:type="dxa"/>
+            </w:tcMar>
+          </w:tcPr>
+          <w:p>
+            <w:pPr>
+              <w:numPr>
+                <w:ilvl w:val="0"/>
+                <w:numId w:val="4"/>
+              </w:numPr>
+              <w:spacing w:after="0" w:line="320" w:lineRule="auto"/>
+            </w:pPr>
+            <w:r>
+              <w:t>Design UI components for category and date range filters.</w:t>
+            </w:r>
+          </w:p>
+          <w:p>
+            <w:pPr>
+              <w:numPr>
+                <w:ilvl w:val="0"/>
+                <w:numId w:val="4"/>
+              </w:numPr>
+              <w:spacing w:after="0" w:line="320" w:lineRule="auto"/>
+            </w:pPr>
+            <w:r>
+              <w:t>Update GET /api/analytics to allow filtering by category and date range through query parameters.</w:t>
+            </w:r>
+          </w:p>
+          <w:p>
+            <w:pPr>
+              <w:numPr>
+                <w:ilvl w:val="0"/>
+                <w:numId w:val="4"/>
+              </w:numPr>
+              <w:spacing w:after="0" w:line="320" w:lineRule="auto"/>
+            </w:pPr>
+            <w:r>
+              <w:t>Develop a client-side state management system to keep track of filter selections.</w:t>
+            </w:r>
+          </w:p>
+          <w:p>
+            <w:pPr>
+              <w:numPr>
+                <w:ilvl w:val="0"/>
+                <w:numId w:val="4"/>
+              </w:numPr>
+              <w:spacing w:after="0" w:line="320" w:lineRule="auto"/>
+            </w:pPr>
+            <w:r>
+              <w:t>Create integration test cases to check if the data are correctly filtered.</w:t>
+            </w:r>
+          </w:p>
+        </w:tc>
+      </w:tr>
+      <w:tr>
+        <w:tc>
+          <w:tcPr>
+            <w:tcW w:w="2000" w:type="dxa"/>
+            <w:tcBorders>
+              <w:top w:val="single" w:sz="4" w:space="0" w:color="000000"/>
+              <w:left w:val="single" w:sz="4" w:space="0" w:color="000000"/>
+              <w:bottom w:val="single" w:sz="4" w:space="0" w:color="000000"/>
+              <w:right w:val="single" w:sz="4" w:space="0" w:color="000000"/>
+            </w:tcBorders>
+            <w:tcMar>
+              <w:top w:w="80" w:type="dxa"/>
+              <w:left w:w="120" w:type="dxa"/>
+              <w:bottom w:w="80" w:type="dxa"/>
+              <w:right w:w="120" w:type="dxa"/>
+            </w:tcMar>
+          </w:tcPr>
+          <w:p>
+            <w:pPr>
+              <w:spacing w:line="320" w:lineRule="auto"/>
+            </w:pPr>
+            <w:r>
+              <w:rPr>
+                <w:b/>
+                <w:bCs/>
+              </w:rPr>
+              <w:t>Test Cases</w:t>
+            </w:r>
+          </w:p>
+        </w:tc>
+        <w:tc>
+          <w:tcPr>
+            <w:tcW w:w="7026" w:type="dxa"/>
+            <w:tcBorders>
+              <w:top w:val="single" w:sz="4" w:space="0" w:color="000000"/>
+              <w:left w:val="single" w:sz="4" w:space="0" w:color="000000"/>
+              <w:bottom w:val="single" w:sz="4" w:space="0" w:color="000000"/>
+              <w:right w:val="single" w:sz="4" w:space="0" w:color="000000"/>
+            </w:tcBorders>
+            <w:tcMar>
+              <w:top w:w="80" w:type="dxa"/>
+              <w:left w:w="120" w:type="dxa"/>
+              <w:bottom w:w="80" w:type="dxa"/>
+              <w:right w:w="120" w:type="dxa"/>
+            </w:tcMar>
+          </w:tcPr>
+          <w:p>
+            <w:pPr>
+              <w:spacing w:line="320" w:lineRule="auto"/>
+            </w:pPr>
+            <w:r>
+              <w:t>to be completed in Assignment 2</w:t>
+            </w:r>
+          </w:p>
+        </w:tc>
+      </w:tr>
+    </w:tbl>
+    <w:p>
+      <w:pPr>
+        <w:spacing w:line="360" w:lineRule="auto"/>
+      </w:pPr>
+    </w:p>
+    <w:p/>
+    <w:p/>
+    <w:bookmarkEnd w:id="5"/>
     <w:p/>
     <w:sectPr>
       <w:pgSz w:w="12240" w:h="15840"/>

</xml_diff>

<commit_message>
Added : Student B: Aakroshan Chaudhary — Epic 3 (Food Inventory Management) + Epic 4 (Notification Centre) — UC2 & UC5
</commit_message>
<xml_diff>
--- a/BIT 216 Assignment 1 (Task 2).docx
+++ b/BIT 216 Assignment 1 (Task 2).docx
@@ -3309,15 +3309,14 @@
       <w:r>
         <w:t>Here we introduce the requirements model for the SavePlate project. We adopted the Epic–User Story–Acceptance Criteria–Tasks structure (Cohn, 2004) to write the permalinks. Each person in the team has been given responsibility for two use cases with which to work out unique user stories. The user stories followed the classic format: Role capability result (as a [user role] I need to have [the ability to do something] so that I can [benefit]). Acceptance criteria are formulated in the Given–When–Then style of writing. Stories get labeled with MoSCoW priority levels as the guidelines of the Agile Business Consortium (2014).</w:t>
       </w:r>
-      <w:bookmarkStart w:id="5" w:name="_GoBack"/>
     </w:p>
     <w:p>
       <w:pPr>
         <w:pStyle w:val="Heading2"/>
         <w:spacing w:before="200" w:after="100"/>
       </w:pPr>
-      <w:bookmarkStart w:id="6" w:name="_heading=h.onivb3tnxbay" w:colFirst="0" w:colLast="0"/>
-      <w:bookmarkEnd w:id="6"/>
+      <w:bookmarkStart w:id="5" w:name="_heading=h.onivb3tnxbay" w:colFirst="0" w:colLast="0"/>
+      <w:bookmarkEnd w:id="5"/>
       <w:r>
         <w:t>3.1  Student A: Aaditya Chaudhary (E2300548)</w:t>
       </w:r>
@@ -3336,8 +3335,8 @@
         <w:pStyle w:val="Heading3"/>
         <w:spacing w:before="160" w:after="80"/>
       </w:pPr>
-      <w:bookmarkStart w:id="7" w:name="_heading=h.z95479jiwqjb" w:colFirst="0" w:colLast="0"/>
-      <w:bookmarkEnd w:id="7"/>
+      <w:bookmarkStart w:id="6" w:name="_heading=h.z95479jiwqjb" w:colFirst="0" w:colLast="0"/>
+      <w:bookmarkEnd w:id="6"/>
       <w:r>
         <w:t>[Epic 1] – User Registration and Account Privacy Management</w:t>
       </w:r>
@@ -4768,8 +4767,8 @@
         <w:pStyle w:val="Heading3"/>
         <w:spacing w:before="160" w:after="80"/>
       </w:pPr>
-      <w:bookmarkStart w:id="8" w:name="_heading=h.58to6wsib549" w:colFirst="0" w:colLast="0"/>
-      <w:bookmarkEnd w:id="8"/>
+      <w:bookmarkStart w:id="7" w:name="_heading=h.58to6wsib549" w:colFirst="0" w:colLast="0"/>
+      <w:bookmarkEnd w:id="7"/>
       <w:r>
         <w:t>[Epic 2] – Food Analytics and Impact Reporting</w:t>
       </w:r>
@@ -5467,13 +5466,1855 @@
       </w:tr>
     </w:tbl>
     <w:p>
+      <w:bookmarkStart w:id="8" w:name="_GoBack"/>
+      <w:bookmarkEnd w:id="8"/>
+    </w:p>
+    <w:p>
+      <w:pPr>
+        <w:pStyle w:val="Heading2"/>
+        <w:spacing w:before="200" w:after="100"/>
+      </w:pPr>
+      <w:bookmarkStart w:id="9" w:name="_heading=h.4yerc9ni0jwr" w:colFirst="0" w:colLast="0"/>
+      <w:bookmarkEnd w:id="9"/>
+      <w:r>
+        <w:t>3.2  Student B: Aakroshan Chaudhary (E2300551)</w:t>
+      </w:r>
+    </w:p>
+    <w:p>
+      <w:pPr>
+        <w:spacing w:after="120" w:line="360" w:lineRule="auto"/>
+        <w:jc w:val="both"/>
+      </w:pPr>
+      <w:r>
+        <w:t xml:space="preserve">Use Cases 2 (Manage Food Inventory) and 5 (View Notifications) fall under Aakroshan's purview. </w:t>
+      </w:r>
+    </w:p>
+    <w:p>
+      <w:pPr>
+        <w:pStyle w:val="Heading3"/>
+        <w:spacing w:before="160" w:after="80"/>
+      </w:pPr>
+      <w:bookmarkStart w:id="10" w:name="_heading=h.g0x437scrac1" w:colFirst="0" w:colLast="0"/>
+      <w:bookmarkEnd w:id="10"/>
+      <w:r>
+        <w:t>[Epic 3] – Food Inventory Management</w:t>
+      </w:r>
+    </w:p>
+    <w:p>
+      <w:pPr>
+        <w:spacing w:after="120" w:line="360" w:lineRule="auto"/>
+        <w:jc w:val="both"/>
+      </w:pPr>
+      <w:r>
+        <w:t xml:space="preserve">The workflows for adding, modifying, viewing, and controlling food items in a user's personal household inventory are all covered in this epic. </w:t>
+      </w:r>
+    </w:p>
+    <w:tbl>
+      <w:tblPr>
+        <w:tblW w:w="9026" w:type="dxa"/>
+        <w:tblBorders>
+          <w:top w:val="single" w:sz="4" w:space="0" w:color="000000"/>
+          <w:left w:val="single" w:sz="4" w:space="0" w:color="000000"/>
+          <w:bottom w:val="single" w:sz="4" w:space="0" w:color="000000"/>
+          <w:right w:val="single" w:sz="4" w:space="0" w:color="000000"/>
+          <w:insideH w:val="single" w:sz="4" w:space="0" w:color="000000"/>
+          <w:insideV w:val="single" w:sz="4" w:space="0" w:color="000000"/>
+        </w:tblBorders>
+        <w:tblLayout w:type="fixed"/>
+        <w:tblLook w:val="0000" w:firstRow="0" w:lastRow="0" w:firstColumn="0" w:lastColumn="0" w:noHBand="0" w:noVBand="0"/>
+      </w:tblPr>
+      <w:tblGrid>
+        <w:gridCol w:w="2000"/>
+        <w:gridCol w:w="7026"/>
+      </w:tblGrid>
+      <w:tr>
+        <w:tc>
+          <w:tcPr>
+            <w:tcW w:w="2000" w:type="dxa"/>
+            <w:tcBorders>
+              <w:top w:val="single" w:sz="4" w:space="0" w:color="000000"/>
+              <w:left w:val="single" w:sz="4" w:space="0" w:color="000000"/>
+              <w:bottom w:val="single" w:sz="4" w:space="0" w:color="000000"/>
+              <w:right w:val="single" w:sz="4" w:space="0" w:color="000000"/>
+            </w:tcBorders>
+            <w:tcMar>
+              <w:top w:w="80" w:type="dxa"/>
+              <w:left w:w="120" w:type="dxa"/>
+              <w:bottom w:w="80" w:type="dxa"/>
+              <w:right w:w="120" w:type="dxa"/>
+            </w:tcMar>
+          </w:tcPr>
+          <w:p>
+            <w:pPr>
+              <w:spacing w:line="320" w:lineRule="auto"/>
+            </w:pPr>
+            <w:r>
+              <w:rPr>
+                <w:b/>
+                <w:bCs/>
+              </w:rPr>
+              <w:t>[User Story 3.1]</w:t>
+            </w:r>
+          </w:p>
+        </w:tc>
+        <w:tc>
+          <w:tcPr>
+            <w:tcW w:w="7026" w:type="dxa"/>
+            <w:tcBorders>
+              <w:top w:val="single" w:sz="4" w:space="0" w:color="000000"/>
+              <w:left w:val="single" w:sz="4" w:space="0" w:color="000000"/>
+              <w:bottom w:val="single" w:sz="4" w:space="0" w:color="000000"/>
+              <w:right w:val="single" w:sz="4" w:space="0" w:color="000000"/>
+            </w:tcBorders>
+            <w:tcMar>
+              <w:top w:w="80" w:type="dxa"/>
+              <w:left w:w="120" w:type="dxa"/>
+              <w:bottom w:w="80" w:type="dxa"/>
+              <w:right w:w="120" w:type="dxa"/>
+            </w:tcMar>
+          </w:tcPr>
+          <w:p>
+            <w:pPr>
+              <w:spacing w:line="320" w:lineRule="auto"/>
+            </w:pPr>
+            <w:r>
+              <w:t>As a household user who's logged-in, I want to be able to add food items to my inventory with details like name quantity expiry date, category, and storage location so that I have an accurate record of the food I have at home.</w:t>
+            </w:r>
+          </w:p>
+        </w:tc>
+      </w:tr>
+      <w:tr>
+        <w:tc>
+          <w:tcPr>
+            <w:tcW w:w="2000" w:type="dxa"/>
+            <w:tcBorders>
+              <w:top w:val="single" w:sz="4" w:space="0" w:color="000000"/>
+              <w:left w:val="single" w:sz="4" w:space="0" w:color="000000"/>
+              <w:bottom w:val="single" w:sz="4" w:space="0" w:color="000000"/>
+              <w:right w:val="single" w:sz="4" w:space="0" w:color="000000"/>
+            </w:tcBorders>
+            <w:tcMar>
+              <w:top w:w="80" w:type="dxa"/>
+              <w:left w:w="120" w:type="dxa"/>
+              <w:bottom w:w="80" w:type="dxa"/>
+              <w:right w:w="120" w:type="dxa"/>
+            </w:tcMar>
+          </w:tcPr>
+          <w:p>
+            <w:pPr>
+              <w:spacing w:line="320" w:lineRule="auto"/>
+            </w:pPr>
+            <w:r>
+              <w:rPr>
+                <w:b/>
+                <w:bCs/>
+              </w:rPr>
+              <w:t>Acceptance Criteria</w:t>
+            </w:r>
+          </w:p>
+        </w:tc>
+        <w:tc>
+          <w:tcPr>
+            <w:tcW w:w="7026" w:type="dxa"/>
+            <w:tcBorders>
+              <w:top w:val="single" w:sz="4" w:space="0" w:color="000000"/>
+              <w:left w:val="single" w:sz="4" w:space="0" w:color="000000"/>
+              <w:bottom w:val="single" w:sz="4" w:space="0" w:color="000000"/>
+              <w:right w:val="single" w:sz="4" w:space="0" w:color="000000"/>
+            </w:tcBorders>
+            <w:tcMar>
+              <w:top w:w="80" w:type="dxa"/>
+              <w:left w:w="120" w:type="dxa"/>
+              <w:bottom w:w="80" w:type="dxa"/>
+              <w:right w:w="120" w:type="dxa"/>
+            </w:tcMar>
+          </w:tcPr>
+          <w:p>
+            <w:pPr>
+              <w:spacing w:line="320" w:lineRule="auto"/>
+            </w:pPr>
+            <w:sdt>
+              <w:sdtPr>
+                <w:tag w:val="goog_rdk_0"/>
+                <w:id w:val="-1065973407"/>
+              </w:sdtPr>
+              <w:sdtContent>
+                <w:r>
+                  <w:rPr>
+                    <w:rFonts w:ascii="Gungsuh" w:eastAsia="Gungsuh" w:hAnsi="Gungsuh" w:cs="Gungsuh"/>
+                  </w:rPr>
+                  <w:t>After a user initiates the "Add Food Item" action on the Food Inventory page and fills out the form correctly (name, quantity ≥ 1, a future expiry date, category, and storage location), upon form submission, the system will first save the food item information into the database. Next, it will update the inventory list to show the new item and an expiry status indicator. Finally, it will display a success toast to the user.</w:t>
+                </w:r>
+              </w:sdtContent>
+            </w:sdt>
+          </w:p>
+        </w:tc>
+      </w:tr>
+      <w:tr>
+        <w:tc>
+          <w:tcPr>
+            <w:tcW w:w="2000" w:type="dxa"/>
+            <w:tcBorders>
+              <w:top w:val="single" w:sz="4" w:space="0" w:color="000000"/>
+              <w:left w:val="single" w:sz="4" w:space="0" w:color="000000"/>
+              <w:bottom w:val="single" w:sz="4" w:space="0" w:color="000000"/>
+              <w:right w:val="single" w:sz="4" w:space="0" w:color="000000"/>
+            </w:tcBorders>
+            <w:tcMar>
+              <w:top w:w="80" w:type="dxa"/>
+              <w:left w:w="120" w:type="dxa"/>
+              <w:bottom w:w="80" w:type="dxa"/>
+              <w:right w:w="120" w:type="dxa"/>
+            </w:tcMar>
+          </w:tcPr>
+          <w:p>
+            <w:pPr>
+              <w:spacing w:line="320" w:lineRule="auto"/>
+            </w:pPr>
+            <w:r>
+              <w:rPr>
+                <w:b/>
+                <w:bCs/>
+              </w:rPr>
+              <w:t>MoSCoW</w:t>
+            </w:r>
+          </w:p>
+        </w:tc>
+        <w:tc>
+          <w:tcPr>
+            <w:tcW w:w="7026" w:type="dxa"/>
+            <w:tcBorders>
+              <w:top w:val="single" w:sz="4" w:space="0" w:color="000000"/>
+              <w:left w:val="single" w:sz="4" w:space="0" w:color="000000"/>
+              <w:bottom w:val="single" w:sz="4" w:space="0" w:color="000000"/>
+              <w:right w:val="single" w:sz="4" w:space="0" w:color="000000"/>
+            </w:tcBorders>
+            <w:tcMar>
+              <w:top w:w="80" w:type="dxa"/>
+              <w:left w:w="120" w:type="dxa"/>
+              <w:bottom w:w="80" w:type="dxa"/>
+              <w:right w:w="120" w:type="dxa"/>
+            </w:tcMar>
+          </w:tcPr>
+          <w:p>
+            <w:pPr>
+              <w:spacing w:line="320" w:lineRule="auto"/>
+            </w:pPr>
+            <w:r>
+              <w:t>Must Have</w:t>
+            </w:r>
+          </w:p>
+        </w:tc>
+      </w:tr>
+      <w:tr>
+        <w:tc>
+          <w:tcPr>
+            <w:tcW w:w="2000" w:type="dxa"/>
+            <w:tcBorders>
+              <w:top w:val="single" w:sz="4" w:space="0" w:color="000000"/>
+              <w:left w:val="single" w:sz="4" w:space="0" w:color="000000"/>
+              <w:bottom w:val="single" w:sz="4" w:space="0" w:color="000000"/>
+              <w:right w:val="single" w:sz="4" w:space="0" w:color="000000"/>
+            </w:tcBorders>
+            <w:tcMar>
+              <w:top w:w="80" w:type="dxa"/>
+              <w:left w:w="120" w:type="dxa"/>
+              <w:bottom w:w="80" w:type="dxa"/>
+              <w:right w:w="120" w:type="dxa"/>
+            </w:tcMar>
+          </w:tcPr>
+          <w:p>
+            <w:pPr>
+              <w:spacing w:line="320" w:lineRule="auto"/>
+            </w:pPr>
+            <w:r>
+              <w:rPr>
+                <w:b/>
+                <w:bCs/>
+              </w:rPr>
+              <w:t>Tasks</w:t>
+            </w:r>
+          </w:p>
+        </w:tc>
+        <w:tc>
+          <w:tcPr>
+            <w:tcW w:w="7026" w:type="dxa"/>
+            <w:tcBorders>
+              <w:top w:val="single" w:sz="4" w:space="0" w:color="000000"/>
+              <w:left w:val="single" w:sz="4" w:space="0" w:color="000000"/>
+              <w:bottom w:val="single" w:sz="4" w:space="0" w:color="000000"/>
+              <w:right w:val="single" w:sz="4" w:space="0" w:color="000000"/>
+            </w:tcBorders>
+            <w:tcMar>
+              <w:top w:w="80" w:type="dxa"/>
+              <w:left w:w="120" w:type="dxa"/>
+              <w:bottom w:w="80" w:type="dxa"/>
+              <w:right w:w="120" w:type="dxa"/>
+            </w:tcMar>
+          </w:tcPr>
+          <w:p>
+            <w:pPr>
+              <w:numPr>
+                <w:ilvl w:val="0"/>
+                <w:numId w:val="17"/>
+              </w:numPr>
+              <w:spacing w:after="0" w:line="320" w:lineRule="auto"/>
+            </w:pPr>
+            <w:r>
+              <w:t xml:space="preserve">Design "Add Food Item" modal UI </w:t>
+            </w:r>
+          </w:p>
+          <w:p>
+            <w:pPr>
+              <w:numPr>
+                <w:ilvl w:val="0"/>
+                <w:numId w:val="17"/>
+              </w:numPr>
+              <w:spacing w:after="0" w:line="320" w:lineRule="auto"/>
+            </w:pPr>
+            <w:r>
+              <w:t xml:space="preserve">Create POST /api/inventory endpoint </w:t>
+            </w:r>
+          </w:p>
+          <w:p>
+            <w:pPr>
+              <w:numPr>
+                <w:ilvl w:val="0"/>
+                <w:numId w:val="17"/>
+              </w:numPr>
+              <w:spacing w:after="0" w:line="320" w:lineRule="auto"/>
+            </w:pPr>
+            <w:r>
+              <w:t xml:space="preserve">Implement server-side input validation </w:t>
+            </w:r>
+          </w:p>
+          <w:p>
+            <w:pPr>
+              <w:numPr>
+                <w:ilvl w:val="0"/>
+                <w:numId w:val="17"/>
+              </w:numPr>
+              <w:spacing w:after="0" w:line="320" w:lineRule="auto"/>
+            </w:pPr>
+            <w:r>
+              <w:t xml:space="preserve">Create expiry status label logic (Fresh, Expiring Soon, Expired) </w:t>
+            </w:r>
+          </w:p>
+          <w:p>
+            <w:pPr>
+              <w:numPr>
+                <w:ilvl w:val="0"/>
+                <w:numId w:val="17"/>
+              </w:numPr>
+              <w:spacing w:after="0" w:line="320" w:lineRule="auto"/>
+            </w:pPr>
+            <w:r>
+              <w:t>Write unit tests for inventory creation endpoint</w:t>
+            </w:r>
+          </w:p>
+        </w:tc>
+      </w:tr>
+      <w:tr>
+        <w:tc>
+          <w:tcPr>
+            <w:tcW w:w="2000" w:type="dxa"/>
+            <w:tcBorders>
+              <w:top w:val="single" w:sz="4" w:space="0" w:color="000000"/>
+              <w:left w:val="single" w:sz="4" w:space="0" w:color="000000"/>
+              <w:bottom w:val="single" w:sz="4" w:space="0" w:color="000000"/>
+              <w:right w:val="single" w:sz="4" w:space="0" w:color="000000"/>
+            </w:tcBorders>
+            <w:tcMar>
+              <w:top w:w="80" w:type="dxa"/>
+              <w:left w:w="120" w:type="dxa"/>
+              <w:bottom w:w="80" w:type="dxa"/>
+              <w:right w:w="120" w:type="dxa"/>
+            </w:tcMar>
+          </w:tcPr>
+          <w:p>
+            <w:pPr>
+              <w:spacing w:line="320" w:lineRule="auto"/>
+            </w:pPr>
+            <w:r>
+              <w:rPr>
+                <w:b/>
+                <w:bCs/>
+              </w:rPr>
+              <w:t>Test Cases</w:t>
+            </w:r>
+          </w:p>
+        </w:tc>
+        <w:tc>
+          <w:tcPr>
+            <w:tcW w:w="7026" w:type="dxa"/>
+            <w:tcBorders>
+              <w:top w:val="single" w:sz="4" w:space="0" w:color="000000"/>
+              <w:left w:val="single" w:sz="4" w:space="0" w:color="000000"/>
+              <w:bottom w:val="single" w:sz="4" w:space="0" w:color="000000"/>
+              <w:right w:val="single" w:sz="4" w:space="0" w:color="000000"/>
+            </w:tcBorders>
+            <w:tcMar>
+              <w:top w:w="80" w:type="dxa"/>
+              <w:left w:w="120" w:type="dxa"/>
+              <w:bottom w:w="80" w:type="dxa"/>
+              <w:right w:w="120" w:type="dxa"/>
+            </w:tcMar>
+          </w:tcPr>
+          <w:p>
+            <w:pPr>
+              <w:spacing w:line="320" w:lineRule="auto"/>
+            </w:pPr>
+            <w:r>
+              <w:t>to be completed in Assignment 2</w:t>
+            </w:r>
+          </w:p>
+        </w:tc>
+      </w:tr>
+    </w:tbl>
+    <w:p>
+      <w:pPr>
+        <w:spacing w:line="360" w:lineRule="auto"/>
+      </w:pPr>
+    </w:p>
+    <w:tbl>
+      <w:tblPr>
+        <w:tblW w:w="9026" w:type="dxa"/>
+        <w:tblBorders>
+          <w:top w:val="single" w:sz="4" w:space="0" w:color="000000"/>
+          <w:left w:val="single" w:sz="4" w:space="0" w:color="000000"/>
+          <w:bottom w:val="single" w:sz="4" w:space="0" w:color="000000"/>
+          <w:right w:val="single" w:sz="4" w:space="0" w:color="000000"/>
+          <w:insideH w:val="single" w:sz="4" w:space="0" w:color="000000"/>
+          <w:insideV w:val="single" w:sz="4" w:space="0" w:color="000000"/>
+        </w:tblBorders>
+        <w:tblLayout w:type="fixed"/>
+        <w:tblLook w:val="0000" w:firstRow="0" w:lastRow="0" w:firstColumn="0" w:lastColumn="0" w:noHBand="0" w:noVBand="0"/>
+      </w:tblPr>
+      <w:tblGrid>
+        <w:gridCol w:w="2000"/>
+        <w:gridCol w:w="7026"/>
+      </w:tblGrid>
+      <w:tr>
+        <w:tc>
+          <w:tcPr>
+            <w:tcW w:w="2000" w:type="dxa"/>
+            <w:tcBorders>
+              <w:top w:val="single" w:sz="4" w:space="0" w:color="000000"/>
+              <w:left w:val="single" w:sz="4" w:space="0" w:color="000000"/>
+              <w:bottom w:val="single" w:sz="4" w:space="0" w:color="000000"/>
+              <w:right w:val="single" w:sz="4" w:space="0" w:color="000000"/>
+            </w:tcBorders>
+            <w:tcMar>
+              <w:top w:w="80" w:type="dxa"/>
+              <w:left w:w="120" w:type="dxa"/>
+              <w:bottom w:w="80" w:type="dxa"/>
+              <w:right w:w="120" w:type="dxa"/>
+            </w:tcMar>
+          </w:tcPr>
+          <w:p>
+            <w:pPr>
+              <w:spacing w:line="320" w:lineRule="auto"/>
+            </w:pPr>
+            <w:r>
+              <w:rPr>
+                <w:b/>
+                <w:bCs/>
+              </w:rPr>
+              <w:t>[User Story 3.2]</w:t>
+            </w:r>
+          </w:p>
+        </w:tc>
+        <w:tc>
+          <w:tcPr>
+            <w:tcW w:w="7026" w:type="dxa"/>
+            <w:tcBorders>
+              <w:top w:val="single" w:sz="4" w:space="0" w:color="000000"/>
+              <w:left w:val="single" w:sz="4" w:space="0" w:color="000000"/>
+              <w:bottom w:val="single" w:sz="4" w:space="0" w:color="000000"/>
+              <w:right w:val="single" w:sz="4" w:space="0" w:color="000000"/>
+            </w:tcBorders>
+            <w:tcMar>
+              <w:top w:w="80" w:type="dxa"/>
+              <w:left w:w="120" w:type="dxa"/>
+              <w:bottom w:w="80" w:type="dxa"/>
+              <w:right w:w="120" w:type="dxa"/>
+            </w:tcMar>
+          </w:tcPr>
+          <w:p>
+            <w:pPr>
+              <w:spacing w:line="320" w:lineRule="auto"/>
+            </w:pPr>
+            <w:r>
+              <w:t xml:space="preserve">To keep my records current and accurate, I must modify, remove, and mark things as eaten in my inventory as a logged-in household user. </w:t>
+            </w:r>
+          </w:p>
+        </w:tc>
+      </w:tr>
+      <w:tr>
+        <w:tc>
+          <w:tcPr>
+            <w:tcW w:w="2000" w:type="dxa"/>
+            <w:tcBorders>
+              <w:top w:val="single" w:sz="4" w:space="0" w:color="000000"/>
+              <w:left w:val="single" w:sz="4" w:space="0" w:color="000000"/>
+              <w:bottom w:val="single" w:sz="4" w:space="0" w:color="000000"/>
+              <w:right w:val="single" w:sz="4" w:space="0" w:color="000000"/>
+            </w:tcBorders>
+            <w:tcMar>
+              <w:top w:w="80" w:type="dxa"/>
+              <w:left w:w="120" w:type="dxa"/>
+              <w:bottom w:w="80" w:type="dxa"/>
+              <w:right w:w="120" w:type="dxa"/>
+            </w:tcMar>
+          </w:tcPr>
+          <w:p>
+            <w:pPr>
+              <w:spacing w:line="320" w:lineRule="auto"/>
+            </w:pPr>
+            <w:r>
+              <w:rPr>
+                <w:b/>
+                <w:bCs/>
+              </w:rPr>
+              <w:t>Acceptance Criteria</w:t>
+            </w:r>
+          </w:p>
+        </w:tc>
+        <w:tc>
+          <w:tcPr>
+            <w:tcW w:w="7026" w:type="dxa"/>
+            <w:tcBorders>
+              <w:top w:val="single" w:sz="4" w:space="0" w:color="000000"/>
+              <w:left w:val="single" w:sz="4" w:space="0" w:color="000000"/>
+              <w:bottom w:val="single" w:sz="4" w:space="0" w:color="000000"/>
+              <w:right w:val="single" w:sz="4" w:space="0" w:color="000000"/>
+            </w:tcBorders>
+            <w:tcMar>
+              <w:top w:w="80" w:type="dxa"/>
+              <w:left w:w="120" w:type="dxa"/>
+              <w:bottom w:w="80" w:type="dxa"/>
+              <w:right w:w="120" w:type="dxa"/>
+            </w:tcMar>
+          </w:tcPr>
+          <w:p>
+            <w:pPr>
+              <w:spacing w:line="320" w:lineRule="auto"/>
+            </w:pPr>
+            <w:r>
+              <w:t>A user is viewing a list of food inventory, selects an item, and then clicks on "Edit", "Delete", or "Mark as Consumed". The system updates the item's record in the database (change details, delete from list, or mark as consumed), and the change is immediately shown in the inventory view without the page being reloaded completely.</w:t>
+            </w:r>
+          </w:p>
+        </w:tc>
+      </w:tr>
+      <w:tr>
+        <w:tc>
+          <w:tcPr>
+            <w:tcW w:w="2000" w:type="dxa"/>
+            <w:tcBorders>
+              <w:top w:val="single" w:sz="4" w:space="0" w:color="000000"/>
+              <w:left w:val="single" w:sz="4" w:space="0" w:color="000000"/>
+              <w:bottom w:val="single" w:sz="4" w:space="0" w:color="000000"/>
+              <w:right w:val="single" w:sz="4" w:space="0" w:color="000000"/>
+            </w:tcBorders>
+            <w:tcMar>
+              <w:top w:w="80" w:type="dxa"/>
+              <w:left w:w="120" w:type="dxa"/>
+              <w:bottom w:w="80" w:type="dxa"/>
+              <w:right w:w="120" w:type="dxa"/>
+            </w:tcMar>
+          </w:tcPr>
+          <w:p>
+            <w:pPr>
+              <w:spacing w:line="320" w:lineRule="auto"/>
+            </w:pPr>
+            <w:r>
+              <w:rPr>
+                <w:b/>
+                <w:bCs/>
+              </w:rPr>
+              <w:t>MoSCoW</w:t>
+            </w:r>
+          </w:p>
+        </w:tc>
+        <w:tc>
+          <w:tcPr>
+            <w:tcW w:w="7026" w:type="dxa"/>
+            <w:tcBorders>
+              <w:top w:val="single" w:sz="4" w:space="0" w:color="000000"/>
+              <w:left w:val="single" w:sz="4" w:space="0" w:color="000000"/>
+              <w:bottom w:val="single" w:sz="4" w:space="0" w:color="000000"/>
+              <w:right w:val="single" w:sz="4" w:space="0" w:color="000000"/>
+            </w:tcBorders>
+            <w:tcMar>
+              <w:top w:w="80" w:type="dxa"/>
+              <w:left w:w="120" w:type="dxa"/>
+              <w:bottom w:w="80" w:type="dxa"/>
+              <w:right w:w="120" w:type="dxa"/>
+            </w:tcMar>
+          </w:tcPr>
+          <w:p>
+            <w:pPr>
+              <w:spacing w:line="320" w:lineRule="auto"/>
+            </w:pPr>
+            <w:r>
+              <w:t>Must Have</w:t>
+            </w:r>
+          </w:p>
+        </w:tc>
+      </w:tr>
+      <w:tr>
+        <w:tc>
+          <w:tcPr>
+            <w:tcW w:w="2000" w:type="dxa"/>
+            <w:tcBorders>
+              <w:top w:val="single" w:sz="4" w:space="0" w:color="000000"/>
+              <w:left w:val="single" w:sz="4" w:space="0" w:color="000000"/>
+              <w:bottom w:val="single" w:sz="4" w:space="0" w:color="000000"/>
+              <w:right w:val="single" w:sz="4" w:space="0" w:color="000000"/>
+            </w:tcBorders>
+            <w:tcMar>
+              <w:top w:w="80" w:type="dxa"/>
+              <w:left w:w="120" w:type="dxa"/>
+              <w:bottom w:w="80" w:type="dxa"/>
+              <w:right w:w="120" w:type="dxa"/>
+            </w:tcMar>
+          </w:tcPr>
+          <w:p>
+            <w:pPr>
+              <w:spacing w:line="320" w:lineRule="auto"/>
+            </w:pPr>
+            <w:r>
+              <w:rPr>
+                <w:b/>
+                <w:bCs/>
+              </w:rPr>
+              <w:t>Tasks</w:t>
+            </w:r>
+          </w:p>
+        </w:tc>
+        <w:tc>
+          <w:tcPr>
+            <w:tcW w:w="7026" w:type="dxa"/>
+            <w:tcBorders>
+              <w:top w:val="single" w:sz="4" w:space="0" w:color="000000"/>
+              <w:left w:val="single" w:sz="4" w:space="0" w:color="000000"/>
+              <w:bottom w:val="single" w:sz="4" w:space="0" w:color="000000"/>
+              <w:right w:val="single" w:sz="4" w:space="0" w:color="000000"/>
+            </w:tcBorders>
+            <w:tcMar>
+              <w:top w:w="80" w:type="dxa"/>
+              <w:left w:w="120" w:type="dxa"/>
+              <w:bottom w:w="80" w:type="dxa"/>
+              <w:right w:w="120" w:type="dxa"/>
+            </w:tcMar>
+          </w:tcPr>
+          <w:p>
+            <w:pPr>
+              <w:numPr>
+                <w:ilvl w:val="0"/>
+                <w:numId w:val="13"/>
+              </w:numPr>
+              <w:spacing w:after="0" w:line="320" w:lineRule="auto"/>
+            </w:pPr>
+            <w:r>
+              <w:t xml:space="preserve">Create action buttons for editing and deleting the inventory list user interface. </w:t>
+            </w:r>
+          </w:p>
+          <w:p>
+            <w:pPr>
+              <w:numPr>
+                <w:ilvl w:val="0"/>
+                <w:numId w:val="13"/>
+              </w:numPr>
+              <w:spacing w:after="0" w:line="320" w:lineRule="auto"/>
+            </w:pPr>
+            <w:r>
+              <w:t xml:space="preserve">Establish DELETE and PATCH endpoints at /api/inventory/:id. </w:t>
+            </w:r>
+          </w:p>
+          <w:p>
+            <w:pPr>
+              <w:numPr>
+                <w:ilvl w:val="0"/>
+                <w:numId w:val="13"/>
+              </w:numPr>
+              <w:spacing w:after="0" w:line="320" w:lineRule="auto"/>
+            </w:pPr>
+            <w:r>
+              <w:t xml:space="preserve">Execute  hopeful front-end user interface update </w:t>
+            </w:r>
+          </w:p>
+          <w:p>
+            <w:pPr>
+              <w:numPr>
+                <w:ilvl w:val="0"/>
+                <w:numId w:val="13"/>
+              </w:numPr>
+              <w:spacing w:after="0" w:line="320" w:lineRule="auto"/>
+            </w:pPr>
+            <w:r>
+              <w:t xml:space="preserve">Create integration tests for tasks like editing and deleting </w:t>
+            </w:r>
+          </w:p>
+        </w:tc>
+      </w:tr>
+      <w:tr>
+        <w:tc>
+          <w:tcPr>
+            <w:tcW w:w="2000" w:type="dxa"/>
+            <w:tcBorders>
+              <w:top w:val="single" w:sz="4" w:space="0" w:color="000000"/>
+              <w:left w:val="single" w:sz="4" w:space="0" w:color="000000"/>
+              <w:bottom w:val="single" w:sz="4" w:space="0" w:color="000000"/>
+              <w:right w:val="single" w:sz="4" w:space="0" w:color="000000"/>
+            </w:tcBorders>
+            <w:tcMar>
+              <w:top w:w="80" w:type="dxa"/>
+              <w:left w:w="120" w:type="dxa"/>
+              <w:bottom w:w="80" w:type="dxa"/>
+              <w:right w:w="120" w:type="dxa"/>
+            </w:tcMar>
+          </w:tcPr>
+          <w:p>
+            <w:pPr>
+              <w:spacing w:line="320" w:lineRule="auto"/>
+            </w:pPr>
+            <w:r>
+              <w:rPr>
+                <w:b/>
+                <w:bCs/>
+              </w:rPr>
+              <w:t>Test Cases</w:t>
+            </w:r>
+          </w:p>
+        </w:tc>
+        <w:tc>
+          <w:tcPr>
+            <w:tcW w:w="7026" w:type="dxa"/>
+            <w:tcBorders>
+              <w:top w:val="single" w:sz="4" w:space="0" w:color="000000"/>
+              <w:left w:val="single" w:sz="4" w:space="0" w:color="000000"/>
+              <w:bottom w:val="single" w:sz="4" w:space="0" w:color="000000"/>
+              <w:right w:val="single" w:sz="4" w:space="0" w:color="000000"/>
+            </w:tcBorders>
+            <w:tcMar>
+              <w:top w:w="80" w:type="dxa"/>
+              <w:left w:w="120" w:type="dxa"/>
+              <w:bottom w:w="80" w:type="dxa"/>
+              <w:right w:w="120" w:type="dxa"/>
+            </w:tcMar>
+          </w:tcPr>
+          <w:p>
+            <w:pPr>
+              <w:spacing w:line="320" w:lineRule="auto"/>
+            </w:pPr>
+            <w:r>
+              <w:t>to be completed in Assignment 2</w:t>
+            </w:r>
+          </w:p>
+        </w:tc>
+      </w:tr>
+    </w:tbl>
+    <w:p>
+      <w:pPr>
+        <w:spacing w:line="360" w:lineRule="auto"/>
+      </w:pPr>
+    </w:p>
+    <w:tbl>
+      <w:tblPr>
+        <w:tblW w:w="9026" w:type="dxa"/>
+        <w:tblBorders>
+          <w:top w:val="single" w:sz="4" w:space="0" w:color="000000"/>
+          <w:left w:val="single" w:sz="4" w:space="0" w:color="000000"/>
+          <w:bottom w:val="single" w:sz="4" w:space="0" w:color="000000"/>
+          <w:right w:val="single" w:sz="4" w:space="0" w:color="000000"/>
+          <w:insideH w:val="single" w:sz="4" w:space="0" w:color="000000"/>
+          <w:insideV w:val="single" w:sz="4" w:space="0" w:color="000000"/>
+        </w:tblBorders>
+        <w:tblLayout w:type="fixed"/>
+        <w:tblLook w:val="0000" w:firstRow="0" w:lastRow="0" w:firstColumn="0" w:lastColumn="0" w:noHBand="0" w:noVBand="0"/>
+      </w:tblPr>
+      <w:tblGrid>
+        <w:gridCol w:w="2000"/>
+        <w:gridCol w:w="7026"/>
+      </w:tblGrid>
+      <w:tr>
+        <w:tc>
+          <w:tcPr>
+            <w:tcW w:w="2000" w:type="dxa"/>
+            <w:tcBorders>
+              <w:top w:val="single" w:sz="4" w:space="0" w:color="000000"/>
+              <w:left w:val="single" w:sz="4" w:space="0" w:color="000000"/>
+              <w:bottom w:val="single" w:sz="4" w:space="0" w:color="000000"/>
+              <w:right w:val="single" w:sz="4" w:space="0" w:color="000000"/>
+            </w:tcBorders>
+            <w:tcMar>
+              <w:top w:w="80" w:type="dxa"/>
+              <w:left w:w="120" w:type="dxa"/>
+              <w:bottom w:w="80" w:type="dxa"/>
+              <w:right w:w="120" w:type="dxa"/>
+            </w:tcMar>
+          </w:tcPr>
+          <w:p>
+            <w:pPr>
+              <w:spacing w:line="320" w:lineRule="auto"/>
+            </w:pPr>
+            <w:r>
+              <w:rPr>
+                <w:b/>
+                <w:bCs/>
+              </w:rPr>
+              <w:t>[User Story 3.3 – Should]</w:t>
+            </w:r>
+          </w:p>
+        </w:tc>
+        <w:tc>
+          <w:tcPr>
+            <w:tcW w:w="7026" w:type="dxa"/>
+            <w:tcBorders>
+              <w:top w:val="single" w:sz="4" w:space="0" w:color="000000"/>
+              <w:left w:val="single" w:sz="4" w:space="0" w:color="000000"/>
+              <w:bottom w:val="single" w:sz="4" w:space="0" w:color="000000"/>
+              <w:right w:val="single" w:sz="4" w:space="0" w:color="000000"/>
+            </w:tcBorders>
+            <w:tcMar>
+              <w:top w:w="80" w:type="dxa"/>
+              <w:left w:w="120" w:type="dxa"/>
+              <w:bottom w:w="80" w:type="dxa"/>
+              <w:right w:w="120" w:type="dxa"/>
+            </w:tcMar>
+          </w:tcPr>
+          <w:p>
+            <w:pPr>
+              <w:spacing w:line="320" w:lineRule="auto"/>
+            </w:pPr>
+            <w:r>
+              <w:t>Being a logged-in household user, I should manage to change an inventory item to a donation listing within three interactions, which will allow me to conveniently share near-expiry food with my community.</w:t>
+            </w:r>
+          </w:p>
+        </w:tc>
+      </w:tr>
+      <w:tr>
+        <w:tc>
+          <w:tcPr>
+            <w:tcW w:w="2000" w:type="dxa"/>
+            <w:tcBorders>
+              <w:top w:val="single" w:sz="4" w:space="0" w:color="000000"/>
+              <w:left w:val="single" w:sz="4" w:space="0" w:color="000000"/>
+              <w:bottom w:val="single" w:sz="4" w:space="0" w:color="000000"/>
+              <w:right w:val="single" w:sz="4" w:space="0" w:color="000000"/>
+            </w:tcBorders>
+            <w:tcMar>
+              <w:top w:w="80" w:type="dxa"/>
+              <w:left w:w="120" w:type="dxa"/>
+              <w:bottom w:w="80" w:type="dxa"/>
+              <w:right w:w="120" w:type="dxa"/>
+            </w:tcMar>
+          </w:tcPr>
+          <w:p>
+            <w:pPr>
+              <w:spacing w:line="320" w:lineRule="auto"/>
+            </w:pPr>
+            <w:r>
+              <w:rPr>
+                <w:b/>
+                <w:bCs/>
+              </w:rPr>
+              <w:t>Acceptance Criteria</w:t>
+            </w:r>
+          </w:p>
+        </w:tc>
+        <w:tc>
+          <w:tcPr>
+            <w:tcW w:w="7026" w:type="dxa"/>
+            <w:tcBorders>
+              <w:top w:val="single" w:sz="4" w:space="0" w:color="000000"/>
+              <w:left w:val="single" w:sz="4" w:space="0" w:color="000000"/>
+              <w:bottom w:val="single" w:sz="4" w:space="0" w:color="000000"/>
+              <w:right w:val="single" w:sz="4" w:space="0" w:color="000000"/>
+            </w:tcBorders>
+            <w:tcMar>
+              <w:top w:w="80" w:type="dxa"/>
+              <w:left w:w="120" w:type="dxa"/>
+              <w:bottom w:w="80" w:type="dxa"/>
+              <w:right w:w="120" w:type="dxa"/>
+            </w:tcMar>
+          </w:tcPr>
+          <w:p>
+            <w:pPr>
+              <w:spacing w:line="320" w:lineRule="auto"/>
+            </w:pPr>
+            <w:r>
+              <w:t>Imagine a user viewing an inventory item that will be expiring in 5 days, after clicking "Convert to Donation" the user confirms the action in the modal, and after submitting the pickup location information, the item gets deleted from the inventory and a donation listing is created which is displayed to other users within the user's geolocation radius.</w:t>
+            </w:r>
+          </w:p>
+        </w:tc>
+      </w:tr>
+      <w:tr>
+        <w:tc>
+          <w:tcPr>
+            <w:tcW w:w="2000" w:type="dxa"/>
+            <w:tcBorders>
+              <w:top w:val="single" w:sz="4" w:space="0" w:color="000000"/>
+              <w:left w:val="single" w:sz="4" w:space="0" w:color="000000"/>
+              <w:bottom w:val="single" w:sz="4" w:space="0" w:color="000000"/>
+              <w:right w:val="single" w:sz="4" w:space="0" w:color="000000"/>
+            </w:tcBorders>
+            <w:tcMar>
+              <w:top w:w="80" w:type="dxa"/>
+              <w:left w:w="120" w:type="dxa"/>
+              <w:bottom w:w="80" w:type="dxa"/>
+              <w:right w:w="120" w:type="dxa"/>
+            </w:tcMar>
+          </w:tcPr>
+          <w:p>
+            <w:pPr>
+              <w:spacing w:line="320" w:lineRule="auto"/>
+            </w:pPr>
+            <w:r>
+              <w:rPr>
+                <w:b/>
+                <w:bCs/>
+              </w:rPr>
+              <w:t>MoSCoW</w:t>
+            </w:r>
+          </w:p>
+        </w:tc>
+        <w:tc>
+          <w:tcPr>
+            <w:tcW w:w="7026" w:type="dxa"/>
+            <w:tcBorders>
+              <w:top w:val="single" w:sz="4" w:space="0" w:color="000000"/>
+              <w:left w:val="single" w:sz="4" w:space="0" w:color="000000"/>
+              <w:bottom w:val="single" w:sz="4" w:space="0" w:color="000000"/>
+              <w:right w:val="single" w:sz="4" w:space="0" w:color="000000"/>
+            </w:tcBorders>
+            <w:tcMar>
+              <w:top w:w="80" w:type="dxa"/>
+              <w:left w:w="120" w:type="dxa"/>
+              <w:bottom w:w="80" w:type="dxa"/>
+              <w:right w:w="120" w:type="dxa"/>
+            </w:tcMar>
+          </w:tcPr>
+          <w:p>
+            <w:pPr>
+              <w:spacing w:line="320" w:lineRule="auto"/>
+            </w:pPr>
+            <w:r>
+              <w:t>Should Have</w:t>
+            </w:r>
+          </w:p>
+        </w:tc>
+      </w:tr>
+      <w:tr>
+        <w:tc>
+          <w:tcPr>
+            <w:tcW w:w="2000" w:type="dxa"/>
+            <w:tcBorders>
+              <w:top w:val="single" w:sz="4" w:space="0" w:color="000000"/>
+              <w:left w:val="single" w:sz="4" w:space="0" w:color="000000"/>
+              <w:bottom w:val="single" w:sz="4" w:space="0" w:color="000000"/>
+              <w:right w:val="single" w:sz="4" w:space="0" w:color="000000"/>
+            </w:tcBorders>
+            <w:tcMar>
+              <w:top w:w="80" w:type="dxa"/>
+              <w:left w:w="120" w:type="dxa"/>
+              <w:bottom w:w="80" w:type="dxa"/>
+              <w:right w:w="120" w:type="dxa"/>
+            </w:tcMar>
+          </w:tcPr>
+          <w:p>
+            <w:pPr>
+              <w:spacing w:line="320" w:lineRule="auto"/>
+            </w:pPr>
+            <w:r>
+              <w:rPr>
+                <w:b/>
+                <w:bCs/>
+              </w:rPr>
+              <w:t>Tasks</w:t>
+            </w:r>
+          </w:p>
+        </w:tc>
+        <w:tc>
+          <w:tcPr>
+            <w:tcW w:w="7026" w:type="dxa"/>
+            <w:tcBorders>
+              <w:top w:val="single" w:sz="4" w:space="0" w:color="000000"/>
+              <w:left w:val="single" w:sz="4" w:space="0" w:color="000000"/>
+              <w:bottom w:val="single" w:sz="4" w:space="0" w:color="000000"/>
+              <w:right w:val="single" w:sz="4" w:space="0" w:color="000000"/>
+            </w:tcBorders>
+            <w:tcMar>
+              <w:top w:w="80" w:type="dxa"/>
+              <w:left w:w="120" w:type="dxa"/>
+              <w:bottom w:w="80" w:type="dxa"/>
+              <w:right w:w="120" w:type="dxa"/>
+            </w:tcMar>
+          </w:tcPr>
+          <w:p>
+            <w:pPr>
+              <w:numPr>
+                <w:ilvl w:val="0"/>
+                <w:numId w:val="9"/>
+              </w:numPr>
+              <w:spacing w:after="0" w:line="320" w:lineRule="auto"/>
+            </w:pPr>
+            <w:r>
+              <w:t xml:space="preserve">Create the donation conversion method. </w:t>
+            </w:r>
+          </w:p>
+          <w:p>
+            <w:pPr>
+              <w:numPr>
+                <w:ilvl w:val="0"/>
+                <w:numId w:val="9"/>
+              </w:numPr>
+              <w:spacing w:after="0" w:line="320" w:lineRule="auto"/>
+            </w:pPr>
+            <w:r>
+              <w:t xml:space="preserve">Establish an inventory item-related POST /api/donations endpoint. </w:t>
+            </w:r>
+          </w:p>
+          <w:p>
+            <w:pPr>
+              <w:numPr>
+                <w:ilvl w:val="0"/>
+                <w:numId w:val="9"/>
+              </w:numPr>
+              <w:spacing w:after="0" w:line="320" w:lineRule="auto"/>
+            </w:pPr>
+            <w:r>
+              <w:t xml:space="preserve">Use geolocation filtering for donations on the backend </w:t>
+            </w:r>
+          </w:p>
+          <w:p>
+            <w:pPr>
+              <w:numPr>
+                <w:ilvl w:val="0"/>
+                <w:numId w:val="9"/>
+              </w:numPr>
+              <w:spacing w:after="0" w:line="320" w:lineRule="auto"/>
+            </w:pPr>
+            <w:r>
+              <w:t xml:space="preserve">Create integration tests for the pipeline that converts donations. </w:t>
+            </w:r>
+          </w:p>
+        </w:tc>
+      </w:tr>
+      <w:tr>
+        <w:tc>
+          <w:tcPr>
+            <w:tcW w:w="2000" w:type="dxa"/>
+            <w:tcBorders>
+              <w:top w:val="single" w:sz="4" w:space="0" w:color="000000"/>
+              <w:left w:val="single" w:sz="4" w:space="0" w:color="000000"/>
+              <w:bottom w:val="single" w:sz="4" w:space="0" w:color="000000"/>
+              <w:right w:val="single" w:sz="4" w:space="0" w:color="000000"/>
+            </w:tcBorders>
+            <w:tcMar>
+              <w:top w:w="80" w:type="dxa"/>
+              <w:left w:w="120" w:type="dxa"/>
+              <w:bottom w:w="80" w:type="dxa"/>
+              <w:right w:w="120" w:type="dxa"/>
+            </w:tcMar>
+          </w:tcPr>
+          <w:p>
+            <w:pPr>
+              <w:spacing w:line="320" w:lineRule="auto"/>
+            </w:pPr>
+            <w:r>
+              <w:rPr>
+                <w:b/>
+                <w:bCs/>
+              </w:rPr>
+              <w:t>Test Cases</w:t>
+            </w:r>
+          </w:p>
+        </w:tc>
+        <w:tc>
+          <w:tcPr>
+            <w:tcW w:w="7026" w:type="dxa"/>
+            <w:tcBorders>
+              <w:top w:val="single" w:sz="4" w:space="0" w:color="000000"/>
+              <w:left w:val="single" w:sz="4" w:space="0" w:color="000000"/>
+              <w:bottom w:val="single" w:sz="4" w:space="0" w:color="000000"/>
+              <w:right w:val="single" w:sz="4" w:space="0" w:color="000000"/>
+            </w:tcBorders>
+            <w:tcMar>
+              <w:top w:w="80" w:type="dxa"/>
+              <w:left w:w="120" w:type="dxa"/>
+              <w:bottom w:w="80" w:type="dxa"/>
+              <w:right w:w="120" w:type="dxa"/>
+            </w:tcMar>
+          </w:tcPr>
+          <w:p>
+            <w:pPr>
+              <w:spacing w:line="320" w:lineRule="auto"/>
+            </w:pPr>
+            <w:r>
+              <w:t>to be completed in Assignment 2</w:t>
+            </w:r>
+          </w:p>
+        </w:tc>
+      </w:tr>
+    </w:tbl>
+    <w:p>
+      <w:pPr>
+        <w:spacing w:line="360" w:lineRule="auto"/>
+      </w:pPr>
+    </w:p>
+    <w:p>
+      <w:pPr>
+        <w:pStyle w:val="Heading3"/>
+        <w:spacing w:before="160" w:after="80"/>
+      </w:pPr>
+      <w:bookmarkStart w:id="11" w:name="_heading=h.fo3jkhqsg8r" w:colFirst="0" w:colLast="0"/>
+      <w:bookmarkEnd w:id="11"/>
+      <w:r>
+        <w:t>[Epic 4] – Notification Centre and Alert Management</w:t>
+      </w:r>
+    </w:p>
+    <w:p>
+      <w:pPr>
+        <w:spacing w:after="120" w:line="360" w:lineRule="auto"/>
+        <w:jc w:val="both"/>
+      </w:pPr>
+      <w:r>
+        <w:t xml:space="preserve">This story discusses the in-app notification system that notifies users of account notifications, food plan reminders, donation updates, and expiration events. </w:t>
+      </w:r>
+    </w:p>
+    <w:tbl>
+      <w:tblPr>
+        <w:tblW w:w="9026" w:type="dxa"/>
+        <w:tblBorders>
+          <w:top w:val="single" w:sz="4" w:space="0" w:color="000000"/>
+          <w:left w:val="single" w:sz="4" w:space="0" w:color="000000"/>
+          <w:bottom w:val="single" w:sz="4" w:space="0" w:color="000000"/>
+          <w:right w:val="single" w:sz="4" w:space="0" w:color="000000"/>
+          <w:insideH w:val="single" w:sz="4" w:space="0" w:color="000000"/>
+          <w:insideV w:val="single" w:sz="4" w:space="0" w:color="000000"/>
+        </w:tblBorders>
+        <w:tblLayout w:type="fixed"/>
+        <w:tblLook w:val="0000" w:firstRow="0" w:lastRow="0" w:firstColumn="0" w:lastColumn="0" w:noHBand="0" w:noVBand="0"/>
+      </w:tblPr>
+      <w:tblGrid>
+        <w:gridCol w:w="2000"/>
+        <w:gridCol w:w="7026"/>
+      </w:tblGrid>
+      <w:tr>
+        <w:tc>
+          <w:tcPr>
+            <w:tcW w:w="2000" w:type="dxa"/>
+            <w:tcBorders>
+              <w:top w:val="single" w:sz="4" w:space="0" w:color="000000"/>
+              <w:left w:val="single" w:sz="4" w:space="0" w:color="000000"/>
+              <w:bottom w:val="single" w:sz="4" w:space="0" w:color="000000"/>
+              <w:right w:val="single" w:sz="4" w:space="0" w:color="000000"/>
+            </w:tcBorders>
+            <w:tcMar>
+              <w:top w:w="80" w:type="dxa"/>
+              <w:left w:w="120" w:type="dxa"/>
+              <w:bottom w:w="80" w:type="dxa"/>
+              <w:right w:w="120" w:type="dxa"/>
+            </w:tcMar>
+          </w:tcPr>
+          <w:p>
+            <w:pPr>
+              <w:spacing w:line="320" w:lineRule="auto"/>
+            </w:pPr>
+            <w:r>
+              <w:rPr>
+                <w:b/>
+                <w:bCs/>
+              </w:rPr>
+              <w:t>[User Story 4.1]</w:t>
+            </w:r>
+          </w:p>
+        </w:tc>
+        <w:tc>
+          <w:tcPr>
+            <w:tcW w:w="7026" w:type="dxa"/>
+            <w:tcBorders>
+              <w:top w:val="single" w:sz="4" w:space="0" w:color="000000"/>
+              <w:left w:val="single" w:sz="4" w:space="0" w:color="000000"/>
+              <w:bottom w:val="single" w:sz="4" w:space="0" w:color="000000"/>
+              <w:right w:val="single" w:sz="4" w:space="0" w:color="000000"/>
+            </w:tcBorders>
+            <w:tcMar>
+              <w:top w:w="80" w:type="dxa"/>
+              <w:left w:w="120" w:type="dxa"/>
+              <w:bottom w:w="80" w:type="dxa"/>
+              <w:right w:w="120" w:type="dxa"/>
+            </w:tcMar>
+          </w:tcPr>
+          <w:p>
+            <w:pPr>
+              <w:spacing w:line="320" w:lineRule="auto"/>
+            </w:pPr>
+            <w:r>
+              <w:t>As a logged-in user, I want to get automatically notified 48 hours before the expiration of any of my inventory items, so I act (use, plan, or donate) and the item won't go to waste.</w:t>
+            </w:r>
+          </w:p>
+        </w:tc>
+      </w:tr>
+      <w:tr>
+        <w:tc>
+          <w:tcPr>
+            <w:tcW w:w="2000" w:type="dxa"/>
+            <w:tcBorders>
+              <w:top w:val="single" w:sz="4" w:space="0" w:color="000000"/>
+              <w:left w:val="single" w:sz="4" w:space="0" w:color="000000"/>
+              <w:bottom w:val="single" w:sz="4" w:space="0" w:color="000000"/>
+              <w:right w:val="single" w:sz="4" w:space="0" w:color="000000"/>
+            </w:tcBorders>
+            <w:tcMar>
+              <w:top w:w="80" w:type="dxa"/>
+              <w:left w:w="120" w:type="dxa"/>
+              <w:bottom w:w="80" w:type="dxa"/>
+              <w:right w:w="120" w:type="dxa"/>
+            </w:tcMar>
+          </w:tcPr>
+          <w:p>
+            <w:pPr>
+              <w:spacing w:line="320" w:lineRule="auto"/>
+            </w:pPr>
+            <w:r>
+              <w:rPr>
+                <w:b/>
+                <w:bCs/>
+              </w:rPr>
+              <w:t>Acceptance Criteria</w:t>
+            </w:r>
+          </w:p>
+        </w:tc>
+        <w:tc>
+          <w:tcPr>
+            <w:tcW w:w="7026" w:type="dxa"/>
+            <w:tcBorders>
+              <w:top w:val="single" w:sz="4" w:space="0" w:color="000000"/>
+              <w:left w:val="single" w:sz="4" w:space="0" w:color="000000"/>
+              <w:bottom w:val="single" w:sz="4" w:space="0" w:color="000000"/>
+              <w:right w:val="single" w:sz="4" w:space="0" w:color="000000"/>
+            </w:tcBorders>
+            <w:tcMar>
+              <w:top w:w="80" w:type="dxa"/>
+              <w:left w:w="120" w:type="dxa"/>
+              <w:bottom w:w="80" w:type="dxa"/>
+              <w:right w:w="120" w:type="dxa"/>
+            </w:tcMar>
+          </w:tcPr>
+          <w:p>
+            <w:pPr>
+              <w:spacing w:line="320" w:lineRule="auto"/>
+            </w:pPr>
+            <w:r>
+              <w:t>If a user has food items in their inventory and the expiry date of one item is no more than 48 hours from the current date and time, then the system will automatically generate an in-app notification mentioning the item name, the expiry date, and action links ("Use It", "Convert to Donation", "Plan for Meal") and the system will also display an unread badge on the notification icon.</w:t>
+            </w:r>
+          </w:p>
+        </w:tc>
+      </w:tr>
+      <w:tr>
+        <w:tc>
+          <w:tcPr>
+            <w:tcW w:w="2000" w:type="dxa"/>
+            <w:tcBorders>
+              <w:top w:val="single" w:sz="4" w:space="0" w:color="000000"/>
+              <w:left w:val="single" w:sz="4" w:space="0" w:color="000000"/>
+              <w:bottom w:val="single" w:sz="4" w:space="0" w:color="000000"/>
+              <w:right w:val="single" w:sz="4" w:space="0" w:color="000000"/>
+            </w:tcBorders>
+            <w:tcMar>
+              <w:top w:w="80" w:type="dxa"/>
+              <w:left w:w="120" w:type="dxa"/>
+              <w:bottom w:w="80" w:type="dxa"/>
+              <w:right w:w="120" w:type="dxa"/>
+            </w:tcMar>
+          </w:tcPr>
+          <w:p>
+            <w:pPr>
+              <w:spacing w:line="320" w:lineRule="auto"/>
+            </w:pPr>
+            <w:r>
+              <w:rPr>
+                <w:b/>
+                <w:bCs/>
+              </w:rPr>
+              <w:t>MoSCoW</w:t>
+            </w:r>
+          </w:p>
+        </w:tc>
+        <w:tc>
+          <w:tcPr>
+            <w:tcW w:w="7026" w:type="dxa"/>
+            <w:tcBorders>
+              <w:top w:val="single" w:sz="4" w:space="0" w:color="000000"/>
+              <w:left w:val="single" w:sz="4" w:space="0" w:color="000000"/>
+              <w:bottom w:val="single" w:sz="4" w:space="0" w:color="000000"/>
+              <w:right w:val="single" w:sz="4" w:space="0" w:color="000000"/>
+            </w:tcBorders>
+            <w:tcMar>
+              <w:top w:w="80" w:type="dxa"/>
+              <w:left w:w="120" w:type="dxa"/>
+              <w:bottom w:w="80" w:type="dxa"/>
+              <w:right w:w="120" w:type="dxa"/>
+            </w:tcMar>
+          </w:tcPr>
+          <w:p>
+            <w:pPr>
+              <w:spacing w:line="320" w:lineRule="auto"/>
+            </w:pPr>
+            <w:r>
+              <w:t>Must Have</w:t>
+            </w:r>
+          </w:p>
+        </w:tc>
+      </w:tr>
+      <w:tr>
+        <w:tc>
+          <w:tcPr>
+            <w:tcW w:w="2000" w:type="dxa"/>
+            <w:tcBorders>
+              <w:top w:val="single" w:sz="4" w:space="0" w:color="000000"/>
+              <w:left w:val="single" w:sz="4" w:space="0" w:color="000000"/>
+              <w:bottom w:val="single" w:sz="4" w:space="0" w:color="000000"/>
+              <w:right w:val="single" w:sz="4" w:space="0" w:color="000000"/>
+            </w:tcBorders>
+            <w:tcMar>
+              <w:top w:w="80" w:type="dxa"/>
+              <w:left w:w="120" w:type="dxa"/>
+              <w:bottom w:w="80" w:type="dxa"/>
+              <w:right w:w="120" w:type="dxa"/>
+            </w:tcMar>
+          </w:tcPr>
+          <w:p>
+            <w:pPr>
+              <w:spacing w:line="320" w:lineRule="auto"/>
+            </w:pPr>
+            <w:r>
+              <w:rPr>
+                <w:b/>
+                <w:bCs/>
+              </w:rPr>
+              <w:t>Tasks</w:t>
+            </w:r>
+          </w:p>
+        </w:tc>
+        <w:tc>
+          <w:tcPr>
+            <w:tcW w:w="7026" w:type="dxa"/>
+            <w:tcBorders>
+              <w:top w:val="single" w:sz="4" w:space="0" w:color="000000"/>
+              <w:left w:val="single" w:sz="4" w:space="0" w:color="000000"/>
+              <w:bottom w:val="single" w:sz="4" w:space="0" w:color="000000"/>
+              <w:right w:val="single" w:sz="4" w:space="0" w:color="000000"/>
+            </w:tcBorders>
+            <w:tcMar>
+              <w:top w:w="80" w:type="dxa"/>
+              <w:left w:w="120" w:type="dxa"/>
+              <w:bottom w:w="80" w:type="dxa"/>
+              <w:right w:w="120" w:type="dxa"/>
+            </w:tcMar>
+          </w:tcPr>
+          <w:p>
+            <w:pPr>
+              <w:numPr>
+                <w:ilvl w:val="0"/>
+                <w:numId w:val="15"/>
+              </w:numPr>
+              <w:spacing w:after="0" w:line="320" w:lineRule="auto"/>
+            </w:pPr>
+            <w:r>
+              <w:t>Design the UI for notifications centre</w:t>
+            </w:r>
+          </w:p>
+          <w:p>
+            <w:pPr>
+              <w:numPr>
+                <w:ilvl w:val="0"/>
+                <w:numId w:val="15"/>
+              </w:numPr>
+              <w:spacing w:after="0" w:line="320" w:lineRule="auto"/>
+            </w:pPr>
+            <w:r>
+              <w:t>Set up scheduled background job (cron) to check expiration dates every 6 hours</w:t>
+            </w:r>
+          </w:p>
+          <w:p>
+            <w:pPr>
+              <w:numPr>
+                <w:ilvl w:val="0"/>
+                <w:numId w:val="15"/>
+              </w:numPr>
+              <w:spacing w:after="0" w:line="320" w:lineRule="auto"/>
+            </w:pPr>
+            <w:r>
+              <w:t>Develop POST /api/notifications endpoint for auto-generated alerts</w:t>
+            </w:r>
+          </w:p>
+          <w:p>
+            <w:pPr>
+              <w:numPr>
+                <w:ilvl w:val="0"/>
+                <w:numId w:val="15"/>
+              </w:numPr>
+              <w:spacing w:after="0" w:line="320" w:lineRule="auto"/>
+            </w:pPr>
+            <w:r>
+              <w:t>Show unread notification badge in the navbar</w:t>
+            </w:r>
+          </w:p>
+          <w:p>
+            <w:pPr>
+              <w:numPr>
+                <w:ilvl w:val="0"/>
+                <w:numId w:val="15"/>
+              </w:numPr>
+              <w:spacing w:after="0" w:line="320" w:lineRule="auto"/>
+            </w:pPr>
+            <w:r>
+              <w:t>Make unit tests for the logic of scheduling expiry notifications</w:t>
+            </w:r>
+          </w:p>
+        </w:tc>
+      </w:tr>
+      <w:tr>
+        <w:tc>
+          <w:tcPr>
+            <w:tcW w:w="2000" w:type="dxa"/>
+            <w:tcBorders>
+              <w:top w:val="single" w:sz="4" w:space="0" w:color="000000"/>
+              <w:left w:val="single" w:sz="4" w:space="0" w:color="000000"/>
+              <w:bottom w:val="single" w:sz="4" w:space="0" w:color="000000"/>
+              <w:right w:val="single" w:sz="4" w:space="0" w:color="000000"/>
+            </w:tcBorders>
+            <w:tcMar>
+              <w:top w:w="80" w:type="dxa"/>
+              <w:left w:w="120" w:type="dxa"/>
+              <w:bottom w:w="80" w:type="dxa"/>
+              <w:right w:w="120" w:type="dxa"/>
+            </w:tcMar>
+          </w:tcPr>
+          <w:p>
+            <w:pPr>
+              <w:spacing w:line="320" w:lineRule="auto"/>
+            </w:pPr>
+            <w:r>
+              <w:rPr>
+                <w:b/>
+                <w:bCs/>
+              </w:rPr>
+              <w:t>Test Cases</w:t>
+            </w:r>
+          </w:p>
+        </w:tc>
+        <w:tc>
+          <w:tcPr>
+            <w:tcW w:w="7026" w:type="dxa"/>
+            <w:tcBorders>
+              <w:top w:val="single" w:sz="4" w:space="0" w:color="000000"/>
+              <w:left w:val="single" w:sz="4" w:space="0" w:color="000000"/>
+              <w:bottom w:val="single" w:sz="4" w:space="0" w:color="000000"/>
+              <w:right w:val="single" w:sz="4" w:space="0" w:color="000000"/>
+            </w:tcBorders>
+            <w:tcMar>
+              <w:top w:w="80" w:type="dxa"/>
+              <w:left w:w="120" w:type="dxa"/>
+              <w:bottom w:w="80" w:type="dxa"/>
+              <w:right w:w="120" w:type="dxa"/>
+            </w:tcMar>
+          </w:tcPr>
+          <w:p>
+            <w:pPr>
+              <w:spacing w:line="320" w:lineRule="auto"/>
+            </w:pPr>
+            <w:r>
+              <w:t>to be completed in Assignment 2</w:t>
+            </w:r>
+          </w:p>
+        </w:tc>
+      </w:tr>
+    </w:tbl>
+    <w:p>
+      <w:pPr>
+        <w:spacing w:line="360" w:lineRule="auto"/>
+      </w:pPr>
+    </w:p>
+    <w:tbl>
+      <w:tblPr>
+        <w:tblW w:w="9026" w:type="dxa"/>
+        <w:tblBorders>
+          <w:top w:val="single" w:sz="4" w:space="0" w:color="000000"/>
+          <w:left w:val="single" w:sz="4" w:space="0" w:color="000000"/>
+          <w:bottom w:val="single" w:sz="4" w:space="0" w:color="000000"/>
+          <w:right w:val="single" w:sz="4" w:space="0" w:color="000000"/>
+          <w:insideH w:val="single" w:sz="4" w:space="0" w:color="000000"/>
+          <w:insideV w:val="single" w:sz="4" w:space="0" w:color="000000"/>
+        </w:tblBorders>
+        <w:tblLayout w:type="fixed"/>
+        <w:tblLook w:val="0000" w:firstRow="0" w:lastRow="0" w:firstColumn="0" w:lastColumn="0" w:noHBand="0" w:noVBand="0"/>
+      </w:tblPr>
+      <w:tblGrid>
+        <w:gridCol w:w="2000"/>
+        <w:gridCol w:w="7026"/>
+      </w:tblGrid>
+      <w:tr>
+        <w:tc>
+          <w:tcPr>
+            <w:tcW w:w="2000" w:type="dxa"/>
+            <w:tcBorders>
+              <w:top w:val="single" w:sz="4" w:space="0" w:color="000000"/>
+              <w:left w:val="single" w:sz="4" w:space="0" w:color="000000"/>
+              <w:bottom w:val="single" w:sz="4" w:space="0" w:color="000000"/>
+              <w:right w:val="single" w:sz="4" w:space="0" w:color="000000"/>
+            </w:tcBorders>
+            <w:tcMar>
+              <w:top w:w="80" w:type="dxa"/>
+              <w:left w:w="120" w:type="dxa"/>
+              <w:bottom w:w="80" w:type="dxa"/>
+              <w:right w:w="120" w:type="dxa"/>
+            </w:tcMar>
+          </w:tcPr>
+          <w:p>
+            <w:pPr>
+              <w:spacing w:line="320" w:lineRule="auto"/>
+            </w:pPr>
+            <w:r>
+              <w:rPr>
+                <w:b/>
+                <w:bCs/>
+              </w:rPr>
+              <w:t>[User Story 4.2]</w:t>
+            </w:r>
+          </w:p>
+        </w:tc>
+        <w:tc>
+          <w:tcPr>
+            <w:tcW w:w="7026" w:type="dxa"/>
+            <w:tcBorders>
+              <w:top w:val="single" w:sz="4" w:space="0" w:color="000000"/>
+              <w:left w:val="single" w:sz="4" w:space="0" w:color="000000"/>
+              <w:bottom w:val="single" w:sz="4" w:space="0" w:color="000000"/>
+              <w:right w:val="single" w:sz="4" w:space="0" w:color="000000"/>
+            </w:tcBorders>
+            <w:tcMar>
+              <w:top w:w="80" w:type="dxa"/>
+              <w:left w:w="120" w:type="dxa"/>
+              <w:bottom w:w="80" w:type="dxa"/>
+              <w:right w:w="120" w:type="dxa"/>
+            </w:tcMar>
+          </w:tcPr>
+          <w:p>
+            <w:pPr>
+              <w:spacing w:line="320" w:lineRule="auto"/>
+            </w:pPr>
+            <w:r>
+              <w:t xml:space="preserve">In order to effectively manage my alerts as a logged-in user, I must be able to access all of my notifications in one location and mark them as read. </w:t>
+            </w:r>
+          </w:p>
+        </w:tc>
+      </w:tr>
+      <w:tr>
+        <w:tc>
+          <w:tcPr>
+            <w:tcW w:w="2000" w:type="dxa"/>
+            <w:tcBorders>
+              <w:top w:val="single" w:sz="4" w:space="0" w:color="000000"/>
+              <w:left w:val="single" w:sz="4" w:space="0" w:color="000000"/>
+              <w:bottom w:val="single" w:sz="4" w:space="0" w:color="000000"/>
+              <w:right w:val="single" w:sz="4" w:space="0" w:color="000000"/>
+            </w:tcBorders>
+            <w:tcMar>
+              <w:top w:w="80" w:type="dxa"/>
+              <w:left w:w="120" w:type="dxa"/>
+              <w:bottom w:w="80" w:type="dxa"/>
+              <w:right w:w="120" w:type="dxa"/>
+            </w:tcMar>
+          </w:tcPr>
+          <w:p>
+            <w:pPr>
+              <w:spacing w:line="320" w:lineRule="auto"/>
+            </w:pPr>
+            <w:r>
+              <w:rPr>
+                <w:b/>
+                <w:bCs/>
+              </w:rPr>
+              <w:t>Acceptance Criteria</w:t>
+            </w:r>
+          </w:p>
+        </w:tc>
+        <w:tc>
+          <w:tcPr>
+            <w:tcW w:w="7026" w:type="dxa"/>
+            <w:tcBorders>
+              <w:top w:val="single" w:sz="4" w:space="0" w:color="000000"/>
+              <w:left w:val="single" w:sz="4" w:space="0" w:color="000000"/>
+              <w:bottom w:val="single" w:sz="4" w:space="0" w:color="000000"/>
+              <w:right w:val="single" w:sz="4" w:space="0" w:color="000000"/>
+            </w:tcBorders>
+            <w:tcMar>
+              <w:top w:w="80" w:type="dxa"/>
+              <w:left w:w="120" w:type="dxa"/>
+              <w:bottom w:w="80" w:type="dxa"/>
+              <w:right w:w="120" w:type="dxa"/>
+            </w:tcMar>
+          </w:tcPr>
+          <w:p>
+            <w:pPr>
+              <w:spacing w:line="320" w:lineRule="auto"/>
+            </w:pPr>
+            <w:r>
+              <w:t>If a user goes to the Notifications page and the page is loaded, then all notifications are shown by the system, sorted by the most recent, and the unread ones are visually differentiated. When the user clicks a notification or the "Mark All as Read" button is pressed, then the system changes the notification status in the database and gets rid of the unread badge.</w:t>
+            </w:r>
+          </w:p>
+        </w:tc>
+      </w:tr>
+      <w:tr>
+        <w:tc>
+          <w:tcPr>
+            <w:tcW w:w="2000" w:type="dxa"/>
+            <w:tcBorders>
+              <w:top w:val="single" w:sz="4" w:space="0" w:color="000000"/>
+              <w:left w:val="single" w:sz="4" w:space="0" w:color="000000"/>
+              <w:bottom w:val="single" w:sz="4" w:space="0" w:color="000000"/>
+              <w:right w:val="single" w:sz="4" w:space="0" w:color="000000"/>
+            </w:tcBorders>
+            <w:tcMar>
+              <w:top w:w="80" w:type="dxa"/>
+              <w:left w:w="120" w:type="dxa"/>
+              <w:bottom w:w="80" w:type="dxa"/>
+              <w:right w:w="120" w:type="dxa"/>
+            </w:tcMar>
+          </w:tcPr>
+          <w:p>
+            <w:pPr>
+              <w:spacing w:line="320" w:lineRule="auto"/>
+            </w:pPr>
+            <w:r>
+              <w:rPr>
+                <w:b/>
+                <w:bCs/>
+              </w:rPr>
+              <w:t>MoSCoW</w:t>
+            </w:r>
+          </w:p>
+        </w:tc>
+        <w:tc>
+          <w:tcPr>
+            <w:tcW w:w="7026" w:type="dxa"/>
+            <w:tcBorders>
+              <w:top w:val="single" w:sz="4" w:space="0" w:color="000000"/>
+              <w:left w:val="single" w:sz="4" w:space="0" w:color="000000"/>
+              <w:bottom w:val="single" w:sz="4" w:space="0" w:color="000000"/>
+              <w:right w:val="single" w:sz="4" w:space="0" w:color="000000"/>
+            </w:tcBorders>
+            <w:tcMar>
+              <w:top w:w="80" w:type="dxa"/>
+              <w:left w:w="120" w:type="dxa"/>
+              <w:bottom w:w="80" w:type="dxa"/>
+              <w:right w:w="120" w:type="dxa"/>
+            </w:tcMar>
+          </w:tcPr>
+          <w:p>
+            <w:pPr>
+              <w:spacing w:line="320" w:lineRule="auto"/>
+            </w:pPr>
+            <w:r>
+              <w:t>Should Have</w:t>
+            </w:r>
+          </w:p>
+        </w:tc>
+      </w:tr>
+      <w:tr>
+        <w:tc>
+          <w:tcPr>
+            <w:tcW w:w="2000" w:type="dxa"/>
+            <w:tcBorders>
+              <w:top w:val="single" w:sz="4" w:space="0" w:color="000000"/>
+              <w:left w:val="single" w:sz="4" w:space="0" w:color="000000"/>
+              <w:bottom w:val="single" w:sz="4" w:space="0" w:color="000000"/>
+              <w:right w:val="single" w:sz="4" w:space="0" w:color="000000"/>
+            </w:tcBorders>
+            <w:tcMar>
+              <w:top w:w="80" w:type="dxa"/>
+              <w:left w:w="120" w:type="dxa"/>
+              <w:bottom w:w="80" w:type="dxa"/>
+              <w:right w:w="120" w:type="dxa"/>
+            </w:tcMar>
+          </w:tcPr>
+          <w:p>
+            <w:pPr>
+              <w:spacing w:line="320" w:lineRule="auto"/>
+            </w:pPr>
+            <w:r>
+              <w:rPr>
+                <w:b/>
+                <w:bCs/>
+              </w:rPr>
+              <w:t>Tasks</w:t>
+            </w:r>
+          </w:p>
+        </w:tc>
+        <w:tc>
+          <w:tcPr>
+            <w:tcW w:w="7026" w:type="dxa"/>
+            <w:tcBorders>
+              <w:top w:val="single" w:sz="4" w:space="0" w:color="000000"/>
+              <w:left w:val="single" w:sz="4" w:space="0" w:color="000000"/>
+              <w:bottom w:val="single" w:sz="4" w:space="0" w:color="000000"/>
+              <w:right w:val="single" w:sz="4" w:space="0" w:color="000000"/>
+            </w:tcBorders>
+            <w:tcMar>
+              <w:top w:w="80" w:type="dxa"/>
+              <w:left w:w="120" w:type="dxa"/>
+              <w:bottom w:w="80" w:type="dxa"/>
+              <w:right w:w="120" w:type="dxa"/>
+            </w:tcMar>
+          </w:tcPr>
+          <w:p>
+            <w:pPr>
+              <w:numPr>
+                <w:ilvl w:val="0"/>
+                <w:numId w:val="10"/>
+              </w:numPr>
+              <w:spacing w:after="0" w:line="320" w:lineRule="auto"/>
+            </w:pPr>
+            <w:r>
+              <w:t>Design notification list interface with read/unread visual indicators</w:t>
+            </w:r>
+          </w:p>
+          <w:p>
+            <w:pPr>
+              <w:numPr>
+                <w:ilvl w:val="0"/>
+                <w:numId w:val="10"/>
+              </w:numPr>
+              <w:spacing w:after="0" w:line="320" w:lineRule="auto"/>
+            </w:pPr>
+            <w:r>
+              <w:t>Develop GET /api/notifications and PATCH /api/notifications/:id/read API endpoints</w:t>
+            </w:r>
+          </w:p>
+          <w:p>
+            <w:pPr>
+              <w:numPr>
+                <w:ilvl w:val="0"/>
+                <w:numId w:val="10"/>
+              </w:numPr>
+              <w:spacing w:after="0" w:line="320" w:lineRule="auto"/>
+            </w:pPr>
+            <w:r>
+              <w:t>Introduce "Mark All as Read" feature that updates notifications in batch</w:t>
+            </w:r>
+          </w:p>
+          <w:p>
+            <w:pPr>
+              <w:numPr>
+                <w:ilvl w:val="0"/>
+                <w:numId w:val="10"/>
+              </w:numPr>
+              <w:spacing w:after="0" w:line="320" w:lineRule="auto"/>
+            </w:pPr>
+            <w:r>
+              <w:t>Produce integration tests for the management of notification read states</w:t>
+            </w:r>
+          </w:p>
+        </w:tc>
+      </w:tr>
+      <w:tr>
+        <w:tc>
+          <w:tcPr>
+            <w:tcW w:w="2000" w:type="dxa"/>
+            <w:tcBorders>
+              <w:top w:val="single" w:sz="4" w:space="0" w:color="000000"/>
+              <w:left w:val="single" w:sz="4" w:space="0" w:color="000000"/>
+              <w:bottom w:val="single" w:sz="4" w:space="0" w:color="000000"/>
+              <w:right w:val="single" w:sz="4" w:space="0" w:color="000000"/>
+            </w:tcBorders>
+            <w:tcMar>
+              <w:top w:w="80" w:type="dxa"/>
+              <w:left w:w="120" w:type="dxa"/>
+              <w:bottom w:w="80" w:type="dxa"/>
+              <w:right w:w="120" w:type="dxa"/>
+            </w:tcMar>
+          </w:tcPr>
+          <w:p>
+            <w:pPr>
+              <w:spacing w:line="320" w:lineRule="auto"/>
+            </w:pPr>
+            <w:r>
+              <w:rPr>
+                <w:b/>
+                <w:bCs/>
+              </w:rPr>
+              <w:t>Test Cases</w:t>
+            </w:r>
+          </w:p>
+        </w:tc>
+        <w:tc>
+          <w:tcPr>
+            <w:tcW w:w="7026" w:type="dxa"/>
+            <w:tcBorders>
+              <w:top w:val="single" w:sz="4" w:space="0" w:color="000000"/>
+              <w:left w:val="single" w:sz="4" w:space="0" w:color="000000"/>
+              <w:bottom w:val="single" w:sz="4" w:space="0" w:color="000000"/>
+              <w:right w:val="single" w:sz="4" w:space="0" w:color="000000"/>
+            </w:tcBorders>
+            <w:tcMar>
+              <w:top w:w="80" w:type="dxa"/>
+              <w:left w:w="120" w:type="dxa"/>
+              <w:bottom w:w="80" w:type="dxa"/>
+              <w:right w:w="120" w:type="dxa"/>
+            </w:tcMar>
+          </w:tcPr>
+          <w:p>
+            <w:pPr>
+              <w:spacing w:line="320" w:lineRule="auto"/>
+            </w:pPr>
+            <w:r>
+              <w:t>to be completed in Assignment 2</w:t>
+            </w:r>
+          </w:p>
+        </w:tc>
+      </w:tr>
+    </w:tbl>
+    <w:p>
       <w:pPr>
         <w:spacing w:line="360" w:lineRule="auto"/>
       </w:pPr>
     </w:p>
     <w:p/>
     <w:p/>
-    <w:bookmarkEnd w:id="5"/>
+    <w:p/>
+    <w:p/>
+    <w:p/>
+    <w:p/>
+    <w:p/>
+    <w:p/>
+    <w:p/>
+    <w:p/>
+    <w:p/>
+    <w:p/>
+    <w:p/>
+    <w:p/>
+    <w:p/>
+    <w:p/>
+    <w:p/>
+    <w:p/>
+    <w:p/>
+    <w:p/>
+    <w:p/>
+    <w:p/>
+    <w:p/>
+    <w:p/>
+    <w:p/>
+    <w:p/>
+    <w:p/>
+    <w:p/>
+    <w:p/>
+    <w:p/>
+    <w:p/>
     <w:p/>
     <w:sectPr>
       <w:pgSz w:w="12240" w:h="15840"/>
@@ -5601,6 +7442,232 @@
     </w:lvl>
   </w:abstractNum>
   <w:abstractNum w:abstractNumId="1" w15:restartNumberingAfterBreak="0">
+    <w:nsid w:val="031D26D5"/>
+    <w:multiLevelType w:val="multilevel"/>
+    <w:tmpl w:val="EE082C76"/>
+    <w:lvl w:ilvl="0">
+      <w:start w:val="1"/>
+      <w:numFmt w:val="decimal"/>
+      <w:lvlText w:val="%1."/>
+      <w:lvlJc w:val="left"/>
+      <w:pPr>
+        <w:ind w:left="720" w:hanging="360"/>
+      </w:pPr>
+      <w:rPr>
+        <w:u w:val="none"/>
+      </w:rPr>
+    </w:lvl>
+    <w:lvl w:ilvl="1">
+      <w:start w:val="1"/>
+      <w:numFmt w:val="lowerLetter"/>
+      <w:lvlText w:val="%2."/>
+      <w:lvlJc w:val="left"/>
+      <w:pPr>
+        <w:ind w:left="1440" w:hanging="360"/>
+      </w:pPr>
+      <w:rPr>
+        <w:u w:val="none"/>
+      </w:rPr>
+    </w:lvl>
+    <w:lvl w:ilvl="2">
+      <w:start w:val="1"/>
+      <w:numFmt w:val="lowerRoman"/>
+      <w:lvlText w:val="%3."/>
+      <w:lvlJc w:val="right"/>
+      <w:pPr>
+        <w:ind w:left="2160" w:hanging="360"/>
+      </w:pPr>
+      <w:rPr>
+        <w:u w:val="none"/>
+      </w:rPr>
+    </w:lvl>
+    <w:lvl w:ilvl="3">
+      <w:start w:val="1"/>
+      <w:numFmt w:val="decimal"/>
+      <w:lvlText w:val="%4."/>
+      <w:lvlJc w:val="left"/>
+      <w:pPr>
+        <w:ind w:left="2880" w:hanging="360"/>
+      </w:pPr>
+      <w:rPr>
+        <w:u w:val="none"/>
+      </w:rPr>
+    </w:lvl>
+    <w:lvl w:ilvl="4">
+      <w:start w:val="1"/>
+      <w:numFmt w:val="lowerLetter"/>
+      <w:lvlText w:val="%5."/>
+      <w:lvlJc w:val="left"/>
+      <w:pPr>
+        <w:ind w:left="3600" w:hanging="360"/>
+      </w:pPr>
+      <w:rPr>
+        <w:u w:val="none"/>
+      </w:rPr>
+    </w:lvl>
+    <w:lvl w:ilvl="5">
+      <w:start w:val="1"/>
+      <w:numFmt w:val="lowerRoman"/>
+      <w:lvlText w:val="%6."/>
+      <w:lvlJc w:val="right"/>
+      <w:pPr>
+        <w:ind w:left="4320" w:hanging="360"/>
+      </w:pPr>
+      <w:rPr>
+        <w:u w:val="none"/>
+      </w:rPr>
+    </w:lvl>
+    <w:lvl w:ilvl="6">
+      <w:start w:val="1"/>
+      <w:numFmt w:val="decimal"/>
+      <w:lvlText w:val="%7."/>
+      <w:lvlJc w:val="left"/>
+      <w:pPr>
+        <w:ind w:left="5040" w:hanging="360"/>
+      </w:pPr>
+      <w:rPr>
+        <w:u w:val="none"/>
+      </w:rPr>
+    </w:lvl>
+    <w:lvl w:ilvl="7">
+      <w:start w:val="1"/>
+      <w:numFmt w:val="lowerLetter"/>
+      <w:lvlText w:val="%8."/>
+      <w:lvlJc w:val="left"/>
+      <w:pPr>
+        <w:ind w:left="5760" w:hanging="360"/>
+      </w:pPr>
+      <w:rPr>
+        <w:u w:val="none"/>
+      </w:rPr>
+    </w:lvl>
+    <w:lvl w:ilvl="8">
+      <w:start w:val="1"/>
+      <w:numFmt w:val="lowerRoman"/>
+      <w:lvlText w:val="%9."/>
+      <w:lvlJc w:val="right"/>
+      <w:pPr>
+        <w:ind w:left="6480" w:hanging="360"/>
+      </w:pPr>
+      <w:rPr>
+        <w:u w:val="none"/>
+      </w:rPr>
+    </w:lvl>
+  </w:abstractNum>
+  <w:abstractNum w:abstractNumId="2" w15:restartNumberingAfterBreak="0">
+    <w:nsid w:val="0AEF2454"/>
+    <w:multiLevelType w:val="multilevel"/>
+    <w:tmpl w:val="C988DAE0"/>
+    <w:lvl w:ilvl="0">
+      <w:start w:val="1"/>
+      <w:numFmt w:val="decimal"/>
+      <w:lvlText w:val="%1."/>
+      <w:lvlJc w:val="left"/>
+      <w:pPr>
+        <w:ind w:left="720" w:hanging="360"/>
+      </w:pPr>
+      <w:rPr>
+        <w:u w:val="none"/>
+      </w:rPr>
+    </w:lvl>
+    <w:lvl w:ilvl="1">
+      <w:start w:val="1"/>
+      <w:numFmt w:val="lowerLetter"/>
+      <w:lvlText w:val="%2."/>
+      <w:lvlJc w:val="left"/>
+      <w:pPr>
+        <w:ind w:left="1440" w:hanging="360"/>
+      </w:pPr>
+      <w:rPr>
+        <w:u w:val="none"/>
+      </w:rPr>
+    </w:lvl>
+    <w:lvl w:ilvl="2">
+      <w:start w:val="1"/>
+      <w:numFmt w:val="lowerRoman"/>
+      <w:lvlText w:val="%3."/>
+      <w:lvlJc w:val="right"/>
+      <w:pPr>
+        <w:ind w:left="2160" w:hanging="360"/>
+      </w:pPr>
+      <w:rPr>
+        <w:u w:val="none"/>
+      </w:rPr>
+    </w:lvl>
+    <w:lvl w:ilvl="3">
+      <w:start w:val="1"/>
+      <w:numFmt w:val="decimal"/>
+      <w:lvlText w:val="%4."/>
+      <w:lvlJc w:val="left"/>
+      <w:pPr>
+        <w:ind w:left="2880" w:hanging="360"/>
+      </w:pPr>
+      <w:rPr>
+        <w:u w:val="none"/>
+      </w:rPr>
+    </w:lvl>
+    <w:lvl w:ilvl="4">
+      <w:start w:val="1"/>
+      <w:numFmt w:val="lowerLetter"/>
+      <w:lvlText w:val="%5."/>
+      <w:lvlJc w:val="left"/>
+      <w:pPr>
+        <w:ind w:left="3600" w:hanging="360"/>
+      </w:pPr>
+      <w:rPr>
+        <w:u w:val="none"/>
+      </w:rPr>
+    </w:lvl>
+    <w:lvl w:ilvl="5">
+      <w:start w:val="1"/>
+      <w:numFmt w:val="lowerRoman"/>
+      <w:lvlText w:val="%6."/>
+      <w:lvlJc w:val="right"/>
+      <w:pPr>
+        <w:ind w:left="4320" w:hanging="360"/>
+      </w:pPr>
+      <w:rPr>
+        <w:u w:val="none"/>
+      </w:rPr>
+    </w:lvl>
+    <w:lvl w:ilvl="6">
+      <w:start w:val="1"/>
+      <w:numFmt w:val="decimal"/>
+      <w:lvlText w:val="%7."/>
+      <w:lvlJc w:val="left"/>
+      <w:pPr>
+        <w:ind w:left="5040" w:hanging="360"/>
+      </w:pPr>
+      <w:rPr>
+        <w:u w:val="none"/>
+      </w:rPr>
+    </w:lvl>
+    <w:lvl w:ilvl="7">
+      <w:start w:val="1"/>
+      <w:numFmt w:val="lowerLetter"/>
+      <w:lvlText w:val="%8."/>
+      <w:lvlJc w:val="left"/>
+      <w:pPr>
+        <w:ind w:left="5760" w:hanging="360"/>
+      </w:pPr>
+      <w:rPr>
+        <w:u w:val="none"/>
+      </w:rPr>
+    </w:lvl>
+    <w:lvl w:ilvl="8">
+      <w:start w:val="1"/>
+      <w:numFmt w:val="lowerRoman"/>
+      <w:lvlText w:val="%9."/>
+      <w:lvlJc w:val="right"/>
+      <w:pPr>
+        <w:ind w:left="6480" w:hanging="360"/>
+      </w:pPr>
+      <w:rPr>
+        <w:u w:val="none"/>
+      </w:rPr>
+    </w:lvl>
+  </w:abstractNum>
+  <w:abstractNum w:abstractNumId="3" w15:restartNumberingAfterBreak="0">
     <w:nsid w:val="0D2B648C"/>
     <w:multiLevelType w:val="multilevel"/>
     <w:tmpl w:val="5950AC0E"/>
@@ -5713,7 +7780,120 @@
       </w:rPr>
     </w:lvl>
   </w:abstractNum>
-  <w:abstractNum w:abstractNumId="2" w15:restartNumberingAfterBreak="0">
+  <w:abstractNum w:abstractNumId="4" w15:restartNumberingAfterBreak="0">
+    <w:nsid w:val="0E25492B"/>
+    <w:multiLevelType w:val="multilevel"/>
+    <w:tmpl w:val="7426540A"/>
+    <w:lvl w:ilvl="0">
+      <w:start w:val="1"/>
+      <w:numFmt w:val="decimal"/>
+      <w:lvlText w:val="%1."/>
+      <w:lvlJc w:val="left"/>
+      <w:pPr>
+        <w:ind w:left="720" w:hanging="360"/>
+      </w:pPr>
+      <w:rPr>
+        <w:u w:val="none"/>
+      </w:rPr>
+    </w:lvl>
+    <w:lvl w:ilvl="1">
+      <w:start w:val="1"/>
+      <w:numFmt w:val="lowerLetter"/>
+      <w:lvlText w:val="%2."/>
+      <w:lvlJc w:val="left"/>
+      <w:pPr>
+        <w:ind w:left="1440" w:hanging="360"/>
+      </w:pPr>
+      <w:rPr>
+        <w:u w:val="none"/>
+      </w:rPr>
+    </w:lvl>
+    <w:lvl w:ilvl="2">
+      <w:start w:val="1"/>
+      <w:numFmt w:val="lowerRoman"/>
+      <w:lvlText w:val="%3."/>
+      <w:lvlJc w:val="right"/>
+      <w:pPr>
+        <w:ind w:left="2160" w:hanging="360"/>
+      </w:pPr>
+      <w:rPr>
+        <w:u w:val="none"/>
+      </w:rPr>
+    </w:lvl>
+    <w:lvl w:ilvl="3">
+      <w:start w:val="1"/>
+      <w:numFmt w:val="decimal"/>
+      <w:lvlText w:val="%4."/>
+      <w:lvlJc w:val="left"/>
+      <w:pPr>
+        <w:ind w:left="2880" w:hanging="360"/>
+      </w:pPr>
+      <w:rPr>
+        <w:u w:val="none"/>
+      </w:rPr>
+    </w:lvl>
+    <w:lvl w:ilvl="4">
+      <w:start w:val="1"/>
+      <w:numFmt w:val="lowerLetter"/>
+      <w:lvlText w:val="%5."/>
+      <w:lvlJc w:val="left"/>
+      <w:pPr>
+        <w:ind w:left="3600" w:hanging="360"/>
+      </w:pPr>
+      <w:rPr>
+        <w:u w:val="none"/>
+      </w:rPr>
+    </w:lvl>
+    <w:lvl w:ilvl="5">
+      <w:start w:val="1"/>
+      <w:numFmt w:val="lowerRoman"/>
+      <w:lvlText w:val="%6."/>
+      <w:lvlJc w:val="right"/>
+      <w:pPr>
+        <w:ind w:left="4320" w:hanging="360"/>
+      </w:pPr>
+      <w:rPr>
+        <w:u w:val="none"/>
+      </w:rPr>
+    </w:lvl>
+    <w:lvl w:ilvl="6">
+      <w:start w:val="1"/>
+      <w:numFmt w:val="decimal"/>
+      <w:lvlText w:val="%7."/>
+      <w:lvlJc w:val="left"/>
+      <w:pPr>
+        <w:ind w:left="5040" w:hanging="360"/>
+      </w:pPr>
+      <w:rPr>
+        <w:u w:val="none"/>
+      </w:rPr>
+    </w:lvl>
+    <w:lvl w:ilvl="7">
+      <w:start w:val="1"/>
+      <w:numFmt w:val="lowerLetter"/>
+      <w:lvlText w:val="%8."/>
+      <w:lvlJc w:val="left"/>
+      <w:pPr>
+        <w:ind w:left="5760" w:hanging="360"/>
+      </w:pPr>
+      <w:rPr>
+        <w:u w:val="none"/>
+      </w:rPr>
+    </w:lvl>
+    <w:lvl w:ilvl="8">
+      <w:start w:val="1"/>
+      <w:numFmt w:val="lowerRoman"/>
+      <w:lvlText w:val="%9."/>
+      <w:lvlJc w:val="right"/>
+      <w:pPr>
+        <w:ind w:left="6480" w:hanging="360"/>
+      </w:pPr>
+      <w:rPr>
+        <w:u w:val="none"/>
+      </w:rPr>
+    </w:lvl>
+  </w:abstractNum>
+  <w:abstractNum w:abstractNumId="5" w15:restartNumberingAfterBreak="0">
     <w:nsid w:val="21C94EFE"/>
     <w:multiLevelType w:val="multilevel"/>
     <w:tmpl w:val="3AE60A9E"/>
@@ -5826,7 +8006,233 @@
       </w:rPr>
     </w:lvl>
   </w:abstractNum>
-  <w:abstractNum w:abstractNumId="3" w15:restartNumberingAfterBreak="0">
+  <w:abstractNum w:abstractNumId="6" w15:restartNumberingAfterBreak="0">
+    <w:nsid w:val="2CAC721B"/>
+    <w:multiLevelType w:val="multilevel"/>
+    <w:tmpl w:val="70B8CED0"/>
+    <w:lvl w:ilvl="0">
+      <w:start w:val="1"/>
+      <w:numFmt w:val="decimal"/>
+      <w:lvlText w:val="%1."/>
+      <w:lvlJc w:val="left"/>
+      <w:pPr>
+        <w:ind w:left="720" w:hanging="360"/>
+      </w:pPr>
+      <w:rPr>
+        <w:u w:val="none"/>
+      </w:rPr>
+    </w:lvl>
+    <w:lvl w:ilvl="1">
+      <w:start w:val="1"/>
+      <w:numFmt w:val="lowerLetter"/>
+      <w:lvlText w:val="%2."/>
+      <w:lvlJc w:val="left"/>
+      <w:pPr>
+        <w:ind w:left="1440" w:hanging="360"/>
+      </w:pPr>
+      <w:rPr>
+        <w:u w:val="none"/>
+      </w:rPr>
+    </w:lvl>
+    <w:lvl w:ilvl="2">
+      <w:start w:val="1"/>
+      <w:numFmt w:val="lowerRoman"/>
+      <w:lvlText w:val="%3."/>
+      <w:lvlJc w:val="right"/>
+      <w:pPr>
+        <w:ind w:left="2160" w:hanging="360"/>
+      </w:pPr>
+      <w:rPr>
+        <w:u w:val="none"/>
+      </w:rPr>
+    </w:lvl>
+    <w:lvl w:ilvl="3">
+      <w:start w:val="1"/>
+      <w:numFmt w:val="decimal"/>
+      <w:lvlText w:val="%4."/>
+      <w:lvlJc w:val="left"/>
+      <w:pPr>
+        <w:ind w:left="2880" w:hanging="360"/>
+      </w:pPr>
+      <w:rPr>
+        <w:u w:val="none"/>
+      </w:rPr>
+    </w:lvl>
+    <w:lvl w:ilvl="4">
+      <w:start w:val="1"/>
+      <w:numFmt w:val="lowerLetter"/>
+      <w:lvlText w:val="%5."/>
+      <w:lvlJc w:val="left"/>
+      <w:pPr>
+        <w:ind w:left="3600" w:hanging="360"/>
+      </w:pPr>
+      <w:rPr>
+        <w:u w:val="none"/>
+      </w:rPr>
+    </w:lvl>
+    <w:lvl w:ilvl="5">
+      <w:start w:val="1"/>
+      <w:numFmt w:val="lowerRoman"/>
+      <w:lvlText w:val="%6."/>
+      <w:lvlJc w:val="right"/>
+      <w:pPr>
+        <w:ind w:left="4320" w:hanging="360"/>
+      </w:pPr>
+      <w:rPr>
+        <w:u w:val="none"/>
+      </w:rPr>
+    </w:lvl>
+    <w:lvl w:ilvl="6">
+      <w:start w:val="1"/>
+      <w:numFmt w:val="decimal"/>
+      <w:lvlText w:val="%7."/>
+      <w:lvlJc w:val="left"/>
+      <w:pPr>
+        <w:ind w:left="5040" w:hanging="360"/>
+      </w:pPr>
+      <w:rPr>
+        <w:u w:val="none"/>
+      </w:rPr>
+    </w:lvl>
+    <w:lvl w:ilvl="7">
+      <w:start w:val="1"/>
+      <w:numFmt w:val="lowerLetter"/>
+      <w:lvlText w:val="%8."/>
+      <w:lvlJc w:val="left"/>
+      <w:pPr>
+        <w:ind w:left="5760" w:hanging="360"/>
+      </w:pPr>
+      <w:rPr>
+        <w:u w:val="none"/>
+      </w:rPr>
+    </w:lvl>
+    <w:lvl w:ilvl="8">
+      <w:start w:val="1"/>
+      <w:numFmt w:val="lowerRoman"/>
+      <w:lvlText w:val="%9."/>
+      <w:lvlJc w:val="right"/>
+      <w:pPr>
+        <w:ind w:left="6480" w:hanging="360"/>
+      </w:pPr>
+      <w:rPr>
+        <w:u w:val="none"/>
+      </w:rPr>
+    </w:lvl>
+  </w:abstractNum>
+  <w:abstractNum w:abstractNumId="7" w15:restartNumberingAfterBreak="0">
+    <w:nsid w:val="310F498C"/>
+    <w:multiLevelType w:val="multilevel"/>
+    <w:tmpl w:val="93E2E282"/>
+    <w:lvl w:ilvl="0">
+      <w:start w:val="1"/>
+      <w:numFmt w:val="decimal"/>
+      <w:lvlText w:val="%1."/>
+      <w:lvlJc w:val="left"/>
+      <w:pPr>
+        <w:ind w:left="720" w:hanging="360"/>
+      </w:pPr>
+      <w:rPr>
+        <w:u w:val="none"/>
+      </w:rPr>
+    </w:lvl>
+    <w:lvl w:ilvl="1">
+      <w:start w:val="1"/>
+      <w:numFmt w:val="lowerLetter"/>
+      <w:lvlText w:val="%2."/>
+      <w:lvlJc w:val="left"/>
+      <w:pPr>
+        <w:ind w:left="1440" w:hanging="360"/>
+      </w:pPr>
+      <w:rPr>
+        <w:u w:val="none"/>
+      </w:rPr>
+    </w:lvl>
+    <w:lvl w:ilvl="2">
+      <w:start w:val="1"/>
+      <w:numFmt w:val="lowerRoman"/>
+      <w:lvlText w:val="%3."/>
+      <w:lvlJc w:val="right"/>
+      <w:pPr>
+        <w:ind w:left="2160" w:hanging="360"/>
+      </w:pPr>
+      <w:rPr>
+        <w:u w:val="none"/>
+      </w:rPr>
+    </w:lvl>
+    <w:lvl w:ilvl="3">
+      <w:start w:val="1"/>
+      <w:numFmt w:val="decimal"/>
+      <w:lvlText w:val="%4."/>
+      <w:lvlJc w:val="left"/>
+      <w:pPr>
+        <w:ind w:left="2880" w:hanging="360"/>
+      </w:pPr>
+      <w:rPr>
+        <w:u w:val="none"/>
+      </w:rPr>
+    </w:lvl>
+    <w:lvl w:ilvl="4">
+      <w:start w:val="1"/>
+      <w:numFmt w:val="lowerLetter"/>
+      <w:lvlText w:val="%5."/>
+      <w:lvlJc w:val="left"/>
+      <w:pPr>
+        <w:ind w:left="3600" w:hanging="360"/>
+      </w:pPr>
+      <w:rPr>
+        <w:u w:val="none"/>
+      </w:rPr>
+    </w:lvl>
+    <w:lvl w:ilvl="5">
+      <w:start w:val="1"/>
+      <w:numFmt w:val="lowerRoman"/>
+      <w:lvlText w:val="%6."/>
+      <w:lvlJc w:val="right"/>
+      <w:pPr>
+        <w:ind w:left="4320" w:hanging="360"/>
+      </w:pPr>
+      <w:rPr>
+        <w:u w:val="none"/>
+      </w:rPr>
+    </w:lvl>
+    <w:lvl w:ilvl="6">
+      <w:start w:val="1"/>
+      <w:numFmt w:val="decimal"/>
+      <w:lvlText w:val="%7."/>
+      <w:lvlJc w:val="left"/>
+      <w:pPr>
+        <w:ind w:left="5040" w:hanging="360"/>
+      </w:pPr>
+      <w:rPr>
+        <w:u w:val="none"/>
+      </w:rPr>
+    </w:lvl>
+    <w:lvl w:ilvl="7">
+      <w:start w:val="1"/>
+      <w:numFmt w:val="lowerLetter"/>
+      <w:lvlText w:val="%8."/>
+      <w:lvlJc w:val="left"/>
+      <w:pPr>
+        <w:ind w:left="5760" w:hanging="360"/>
+      </w:pPr>
+      <w:rPr>
+        <w:u w:val="none"/>
+      </w:rPr>
+    </w:lvl>
+    <w:lvl w:ilvl="8">
+      <w:start w:val="1"/>
+      <w:numFmt w:val="lowerRoman"/>
+      <w:lvlText w:val="%9."/>
+      <w:lvlJc w:val="right"/>
+      <w:pPr>
+        <w:ind w:left="6480" w:hanging="360"/>
+      </w:pPr>
+      <w:rPr>
+        <w:u w:val="none"/>
+      </w:rPr>
+    </w:lvl>
+  </w:abstractNum>
+  <w:abstractNum w:abstractNumId="8" w15:restartNumberingAfterBreak="0">
     <w:nsid w:val="33CA0997"/>
     <w:multiLevelType w:val="multilevel"/>
     <w:tmpl w:val="0B5C1528"/>
@@ -5939,7 +8345,459 @@
       </w:rPr>
     </w:lvl>
   </w:abstractNum>
-  <w:abstractNum w:abstractNumId="4" w15:restartNumberingAfterBreak="0">
+  <w:abstractNum w:abstractNumId="9" w15:restartNumberingAfterBreak="0">
+    <w:nsid w:val="35A12809"/>
+    <w:multiLevelType w:val="multilevel"/>
+    <w:tmpl w:val="4142DF12"/>
+    <w:lvl w:ilvl="0">
+      <w:start w:val="1"/>
+      <w:numFmt w:val="decimal"/>
+      <w:lvlText w:val="%1."/>
+      <w:lvlJc w:val="left"/>
+      <w:pPr>
+        <w:ind w:left="720" w:hanging="360"/>
+      </w:pPr>
+      <w:rPr>
+        <w:u w:val="none"/>
+      </w:rPr>
+    </w:lvl>
+    <w:lvl w:ilvl="1">
+      <w:start w:val="1"/>
+      <w:numFmt w:val="lowerLetter"/>
+      <w:lvlText w:val="%2."/>
+      <w:lvlJc w:val="left"/>
+      <w:pPr>
+        <w:ind w:left="1440" w:hanging="360"/>
+      </w:pPr>
+      <w:rPr>
+        <w:u w:val="none"/>
+      </w:rPr>
+    </w:lvl>
+    <w:lvl w:ilvl="2">
+      <w:start w:val="1"/>
+      <w:numFmt w:val="lowerRoman"/>
+      <w:lvlText w:val="%3."/>
+      <w:lvlJc w:val="right"/>
+      <w:pPr>
+        <w:ind w:left="2160" w:hanging="360"/>
+      </w:pPr>
+      <w:rPr>
+        <w:u w:val="none"/>
+      </w:rPr>
+    </w:lvl>
+    <w:lvl w:ilvl="3">
+      <w:start w:val="1"/>
+      <w:numFmt w:val="decimal"/>
+      <w:lvlText w:val="%4."/>
+      <w:lvlJc w:val="left"/>
+      <w:pPr>
+        <w:ind w:left="2880" w:hanging="360"/>
+      </w:pPr>
+      <w:rPr>
+        <w:u w:val="none"/>
+      </w:rPr>
+    </w:lvl>
+    <w:lvl w:ilvl="4">
+      <w:start w:val="1"/>
+      <w:numFmt w:val="lowerLetter"/>
+      <w:lvlText w:val="%5."/>
+      <w:lvlJc w:val="left"/>
+      <w:pPr>
+        <w:ind w:left="3600" w:hanging="360"/>
+      </w:pPr>
+      <w:rPr>
+        <w:u w:val="none"/>
+      </w:rPr>
+    </w:lvl>
+    <w:lvl w:ilvl="5">
+      <w:start w:val="1"/>
+      <w:numFmt w:val="lowerRoman"/>
+      <w:lvlText w:val="%6."/>
+      <w:lvlJc w:val="right"/>
+      <w:pPr>
+        <w:ind w:left="4320" w:hanging="360"/>
+      </w:pPr>
+      <w:rPr>
+        <w:u w:val="none"/>
+      </w:rPr>
+    </w:lvl>
+    <w:lvl w:ilvl="6">
+      <w:start w:val="1"/>
+      <w:numFmt w:val="decimal"/>
+      <w:lvlText w:val="%7."/>
+      <w:lvlJc w:val="left"/>
+      <w:pPr>
+        <w:ind w:left="5040" w:hanging="360"/>
+      </w:pPr>
+      <w:rPr>
+        <w:u w:val="none"/>
+      </w:rPr>
+    </w:lvl>
+    <w:lvl w:ilvl="7">
+      <w:start w:val="1"/>
+      <w:numFmt w:val="lowerLetter"/>
+      <w:lvlText w:val="%8."/>
+      <w:lvlJc w:val="left"/>
+      <w:pPr>
+        <w:ind w:left="5760" w:hanging="360"/>
+      </w:pPr>
+      <w:rPr>
+        <w:u w:val="none"/>
+      </w:rPr>
+    </w:lvl>
+    <w:lvl w:ilvl="8">
+      <w:start w:val="1"/>
+      <w:numFmt w:val="lowerRoman"/>
+      <w:lvlText w:val="%9."/>
+      <w:lvlJc w:val="right"/>
+      <w:pPr>
+        <w:ind w:left="6480" w:hanging="360"/>
+      </w:pPr>
+      <w:rPr>
+        <w:u w:val="none"/>
+      </w:rPr>
+    </w:lvl>
+  </w:abstractNum>
+  <w:abstractNum w:abstractNumId="10" w15:restartNumberingAfterBreak="0">
+    <w:nsid w:val="377A730A"/>
+    <w:multiLevelType w:val="multilevel"/>
+    <w:tmpl w:val="1248B802"/>
+    <w:lvl w:ilvl="0">
+      <w:start w:val="1"/>
+      <w:numFmt w:val="decimal"/>
+      <w:lvlText w:val="%1."/>
+      <w:lvlJc w:val="left"/>
+      <w:pPr>
+        <w:ind w:left="720" w:hanging="360"/>
+      </w:pPr>
+      <w:rPr>
+        <w:u w:val="none"/>
+      </w:rPr>
+    </w:lvl>
+    <w:lvl w:ilvl="1">
+      <w:start w:val="1"/>
+      <w:numFmt w:val="lowerLetter"/>
+      <w:lvlText w:val="%2."/>
+      <w:lvlJc w:val="left"/>
+      <w:pPr>
+        <w:ind w:left="1440" w:hanging="360"/>
+      </w:pPr>
+      <w:rPr>
+        <w:u w:val="none"/>
+      </w:rPr>
+    </w:lvl>
+    <w:lvl w:ilvl="2">
+      <w:start w:val="1"/>
+      <w:numFmt w:val="lowerRoman"/>
+      <w:lvlText w:val="%3."/>
+      <w:lvlJc w:val="right"/>
+      <w:pPr>
+        <w:ind w:left="2160" w:hanging="360"/>
+      </w:pPr>
+      <w:rPr>
+        <w:u w:val="none"/>
+      </w:rPr>
+    </w:lvl>
+    <w:lvl w:ilvl="3">
+      <w:start w:val="1"/>
+      <w:numFmt w:val="decimal"/>
+      <w:lvlText w:val="%4."/>
+      <w:lvlJc w:val="left"/>
+      <w:pPr>
+        <w:ind w:left="2880" w:hanging="360"/>
+      </w:pPr>
+      <w:rPr>
+        <w:u w:val="none"/>
+      </w:rPr>
+    </w:lvl>
+    <w:lvl w:ilvl="4">
+      <w:start w:val="1"/>
+      <w:numFmt w:val="lowerLetter"/>
+      <w:lvlText w:val="%5."/>
+      <w:lvlJc w:val="left"/>
+      <w:pPr>
+        <w:ind w:left="3600" w:hanging="360"/>
+      </w:pPr>
+      <w:rPr>
+        <w:u w:val="none"/>
+      </w:rPr>
+    </w:lvl>
+    <w:lvl w:ilvl="5">
+      <w:start w:val="1"/>
+      <w:numFmt w:val="lowerRoman"/>
+      <w:lvlText w:val="%6."/>
+      <w:lvlJc w:val="right"/>
+      <w:pPr>
+        <w:ind w:left="4320" w:hanging="360"/>
+      </w:pPr>
+      <w:rPr>
+        <w:u w:val="none"/>
+      </w:rPr>
+    </w:lvl>
+    <w:lvl w:ilvl="6">
+      <w:start w:val="1"/>
+      <w:numFmt w:val="decimal"/>
+      <w:lvlText w:val="%7."/>
+      <w:lvlJc w:val="left"/>
+      <w:pPr>
+        <w:ind w:left="5040" w:hanging="360"/>
+      </w:pPr>
+      <w:rPr>
+        <w:u w:val="none"/>
+      </w:rPr>
+    </w:lvl>
+    <w:lvl w:ilvl="7">
+      <w:start w:val="1"/>
+      <w:numFmt w:val="lowerLetter"/>
+      <w:lvlText w:val="%8."/>
+      <w:lvlJc w:val="left"/>
+      <w:pPr>
+        <w:ind w:left="5760" w:hanging="360"/>
+      </w:pPr>
+      <w:rPr>
+        <w:u w:val="none"/>
+      </w:rPr>
+    </w:lvl>
+    <w:lvl w:ilvl="8">
+      <w:start w:val="1"/>
+      <w:numFmt w:val="lowerRoman"/>
+      <w:lvlText w:val="%9."/>
+      <w:lvlJc w:val="right"/>
+      <w:pPr>
+        <w:ind w:left="6480" w:hanging="360"/>
+      </w:pPr>
+      <w:rPr>
+        <w:u w:val="none"/>
+      </w:rPr>
+    </w:lvl>
+  </w:abstractNum>
+  <w:abstractNum w:abstractNumId="11" w15:restartNumberingAfterBreak="0">
+    <w:nsid w:val="3F0015AE"/>
+    <w:multiLevelType w:val="multilevel"/>
+    <w:tmpl w:val="EE385F06"/>
+    <w:lvl w:ilvl="0">
+      <w:start w:val="1"/>
+      <w:numFmt w:val="decimal"/>
+      <w:lvlText w:val="%1."/>
+      <w:lvlJc w:val="left"/>
+      <w:pPr>
+        <w:ind w:left="720" w:hanging="360"/>
+      </w:pPr>
+      <w:rPr>
+        <w:u w:val="none"/>
+      </w:rPr>
+    </w:lvl>
+    <w:lvl w:ilvl="1">
+      <w:start w:val="1"/>
+      <w:numFmt w:val="lowerLetter"/>
+      <w:lvlText w:val="%2."/>
+      <w:lvlJc w:val="left"/>
+      <w:pPr>
+        <w:ind w:left="1440" w:hanging="360"/>
+      </w:pPr>
+      <w:rPr>
+        <w:u w:val="none"/>
+      </w:rPr>
+    </w:lvl>
+    <w:lvl w:ilvl="2">
+      <w:start w:val="1"/>
+      <w:numFmt w:val="lowerRoman"/>
+      <w:lvlText w:val="%3."/>
+      <w:lvlJc w:val="right"/>
+      <w:pPr>
+        <w:ind w:left="2160" w:hanging="360"/>
+      </w:pPr>
+      <w:rPr>
+        <w:u w:val="none"/>
+      </w:rPr>
+    </w:lvl>
+    <w:lvl w:ilvl="3">
+      <w:start w:val="1"/>
+      <w:numFmt w:val="decimal"/>
+      <w:lvlText w:val="%4."/>
+      <w:lvlJc w:val="left"/>
+      <w:pPr>
+        <w:ind w:left="2880" w:hanging="360"/>
+      </w:pPr>
+      <w:rPr>
+        <w:u w:val="none"/>
+      </w:rPr>
+    </w:lvl>
+    <w:lvl w:ilvl="4">
+      <w:start w:val="1"/>
+      <w:numFmt w:val="lowerLetter"/>
+      <w:lvlText w:val="%5."/>
+      <w:lvlJc w:val="left"/>
+      <w:pPr>
+        <w:ind w:left="3600" w:hanging="360"/>
+      </w:pPr>
+      <w:rPr>
+        <w:u w:val="none"/>
+      </w:rPr>
+    </w:lvl>
+    <w:lvl w:ilvl="5">
+      <w:start w:val="1"/>
+      <w:numFmt w:val="lowerRoman"/>
+      <w:lvlText w:val="%6."/>
+      <w:lvlJc w:val="right"/>
+      <w:pPr>
+        <w:ind w:left="4320" w:hanging="360"/>
+      </w:pPr>
+      <w:rPr>
+        <w:u w:val="none"/>
+      </w:rPr>
+    </w:lvl>
+    <w:lvl w:ilvl="6">
+      <w:start w:val="1"/>
+      <w:numFmt w:val="decimal"/>
+      <w:lvlText w:val="%7."/>
+      <w:lvlJc w:val="left"/>
+      <w:pPr>
+        <w:ind w:left="5040" w:hanging="360"/>
+      </w:pPr>
+      <w:rPr>
+        <w:u w:val="none"/>
+      </w:rPr>
+    </w:lvl>
+    <w:lvl w:ilvl="7">
+      <w:start w:val="1"/>
+      <w:numFmt w:val="lowerLetter"/>
+      <w:lvlText w:val="%8."/>
+      <w:lvlJc w:val="left"/>
+      <w:pPr>
+        <w:ind w:left="5760" w:hanging="360"/>
+      </w:pPr>
+      <w:rPr>
+        <w:u w:val="none"/>
+      </w:rPr>
+    </w:lvl>
+    <w:lvl w:ilvl="8">
+      <w:start w:val="1"/>
+      <w:numFmt w:val="lowerRoman"/>
+      <w:lvlText w:val="%9."/>
+      <w:lvlJc w:val="right"/>
+      <w:pPr>
+        <w:ind w:left="6480" w:hanging="360"/>
+      </w:pPr>
+      <w:rPr>
+        <w:u w:val="none"/>
+      </w:rPr>
+    </w:lvl>
+  </w:abstractNum>
+  <w:abstractNum w:abstractNumId="12" w15:restartNumberingAfterBreak="0">
+    <w:nsid w:val="40BF2200"/>
+    <w:multiLevelType w:val="multilevel"/>
+    <w:tmpl w:val="31CA64D6"/>
+    <w:lvl w:ilvl="0">
+      <w:start w:val="1"/>
+      <w:numFmt w:val="decimal"/>
+      <w:lvlText w:val="%1."/>
+      <w:lvlJc w:val="left"/>
+      <w:pPr>
+        <w:ind w:left="720" w:hanging="360"/>
+      </w:pPr>
+      <w:rPr>
+        <w:u w:val="none"/>
+      </w:rPr>
+    </w:lvl>
+    <w:lvl w:ilvl="1">
+      <w:start w:val="1"/>
+      <w:numFmt w:val="lowerLetter"/>
+      <w:lvlText w:val="%2."/>
+      <w:lvlJc w:val="left"/>
+      <w:pPr>
+        <w:ind w:left="1440" w:hanging="360"/>
+      </w:pPr>
+      <w:rPr>
+        <w:u w:val="none"/>
+      </w:rPr>
+    </w:lvl>
+    <w:lvl w:ilvl="2">
+      <w:start w:val="1"/>
+      <w:numFmt w:val="lowerRoman"/>
+      <w:lvlText w:val="%3."/>
+      <w:lvlJc w:val="right"/>
+      <w:pPr>
+        <w:ind w:left="2160" w:hanging="360"/>
+      </w:pPr>
+      <w:rPr>
+        <w:u w:val="none"/>
+      </w:rPr>
+    </w:lvl>
+    <w:lvl w:ilvl="3">
+      <w:start w:val="1"/>
+      <w:numFmt w:val="decimal"/>
+      <w:lvlText w:val="%4."/>
+      <w:lvlJc w:val="left"/>
+      <w:pPr>
+        <w:ind w:left="2880" w:hanging="360"/>
+      </w:pPr>
+      <w:rPr>
+        <w:u w:val="none"/>
+      </w:rPr>
+    </w:lvl>
+    <w:lvl w:ilvl="4">
+      <w:start w:val="1"/>
+      <w:numFmt w:val="lowerLetter"/>
+      <w:lvlText w:val="%5."/>
+      <w:lvlJc w:val="left"/>
+      <w:pPr>
+        <w:ind w:left="3600" w:hanging="360"/>
+      </w:pPr>
+      <w:rPr>
+        <w:u w:val="none"/>
+      </w:rPr>
+    </w:lvl>
+    <w:lvl w:ilvl="5">
+      <w:start w:val="1"/>
+      <w:numFmt w:val="lowerRoman"/>
+      <w:lvlText w:val="%6."/>
+      <w:lvlJc w:val="right"/>
+      <w:pPr>
+        <w:ind w:left="4320" w:hanging="360"/>
+      </w:pPr>
+      <w:rPr>
+        <w:u w:val="none"/>
+      </w:rPr>
+    </w:lvl>
+    <w:lvl w:ilvl="6">
+      <w:start w:val="1"/>
+      <w:numFmt w:val="decimal"/>
+      <w:lvlText w:val="%7."/>
+      <w:lvlJc w:val="left"/>
+      <w:pPr>
+        <w:ind w:left="5040" w:hanging="360"/>
+      </w:pPr>
+      <w:rPr>
+        <w:u w:val="none"/>
+      </w:rPr>
+    </w:lvl>
+    <w:lvl w:ilvl="7">
+      <w:start w:val="1"/>
+      <w:numFmt w:val="lowerLetter"/>
+      <w:lvlText w:val="%8."/>
+      <w:lvlJc w:val="left"/>
+      <w:pPr>
+        <w:ind w:left="5760" w:hanging="360"/>
+      </w:pPr>
+      <w:rPr>
+        <w:u w:val="none"/>
+      </w:rPr>
+    </w:lvl>
+    <w:lvl w:ilvl="8">
+      <w:start w:val="1"/>
+      <w:numFmt w:val="lowerRoman"/>
+      <w:lvlText w:val="%9."/>
+      <w:lvlJc w:val="right"/>
+      <w:pPr>
+        <w:ind w:left="6480" w:hanging="360"/>
+      </w:pPr>
+      <w:rPr>
+        <w:u w:val="none"/>
+      </w:rPr>
+    </w:lvl>
+  </w:abstractNum>
+  <w:abstractNum w:abstractNumId="13" w15:restartNumberingAfterBreak="0">
     <w:nsid w:val="4E6830B4"/>
     <w:multiLevelType w:val="multilevel"/>
     <w:tmpl w:val="5F362542"/>
@@ -6052,7 +8910,7 @@
       </w:rPr>
     </w:lvl>
   </w:abstractNum>
-  <w:abstractNum w:abstractNumId="5" w15:restartNumberingAfterBreak="0">
+  <w:abstractNum w:abstractNumId="14" w15:restartNumberingAfterBreak="0">
     <w:nsid w:val="56525030"/>
     <w:multiLevelType w:val="multilevel"/>
     <w:tmpl w:val="F91C3A84"/>
@@ -6165,23 +9023,282 @@
       </w:rPr>
     </w:lvl>
   </w:abstractNum>
+  <w:abstractNum w:abstractNumId="15" w15:restartNumberingAfterBreak="0">
+    <w:nsid w:val="6A78421B"/>
+    <w:multiLevelType w:val="multilevel"/>
+    <w:tmpl w:val="B002D5FA"/>
+    <w:lvl w:ilvl="0">
+      <w:start w:val="1"/>
+      <w:numFmt w:val="decimal"/>
+      <w:lvlText w:val="%1."/>
+      <w:lvlJc w:val="left"/>
+      <w:pPr>
+        <w:ind w:left="720" w:hanging="360"/>
+      </w:pPr>
+      <w:rPr>
+        <w:u w:val="none"/>
+      </w:rPr>
+    </w:lvl>
+    <w:lvl w:ilvl="1">
+      <w:start w:val="1"/>
+      <w:numFmt w:val="lowerLetter"/>
+      <w:lvlText w:val="%2."/>
+      <w:lvlJc w:val="left"/>
+      <w:pPr>
+        <w:ind w:left="1440" w:hanging="360"/>
+      </w:pPr>
+      <w:rPr>
+        <w:u w:val="none"/>
+      </w:rPr>
+    </w:lvl>
+    <w:lvl w:ilvl="2">
+      <w:start w:val="1"/>
+      <w:numFmt w:val="lowerRoman"/>
+      <w:lvlText w:val="%3."/>
+      <w:lvlJc w:val="right"/>
+      <w:pPr>
+        <w:ind w:left="2160" w:hanging="360"/>
+      </w:pPr>
+      <w:rPr>
+        <w:u w:val="none"/>
+      </w:rPr>
+    </w:lvl>
+    <w:lvl w:ilvl="3">
+      <w:start w:val="1"/>
+      <w:numFmt w:val="decimal"/>
+      <w:lvlText w:val="%4."/>
+      <w:lvlJc w:val="left"/>
+      <w:pPr>
+        <w:ind w:left="2880" w:hanging="360"/>
+      </w:pPr>
+      <w:rPr>
+        <w:u w:val="none"/>
+      </w:rPr>
+    </w:lvl>
+    <w:lvl w:ilvl="4">
+      <w:start w:val="1"/>
+      <w:numFmt w:val="lowerLetter"/>
+      <w:lvlText w:val="%5."/>
+      <w:lvlJc w:val="left"/>
+      <w:pPr>
+        <w:ind w:left="3600" w:hanging="360"/>
+      </w:pPr>
+      <w:rPr>
+        <w:u w:val="none"/>
+      </w:rPr>
+    </w:lvl>
+    <w:lvl w:ilvl="5">
+      <w:start w:val="1"/>
+      <w:numFmt w:val="lowerRoman"/>
+      <w:lvlText w:val="%6."/>
+      <w:lvlJc w:val="right"/>
+      <w:pPr>
+        <w:ind w:left="4320" w:hanging="360"/>
+      </w:pPr>
+      <w:rPr>
+        <w:u w:val="none"/>
+      </w:rPr>
+    </w:lvl>
+    <w:lvl w:ilvl="6">
+      <w:start w:val="1"/>
+      <w:numFmt w:val="decimal"/>
+      <w:lvlText w:val="%7."/>
+      <w:lvlJc w:val="left"/>
+      <w:pPr>
+        <w:ind w:left="5040" w:hanging="360"/>
+      </w:pPr>
+      <w:rPr>
+        <w:u w:val="none"/>
+      </w:rPr>
+    </w:lvl>
+    <w:lvl w:ilvl="7">
+      <w:start w:val="1"/>
+      <w:numFmt w:val="lowerLetter"/>
+      <w:lvlText w:val="%8."/>
+      <w:lvlJc w:val="left"/>
+      <w:pPr>
+        <w:ind w:left="5760" w:hanging="360"/>
+      </w:pPr>
+      <w:rPr>
+        <w:u w:val="none"/>
+      </w:rPr>
+    </w:lvl>
+    <w:lvl w:ilvl="8">
+      <w:start w:val="1"/>
+      <w:numFmt w:val="lowerRoman"/>
+      <w:lvlText w:val="%9."/>
+      <w:lvlJc w:val="right"/>
+      <w:pPr>
+        <w:ind w:left="6480" w:hanging="360"/>
+      </w:pPr>
+      <w:rPr>
+        <w:u w:val="none"/>
+      </w:rPr>
+    </w:lvl>
+  </w:abstractNum>
+  <w:abstractNum w:abstractNumId="16" w15:restartNumberingAfterBreak="0">
+    <w:nsid w:val="78C43A76"/>
+    <w:multiLevelType w:val="multilevel"/>
+    <w:tmpl w:val="EE781808"/>
+    <w:lvl w:ilvl="0">
+      <w:start w:val="1"/>
+      <w:numFmt w:val="decimal"/>
+      <w:lvlText w:val="%1."/>
+      <w:lvlJc w:val="left"/>
+      <w:pPr>
+        <w:ind w:left="720" w:hanging="360"/>
+      </w:pPr>
+      <w:rPr>
+        <w:u w:val="none"/>
+      </w:rPr>
+    </w:lvl>
+    <w:lvl w:ilvl="1">
+      <w:start w:val="1"/>
+      <w:numFmt w:val="lowerLetter"/>
+      <w:lvlText w:val="%2."/>
+      <w:lvlJc w:val="left"/>
+      <w:pPr>
+        <w:ind w:left="1440" w:hanging="360"/>
+      </w:pPr>
+      <w:rPr>
+        <w:u w:val="none"/>
+      </w:rPr>
+    </w:lvl>
+    <w:lvl w:ilvl="2">
+      <w:start w:val="1"/>
+      <w:numFmt w:val="lowerRoman"/>
+      <w:lvlText w:val="%3."/>
+      <w:lvlJc w:val="right"/>
+      <w:pPr>
+        <w:ind w:left="2160" w:hanging="360"/>
+      </w:pPr>
+      <w:rPr>
+        <w:u w:val="none"/>
+      </w:rPr>
+    </w:lvl>
+    <w:lvl w:ilvl="3">
+      <w:start w:val="1"/>
+      <w:numFmt w:val="decimal"/>
+      <w:lvlText w:val="%4."/>
+      <w:lvlJc w:val="left"/>
+      <w:pPr>
+        <w:ind w:left="2880" w:hanging="360"/>
+      </w:pPr>
+      <w:rPr>
+        <w:u w:val="none"/>
+      </w:rPr>
+    </w:lvl>
+    <w:lvl w:ilvl="4">
+      <w:start w:val="1"/>
+      <w:numFmt w:val="lowerLetter"/>
+      <w:lvlText w:val="%5."/>
+      <w:lvlJc w:val="left"/>
+      <w:pPr>
+        <w:ind w:left="3600" w:hanging="360"/>
+      </w:pPr>
+      <w:rPr>
+        <w:u w:val="none"/>
+      </w:rPr>
+    </w:lvl>
+    <w:lvl w:ilvl="5">
+      <w:start w:val="1"/>
+      <w:numFmt w:val="lowerRoman"/>
+      <w:lvlText w:val="%6."/>
+      <w:lvlJc w:val="right"/>
+      <w:pPr>
+        <w:ind w:left="4320" w:hanging="360"/>
+      </w:pPr>
+      <w:rPr>
+        <w:u w:val="none"/>
+      </w:rPr>
+    </w:lvl>
+    <w:lvl w:ilvl="6">
+      <w:start w:val="1"/>
+      <w:numFmt w:val="decimal"/>
+      <w:lvlText w:val="%7."/>
+      <w:lvlJc w:val="left"/>
+      <w:pPr>
+        <w:ind w:left="5040" w:hanging="360"/>
+      </w:pPr>
+      <w:rPr>
+        <w:u w:val="none"/>
+      </w:rPr>
+    </w:lvl>
+    <w:lvl w:ilvl="7">
+      <w:start w:val="1"/>
+      <w:numFmt w:val="lowerLetter"/>
+      <w:lvlText w:val="%8."/>
+      <w:lvlJc w:val="left"/>
+      <w:pPr>
+        <w:ind w:left="5760" w:hanging="360"/>
+      </w:pPr>
+      <w:rPr>
+        <w:u w:val="none"/>
+      </w:rPr>
+    </w:lvl>
+    <w:lvl w:ilvl="8">
+      <w:start w:val="1"/>
+      <w:numFmt w:val="lowerRoman"/>
+      <w:lvlText w:val="%9."/>
+      <w:lvlJc w:val="right"/>
+      <w:pPr>
+        <w:ind w:left="6480" w:hanging="360"/>
+      </w:pPr>
+      <w:rPr>
+        <w:u w:val="none"/>
+      </w:rPr>
+    </w:lvl>
+  </w:abstractNum>
   <w:num w:numId="1">
-    <w:abstractNumId w:val="1"/>
+    <w:abstractNumId w:val="3"/>
   </w:num>
   <w:num w:numId="2">
-    <w:abstractNumId w:val="3"/>
+    <w:abstractNumId w:val="8"/>
   </w:num>
   <w:num w:numId="3">
     <w:abstractNumId w:val="0"/>
   </w:num>
   <w:num w:numId="4">
+    <w:abstractNumId w:val="13"/>
+  </w:num>
+  <w:num w:numId="5">
+    <w:abstractNumId w:val="5"/>
+  </w:num>
+  <w:num w:numId="6">
+    <w:abstractNumId w:val="14"/>
+  </w:num>
+  <w:num w:numId="7">
+    <w:abstractNumId w:val="6"/>
+  </w:num>
+  <w:num w:numId="8">
+    <w:abstractNumId w:val="11"/>
+  </w:num>
+  <w:num w:numId="9">
+    <w:abstractNumId w:val="1"/>
+  </w:num>
+  <w:num w:numId="10">
+    <w:abstractNumId w:val="2"/>
+  </w:num>
+  <w:num w:numId="11">
+    <w:abstractNumId w:val="15"/>
+  </w:num>
+  <w:num w:numId="12">
+    <w:abstractNumId w:val="12"/>
+  </w:num>
+  <w:num w:numId="13">
+    <w:abstractNumId w:val="16"/>
+  </w:num>
+  <w:num w:numId="14">
+    <w:abstractNumId w:val="7"/>
+  </w:num>
+  <w:num w:numId="15">
     <w:abstractNumId w:val="4"/>
   </w:num>
-  <w:num w:numId="5">
-    <w:abstractNumId w:val="2"/>
+  <w:num w:numId="16">
+    <w:abstractNumId w:val="9"/>
   </w:num>
-  <w:num w:numId="6">
-    <w:abstractNumId w:val="5"/>
+  <w:num w:numId="17">
+    <w:abstractNumId w:val="10"/>
   </w:num>
 </w:numbering>
 </file>

</xml_diff>

<commit_message>
Add : Student C: Ajay Goit — Epic 5 (Browse & Donation Claim) + Epic 6 (Weekly Meal Planning) — UC3 & UC6
</commit_message>
<xml_diff>
--- a/BIT 216 Assignment 1 (Task 2).docx
+++ b/BIT 216 Assignment 1 (Task 2).docx
@@ -5465,17 +5465,14 @@
         </w:tc>
       </w:tr>
     </w:tbl>
-    <w:p>
-      <w:bookmarkStart w:id="8" w:name="_GoBack"/>
-      <w:bookmarkEnd w:id="8"/>
-    </w:p>
+    <w:p/>
     <w:p>
       <w:pPr>
         <w:pStyle w:val="Heading2"/>
         <w:spacing w:before="200" w:after="100"/>
       </w:pPr>
-      <w:bookmarkStart w:id="9" w:name="_heading=h.4yerc9ni0jwr" w:colFirst="0" w:colLast="0"/>
-      <w:bookmarkEnd w:id="9"/>
+      <w:bookmarkStart w:id="8" w:name="_heading=h.4yerc9ni0jwr" w:colFirst="0" w:colLast="0"/>
+      <w:bookmarkEnd w:id="8"/>
       <w:r>
         <w:t>3.2  Student B: Aakroshan Chaudhary (E2300551)</w:t>
       </w:r>
@@ -5494,8 +5491,8 @@
         <w:pStyle w:val="Heading3"/>
         <w:spacing w:before="160" w:after="80"/>
       </w:pPr>
-      <w:bookmarkStart w:id="10" w:name="_heading=h.g0x437scrac1" w:colFirst="0" w:colLast="0"/>
-      <w:bookmarkEnd w:id="10"/>
+      <w:bookmarkStart w:id="9" w:name="_heading=h.g0x437scrac1" w:colFirst="0" w:colLast="0"/>
+      <w:bookmarkEnd w:id="9"/>
       <w:r>
         <w:t>[Epic 3] – Food Inventory Management</w:t>
       </w:r>
@@ -6569,8 +6566,8 @@
         <w:pStyle w:val="Heading3"/>
         <w:spacing w:before="160" w:after="80"/>
       </w:pPr>
-      <w:bookmarkStart w:id="11" w:name="_heading=h.fo3jkhqsg8r" w:colFirst="0" w:colLast="0"/>
-      <w:bookmarkEnd w:id="11"/>
+      <w:bookmarkStart w:id="10" w:name="_heading=h.fo3jkhqsg8r" w:colFirst="0" w:colLast="0"/>
+      <w:bookmarkEnd w:id="10"/>
       <w:r>
         <w:t>[Epic 4] – Notification Centre and Alert Management</w:t>
       </w:r>
@@ -7286,6 +7283,2178 @@
     </w:p>
     <w:p/>
     <w:p/>
+    <w:p>
+      <w:pPr>
+        <w:pStyle w:val="Heading2"/>
+        <w:spacing w:before="200" w:after="100"/>
+      </w:pPr>
+      <w:r>
+        <w:t>3.3  Student C: Ajay Goit (E2300553)</w:t>
+      </w:r>
+    </w:p>
+    <w:p>
+      <w:pPr>
+        <w:spacing w:after="120" w:line="360" w:lineRule="auto"/>
+        <w:jc w:val="both"/>
+      </w:pPr>
+      <w:r>
+        <w:t xml:space="preserve">Use Cases 3 (Browse Food Items) and 6 (Plan Weekly Meals) fall under Ajay's purview. </w:t>
+      </w:r>
+    </w:p>
+    <w:p>
+      <w:pPr>
+        <w:pStyle w:val="Heading3"/>
+        <w:spacing w:before="160" w:after="80"/>
+      </w:pPr>
+      <w:bookmarkStart w:id="11" w:name="_heading=h.anlv3eqx9eb1" w:colFirst="0" w:colLast="0"/>
+      <w:bookmarkEnd w:id="11"/>
+      <w:r>
+        <w:t>[Epic 5] – Browse Food Items and Donation Claim</w:t>
+      </w:r>
+    </w:p>
+    <w:p>
+      <w:pPr>
+        <w:spacing w:after="120" w:line="360" w:lineRule="auto"/>
+        <w:jc w:val="both"/>
+      </w:pPr>
+      <w:r>
+        <w:t xml:space="preserve">The technology that allows users to locate available donation listings and claim food items submitted by other community members is covered in this epic. </w:t>
+      </w:r>
+    </w:p>
+    <w:tbl>
+      <w:tblPr>
+        <w:tblW w:w="9026" w:type="dxa"/>
+        <w:tblBorders>
+          <w:top w:val="single" w:sz="4" w:space="0" w:color="000000"/>
+          <w:left w:val="single" w:sz="4" w:space="0" w:color="000000"/>
+          <w:bottom w:val="single" w:sz="4" w:space="0" w:color="000000"/>
+          <w:right w:val="single" w:sz="4" w:space="0" w:color="000000"/>
+          <w:insideH w:val="single" w:sz="4" w:space="0" w:color="000000"/>
+          <w:insideV w:val="single" w:sz="4" w:space="0" w:color="000000"/>
+        </w:tblBorders>
+        <w:tblLayout w:type="fixed"/>
+        <w:tblLook w:val="0000" w:firstRow="0" w:lastRow="0" w:firstColumn="0" w:lastColumn="0" w:noHBand="0" w:noVBand="0"/>
+      </w:tblPr>
+      <w:tblGrid>
+        <w:gridCol w:w="2000"/>
+        <w:gridCol w:w="7026"/>
+      </w:tblGrid>
+      <w:tr>
+        <w:tc>
+          <w:tcPr>
+            <w:tcW w:w="2000" w:type="dxa"/>
+            <w:tcBorders>
+              <w:top w:val="single" w:sz="4" w:space="0" w:color="000000"/>
+              <w:left w:val="single" w:sz="4" w:space="0" w:color="000000"/>
+              <w:bottom w:val="single" w:sz="4" w:space="0" w:color="000000"/>
+              <w:right w:val="single" w:sz="4" w:space="0" w:color="000000"/>
+            </w:tcBorders>
+            <w:tcMar>
+              <w:top w:w="80" w:type="dxa"/>
+              <w:left w:w="120" w:type="dxa"/>
+              <w:bottom w:w="80" w:type="dxa"/>
+              <w:right w:w="120" w:type="dxa"/>
+            </w:tcMar>
+          </w:tcPr>
+          <w:p>
+            <w:pPr>
+              <w:spacing w:line="320" w:lineRule="auto"/>
+            </w:pPr>
+            <w:r>
+              <w:rPr>
+                <w:b/>
+                <w:bCs/>
+              </w:rPr>
+              <w:t>[User Story 5.1]</w:t>
+            </w:r>
+          </w:p>
+        </w:tc>
+        <w:tc>
+          <w:tcPr>
+            <w:tcW w:w="7026" w:type="dxa"/>
+            <w:tcBorders>
+              <w:top w:val="single" w:sz="4" w:space="0" w:color="000000"/>
+              <w:left w:val="single" w:sz="4" w:space="0" w:color="000000"/>
+              <w:bottom w:val="single" w:sz="4" w:space="0" w:color="000000"/>
+              <w:right w:val="single" w:sz="4" w:space="0" w:color="000000"/>
+            </w:tcBorders>
+            <w:tcMar>
+              <w:top w:w="80" w:type="dxa"/>
+              <w:left w:w="120" w:type="dxa"/>
+              <w:bottom w:w="80" w:type="dxa"/>
+              <w:right w:w="120" w:type="dxa"/>
+            </w:tcMar>
+          </w:tcPr>
+          <w:p>
+            <w:pPr>
+              <w:spacing w:line="320" w:lineRule="auto"/>
+            </w:pPr>
+            <w:r>
+              <w:t>I must look through the available food donation listings as a logged-in user, filtered by category, expiration date, and storage type, in order to swiftly locate items that match my needs.</w:t>
+            </w:r>
+          </w:p>
+        </w:tc>
+      </w:tr>
+      <w:tr>
+        <w:tc>
+          <w:tcPr>
+            <w:tcW w:w="2000" w:type="dxa"/>
+            <w:tcBorders>
+              <w:top w:val="single" w:sz="4" w:space="0" w:color="000000"/>
+              <w:left w:val="single" w:sz="4" w:space="0" w:color="000000"/>
+              <w:bottom w:val="single" w:sz="4" w:space="0" w:color="000000"/>
+              <w:right w:val="single" w:sz="4" w:space="0" w:color="000000"/>
+            </w:tcBorders>
+            <w:tcMar>
+              <w:top w:w="80" w:type="dxa"/>
+              <w:left w:w="120" w:type="dxa"/>
+              <w:bottom w:w="80" w:type="dxa"/>
+              <w:right w:w="120" w:type="dxa"/>
+            </w:tcMar>
+          </w:tcPr>
+          <w:p>
+            <w:pPr>
+              <w:spacing w:line="320" w:lineRule="auto"/>
+            </w:pPr>
+            <w:r>
+              <w:rPr>
+                <w:b/>
+                <w:bCs/>
+              </w:rPr>
+              <w:t>Acceptance Criteria</w:t>
+            </w:r>
+          </w:p>
+        </w:tc>
+        <w:tc>
+          <w:tcPr>
+            <w:tcW w:w="7026" w:type="dxa"/>
+            <w:tcBorders>
+              <w:top w:val="single" w:sz="4" w:space="0" w:color="000000"/>
+              <w:left w:val="single" w:sz="4" w:space="0" w:color="000000"/>
+              <w:bottom w:val="single" w:sz="4" w:space="0" w:color="000000"/>
+              <w:right w:val="single" w:sz="4" w:space="0" w:color="000000"/>
+            </w:tcBorders>
+            <w:tcMar>
+              <w:top w:w="80" w:type="dxa"/>
+              <w:left w:w="120" w:type="dxa"/>
+              <w:bottom w:w="80" w:type="dxa"/>
+              <w:right w:w="120" w:type="dxa"/>
+            </w:tcMar>
+          </w:tcPr>
+          <w:p>
+            <w:pPr>
+              <w:spacing w:line="320" w:lineRule="auto"/>
+            </w:pPr>
+            <w:r>
+              <w:t>GIf a user goes to "Browse Donations", then selects one or more filters (category, expiry date, type of storage), the system will refresh the listing grid to show only the matching items and each card will display the item name, image expiry date, category badge, and distance.</w:t>
+            </w:r>
+          </w:p>
+        </w:tc>
+      </w:tr>
+      <w:tr>
+        <w:tc>
+          <w:tcPr>
+            <w:tcW w:w="2000" w:type="dxa"/>
+            <w:tcBorders>
+              <w:top w:val="single" w:sz="4" w:space="0" w:color="000000"/>
+              <w:left w:val="single" w:sz="4" w:space="0" w:color="000000"/>
+              <w:bottom w:val="single" w:sz="4" w:space="0" w:color="000000"/>
+              <w:right w:val="single" w:sz="4" w:space="0" w:color="000000"/>
+            </w:tcBorders>
+            <w:tcMar>
+              <w:top w:w="80" w:type="dxa"/>
+              <w:left w:w="120" w:type="dxa"/>
+              <w:bottom w:w="80" w:type="dxa"/>
+              <w:right w:w="120" w:type="dxa"/>
+            </w:tcMar>
+          </w:tcPr>
+          <w:p>
+            <w:pPr>
+              <w:spacing w:line="320" w:lineRule="auto"/>
+            </w:pPr>
+            <w:r>
+              <w:rPr>
+                <w:b/>
+                <w:bCs/>
+              </w:rPr>
+              <w:t>MoSCoW</w:t>
+            </w:r>
+          </w:p>
+        </w:tc>
+        <w:tc>
+          <w:tcPr>
+            <w:tcW w:w="7026" w:type="dxa"/>
+            <w:tcBorders>
+              <w:top w:val="single" w:sz="4" w:space="0" w:color="000000"/>
+              <w:left w:val="single" w:sz="4" w:space="0" w:color="000000"/>
+              <w:bottom w:val="single" w:sz="4" w:space="0" w:color="000000"/>
+              <w:right w:val="single" w:sz="4" w:space="0" w:color="000000"/>
+            </w:tcBorders>
+            <w:tcMar>
+              <w:top w:w="80" w:type="dxa"/>
+              <w:left w:w="120" w:type="dxa"/>
+              <w:bottom w:w="80" w:type="dxa"/>
+              <w:right w:w="120" w:type="dxa"/>
+            </w:tcMar>
+          </w:tcPr>
+          <w:p>
+            <w:pPr>
+              <w:spacing w:line="320" w:lineRule="auto"/>
+            </w:pPr>
+            <w:r>
+              <w:t>Must Have</w:t>
+            </w:r>
+          </w:p>
+        </w:tc>
+      </w:tr>
+      <w:tr>
+        <w:tc>
+          <w:tcPr>
+            <w:tcW w:w="2000" w:type="dxa"/>
+            <w:tcBorders>
+              <w:top w:val="single" w:sz="4" w:space="0" w:color="000000"/>
+              <w:left w:val="single" w:sz="4" w:space="0" w:color="000000"/>
+              <w:bottom w:val="single" w:sz="4" w:space="0" w:color="000000"/>
+              <w:right w:val="single" w:sz="4" w:space="0" w:color="000000"/>
+            </w:tcBorders>
+            <w:tcMar>
+              <w:top w:w="80" w:type="dxa"/>
+              <w:left w:w="120" w:type="dxa"/>
+              <w:bottom w:w="80" w:type="dxa"/>
+              <w:right w:w="120" w:type="dxa"/>
+            </w:tcMar>
+          </w:tcPr>
+          <w:p>
+            <w:pPr>
+              <w:spacing w:line="320" w:lineRule="auto"/>
+            </w:pPr>
+            <w:r>
+              <w:rPr>
+                <w:b/>
+                <w:bCs/>
+              </w:rPr>
+              <w:t>Tasks</w:t>
+            </w:r>
+          </w:p>
+        </w:tc>
+        <w:tc>
+          <w:tcPr>
+            <w:tcW w:w="7026" w:type="dxa"/>
+            <w:tcBorders>
+              <w:top w:val="single" w:sz="4" w:space="0" w:color="000000"/>
+              <w:left w:val="single" w:sz="4" w:space="0" w:color="000000"/>
+              <w:bottom w:val="single" w:sz="4" w:space="0" w:color="000000"/>
+              <w:right w:val="single" w:sz="4" w:space="0" w:color="000000"/>
+            </w:tcBorders>
+            <w:tcMar>
+              <w:top w:w="80" w:type="dxa"/>
+              <w:left w:w="120" w:type="dxa"/>
+              <w:bottom w:w="80" w:type="dxa"/>
+              <w:right w:w="120" w:type="dxa"/>
+            </w:tcMar>
+          </w:tcPr>
+          <w:p>
+            <w:pPr>
+              <w:numPr>
+                <w:ilvl w:val="0"/>
+                <w:numId w:val="14"/>
+              </w:numPr>
+              <w:spacing w:after="0" w:line="320" w:lineRule="auto"/>
+            </w:pPr>
+            <w:r>
+              <w:t xml:space="preserve">Design the Browse Donations grid and filter panel in Figma </w:t>
+            </w:r>
+          </w:p>
+          <w:p>
+            <w:pPr>
+              <w:numPr>
+                <w:ilvl w:val="0"/>
+                <w:numId w:val="14"/>
+              </w:numPr>
+              <w:spacing w:after="0" w:line="320" w:lineRule="auto"/>
+            </w:pPr>
+            <w:r>
+              <w:t xml:space="preserve">Create GET /api/donations endpoint with filter query parameters  </w:t>
+            </w:r>
+          </w:p>
+          <w:p>
+            <w:pPr>
+              <w:numPr>
+                <w:ilvl w:val="0"/>
+                <w:numId w:val="14"/>
+              </w:numPr>
+              <w:spacing w:after="0" w:line="320" w:lineRule="auto"/>
+            </w:pPr>
+            <w:r>
+              <w:t>Implement geolocation-based sorting on backend</w:t>
+            </w:r>
+          </w:p>
+          <w:p>
+            <w:pPr>
+              <w:numPr>
+                <w:ilvl w:val="0"/>
+                <w:numId w:val="14"/>
+              </w:numPr>
+              <w:spacing w:after="0" w:line="320" w:lineRule="auto"/>
+            </w:pPr>
+            <w:r>
+              <w:t>Build filter UI components with real-time query execution</w:t>
+            </w:r>
+          </w:p>
+          <w:p>
+            <w:pPr>
+              <w:numPr>
+                <w:ilvl w:val="0"/>
+                <w:numId w:val="14"/>
+              </w:numPr>
+              <w:spacing w:after="0" w:line="320" w:lineRule="auto"/>
+            </w:pPr>
+            <w:r>
+              <w:t>Write integration tests for filter combinations</w:t>
+            </w:r>
+          </w:p>
+        </w:tc>
+      </w:tr>
+      <w:tr>
+        <w:tc>
+          <w:tcPr>
+            <w:tcW w:w="2000" w:type="dxa"/>
+            <w:tcBorders>
+              <w:top w:val="single" w:sz="4" w:space="0" w:color="000000"/>
+              <w:left w:val="single" w:sz="4" w:space="0" w:color="000000"/>
+              <w:bottom w:val="single" w:sz="4" w:space="0" w:color="000000"/>
+              <w:right w:val="single" w:sz="4" w:space="0" w:color="000000"/>
+            </w:tcBorders>
+            <w:tcMar>
+              <w:top w:w="80" w:type="dxa"/>
+              <w:left w:w="120" w:type="dxa"/>
+              <w:bottom w:w="80" w:type="dxa"/>
+              <w:right w:w="120" w:type="dxa"/>
+            </w:tcMar>
+          </w:tcPr>
+          <w:p>
+            <w:pPr>
+              <w:spacing w:line="320" w:lineRule="auto"/>
+            </w:pPr>
+            <w:r>
+              <w:rPr>
+                <w:b/>
+                <w:bCs/>
+              </w:rPr>
+              <w:t>Test Cases</w:t>
+            </w:r>
+          </w:p>
+        </w:tc>
+        <w:tc>
+          <w:tcPr>
+            <w:tcW w:w="7026" w:type="dxa"/>
+            <w:tcBorders>
+              <w:top w:val="single" w:sz="4" w:space="0" w:color="000000"/>
+              <w:left w:val="single" w:sz="4" w:space="0" w:color="000000"/>
+              <w:bottom w:val="single" w:sz="4" w:space="0" w:color="000000"/>
+              <w:right w:val="single" w:sz="4" w:space="0" w:color="000000"/>
+            </w:tcBorders>
+            <w:tcMar>
+              <w:top w:w="80" w:type="dxa"/>
+              <w:left w:w="120" w:type="dxa"/>
+              <w:bottom w:w="80" w:type="dxa"/>
+              <w:right w:w="120" w:type="dxa"/>
+            </w:tcMar>
+          </w:tcPr>
+          <w:p>
+            <w:pPr>
+              <w:spacing w:line="320" w:lineRule="auto"/>
+            </w:pPr>
+            <w:r>
+              <w:t>to be completed in Assignment 2</w:t>
+            </w:r>
+          </w:p>
+        </w:tc>
+      </w:tr>
+    </w:tbl>
+    <w:p>
+      <w:pPr>
+        <w:spacing w:line="360" w:lineRule="auto"/>
+      </w:pPr>
+    </w:p>
+    <w:tbl>
+      <w:tblPr>
+        <w:tblW w:w="9026" w:type="dxa"/>
+        <w:tblBorders>
+          <w:top w:val="single" w:sz="4" w:space="0" w:color="000000"/>
+          <w:left w:val="single" w:sz="4" w:space="0" w:color="000000"/>
+          <w:bottom w:val="single" w:sz="4" w:space="0" w:color="000000"/>
+          <w:right w:val="single" w:sz="4" w:space="0" w:color="000000"/>
+          <w:insideH w:val="single" w:sz="4" w:space="0" w:color="000000"/>
+          <w:insideV w:val="single" w:sz="4" w:space="0" w:color="000000"/>
+        </w:tblBorders>
+        <w:tblLayout w:type="fixed"/>
+        <w:tblLook w:val="0000" w:firstRow="0" w:lastRow="0" w:firstColumn="0" w:lastColumn="0" w:noHBand="0" w:noVBand="0"/>
+      </w:tblPr>
+      <w:tblGrid>
+        <w:gridCol w:w="2000"/>
+        <w:gridCol w:w="7026"/>
+      </w:tblGrid>
+      <w:tr>
+        <w:tc>
+          <w:tcPr>
+            <w:tcW w:w="2000" w:type="dxa"/>
+            <w:tcBorders>
+              <w:top w:val="single" w:sz="4" w:space="0" w:color="000000"/>
+              <w:left w:val="single" w:sz="4" w:space="0" w:color="000000"/>
+              <w:bottom w:val="single" w:sz="4" w:space="0" w:color="000000"/>
+              <w:right w:val="single" w:sz="4" w:space="0" w:color="000000"/>
+            </w:tcBorders>
+            <w:tcMar>
+              <w:top w:w="80" w:type="dxa"/>
+              <w:left w:w="120" w:type="dxa"/>
+              <w:bottom w:w="80" w:type="dxa"/>
+              <w:right w:w="120" w:type="dxa"/>
+            </w:tcMar>
+          </w:tcPr>
+          <w:p>
+            <w:pPr>
+              <w:spacing w:line="320" w:lineRule="auto"/>
+            </w:pPr>
+            <w:r>
+              <w:rPr>
+                <w:b/>
+                <w:bCs/>
+              </w:rPr>
+              <w:t>[User Story 5.2]</w:t>
+            </w:r>
+          </w:p>
+        </w:tc>
+        <w:tc>
+          <w:tcPr>
+            <w:tcW w:w="7026" w:type="dxa"/>
+            <w:tcBorders>
+              <w:top w:val="single" w:sz="4" w:space="0" w:color="000000"/>
+              <w:left w:val="single" w:sz="4" w:space="0" w:color="000000"/>
+              <w:bottom w:val="single" w:sz="4" w:space="0" w:color="000000"/>
+              <w:right w:val="single" w:sz="4" w:space="0" w:color="000000"/>
+            </w:tcBorders>
+            <w:tcMar>
+              <w:top w:w="80" w:type="dxa"/>
+              <w:left w:w="120" w:type="dxa"/>
+              <w:bottom w:w="80" w:type="dxa"/>
+              <w:right w:w="120" w:type="dxa"/>
+            </w:tcMar>
+          </w:tcPr>
+          <w:p>
+            <w:pPr>
+              <w:spacing w:line="320" w:lineRule="auto"/>
+            </w:pPr>
+            <w:r>
+              <w:t xml:space="preserve">In order to schedule the pickup of the donated food item, I must claim a donation listing as a logged-in user and receive a confirmation notification. </w:t>
+            </w:r>
+          </w:p>
+        </w:tc>
+      </w:tr>
+      <w:tr>
+        <w:tc>
+          <w:tcPr>
+            <w:tcW w:w="2000" w:type="dxa"/>
+            <w:tcBorders>
+              <w:top w:val="single" w:sz="4" w:space="0" w:color="000000"/>
+              <w:left w:val="single" w:sz="4" w:space="0" w:color="000000"/>
+              <w:bottom w:val="single" w:sz="4" w:space="0" w:color="000000"/>
+              <w:right w:val="single" w:sz="4" w:space="0" w:color="000000"/>
+            </w:tcBorders>
+            <w:tcMar>
+              <w:top w:w="80" w:type="dxa"/>
+              <w:left w:w="120" w:type="dxa"/>
+              <w:bottom w:w="80" w:type="dxa"/>
+              <w:right w:w="120" w:type="dxa"/>
+            </w:tcMar>
+          </w:tcPr>
+          <w:p>
+            <w:pPr>
+              <w:spacing w:line="320" w:lineRule="auto"/>
+            </w:pPr>
+            <w:r>
+              <w:rPr>
+                <w:b/>
+                <w:bCs/>
+              </w:rPr>
+              <w:t>Acceptance Criteria</w:t>
+            </w:r>
+          </w:p>
+        </w:tc>
+        <w:tc>
+          <w:tcPr>
+            <w:tcW w:w="7026" w:type="dxa"/>
+            <w:tcBorders>
+              <w:top w:val="single" w:sz="4" w:space="0" w:color="000000"/>
+              <w:left w:val="single" w:sz="4" w:space="0" w:color="000000"/>
+              <w:bottom w:val="single" w:sz="4" w:space="0" w:color="000000"/>
+              <w:right w:val="single" w:sz="4" w:space="0" w:color="000000"/>
+            </w:tcBorders>
+            <w:tcMar>
+              <w:top w:w="80" w:type="dxa"/>
+              <w:left w:w="120" w:type="dxa"/>
+              <w:bottom w:w="80" w:type="dxa"/>
+              <w:right w:w="120" w:type="dxa"/>
+            </w:tcMar>
+          </w:tcPr>
+          <w:p>
+            <w:pPr>
+              <w:spacing w:line="320" w:lineRule="auto"/>
+            </w:pPr>
+            <w:r>
+              <w:t>When a user sees a donation listing detail page, clicks "Claim Donation" and confirms it, in this case the system will mark the listing as claimed, send a confirmation notice to both the donor and the recipient, and show the donor's pickup information plus a map link.</w:t>
+            </w:r>
+          </w:p>
+        </w:tc>
+      </w:tr>
+      <w:tr>
+        <w:tc>
+          <w:tcPr>
+            <w:tcW w:w="2000" w:type="dxa"/>
+            <w:tcBorders>
+              <w:top w:val="single" w:sz="4" w:space="0" w:color="000000"/>
+              <w:left w:val="single" w:sz="4" w:space="0" w:color="000000"/>
+              <w:bottom w:val="single" w:sz="4" w:space="0" w:color="000000"/>
+              <w:right w:val="single" w:sz="4" w:space="0" w:color="000000"/>
+            </w:tcBorders>
+            <w:tcMar>
+              <w:top w:w="80" w:type="dxa"/>
+              <w:left w:w="120" w:type="dxa"/>
+              <w:bottom w:w="80" w:type="dxa"/>
+              <w:right w:w="120" w:type="dxa"/>
+            </w:tcMar>
+          </w:tcPr>
+          <w:p>
+            <w:pPr>
+              <w:spacing w:line="320" w:lineRule="auto"/>
+            </w:pPr>
+            <w:r>
+              <w:rPr>
+                <w:b/>
+                <w:bCs/>
+              </w:rPr>
+              <w:t>MoSCoW</w:t>
+            </w:r>
+          </w:p>
+        </w:tc>
+        <w:tc>
+          <w:tcPr>
+            <w:tcW w:w="7026" w:type="dxa"/>
+            <w:tcBorders>
+              <w:top w:val="single" w:sz="4" w:space="0" w:color="000000"/>
+              <w:left w:val="single" w:sz="4" w:space="0" w:color="000000"/>
+              <w:bottom w:val="single" w:sz="4" w:space="0" w:color="000000"/>
+              <w:right w:val="single" w:sz="4" w:space="0" w:color="000000"/>
+            </w:tcBorders>
+            <w:tcMar>
+              <w:top w:w="80" w:type="dxa"/>
+              <w:left w:w="120" w:type="dxa"/>
+              <w:bottom w:w="80" w:type="dxa"/>
+              <w:right w:w="120" w:type="dxa"/>
+            </w:tcMar>
+          </w:tcPr>
+          <w:p>
+            <w:pPr>
+              <w:spacing w:line="320" w:lineRule="auto"/>
+            </w:pPr>
+            <w:r>
+              <w:t>Must Have</w:t>
+            </w:r>
+          </w:p>
+        </w:tc>
+      </w:tr>
+      <w:tr>
+        <w:tc>
+          <w:tcPr>
+            <w:tcW w:w="2000" w:type="dxa"/>
+            <w:tcBorders>
+              <w:top w:val="single" w:sz="4" w:space="0" w:color="000000"/>
+              <w:left w:val="single" w:sz="4" w:space="0" w:color="000000"/>
+              <w:bottom w:val="single" w:sz="4" w:space="0" w:color="000000"/>
+              <w:right w:val="single" w:sz="4" w:space="0" w:color="000000"/>
+            </w:tcBorders>
+            <w:tcMar>
+              <w:top w:w="80" w:type="dxa"/>
+              <w:left w:w="120" w:type="dxa"/>
+              <w:bottom w:w="80" w:type="dxa"/>
+              <w:right w:w="120" w:type="dxa"/>
+            </w:tcMar>
+          </w:tcPr>
+          <w:p>
+            <w:pPr>
+              <w:spacing w:line="320" w:lineRule="auto"/>
+            </w:pPr>
+            <w:r>
+              <w:rPr>
+                <w:b/>
+                <w:bCs/>
+              </w:rPr>
+              <w:t>Tasks</w:t>
+            </w:r>
+          </w:p>
+        </w:tc>
+        <w:tc>
+          <w:tcPr>
+            <w:tcW w:w="7026" w:type="dxa"/>
+            <w:tcBorders>
+              <w:top w:val="single" w:sz="4" w:space="0" w:color="000000"/>
+              <w:left w:val="single" w:sz="4" w:space="0" w:color="000000"/>
+              <w:bottom w:val="single" w:sz="4" w:space="0" w:color="000000"/>
+              <w:right w:val="single" w:sz="4" w:space="0" w:color="000000"/>
+            </w:tcBorders>
+            <w:tcMar>
+              <w:top w:w="80" w:type="dxa"/>
+              <w:left w:w="120" w:type="dxa"/>
+              <w:bottom w:w="80" w:type="dxa"/>
+              <w:right w:w="120" w:type="dxa"/>
+            </w:tcMar>
+          </w:tcPr>
+          <w:p>
+            <w:pPr>
+              <w:numPr>
+                <w:ilvl w:val="0"/>
+                <w:numId w:val="12"/>
+              </w:numPr>
+              <w:spacing w:after="0" w:line="320" w:lineRule="auto"/>
+            </w:pPr>
+            <w:r>
+              <w:t xml:space="preserve">Construct the donation detail modal including the feature to claim </w:t>
+            </w:r>
+          </w:p>
+          <w:p>
+            <w:pPr>
+              <w:numPr>
+                <w:ilvl w:val="0"/>
+                <w:numId w:val="12"/>
+              </w:numPr>
+              <w:spacing w:after="0" w:line="320" w:lineRule="auto"/>
+            </w:pPr>
+            <w:r>
+              <w:t xml:space="preserve">Develop a POST /api/donations/:id/claim endpoint </w:t>
+            </w:r>
+          </w:p>
+          <w:p>
+            <w:pPr>
+              <w:numPr>
+                <w:ilvl w:val="0"/>
+                <w:numId w:val="12"/>
+              </w:numPr>
+              <w:spacing w:after="0" w:line="320" w:lineRule="auto"/>
+            </w:pPr>
+            <w:r>
+              <w:t xml:space="preserve">Set up the claim confirmation notification sending to both users </w:t>
+            </w:r>
+          </w:p>
+          <w:p>
+            <w:pPr>
+              <w:numPr>
+                <w:ilvl w:val="0"/>
+                <w:numId w:val="12"/>
+              </w:numPr>
+              <w:spacing w:after="0" w:line="320" w:lineRule="auto"/>
+            </w:pPr>
+            <w:r>
+              <w:t xml:space="preserve">Code the listing status change to "Claimed" </w:t>
+            </w:r>
+          </w:p>
+          <w:p>
+            <w:pPr>
+              <w:numPr>
+                <w:ilvl w:val="0"/>
+                <w:numId w:val="12"/>
+              </w:numPr>
+              <w:spacing w:after="0" w:line="320" w:lineRule="auto"/>
+            </w:pPr>
+            <w:r>
+              <w:t>Conduct integration tests for the claim process</w:t>
+            </w:r>
+          </w:p>
+        </w:tc>
+      </w:tr>
+      <w:tr>
+        <w:tc>
+          <w:tcPr>
+            <w:tcW w:w="2000" w:type="dxa"/>
+            <w:tcBorders>
+              <w:top w:val="single" w:sz="4" w:space="0" w:color="000000"/>
+              <w:left w:val="single" w:sz="4" w:space="0" w:color="000000"/>
+              <w:bottom w:val="single" w:sz="4" w:space="0" w:color="000000"/>
+              <w:right w:val="single" w:sz="4" w:space="0" w:color="000000"/>
+            </w:tcBorders>
+            <w:tcMar>
+              <w:top w:w="80" w:type="dxa"/>
+              <w:left w:w="120" w:type="dxa"/>
+              <w:bottom w:w="80" w:type="dxa"/>
+              <w:right w:w="120" w:type="dxa"/>
+            </w:tcMar>
+          </w:tcPr>
+          <w:p>
+            <w:pPr>
+              <w:spacing w:line="320" w:lineRule="auto"/>
+            </w:pPr>
+            <w:r>
+              <w:rPr>
+                <w:b/>
+                <w:bCs/>
+              </w:rPr>
+              <w:t>Test Cases</w:t>
+            </w:r>
+          </w:p>
+        </w:tc>
+        <w:tc>
+          <w:tcPr>
+            <w:tcW w:w="7026" w:type="dxa"/>
+            <w:tcBorders>
+              <w:top w:val="single" w:sz="4" w:space="0" w:color="000000"/>
+              <w:left w:val="single" w:sz="4" w:space="0" w:color="000000"/>
+              <w:bottom w:val="single" w:sz="4" w:space="0" w:color="000000"/>
+              <w:right w:val="single" w:sz="4" w:space="0" w:color="000000"/>
+            </w:tcBorders>
+            <w:tcMar>
+              <w:top w:w="80" w:type="dxa"/>
+              <w:left w:w="120" w:type="dxa"/>
+              <w:bottom w:w="80" w:type="dxa"/>
+              <w:right w:w="120" w:type="dxa"/>
+            </w:tcMar>
+          </w:tcPr>
+          <w:p>
+            <w:pPr>
+              <w:spacing w:line="320" w:lineRule="auto"/>
+            </w:pPr>
+            <w:r>
+              <w:t>to be completed in Assignment 2</w:t>
+            </w:r>
+          </w:p>
+        </w:tc>
+      </w:tr>
+    </w:tbl>
+    <w:p>
+      <w:pPr>
+        <w:spacing w:line="360" w:lineRule="auto"/>
+      </w:pPr>
+    </w:p>
+    <w:tbl>
+      <w:tblPr>
+        <w:tblW w:w="9026" w:type="dxa"/>
+        <w:tblBorders>
+          <w:top w:val="single" w:sz="4" w:space="0" w:color="000000"/>
+          <w:left w:val="single" w:sz="4" w:space="0" w:color="000000"/>
+          <w:bottom w:val="single" w:sz="4" w:space="0" w:color="000000"/>
+          <w:right w:val="single" w:sz="4" w:space="0" w:color="000000"/>
+          <w:insideH w:val="single" w:sz="4" w:space="0" w:color="000000"/>
+          <w:insideV w:val="single" w:sz="4" w:space="0" w:color="000000"/>
+        </w:tblBorders>
+        <w:tblLayout w:type="fixed"/>
+        <w:tblLook w:val="0000" w:firstRow="0" w:lastRow="0" w:firstColumn="0" w:lastColumn="0" w:noHBand="0" w:noVBand="0"/>
+      </w:tblPr>
+      <w:tblGrid>
+        <w:gridCol w:w="2000"/>
+        <w:gridCol w:w="7026"/>
+      </w:tblGrid>
+      <w:tr>
+        <w:tc>
+          <w:tcPr>
+            <w:tcW w:w="2000" w:type="dxa"/>
+            <w:tcBorders>
+              <w:top w:val="single" w:sz="4" w:space="0" w:color="000000"/>
+              <w:left w:val="single" w:sz="4" w:space="0" w:color="000000"/>
+              <w:bottom w:val="single" w:sz="4" w:space="0" w:color="000000"/>
+              <w:right w:val="single" w:sz="4" w:space="0" w:color="000000"/>
+            </w:tcBorders>
+            <w:tcMar>
+              <w:top w:w="80" w:type="dxa"/>
+              <w:left w:w="120" w:type="dxa"/>
+              <w:bottom w:w="80" w:type="dxa"/>
+              <w:right w:w="120" w:type="dxa"/>
+            </w:tcMar>
+          </w:tcPr>
+          <w:p>
+            <w:pPr>
+              <w:spacing w:line="320" w:lineRule="auto"/>
+            </w:pPr>
+            <w:r>
+              <w:rPr>
+                <w:b/>
+                <w:bCs/>
+              </w:rPr>
+              <w:t>[User Story 5.3 – Could]</w:t>
+            </w:r>
+          </w:p>
+        </w:tc>
+        <w:tc>
+          <w:tcPr>
+            <w:tcW w:w="7026" w:type="dxa"/>
+            <w:tcBorders>
+              <w:top w:val="single" w:sz="4" w:space="0" w:color="000000"/>
+              <w:left w:val="single" w:sz="4" w:space="0" w:color="000000"/>
+              <w:bottom w:val="single" w:sz="4" w:space="0" w:color="000000"/>
+              <w:right w:val="single" w:sz="4" w:space="0" w:color="000000"/>
+            </w:tcBorders>
+            <w:tcMar>
+              <w:top w:w="80" w:type="dxa"/>
+              <w:left w:w="120" w:type="dxa"/>
+              <w:bottom w:w="80" w:type="dxa"/>
+              <w:right w:w="120" w:type="dxa"/>
+            </w:tcMar>
+          </w:tcPr>
+          <w:p>
+            <w:pPr>
+              <w:spacing w:line="320" w:lineRule="auto"/>
+            </w:pPr>
+            <w:r>
+              <w:t>As a logged-in user that has a claim on my donation listing, I wanted to see an individual match score and recipient candidate profile to ascertain the best recipient candidate before I select pickup.</w:t>
+            </w:r>
+          </w:p>
+        </w:tc>
+      </w:tr>
+      <w:tr>
+        <w:tc>
+          <w:tcPr>
+            <w:tcW w:w="2000" w:type="dxa"/>
+            <w:tcBorders>
+              <w:top w:val="single" w:sz="4" w:space="0" w:color="000000"/>
+              <w:left w:val="single" w:sz="4" w:space="0" w:color="000000"/>
+              <w:bottom w:val="single" w:sz="4" w:space="0" w:color="000000"/>
+              <w:right w:val="single" w:sz="4" w:space="0" w:color="000000"/>
+            </w:tcBorders>
+            <w:tcMar>
+              <w:top w:w="80" w:type="dxa"/>
+              <w:left w:w="120" w:type="dxa"/>
+              <w:bottom w:w="80" w:type="dxa"/>
+              <w:right w:w="120" w:type="dxa"/>
+            </w:tcMar>
+          </w:tcPr>
+          <w:p>
+            <w:pPr>
+              <w:spacing w:line="320" w:lineRule="auto"/>
+            </w:pPr>
+            <w:r>
+              <w:rPr>
+                <w:b/>
+                <w:bCs/>
+              </w:rPr>
+              <w:t>Acceptance Criteria</w:t>
+            </w:r>
+          </w:p>
+        </w:tc>
+        <w:tc>
+          <w:tcPr>
+            <w:tcW w:w="7026" w:type="dxa"/>
+            <w:tcBorders>
+              <w:top w:val="single" w:sz="4" w:space="0" w:color="000000"/>
+              <w:left w:val="single" w:sz="4" w:space="0" w:color="000000"/>
+              <w:bottom w:val="single" w:sz="4" w:space="0" w:color="000000"/>
+              <w:right w:val="single" w:sz="4" w:space="0" w:color="000000"/>
+            </w:tcBorders>
+            <w:tcMar>
+              <w:top w:w="80" w:type="dxa"/>
+              <w:left w:w="120" w:type="dxa"/>
+              <w:bottom w:w="80" w:type="dxa"/>
+              <w:right w:w="120" w:type="dxa"/>
+            </w:tcMar>
+          </w:tcPr>
+          <w:p>
+            <w:pPr>
+              <w:spacing w:line="320" w:lineRule="auto"/>
+            </w:pPr>
+            <w:r>
+              <w:t>If a donor's listing is claimed by one or more users, when the donor opens the "Active Match" view, the system will display a ranked list of recipient candidates with match scores considering proximity, need frequency, and community rating as factors.</w:t>
+            </w:r>
+          </w:p>
+        </w:tc>
+      </w:tr>
+      <w:tr>
+        <w:tc>
+          <w:tcPr>
+            <w:tcW w:w="2000" w:type="dxa"/>
+            <w:tcBorders>
+              <w:top w:val="single" w:sz="4" w:space="0" w:color="000000"/>
+              <w:left w:val="single" w:sz="4" w:space="0" w:color="000000"/>
+              <w:bottom w:val="single" w:sz="4" w:space="0" w:color="000000"/>
+              <w:right w:val="single" w:sz="4" w:space="0" w:color="000000"/>
+            </w:tcBorders>
+            <w:tcMar>
+              <w:top w:w="80" w:type="dxa"/>
+              <w:left w:w="120" w:type="dxa"/>
+              <w:bottom w:w="80" w:type="dxa"/>
+              <w:right w:w="120" w:type="dxa"/>
+            </w:tcMar>
+          </w:tcPr>
+          <w:p>
+            <w:pPr>
+              <w:spacing w:line="320" w:lineRule="auto"/>
+            </w:pPr>
+            <w:r>
+              <w:rPr>
+                <w:b/>
+                <w:bCs/>
+              </w:rPr>
+              <w:t>MoSCoW</w:t>
+            </w:r>
+          </w:p>
+        </w:tc>
+        <w:tc>
+          <w:tcPr>
+            <w:tcW w:w="7026" w:type="dxa"/>
+            <w:tcBorders>
+              <w:top w:val="single" w:sz="4" w:space="0" w:color="000000"/>
+              <w:left w:val="single" w:sz="4" w:space="0" w:color="000000"/>
+              <w:bottom w:val="single" w:sz="4" w:space="0" w:color="000000"/>
+              <w:right w:val="single" w:sz="4" w:space="0" w:color="000000"/>
+            </w:tcBorders>
+            <w:tcMar>
+              <w:top w:w="80" w:type="dxa"/>
+              <w:left w:w="120" w:type="dxa"/>
+              <w:bottom w:w="80" w:type="dxa"/>
+              <w:right w:w="120" w:type="dxa"/>
+            </w:tcMar>
+          </w:tcPr>
+          <w:p>
+            <w:pPr>
+              <w:spacing w:line="320" w:lineRule="auto"/>
+            </w:pPr>
+            <w:r>
+              <w:t>Could Have</w:t>
+            </w:r>
+          </w:p>
+        </w:tc>
+      </w:tr>
+      <w:tr>
+        <w:tc>
+          <w:tcPr>
+            <w:tcW w:w="2000" w:type="dxa"/>
+            <w:tcBorders>
+              <w:top w:val="single" w:sz="4" w:space="0" w:color="000000"/>
+              <w:left w:val="single" w:sz="4" w:space="0" w:color="000000"/>
+              <w:bottom w:val="single" w:sz="4" w:space="0" w:color="000000"/>
+              <w:right w:val="single" w:sz="4" w:space="0" w:color="000000"/>
+            </w:tcBorders>
+            <w:tcMar>
+              <w:top w:w="80" w:type="dxa"/>
+              <w:left w:w="120" w:type="dxa"/>
+              <w:bottom w:w="80" w:type="dxa"/>
+              <w:right w:w="120" w:type="dxa"/>
+            </w:tcMar>
+          </w:tcPr>
+          <w:p>
+            <w:pPr>
+              <w:spacing w:line="320" w:lineRule="auto"/>
+            </w:pPr>
+            <w:r>
+              <w:rPr>
+                <w:b/>
+                <w:bCs/>
+              </w:rPr>
+              <w:t>Tasks</w:t>
+            </w:r>
+          </w:p>
+        </w:tc>
+        <w:tc>
+          <w:tcPr>
+            <w:tcW w:w="7026" w:type="dxa"/>
+            <w:tcBorders>
+              <w:top w:val="single" w:sz="4" w:space="0" w:color="000000"/>
+              <w:left w:val="single" w:sz="4" w:space="0" w:color="000000"/>
+              <w:bottom w:val="single" w:sz="4" w:space="0" w:color="000000"/>
+              <w:right w:val="single" w:sz="4" w:space="0" w:color="000000"/>
+            </w:tcBorders>
+            <w:tcMar>
+              <w:top w:w="80" w:type="dxa"/>
+              <w:left w:w="120" w:type="dxa"/>
+              <w:bottom w:w="80" w:type="dxa"/>
+              <w:right w:w="120" w:type="dxa"/>
+            </w:tcMar>
+          </w:tcPr>
+          <w:p>
+            <w:pPr>
+              <w:numPr>
+                <w:ilvl w:val="0"/>
+                <w:numId w:val="8"/>
+              </w:numPr>
+              <w:spacing w:after="0" w:line="320" w:lineRule="auto"/>
+            </w:pPr>
+            <w:r>
+              <w:t>Create the Active Match user interface panel.</w:t>
+            </w:r>
+          </w:p>
+          <w:p>
+            <w:pPr>
+              <w:numPr>
+                <w:ilvl w:val="0"/>
+                <w:numId w:val="8"/>
+              </w:numPr>
+              <w:spacing w:after="0" w:line="320" w:lineRule="auto"/>
+            </w:pPr>
+            <w:r>
+              <w:t xml:space="preserve">Create a match scoring algorithm (require frequency, proximity) </w:t>
+            </w:r>
+          </w:p>
+          <w:p>
+            <w:pPr>
+              <w:numPr>
+                <w:ilvl w:val="0"/>
+                <w:numId w:val="8"/>
+              </w:numPr>
+              <w:spacing w:after="0" w:line="320" w:lineRule="auto"/>
+            </w:pPr>
+            <w:r>
+              <w:t xml:space="preserve">Establish the GET /api/donations/:id/matches endpoint. </w:t>
+            </w:r>
+          </w:p>
+          <w:p>
+            <w:pPr>
+              <w:numPr>
+                <w:ilvl w:val="0"/>
+                <w:numId w:val="8"/>
+              </w:numPr>
+              <w:spacing w:after="0" w:line="320" w:lineRule="auto"/>
+            </w:pPr>
+            <w:r>
+              <w:t xml:space="preserve">Create unit tests for the algorithm used to score matches. </w:t>
+            </w:r>
+          </w:p>
+        </w:tc>
+      </w:tr>
+      <w:tr>
+        <w:tc>
+          <w:tcPr>
+            <w:tcW w:w="2000" w:type="dxa"/>
+            <w:tcBorders>
+              <w:top w:val="single" w:sz="4" w:space="0" w:color="000000"/>
+              <w:left w:val="single" w:sz="4" w:space="0" w:color="000000"/>
+              <w:bottom w:val="single" w:sz="4" w:space="0" w:color="000000"/>
+              <w:right w:val="single" w:sz="4" w:space="0" w:color="000000"/>
+            </w:tcBorders>
+            <w:tcMar>
+              <w:top w:w="80" w:type="dxa"/>
+              <w:left w:w="120" w:type="dxa"/>
+              <w:bottom w:w="80" w:type="dxa"/>
+              <w:right w:w="120" w:type="dxa"/>
+            </w:tcMar>
+          </w:tcPr>
+          <w:p>
+            <w:pPr>
+              <w:spacing w:line="320" w:lineRule="auto"/>
+            </w:pPr>
+            <w:r>
+              <w:rPr>
+                <w:b/>
+                <w:bCs/>
+              </w:rPr>
+              <w:t>Test Cases</w:t>
+            </w:r>
+          </w:p>
+        </w:tc>
+        <w:tc>
+          <w:tcPr>
+            <w:tcW w:w="7026" w:type="dxa"/>
+            <w:tcBorders>
+              <w:top w:val="single" w:sz="4" w:space="0" w:color="000000"/>
+              <w:left w:val="single" w:sz="4" w:space="0" w:color="000000"/>
+              <w:bottom w:val="single" w:sz="4" w:space="0" w:color="000000"/>
+              <w:right w:val="single" w:sz="4" w:space="0" w:color="000000"/>
+            </w:tcBorders>
+            <w:tcMar>
+              <w:top w:w="80" w:type="dxa"/>
+              <w:left w:w="120" w:type="dxa"/>
+              <w:bottom w:w="80" w:type="dxa"/>
+              <w:right w:w="120" w:type="dxa"/>
+            </w:tcMar>
+          </w:tcPr>
+          <w:p>
+            <w:pPr>
+              <w:spacing w:line="320" w:lineRule="auto"/>
+            </w:pPr>
+            <w:r>
+              <w:t>Leave Blank – to be completed in Assignment 2</w:t>
+            </w:r>
+          </w:p>
+        </w:tc>
+      </w:tr>
+    </w:tbl>
+    <w:p>
+      <w:pPr>
+        <w:spacing w:line="360" w:lineRule="auto"/>
+      </w:pPr>
+    </w:p>
+    <w:p>
+      <w:pPr>
+        <w:pStyle w:val="Heading3"/>
+        <w:spacing w:before="160" w:after="80"/>
+      </w:pPr>
+      <w:bookmarkStart w:id="12" w:name="_heading=h.bj8erhmkony4" w:colFirst="0" w:colLast="0"/>
+      <w:bookmarkEnd w:id="12"/>
+      <w:r>
+        <w:t>[Epic 6] – Weekly Meal Planning</w:t>
+      </w:r>
+    </w:p>
+    <w:p>
+      <w:pPr>
+        <w:spacing w:after="120" w:line="360" w:lineRule="auto"/>
+        <w:jc w:val="both"/>
+      </w:pPr>
+      <w:r>
+        <w:t xml:space="preserve">This epic discusses the meal planning feature that lets customers plan their weekly meals using products from their current inventory, with the system making recommendations for ingredients that are about to expire. </w:t>
+      </w:r>
+    </w:p>
+    <w:tbl>
+      <w:tblPr>
+        <w:tblW w:w="9026" w:type="dxa"/>
+        <w:tblBorders>
+          <w:top w:val="single" w:sz="4" w:space="0" w:color="000000"/>
+          <w:left w:val="single" w:sz="4" w:space="0" w:color="000000"/>
+          <w:bottom w:val="single" w:sz="4" w:space="0" w:color="000000"/>
+          <w:right w:val="single" w:sz="4" w:space="0" w:color="000000"/>
+          <w:insideH w:val="single" w:sz="4" w:space="0" w:color="000000"/>
+          <w:insideV w:val="single" w:sz="4" w:space="0" w:color="000000"/>
+        </w:tblBorders>
+        <w:tblLayout w:type="fixed"/>
+        <w:tblLook w:val="0000" w:firstRow="0" w:lastRow="0" w:firstColumn="0" w:lastColumn="0" w:noHBand="0" w:noVBand="0"/>
+      </w:tblPr>
+      <w:tblGrid>
+        <w:gridCol w:w="2000"/>
+        <w:gridCol w:w="7026"/>
+      </w:tblGrid>
+      <w:tr>
+        <w:tc>
+          <w:tcPr>
+            <w:tcW w:w="2000" w:type="dxa"/>
+            <w:tcBorders>
+              <w:top w:val="single" w:sz="4" w:space="0" w:color="000000"/>
+              <w:left w:val="single" w:sz="4" w:space="0" w:color="000000"/>
+              <w:bottom w:val="single" w:sz="4" w:space="0" w:color="000000"/>
+              <w:right w:val="single" w:sz="4" w:space="0" w:color="000000"/>
+            </w:tcBorders>
+            <w:tcMar>
+              <w:top w:w="80" w:type="dxa"/>
+              <w:left w:w="120" w:type="dxa"/>
+              <w:bottom w:w="80" w:type="dxa"/>
+              <w:right w:w="120" w:type="dxa"/>
+            </w:tcMar>
+          </w:tcPr>
+          <w:p>
+            <w:pPr>
+              <w:spacing w:line="320" w:lineRule="auto"/>
+            </w:pPr>
+            <w:r>
+              <w:rPr>
+                <w:b/>
+                <w:bCs/>
+              </w:rPr>
+              <w:t>[User Story 6.1]</w:t>
+            </w:r>
+          </w:p>
+        </w:tc>
+        <w:tc>
+          <w:tcPr>
+            <w:tcW w:w="7026" w:type="dxa"/>
+            <w:tcBorders>
+              <w:top w:val="single" w:sz="4" w:space="0" w:color="000000"/>
+              <w:left w:val="single" w:sz="4" w:space="0" w:color="000000"/>
+              <w:bottom w:val="single" w:sz="4" w:space="0" w:color="000000"/>
+              <w:right w:val="single" w:sz="4" w:space="0" w:color="000000"/>
+            </w:tcBorders>
+            <w:tcMar>
+              <w:top w:w="80" w:type="dxa"/>
+              <w:left w:w="120" w:type="dxa"/>
+              <w:bottom w:w="80" w:type="dxa"/>
+              <w:right w:w="120" w:type="dxa"/>
+            </w:tcMar>
+          </w:tcPr>
+          <w:p>
+            <w:pPr>
+              <w:spacing w:line="320" w:lineRule="auto"/>
+            </w:pPr>
+            <w:r>
+              <w:t>In order to schedule my meals, I must access a weekly calendar as a logged-in user and allocate meals to breakfast, lunch, dinner, and snack times. schedule in advance using my current inventory.</w:t>
+            </w:r>
+          </w:p>
+        </w:tc>
+      </w:tr>
+      <w:tr>
+        <w:tc>
+          <w:tcPr>
+            <w:tcW w:w="2000" w:type="dxa"/>
+            <w:tcBorders>
+              <w:top w:val="single" w:sz="4" w:space="0" w:color="000000"/>
+              <w:left w:val="single" w:sz="4" w:space="0" w:color="000000"/>
+              <w:bottom w:val="single" w:sz="4" w:space="0" w:color="000000"/>
+              <w:right w:val="single" w:sz="4" w:space="0" w:color="000000"/>
+            </w:tcBorders>
+            <w:tcMar>
+              <w:top w:w="80" w:type="dxa"/>
+              <w:left w:w="120" w:type="dxa"/>
+              <w:bottom w:w="80" w:type="dxa"/>
+              <w:right w:w="120" w:type="dxa"/>
+            </w:tcMar>
+          </w:tcPr>
+          <w:p>
+            <w:pPr>
+              <w:spacing w:line="320" w:lineRule="auto"/>
+            </w:pPr>
+            <w:r>
+              <w:rPr>
+                <w:b/>
+                <w:bCs/>
+              </w:rPr>
+              <w:t>Acceptance Criteria</w:t>
+            </w:r>
+          </w:p>
+        </w:tc>
+        <w:tc>
+          <w:tcPr>
+            <w:tcW w:w="7026" w:type="dxa"/>
+            <w:tcBorders>
+              <w:top w:val="single" w:sz="4" w:space="0" w:color="000000"/>
+              <w:left w:val="single" w:sz="4" w:space="0" w:color="000000"/>
+              <w:bottom w:val="single" w:sz="4" w:space="0" w:color="000000"/>
+              <w:right w:val="single" w:sz="4" w:space="0" w:color="000000"/>
+            </w:tcBorders>
+            <w:tcMar>
+              <w:top w:w="80" w:type="dxa"/>
+              <w:left w:w="120" w:type="dxa"/>
+              <w:bottom w:w="80" w:type="dxa"/>
+              <w:right w:w="120" w:type="dxa"/>
+            </w:tcMar>
+          </w:tcPr>
+          <w:p>
+            <w:pPr>
+              <w:spacing w:line="320" w:lineRule="auto"/>
+            </w:pPr>
+            <w:r>
+              <w:t>When a user launches the Meal Planner page, upon its opening, the system will present a 7-day calendar layout with columns representing meals (Breakfast, Lunch, Dinner, Snacks). In case the user presses a particular cell and either types the name of a dish or chooses from a list of recommended recipes, the system records the meal at that cell and shows it on the calendar..</w:t>
+            </w:r>
+          </w:p>
+        </w:tc>
+      </w:tr>
+      <w:tr>
+        <w:tc>
+          <w:tcPr>
+            <w:tcW w:w="2000" w:type="dxa"/>
+            <w:tcBorders>
+              <w:top w:val="single" w:sz="4" w:space="0" w:color="000000"/>
+              <w:left w:val="single" w:sz="4" w:space="0" w:color="000000"/>
+              <w:bottom w:val="single" w:sz="4" w:space="0" w:color="000000"/>
+              <w:right w:val="single" w:sz="4" w:space="0" w:color="000000"/>
+            </w:tcBorders>
+            <w:tcMar>
+              <w:top w:w="80" w:type="dxa"/>
+              <w:left w:w="120" w:type="dxa"/>
+              <w:bottom w:w="80" w:type="dxa"/>
+              <w:right w:w="120" w:type="dxa"/>
+            </w:tcMar>
+          </w:tcPr>
+          <w:p>
+            <w:pPr>
+              <w:spacing w:line="320" w:lineRule="auto"/>
+            </w:pPr>
+            <w:r>
+              <w:rPr>
+                <w:b/>
+                <w:bCs/>
+              </w:rPr>
+              <w:t>MoSCoW</w:t>
+            </w:r>
+          </w:p>
+        </w:tc>
+        <w:tc>
+          <w:tcPr>
+            <w:tcW w:w="7026" w:type="dxa"/>
+            <w:tcBorders>
+              <w:top w:val="single" w:sz="4" w:space="0" w:color="000000"/>
+              <w:left w:val="single" w:sz="4" w:space="0" w:color="000000"/>
+              <w:bottom w:val="single" w:sz="4" w:space="0" w:color="000000"/>
+              <w:right w:val="single" w:sz="4" w:space="0" w:color="000000"/>
+            </w:tcBorders>
+            <w:tcMar>
+              <w:top w:w="80" w:type="dxa"/>
+              <w:left w:w="120" w:type="dxa"/>
+              <w:bottom w:w="80" w:type="dxa"/>
+              <w:right w:w="120" w:type="dxa"/>
+            </w:tcMar>
+          </w:tcPr>
+          <w:p>
+            <w:pPr>
+              <w:spacing w:line="320" w:lineRule="auto"/>
+            </w:pPr>
+            <w:r>
+              <w:t>Should Have</w:t>
+            </w:r>
+          </w:p>
+        </w:tc>
+      </w:tr>
+      <w:tr>
+        <w:tc>
+          <w:tcPr>
+            <w:tcW w:w="2000" w:type="dxa"/>
+            <w:tcBorders>
+              <w:top w:val="single" w:sz="4" w:space="0" w:color="000000"/>
+              <w:left w:val="single" w:sz="4" w:space="0" w:color="000000"/>
+              <w:bottom w:val="single" w:sz="4" w:space="0" w:color="000000"/>
+              <w:right w:val="single" w:sz="4" w:space="0" w:color="000000"/>
+            </w:tcBorders>
+            <w:tcMar>
+              <w:top w:w="80" w:type="dxa"/>
+              <w:left w:w="120" w:type="dxa"/>
+              <w:bottom w:w="80" w:type="dxa"/>
+              <w:right w:w="120" w:type="dxa"/>
+            </w:tcMar>
+          </w:tcPr>
+          <w:p>
+            <w:pPr>
+              <w:spacing w:line="320" w:lineRule="auto"/>
+            </w:pPr>
+            <w:r>
+              <w:rPr>
+                <w:b/>
+                <w:bCs/>
+              </w:rPr>
+              <w:t>Tasks</w:t>
+            </w:r>
+          </w:p>
+        </w:tc>
+        <w:tc>
+          <w:tcPr>
+            <w:tcW w:w="7026" w:type="dxa"/>
+            <w:tcBorders>
+              <w:top w:val="single" w:sz="4" w:space="0" w:color="000000"/>
+              <w:left w:val="single" w:sz="4" w:space="0" w:color="000000"/>
+              <w:bottom w:val="single" w:sz="4" w:space="0" w:color="000000"/>
+              <w:right w:val="single" w:sz="4" w:space="0" w:color="000000"/>
+            </w:tcBorders>
+            <w:tcMar>
+              <w:top w:w="80" w:type="dxa"/>
+              <w:left w:w="120" w:type="dxa"/>
+              <w:bottom w:w="80" w:type="dxa"/>
+              <w:right w:w="120" w:type="dxa"/>
+            </w:tcMar>
+          </w:tcPr>
+          <w:p>
+            <w:pPr>
+              <w:numPr>
+                <w:ilvl w:val="0"/>
+                <w:numId w:val="16"/>
+              </w:numPr>
+              <w:spacing w:after="0" w:line="320" w:lineRule="auto"/>
+            </w:pPr>
+            <w:r>
+              <w:t xml:space="preserve">Do weekly meal planner calendar UI design in Figma </w:t>
+            </w:r>
+          </w:p>
+          <w:p>
+            <w:pPr>
+              <w:numPr>
+                <w:ilvl w:val="0"/>
+                <w:numId w:val="16"/>
+              </w:numPr>
+              <w:spacing w:after="0" w:line="320" w:lineRule="auto"/>
+            </w:pPr>
+            <w:r>
+              <w:t>Implement GET /api/meals/plan and POST /api/meals/plan API endpoints</w:t>
+            </w:r>
+          </w:p>
+          <w:p>
+            <w:pPr>
+              <w:numPr>
+                <w:ilvl w:val="0"/>
+                <w:numId w:val="16"/>
+              </w:numPr>
+              <w:spacing w:after="0" w:line="320" w:lineRule="auto"/>
+            </w:pPr>
+            <w:r>
+              <w:t xml:space="preserve">Develop meal slot assignment popup with inventory item search </w:t>
+            </w:r>
+          </w:p>
+          <w:p>
+            <w:pPr>
+              <w:numPr>
+                <w:ilvl w:val="0"/>
+                <w:numId w:val="16"/>
+              </w:numPr>
+              <w:spacing w:after="0" w:line="320" w:lineRule="auto"/>
+            </w:pPr>
+            <w:r>
+              <w:t>Create unit tests for meal plan saving logic</w:t>
+            </w:r>
+          </w:p>
+        </w:tc>
+      </w:tr>
+      <w:tr>
+        <w:tc>
+          <w:tcPr>
+            <w:tcW w:w="2000" w:type="dxa"/>
+            <w:tcBorders>
+              <w:top w:val="single" w:sz="4" w:space="0" w:color="000000"/>
+              <w:left w:val="single" w:sz="4" w:space="0" w:color="000000"/>
+              <w:bottom w:val="single" w:sz="4" w:space="0" w:color="000000"/>
+              <w:right w:val="single" w:sz="4" w:space="0" w:color="000000"/>
+            </w:tcBorders>
+            <w:tcMar>
+              <w:top w:w="80" w:type="dxa"/>
+              <w:left w:w="120" w:type="dxa"/>
+              <w:bottom w:w="80" w:type="dxa"/>
+              <w:right w:w="120" w:type="dxa"/>
+            </w:tcMar>
+          </w:tcPr>
+          <w:p>
+            <w:pPr>
+              <w:spacing w:line="320" w:lineRule="auto"/>
+            </w:pPr>
+            <w:r>
+              <w:rPr>
+                <w:b/>
+                <w:bCs/>
+              </w:rPr>
+              <w:t>Test Cases</w:t>
+            </w:r>
+          </w:p>
+        </w:tc>
+        <w:tc>
+          <w:tcPr>
+            <w:tcW w:w="7026" w:type="dxa"/>
+            <w:tcBorders>
+              <w:top w:val="single" w:sz="4" w:space="0" w:color="000000"/>
+              <w:left w:val="single" w:sz="4" w:space="0" w:color="000000"/>
+              <w:bottom w:val="single" w:sz="4" w:space="0" w:color="000000"/>
+              <w:right w:val="single" w:sz="4" w:space="0" w:color="000000"/>
+            </w:tcBorders>
+            <w:tcMar>
+              <w:top w:w="80" w:type="dxa"/>
+              <w:left w:w="120" w:type="dxa"/>
+              <w:bottom w:w="80" w:type="dxa"/>
+              <w:right w:w="120" w:type="dxa"/>
+            </w:tcMar>
+          </w:tcPr>
+          <w:p>
+            <w:pPr>
+              <w:spacing w:line="320" w:lineRule="auto"/>
+            </w:pPr>
+            <w:r>
+              <w:t>to be completed in Assignment 2</w:t>
+            </w:r>
+          </w:p>
+        </w:tc>
+      </w:tr>
+    </w:tbl>
+    <w:p>
+      <w:pPr>
+        <w:spacing w:line="360" w:lineRule="auto"/>
+      </w:pPr>
+    </w:p>
+    <w:tbl>
+      <w:tblPr>
+        <w:tblW w:w="9026" w:type="dxa"/>
+        <w:tblBorders>
+          <w:top w:val="single" w:sz="4" w:space="0" w:color="000000"/>
+          <w:left w:val="single" w:sz="4" w:space="0" w:color="000000"/>
+          <w:bottom w:val="single" w:sz="4" w:space="0" w:color="000000"/>
+          <w:right w:val="single" w:sz="4" w:space="0" w:color="000000"/>
+          <w:insideH w:val="single" w:sz="4" w:space="0" w:color="000000"/>
+          <w:insideV w:val="single" w:sz="4" w:space="0" w:color="000000"/>
+        </w:tblBorders>
+        <w:tblLayout w:type="fixed"/>
+        <w:tblLook w:val="0000" w:firstRow="0" w:lastRow="0" w:firstColumn="0" w:lastColumn="0" w:noHBand="0" w:noVBand="0"/>
+      </w:tblPr>
+      <w:tblGrid>
+        <w:gridCol w:w="2000"/>
+        <w:gridCol w:w="7026"/>
+      </w:tblGrid>
+      <w:tr>
+        <w:tc>
+          <w:tcPr>
+            <w:tcW w:w="2000" w:type="dxa"/>
+            <w:tcBorders>
+              <w:top w:val="single" w:sz="4" w:space="0" w:color="000000"/>
+              <w:left w:val="single" w:sz="4" w:space="0" w:color="000000"/>
+              <w:bottom w:val="single" w:sz="4" w:space="0" w:color="000000"/>
+              <w:right w:val="single" w:sz="4" w:space="0" w:color="000000"/>
+            </w:tcBorders>
+            <w:tcMar>
+              <w:top w:w="80" w:type="dxa"/>
+              <w:left w:w="120" w:type="dxa"/>
+              <w:bottom w:w="80" w:type="dxa"/>
+              <w:right w:w="120" w:type="dxa"/>
+            </w:tcMar>
+          </w:tcPr>
+          <w:p>
+            <w:pPr>
+              <w:spacing w:line="320" w:lineRule="auto"/>
+            </w:pPr>
+            <w:r>
+              <w:rPr>
+                <w:b/>
+                <w:bCs/>
+              </w:rPr>
+              <w:t>[User Story 6.2]</w:t>
+            </w:r>
+          </w:p>
+        </w:tc>
+        <w:tc>
+          <w:tcPr>
+            <w:tcW w:w="7026" w:type="dxa"/>
+            <w:tcBorders>
+              <w:top w:val="single" w:sz="4" w:space="0" w:color="000000"/>
+              <w:left w:val="single" w:sz="4" w:space="0" w:color="000000"/>
+              <w:bottom w:val="single" w:sz="4" w:space="0" w:color="000000"/>
+              <w:right w:val="single" w:sz="4" w:space="0" w:color="000000"/>
+            </w:tcBorders>
+            <w:tcMar>
+              <w:top w:w="80" w:type="dxa"/>
+              <w:left w:w="120" w:type="dxa"/>
+              <w:bottom w:w="80" w:type="dxa"/>
+              <w:right w:w="120" w:type="dxa"/>
+            </w:tcMar>
+          </w:tcPr>
+          <w:p>
+            <w:pPr>
+              <w:spacing w:line="320" w:lineRule="auto"/>
+            </w:pPr>
+            <w:r>
+              <w:t xml:space="preserve">I need the system to recommend recipes based on my near-expiry inventory items as a logged-in user so that I can use those ingredients before they expire and cut down on waste. </w:t>
+            </w:r>
+          </w:p>
+        </w:tc>
+      </w:tr>
+      <w:tr>
+        <w:tc>
+          <w:tcPr>
+            <w:tcW w:w="2000" w:type="dxa"/>
+            <w:tcBorders>
+              <w:top w:val="single" w:sz="4" w:space="0" w:color="000000"/>
+              <w:left w:val="single" w:sz="4" w:space="0" w:color="000000"/>
+              <w:bottom w:val="single" w:sz="4" w:space="0" w:color="000000"/>
+              <w:right w:val="single" w:sz="4" w:space="0" w:color="000000"/>
+            </w:tcBorders>
+            <w:tcMar>
+              <w:top w:w="80" w:type="dxa"/>
+              <w:left w:w="120" w:type="dxa"/>
+              <w:bottom w:w="80" w:type="dxa"/>
+              <w:right w:w="120" w:type="dxa"/>
+            </w:tcMar>
+          </w:tcPr>
+          <w:p>
+            <w:pPr>
+              <w:spacing w:line="320" w:lineRule="auto"/>
+            </w:pPr>
+            <w:r>
+              <w:rPr>
+                <w:b/>
+                <w:bCs/>
+              </w:rPr>
+              <w:t>Acceptance Criteria</w:t>
+            </w:r>
+          </w:p>
+        </w:tc>
+        <w:tc>
+          <w:tcPr>
+            <w:tcW w:w="7026" w:type="dxa"/>
+            <w:tcBorders>
+              <w:top w:val="single" w:sz="4" w:space="0" w:color="000000"/>
+              <w:left w:val="single" w:sz="4" w:space="0" w:color="000000"/>
+              <w:bottom w:val="single" w:sz="4" w:space="0" w:color="000000"/>
+              <w:right w:val="single" w:sz="4" w:space="0" w:color="000000"/>
+            </w:tcBorders>
+            <w:tcMar>
+              <w:top w:w="80" w:type="dxa"/>
+              <w:left w:w="120" w:type="dxa"/>
+              <w:bottom w:w="80" w:type="dxa"/>
+              <w:right w:w="120" w:type="dxa"/>
+            </w:tcMar>
+          </w:tcPr>
+          <w:p>
+            <w:pPr>
+              <w:spacing w:line="320" w:lineRule="auto"/>
+            </w:pPr>
+            <w:r>
+              <w:t xml:space="preserve">The system will automatically display a "Suggested Meals" panel with up to five recipe cards, each with the recipe name, cooking time, necessary ingredients, and a "Add to Plan" button, if a user is on the Meal Planner page and has inventory items that are expiring within five days. </w:t>
+            </w:r>
+          </w:p>
+        </w:tc>
+      </w:tr>
+      <w:tr>
+        <w:tc>
+          <w:tcPr>
+            <w:tcW w:w="2000" w:type="dxa"/>
+            <w:tcBorders>
+              <w:top w:val="single" w:sz="4" w:space="0" w:color="000000"/>
+              <w:left w:val="single" w:sz="4" w:space="0" w:color="000000"/>
+              <w:bottom w:val="single" w:sz="4" w:space="0" w:color="000000"/>
+              <w:right w:val="single" w:sz="4" w:space="0" w:color="000000"/>
+            </w:tcBorders>
+            <w:tcMar>
+              <w:top w:w="80" w:type="dxa"/>
+              <w:left w:w="120" w:type="dxa"/>
+              <w:bottom w:w="80" w:type="dxa"/>
+              <w:right w:w="120" w:type="dxa"/>
+            </w:tcMar>
+          </w:tcPr>
+          <w:p>
+            <w:pPr>
+              <w:spacing w:line="320" w:lineRule="auto"/>
+            </w:pPr>
+            <w:r>
+              <w:rPr>
+                <w:b/>
+                <w:bCs/>
+              </w:rPr>
+              <w:t>MoSCoW</w:t>
+            </w:r>
+          </w:p>
+        </w:tc>
+        <w:tc>
+          <w:tcPr>
+            <w:tcW w:w="7026" w:type="dxa"/>
+            <w:tcBorders>
+              <w:top w:val="single" w:sz="4" w:space="0" w:color="000000"/>
+              <w:left w:val="single" w:sz="4" w:space="0" w:color="000000"/>
+              <w:bottom w:val="single" w:sz="4" w:space="0" w:color="000000"/>
+              <w:right w:val="single" w:sz="4" w:space="0" w:color="000000"/>
+            </w:tcBorders>
+            <w:tcMar>
+              <w:top w:w="80" w:type="dxa"/>
+              <w:left w:w="120" w:type="dxa"/>
+              <w:bottom w:w="80" w:type="dxa"/>
+              <w:right w:w="120" w:type="dxa"/>
+            </w:tcMar>
+          </w:tcPr>
+          <w:p>
+            <w:pPr>
+              <w:spacing w:line="320" w:lineRule="auto"/>
+            </w:pPr>
+            <w:r>
+              <w:t>Should Have</w:t>
+            </w:r>
+          </w:p>
+        </w:tc>
+      </w:tr>
+      <w:tr>
+        <w:tc>
+          <w:tcPr>
+            <w:tcW w:w="2000" w:type="dxa"/>
+            <w:tcBorders>
+              <w:top w:val="single" w:sz="4" w:space="0" w:color="000000"/>
+              <w:left w:val="single" w:sz="4" w:space="0" w:color="000000"/>
+              <w:bottom w:val="single" w:sz="4" w:space="0" w:color="000000"/>
+              <w:right w:val="single" w:sz="4" w:space="0" w:color="000000"/>
+            </w:tcBorders>
+            <w:tcMar>
+              <w:top w:w="80" w:type="dxa"/>
+              <w:left w:w="120" w:type="dxa"/>
+              <w:bottom w:w="80" w:type="dxa"/>
+              <w:right w:w="120" w:type="dxa"/>
+            </w:tcMar>
+          </w:tcPr>
+          <w:p>
+            <w:pPr>
+              <w:spacing w:line="320" w:lineRule="auto"/>
+            </w:pPr>
+            <w:r>
+              <w:rPr>
+                <w:b/>
+                <w:bCs/>
+              </w:rPr>
+              <w:t>Tasks</w:t>
+            </w:r>
+          </w:p>
+        </w:tc>
+        <w:tc>
+          <w:tcPr>
+            <w:tcW w:w="7026" w:type="dxa"/>
+            <w:tcBorders>
+              <w:top w:val="single" w:sz="4" w:space="0" w:color="000000"/>
+              <w:left w:val="single" w:sz="4" w:space="0" w:color="000000"/>
+              <w:bottom w:val="single" w:sz="4" w:space="0" w:color="000000"/>
+              <w:right w:val="single" w:sz="4" w:space="0" w:color="000000"/>
+            </w:tcBorders>
+            <w:tcMar>
+              <w:top w:w="80" w:type="dxa"/>
+              <w:left w:w="120" w:type="dxa"/>
+              <w:bottom w:w="80" w:type="dxa"/>
+              <w:right w:w="120" w:type="dxa"/>
+            </w:tcMar>
+          </w:tcPr>
+          <w:p>
+            <w:pPr>
+              <w:numPr>
+                <w:ilvl w:val="0"/>
+                <w:numId w:val="11"/>
+              </w:numPr>
+              <w:spacing w:after="0" w:line="320" w:lineRule="auto"/>
+            </w:pPr>
+            <w:r>
+              <w:t xml:space="preserve">Create the Modal Suggested Meals </w:t>
+            </w:r>
+          </w:p>
+          <w:p>
+            <w:pPr>
+              <w:numPr>
+                <w:ilvl w:val="0"/>
+                <w:numId w:val="11"/>
+              </w:numPr>
+              <w:spacing w:after="0" w:line="320" w:lineRule="auto"/>
+            </w:pPr>
+            <w:r>
+              <w:t xml:space="preserve">To query near-expiry inventory items, create a GET /api/meals/suggestions endpoint. </w:t>
+            </w:r>
+          </w:p>
+          <w:p>
+            <w:pPr>
+              <w:numPr>
+                <w:ilvl w:val="0"/>
+                <w:numId w:val="11"/>
+              </w:numPr>
+              <w:spacing w:after="0" w:line="320" w:lineRule="auto"/>
+            </w:pPr>
+            <w:r>
+              <w:t xml:space="preserve">Create a dataset of static recipes connected to ingredient terms </w:t>
+            </w:r>
+          </w:p>
+          <w:p>
+            <w:pPr>
+              <w:numPr>
+                <w:ilvl w:val="0"/>
+                <w:numId w:val="11"/>
+              </w:numPr>
+              <w:spacing w:after="0" w:line="320" w:lineRule="auto"/>
+            </w:pPr>
+            <w:r>
+              <w:t xml:space="preserve">Put the "Add to Plan" action on suggestion cards. </w:t>
+            </w:r>
+          </w:p>
+          <w:p>
+            <w:pPr>
+              <w:numPr>
+                <w:ilvl w:val="0"/>
+                <w:numId w:val="11"/>
+              </w:numPr>
+              <w:spacing w:after="0" w:line="320" w:lineRule="auto"/>
+            </w:pPr>
+            <w:r>
+              <w:t xml:space="preserve">Create integration tests for the suggestion engine. </w:t>
+            </w:r>
+          </w:p>
+        </w:tc>
+      </w:tr>
+      <w:tr>
+        <w:tc>
+          <w:tcPr>
+            <w:tcW w:w="2000" w:type="dxa"/>
+            <w:tcBorders>
+              <w:top w:val="single" w:sz="4" w:space="0" w:color="000000"/>
+              <w:left w:val="single" w:sz="4" w:space="0" w:color="000000"/>
+              <w:bottom w:val="single" w:sz="4" w:space="0" w:color="000000"/>
+              <w:right w:val="single" w:sz="4" w:space="0" w:color="000000"/>
+            </w:tcBorders>
+            <w:tcMar>
+              <w:top w:w="80" w:type="dxa"/>
+              <w:left w:w="120" w:type="dxa"/>
+              <w:bottom w:w="80" w:type="dxa"/>
+              <w:right w:w="120" w:type="dxa"/>
+            </w:tcMar>
+          </w:tcPr>
+          <w:p>
+            <w:pPr>
+              <w:spacing w:line="320" w:lineRule="auto"/>
+            </w:pPr>
+            <w:r>
+              <w:rPr>
+                <w:b/>
+                <w:bCs/>
+              </w:rPr>
+              <w:t>Test Cases</w:t>
+            </w:r>
+          </w:p>
+        </w:tc>
+        <w:tc>
+          <w:tcPr>
+            <w:tcW w:w="7026" w:type="dxa"/>
+            <w:tcBorders>
+              <w:top w:val="single" w:sz="4" w:space="0" w:color="000000"/>
+              <w:left w:val="single" w:sz="4" w:space="0" w:color="000000"/>
+              <w:bottom w:val="single" w:sz="4" w:space="0" w:color="000000"/>
+              <w:right w:val="single" w:sz="4" w:space="0" w:color="000000"/>
+            </w:tcBorders>
+            <w:tcMar>
+              <w:top w:w="80" w:type="dxa"/>
+              <w:left w:w="120" w:type="dxa"/>
+              <w:bottom w:w="80" w:type="dxa"/>
+              <w:right w:w="120" w:type="dxa"/>
+            </w:tcMar>
+          </w:tcPr>
+          <w:p>
+            <w:pPr>
+              <w:spacing w:line="320" w:lineRule="auto"/>
+            </w:pPr>
+            <w:r>
+              <w:t>to be completed in Assignment 2</w:t>
+            </w:r>
+          </w:p>
+        </w:tc>
+      </w:tr>
+    </w:tbl>
+    <w:p>
+      <w:pPr>
+        <w:spacing w:line="360" w:lineRule="auto"/>
+      </w:pPr>
+      <w:bookmarkStart w:id="13" w:name="_GoBack"/>
+      <w:bookmarkEnd w:id="13"/>
+    </w:p>
+    <w:tbl>
+      <w:tblPr>
+        <w:tblW w:w="9026" w:type="dxa"/>
+        <w:tblBorders>
+          <w:top w:val="single" w:sz="4" w:space="0" w:color="000000"/>
+          <w:left w:val="single" w:sz="4" w:space="0" w:color="000000"/>
+          <w:bottom w:val="single" w:sz="4" w:space="0" w:color="000000"/>
+          <w:right w:val="single" w:sz="4" w:space="0" w:color="000000"/>
+          <w:insideH w:val="single" w:sz="4" w:space="0" w:color="000000"/>
+          <w:insideV w:val="single" w:sz="4" w:space="0" w:color="000000"/>
+        </w:tblBorders>
+        <w:tblLayout w:type="fixed"/>
+        <w:tblLook w:val="0000" w:firstRow="0" w:lastRow="0" w:firstColumn="0" w:lastColumn="0" w:noHBand="0" w:noVBand="0"/>
+      </w:tblPr>
+      <w:tblGrid>
+        <w:gridCol w:w="2000"/>
+        <w:gridCol w:w="7026"/>
+      </w:tblGrid>
+      <w:tr>
+        <w:tc>
+          <w:tcPr>
+            <w:tcW w:w="2000" w:type="dxa"/>
+            <w:tcBorders>
+              <w:top w:val="single" w:sz="4" w:space="0" w:color="000000"/>
+              <w:left w:val="single" w:sz="4" w:space="0" w:color="000000"/>
+              <w:bottom w:val="single" w:sz="4" w:space="0" w:color="000000"/>
+              <w:right w:val="single" w:sz="4" w:space="0" w:color="000000"/>
+            </w:tcBorders>
+            <w:tcMar>
+              <w:top w:w="80" w:type="dxa"/>
+              <w:left w:w="120" w:type="dxa"/>
+              <w:bottom w:w="80" w:type="dxa"/>
+              <w:right w:w="120" w:type="dxa"/>
+            </w:tcMar>
+          </w:tcPr>
+          <w:p>
+            <w:pPr>
+              <w:spacing w:line="320" w:lineRule="auto"/>
+            </w:pPr>
+            <w:r>
+              <w:rPr>
+                <w:b/>
+                <w:bCs/>
+              </w:rPr>
+              <w:t>[User Story 6.3 – Should]</w:t>
+            </w:r>
+          </w:p>
+        </w:tc>
+        <w:tc>
+          <w:tcPr>
+            <w:tcW w:w="7026" w:type="dxa"/>
+            <w:tcBorders>
+              <w:top w:val="single" w:sz="4" w:space="0" w:color="000000"/>
+              <w:left w:val="single" w:sz="4" w:space="0" w:color="000000"/>
+              <w:bottom w:val="single" w:sz="4" w:space="0" w:color="000000"/>
+              <w:right w:val="single" w:sz="4" w:space="0" w:color="000000"/>
+            </w:tcBorders>
+            <w:tcMar>
+              <w:top w:w="80" w:type="dxa"/>
+              <w:left w:w="120" w:type="dxa"/>
+              <w:bottom w:w="80" w:type="dxa"/>
+              <w:right w:w="120" w:type="dxa"/>
+            </w:tcMar>
+          </w:tcPr>
+          <w:p>
+            <w:pPr>
+              <w:spacing w:line="320" w:lineRule="auto"/>
+            </w:pPr>
+            <w:r>
+              <w:t xml:space="preserve">I should be able to confirm my weekly meal plan as a logged-in user, have the system reserve the necessary inventory quantities, and create meal reminders to help me stick to my meal schedule. </w:t>
+            </w:r>
+          </w:p>
+        </w:tc>
+      </w:tr>
+      <w:tr>
+        <w:tc>
+          <w:tcPr>
+            <w:tcW w:w="2000" w:type="dxa"/>
+            <w:tcBorders>
+              <w:top w:val="single" w:sz="4" w:space="0" w:color="000000"/>
+              <w:left w:val="single" w:sz="4" w:space="0" w:color="000000"/>
+              <w:bottom w:val="single" w:sz="4" w:space="0" w:color="000000"/>
+              <w:right w:val="single" w:sz="4" w:space="0" w:color="000000"/>
+            </w:tcBorders>
+            <w:tcMar>
+              <w:top w:w="80" w:type="dxa"/>
+              <w:left w:w="120" w:type="dxa"/>
+              <w:bottom w:w="80" w:type="dxa"/>
+              <w:right w:w="120" w:type="dxa"/>
+            </w:tcMar>
+          </w:tcPr>
+          <w:p>
+            <w:pPr>
+              <w:spacing w:line="320" w:lineRule="auto"/>
+            </w:pPr>
+            <w:r>
+              <w:rPr>
+                <w:b/>
+                <w:bCs/>
+              </w:rPr>
+              <w:t>Acceptance Criteria</w:t>
+            </w:r>
+          </w:p>
+        </w:tc>
+        <w:tc>
+          <w:tcPr>
+            <w:tcW w:w="7026" w:type="dxa"/>
+            <w:tcBorders>
+              <w:top w:val="single" w:sz="4" w:space="0" w:color="000000"/>
+              <w:left w:val="single" w:sz="4" w:space="0" w:color="000000"/>
+              <w:bottom w:val="single" w:sz="4" w:space="0" w:color="000000"/>
+              <w:right w:val="single" w:sz="4" w:space="0" w:color="000000"/>
+            </w:tcBorders>
+            <w:tcMar>
+              <w:top w:w="80" w:type="dxa"/>
+              <w:left w:w="120" w:type="dxa"/>
+              <w:bottom w:w="80" w:type="dxa"/>
+              <w:right w:w="120" w:type="dxa"/>
+            </w:tcMar>
+          </w:tcPr>
+          <w:p>
+            <w:pPr>
+              <w:spacing w:line="320" w:lineRule="auto"/>
+            </w:pPr>
+            <w:r>
+              <w:t xml:space="preserve">When a user clicks "Confirm Weekly Meal Plan" after filling out their weekly meal plan, the system schedules reminder notifications for each planned meal, reserves the necessary ingredient quantities in the inventory (reducing available quantity), and shows a confirmation summary with reserved inventory and upcoming reminders. </w:t>
+            </w:r>
+          </w:p>
+        </w:tc>
+      </w:tr>
+      <w:tr>
+        <w:tc>
+          <w:tcPr>
+            <w:tcW w:w="2000" w:type="dxa"/>
+            <w:tcBorders>
+              <w:top w:val="single" w:sz="4" w:space="0" w:color="000000"/>
+              <w:left w:val="single" w:sz="4" w:space="0" w:color="000000"/>
+              <w:bottom w:val="single" w:sz="4" w:space="0" w:color="000000"/>
+              <w:right w:val="single" w:sz="4" w:space="0" w:color="000000"/>
+            </w:tcBorders>
+            <w:tcMar>
+              <w:top w:w="80" w:type="dxa"/>
+              <w:left w:w="120" w:type="dxa"/>
+              <w:bottom w:w="80" w:type="dxa"/>
+              <w:right w:w="120" w:type="dxa"/>
+            </w:tcMar>
+          </w:tcPr>
+          <w:p>
+            <w:pPr>
+              <w:spacing w:line="320" w:lineRule="auto"/>
+            </w:pPr>
+            <w:r>
+              <w:rPr>
+                <w:b/>
+                <w:bCs/>
+              </w:rPr>
+              <w:t>MoSCoW</w:t>
+            </w:r>
+          </w:p>
+        </w:tc>
+        <w:tc>
+          <w:tcPr>
+            <w:tcW w:w="7026" w:type="dxa"/>
+            <w:tcBorders>
+              <w:top w:val="single" w:sz="4" w:space="0" w:color="000000"/>
+              <w:left w:val="single" w:sz="4" w:space="0" w:color="000000"/>
+              <w:bottom w:val="single" w:sz="4" w:space="0" w:color="000000"/>
+              <w:right w:val="single" w:sz="4" w:space="0" w:color="000000"/>
+            </w:tcBorders>
+            <w:tcMar>
+              <w:top w:w="80" w:type="dxa"/>
+              <w:left w:w="120" w:type="dxa"/>
+              <w:bottom w:w="80" w:type="dxa"/>
+              <w:right w:w="120" w:type="dxa"/>
+            </w:tcMar>
+          </w:tcPr>
+          <w:p>
+            <w:pPr>
+              <w:spacing w:line="320" w:lineRule="auto"/>
+            </w:pPr>
+            <w:r>
+              <w:t>Should Have</w:t>
+            </w:r>
+          </w:p>
+        </w:tc>
+      </w:tr>
+      <w:tr>
+        <w:tc>
+          <w:tcPr>
+            <w:tcW w:w="2000" w:type="dxa"/>
+            <w:tcBorders>
+              <w:top w:val="single" w:sz="4" w:space="0" w:color="000000"/>
+              <w:left w:val="single" w:sz="4" w:space="0" w:color="000000"/>
+              <w:bottom w:val="single" w:sz="4" w:space="0" w:color="000000"/>
+              <w:right w:val="single" w:sz="4" w:space="0" w:color="000000"/>
+            </w:tcBorders>
+            <w:tcMar>
+              <w:top w:w="80" w:type="dxa"/>
+              <w:left w:w="120" w:type="dxa"/>
+              <w:bottom w:w="80" w:type="dxa"/>
+              <w:right w:w="120" w:type="dxa"/>
+            </w:tcMar>
+          </w:tcPr>
+          <w:p>
+            <w:pPr>
+              <w:spacing w:line="320" w:lineRule="auto"/>
+            </w:pPr>
+            <w:r>
+              <w:rPr>
+                <w:b/>
+                <w:bCs/>
+              </w:rPr>
+              <w:t>Tasks</w:t>
+            </w:r>
+          </w:p>
+        </w:tc>
+        <w:tc>
+          <w:tcPr>
+            <w:tcW w:w="7026" w:type="dxa"/>
+            <w:tcBorders>
+              <w:top w:val="single" w:sz="4" w:space="0" w:color="000000"/>
+              <w:left w:val="single" w:sz="4" w:space="0" w:color="000000"/>
+              <w:bottom w:val="single" w:sz="4" w:space="0" w:color="000000"/>
+              <w:right w:val="single" w:sz="4" w:space="0" w:color="000000"/>
+            </w:tcBorders>
+            <w:tcMar>
+              <w:top w:w="80" w:type="dxa"/>
+              <w:left w:w="120" w:type="dxa"/>
+              <w:bottom w:w="80" w:type="dxa"/>
+              <w:right w:w="120" w:type="dxa"/>
+            </w:tcMar>
+          </w:tcPr>
+          <w:p>
+            <w:pPr>
+              <w:numPr>
+                <w:ilvl w:val="0"/>
+                <w:numId w:val="7"/>
+              </w:numPr>
+              <w:spacing w:after="0" w:line="320" w:lineRule="auto"/>
+            </w:pPr>
+            <w:r>
+              <w:t xml:space="preserve">Create the modal for the plan confirmation summary. </w:t>
+            </w:r>
+          </w:p>
+          <w:p>
+            <w:pPr>
+              <w:numPr>
+                <w:ilvl w:val="0"/>
+                <w:numId w:val="7"/>
+              </w:numPr>
+              <w:spacing w:after="0" w:line="320" w:lineRule="auto"/>
+            </w:pPr>
+            <w:r>
+              <w:t xml:space="preserve">Establish a POST endpoint at /api/meals/plan/confirm </w:t>
+            </w:r>
+          </w:p>
+          <w:p>
+            <w:pPr>
+              <w:numPr>
+                <w:ilvl w:val="0"/>
+                <w:numId w:val="7"/>
+              </w:numPr>
+              <w:spacing w:after="0" w:line="320" w:lineRule="auto"/>
+            </w:pPr>
+            <w:r>
+              <w:t xml:space="preserve">Put inventory reservation logic into practice (deduct reserved quantities) </w:t>
+            </w:r>
+          </w:p>
+          <w:p>
+            <w:pPr>
+              <w:numPr>
+                <w:ilvl w:val="0"/>
+                <w:numId w:val="7"/>
+              </w:numPr>
+              <w:spacing w:after="0" w:line="320" w:lineRule="auto"/>
+            </w:pPr>
+            <w:r>
+              <w:t xml:space="preserve">Use a cron job to set up meal reminder notifications. </w:t>
+            </w:r>
+          </w:p>
+          <w:p>
+            <w:pPr>
+              <w:numPr>
+                <w:ilvl w:val="0"/>
+                <w:numId w:val="7"/>
+              </w:numPr>
+              <w:spacing w:after="0" w:line="320" w:lineRule="auto"/>
+            </w:pPr>
+            <w:r>
+              <w:t xml:space="preserve">Create integration tests for the workflow for reservations and reminders. </w:t>
+            </w:r>
+          </w:p>
+        </w:tc>
+      </w:tr>
+      <w:tr>
+        <w:tc>
+          <w:tcPr>
+            <w:tcW w:w="2000" w:type="dxa"/>
+            <w:tcBorders>
+              <w:top w:val="single" w:sz="4" w:space="0" w:color="000000"/>
+              <w:left w:val="single" w:sz="4" w:space="0" w:color="000000"/>
+              <w:bottom w:val="single" w:sz="4" w:space="0" w:color="000000"/>
+              <w:right w:val="single" w:sz="4" w:space="0" w:color="000000"/>
+            </w:tcBorders>
+            <w:tcMar>
+              <w:top w:w="80" w:type="dxa"/>
+              <w:left w:w="120" w:type="dxa"/>
+              <w:bottom w:w="80" w:type="dxa"/>
+              <w:right w:w="120" w:type="dxa"/>
+            </w:tcMar>
+          </w:tcPr>
+          <w:p>
+            <w:pPr>
+              <w:spacing w:line="320" w:lineRule="auto"/>
+            </w:pPr>
+            <w:r>
+              <w:rPr>
+                <w:b/>
+                <w:bCs/>
+              </w:rPr>
+              <w:t>Test Cases</w:t>
+            </w:r>
+          </w:p>
+        </w:tc>
+        <w:tc>
+          <w:tcPr>
+            <w:tcW w:w="7026" w:type="dxa"/>
+            <w:tcBorders>
+              <w:top w:val="single" w:sz="4" w:space="0" w:color="000000"/>
+              <w:left w:val="single" w:sz="4" w:space="0" w:color="000000"/>
+              <w:bottom w:val="single" w:sz="4" w:space="0" w:color="000000"/>
+              <w:right w:val="single" w:sz="4" w:space="0" w:color="000000"/>
+            </w:tcBorders>
+            <w:tcMar>
+              <w:top w:w="80" w:type="dxa"/>
+              <w:left w:w="120" w:type="dxa"/>
+              <w:bottom w:w="80" w:type="dxa"/>
+              <w:right w:w="120" w:type="dxa"/>
+            </w:tcMar>
+          </w:tcPr>
+          <w:p>
+            <w:pPr>
+              <w:spacing w:line="320" w:lineRule="auto"/>
+            </w:pPr>
+            <w:r>
+              <w:t>to be completed in Assignment 2</w:t>
+            </w:r>
+          </w:p>
+        </w:tc>
+      </w:tr>
+    </w:tbl>
+    <w:p>
+      <w:pPr>
+        <w:spacing w:line="360" w:lineRule="auto"/>
+      </w:pPr>
+    </w:p>
     <w:p/>
     <w:p/>
     <w:p/>

</xml_diff>

<commit_message>
Added : Design Specification,Architectural Design – Deployment Diagram& Entity Relationship Diagram (ERD)
</commit_message>
<xml_diff>
--- a/BIT 216 Assignment 1 (Task 2).docx
+++ b/BIT 216 Assignment 1 (Task 2).docx
@@ -9096,8 +9096,6 @@
       <w:pPr>
         <w:spacing w:line="360" w:lineRule="auto"/>
       </w:pPr>
-      <w:bookmarkStart w:id="13" w:name="_GoBack"/>
-      <w:bookmarkEnd w:id="13"/>
     </w:p>
     <w:tbl>
       <w:tblPr>
@@ -9457,6 +9455,220 @@
     </w:p>
     <w:p/>
     <w:p/>
+    <w:p>
+      <w:pPr>
+        <w:pStyle w:val="Heading1"/>
+        <w:spacing w:before="240" w:after="120"/>
+      </w:pPr>
+      <w:r>
+        <w:t>4.0  Design Specification</w:t>
+      </w:r>
+    </w:p>
+    <w:p>
+      <w:pPr>
+        <w:spacing w:after="120" w:line="360" w:lineRule="auto"/>
+        <w:jc w:val="both"/>
+      </w:pPr>
+      <w:r>
+        <w:t xml:space="preserve">The requirements stated in Sections 2 and 3 are translated into tangible architectural and visual artefacts in the design specification. When combined, these graphics offer a thorough plan for the SavePlate system's complete development. A React.js frontend, a Node.js/Express.js RESTful API backend, and a PostgreSQL relational database make up the design's three-tier client-server architecture pattern (Pressman &amp; Maxim, 2020). Every item has a description, is contextualised in relation to the requirements it meets, and has a matching diagram. </w:t>
+      </w:r>
+    </w:p>
+    <w:p>
+      <w:pPr>
+        <w:pStyle w:val="Heading2"/>
+        <w:spacing w:before="200" w:after="100"/>
+      </w:pPr>
+      <w:bookmarkStart w:id="13" w:name="_heading=h.kp7cmn8hqdxb" w:colFirst="0" w:colLast="0"/>
+      <w:bookmarkEnd w:id="13"/>
+      <w:r>
+        <w:t>4.1  Architectural Design – Deployment Diagram</w:t>
+      </w:r>
+    </w:p>
+    <w:p>
+      <w:pPr>
+        <w:spacing w:after="120" w:line="360" w:lineRule="auto"/>
+        <w:jc w:val="both"/>
+      </w:pPr>
+      <w:r>
+        <w:t>The architectural deployment diagram of the SavePlate app in Figure 1 depicts its physical deployment topology. The system is based on a 3-tier architecture and consists of client tier, application tier, and data tier tiers. At the client tier, users use the React.js frontend to access SavePlate web browsers (Google Chrome or Mozilla Firefox). The frontend of the application is served via HTTP/HTTPS. In the application tier, the Node.js with Express.js RESTful API server resides, which handles all the business logic including inventory management, donation workflows, notification scheduling, and user authentication with JWT-based session management. A dedicated JWT Authentication Middleware is responsible for validating all API requests before they are forwarded to the business logic controllers. The data tier comprises a PostgreSQL relational database that saves all user inventory donation, meal plan, and notification records. An external SMTP Email Service is connected to the application tier and is used for sending out verification codes, notification emails, and welcome messages. This architecture maintains a clean separation of concerns and allows for horizontal scalability in future versions (Bass, Clements, &amp; Kazman, 2012).</w:t>
+      </w:r>
+    </w:p>
+    <w:p>
+      <w:pPr>
+        <w:spacing w:before="120" w:after="60"/>
+        <w:jc w:val="center"/>
+      </w:pPr>
+    </w:p>
+    <w:p>
+      <w:pPr>
+        <w:spacing w:before="120" w:after="60"/>
+        <w:jc w:val="center"/>
+      </w:pPr>
+      <w:r>
+        <w:rPr>
+          <w:noProof/>
+        </w:rPr>
+        <w:drawing>
+          <wp:inline distT="0" distB="0" distL="0" distR="0" wp14:anchorId="26E036F3" wp14:editId="02A8D070">
+            <wp:extent cx="4701947" cy="4320914"/>
+            <wp:effectExtent l="0" t="0" r="3810" b="3810"/>
+            <wp:docPr id="27" name="Picture 27"/>
+            <wp:cNvGraphicFramePr>
+              <a:graphicFrameLocks xmlns:a="http://schemas.openxmlformats.org/drawingml/2006/main" noChangeAspect="1"/>
+            </wp:cNvGraphicFramePr>
+            <a:graphic xmlns:a="http://schemas.openxmlformats.org/drawingml/2006/main">
+              <a:graphicData uri="http://schemas.openxmlformats.org/drawingml/2006/picture">
+                <pic:pic xmlns:pic="http://schemas.openxmlformats.org/drawingml/2006/picture">
+                  <pic:nvPicPr>
+                    <pic:cNvPr id="1" name=""/>
+                    <pic:cNvPicPr/>
+                  </pic:nvPicPr>
+                  <pic:blipFill>
+                    <a:blip r:embed="rId5"/>
+                    <a:stretch>
+                      <a:fillRect/>
+                    </a:stretch>
+                  </pic:blipFill>
+                  <pic:spPr>
+                    <a:xfrm>
+                      <a:off x="0" y="0"/>
+                      <a:ext cx="4701947" cy="4320914"/>
+                    </a:xfrm>
+                    <a:prstGeom prst="rect">
+                      <a:avLst/>
+                    </a:prstGeom>
+                  </pic:spPr>
+                </pic:pic>
+              </a:graphicData>
+            </a:graphic>
+          </wp:inline>
+        </w:drawing>
+      </w:r>
+    </w:p>
+    <w:p>
+      <w:pPr>
+        <w:spacing w:before="60" w:after="120"/>
+        <w:jc w:val="center"/>
+        <w:rPr>
+          <w:i/>
+          <w:iCs/>
+        </w:rPr>
+      </w:pPr>
+      <w:r>
+        <w:rPr>
+          <w:i/>
+          <w:iCs/>
+        </w:rPr>
+        <w:t>Figure 1: SavePlate Deployment Architecture Diagram</w:t>
+      </w:r>
+    </w:p>
+    <w:p>
+      <w:pPr>
+        <w:spacing w:before="60" w:after="120"/>
+        <w:jc w:val="center"/>
+        <w:rPr>
+          <w:i/>
+          <w:iCs/>
+        </w:rPr>
+      </w:pPr>
+    </w:p>
+    <w:p>
+      <w:pPr>
+        <w:pStyle w:val="Heading2"/>
+        <w:spacing w:before="200" w:after="100"/>
+      </w:pPr>
+      <w:bookmarkStart w:id="14" w:name="_heading=h.5muk6q16yanh" w:colFirst="0" w:colLast="0"/>
+      <w:bookmarkEnd w:id="14"/>
+      <w:r>
+        <w:t>4.2  Entity Relationship Diagram (ERD)</w:t>
+      </w:r>
+    </w:p>
+    <w:p>
+      <w:pPr>
+        <w:spacing w:after="120" w:line="360" w:lineRule="auto"/>
+        <w:jc w:val="both"/>
+      </w:pPr>
+      <w:r>
+        <w:t>The Entity Relationship Diagram (ERD) shown in Figure 2 illustrates the concept of the SavePlate database using Crow's Foot notation. The main focus is on the users table, which keeps account credentials, household information, and privacy settings. One user can have multiple inventory items (one-to-many relationship with food_items),can make many donation listings (one-to-many with donations), and can have meal plan entries (one-to-many with meal_plans). The notifications table saves records of all system-generated alerts of which each is linked to a particular user. The donations table points to both the donor user and the specific food item donated. Junction relations enable multiple recipients to claim a donation listing (donations_claims). The data model is normalized to Third Normal Form (3NF) for eliminating data redundancy and ensuring referential integrity (Elmasri &amp; Navathe, 2015). All foreign key constraints maintain referential integrity, and cascading deletions are used wherever suitable (e.g. deleting a user removes all related inventory and donation records).</w:t>
+      </w:r>
+    </w:p>
+    <w:p>
+      <w:pPr>
+        <w:spacing w:before="120" w:after="60"/>
+        <w:jc w:val="center"/>
+      </w:pPr>
+      <w:r>
+        <w:rPr>
+          <w:noProof/>
+        </w:rPr>
+        <w:drawing>
+          <wp:inline distT="0" distB="0" distL="0" distR="0" wp14:anchorId="21510918" wp14:editId="3CD69E3C">
+            <wp:extent cx="4762500" cy="2952750"/>
+            <wp:effectExtent l="0" t="0" r="0" b="0"/>
+            <wp:docPr id="9" name="image2.png" descr="image2.png"/>
+            <wp:cNvGraphicFramePr/>
+            <a:graphic xmlns:a="http://schemas.openxmlformats.org/drawingml/2006/main">
+              <a:graphicData uri="http://schemas.openxmlformats.org/drawingml/2006/picture">
+                <pic:pic xmlns:pic="http://schemas.openxmlformats.org/drawingml/2006/picture">
+                  <pic:nvPicPr>
+                    <pic:cNvPr id="0" name="image2.png" descr="image2.png"/>
+                    <pic:cNvPicPr preferRelativeResize="0"/>
+                  </pic:nvPicPr>
+                  <pic:blipFill>
+                    <a:blip r:embed="rId6"/>
+                    <a:srcRect/>
+                    <a:stretch>
+                      <a:fillRect/>
+                    </a:stretch>
+                  </pic:blipFill>
+                  <pic:spPr>
+                    <a:xfrm>
+                      <a:off x="0" y="0"/>
+                      <a:ext cx="4762500" cy="2952750"/>
+                    </a:xfrm>
+                    <a:prstGeom prst="rect">
+                      <a:avLst/>
+                    </a:prstGeom>
+                    <a:ln/>
+                  </pic:spPr>
+                </pic:pic>
+              </a:graphicData>
+            </a:graphic>
+          </wp:inline>
+        </w:drawing>
+      </w:r>
+    </w:p>
+    <w:p>
+      <w:pPr>
+        <w:spacing w:before="60" w:after="120"/>
+        <w:jc w:val="center"/>
+        <w:rPr>
+          <w:i/>
+          <w:iCs/>
+        </w:rPr>
+      </w:pPr>
+      <w:r>
+        <w:rPr>
+          <w:i/>
+          <w:iCs/>
+        </w:rPr>
+        <w:t>Figure 2: SavePlate Entity Relationship Diagram (Crow's Foot Notation)</w:t>
+      </w:r>
+    </w:p>
+    <w:p>
+      <w:pPr>
+        <w:spacing w:before="60" w:after="120"/>
+        <w:jc w:val="center"/>
+        <w:rPr>
+          <w:i/>
+          <w:iCs/>
+        </w:rPr>
+      </w:pPr>
+    </w:p>
+    <w:p>
+      <w:bookmarkStart w:id="15" w:name="_GoBack"/>
+      <w:bookmarkEnd w:id="15"/>
+    </w:p>
     <w:p/>
     <w:p/>
     <w:p/>

</xml_diff>

<commit_message>
Added : Site Map
</commit_message>
<xml_diff>
--- a/BIT 216 Assignment 1 (Task 2).docx
+++ b/BIT 216 Assignment 1 (Task 2).docx
@@ -9665,9 +9665,103 @@
         </w:rPr>
       </w:pPr>
     </w:p>
+    <w:p/>
     <w:p>
-      <w:bookmarkStart w:id="15" w:name="_GoBack"/>
+      <w:pPr>
+        <w:spacing w:before="60" w:after="120"/>
+        <w:jc w:val="center"/>
+        <w:rPr>
+          <w:i/>
+          <w:iCs/>
+        </w:rPr>
+      </w:pPr>
+    </w:p>
+    <w:p>
+      <w:pPr>
+        <w:pStyle w:val="Heading2"/>
+        <w:spacing w:before="200" w:after="100"/>
+      </w:pPr>
+      <w:bookmarkStart w:id="15" w:name="_heading=h.w3jvdkv2ewwi" w:colFirst="0" w:colLast="0"/>
       <w:bookmarkEnd w:id="15"/>
+      <w:r>
+        <w:t>4.3  Site Map</w:t>
+      </w:r>
+    </w:p>
+    <w:p>
+      <w:pPr>
+        <w:spacing w:after="120" w:line="360" w:lineRule="auto"/>
+        <w:jc w:val="both"/>
+      </w:pPr>
+      <w:r>
+        <w:t>The site map in Figure 3 is a graphical representation showing the navigation hierarchy of SavePlate web application. Screen 1 represents the public-facing landing page, giving the entry point and leading to the registration and login flows. Only landing, registration (Screens 2–3), login (Screen 4), and password reset (Screen 5) screens are accessible by unauthenticated users. After successful authentication, users are taken to the main Dashboard (Screen 6) which is the navigation hub for the main eight sections: Food Inventory, Browse Donations, Meal Planner Analytics Notifications, and Account Settings. Each of these main sections is composed of additional sub-screens for detailed views and modal interactions. The site map represents the MoSCoW prioritisation, with features marked as Must Have (Inventory Donations Notifications) at the highest navigation level while features marked as Could Have are accessible as secondary flows (Cohn, 2004).</w:t>
+      </w:r>
+    </w:p>
+    <w:p>
+      <w:pPr>
+        <w:spacing w:before="120" w:after="60"/>
+        <w:jc w:val="center"/>
+      </w:pPr>
+      <w:r>
+        <w:rPr>
+          <w:noProof/>
+        </w:rPr>
+        <w:drawing>
+          <wp:inline distT="0" distB="0" distL="0" distR="0" wp14:anchorId="08AB25E5" wp14:editId="28D98541">
+            <wp:extent cx="4572000" cy="3095625"/>
+            <wp:effectExtent l="0" t="0" r="0" b="0"/>
+            <wp:docPr id="8" name="image13.png" descr="image3.png"/>
+            <wp:cNvGraphicFramePr/>
+            <a:graphic xmlns:a="http://schemas.openxmlformats.org/drawingml/2006/main">
+              <a:graphicData uri="http://schemas.openxmlformats.org/drawingml/2006/picture">
+                <pic:pic xmlns:pic="http://schemas.openxmlformats.org/drawingml/2006/picture">
+                  <pic:nvPicPr>
+                    <pic:cNvPr id="0" name="image13.png" descr="image3.png"/>
+                    <pic:cNvPicPr preferRelativeResize="0"/>
+                  </pic:nvPicPr>
+                  <pic:blipFill>
+                    <a:blip r:embed="rId7"/>
+                    <a:srcRect/>
+                    <a:stretch>
+                      <a:fillRect/>
+                    </a:stretch>
+                  </pic:blipFill>
+                  <pic:spPr>
+                    <a:xfrm>
+                      <a:off x="0" y="0"/>
+                      <a:ext cx="4572000" cy="3095625"/>
+                    </a:xfrm>
+                    <a:prstGeom prst="rect">
+                      <a:avLst/>
+                    </a:prstGeom>
+                    <a:ln/>
+                  </pic:spPr>
+                </pic:pic>
+              </a:graphicData>
+            </a:graphic>
+          </wp:inline>
+        </w:drawing>
+      </w:r>
+    </w:p>
+    <w:p>
+      <w:pPr>
+        <w:spacing w:before="60" w:after="120"/>
+        <w:jc w:val="center"/>
+        <w:rPr>
+          <w:i/>
+          <w:iCs/>
+        </w:rPr>
+      </w:pPr>
+      <w:r>
+        <w:rPr>
+          <w:i/>
+          <w:iCs/>
+        </w:rPr>
+        <w:t>Figure 3: SavePlate Site Map (Navigation Hierarchy)</w:t>
+      </w:r>
+    </w:p>
+    <w:p>
+      <w:bookmarkStart w:id="16" w:name="_GoBack"/>
+      <w:bookmarkEnd w:id="16"/>
     </w:p>
     <w:p/>
     <w:p/>

</xml_diff>

<commit_message>
Added : Wireframes and User Interface Design of Landing pages
</commit_message>
<xml_diff>
--- a/BIT 216 Assignment 1 (Task 2).docx
+++ b/BIT 216 Assignment 1 (Task 2).docx
@@ -9759,13 +9759,365 @@
         <w:t>Figure 3: SavePlate Site Map (Navigation Hierarchy)</w:t>
       </w:r>
     </w:p>
-    <w:p>
-      <w:bookmarkStart w:id="16" w:name="_GoBack"/>
-      <w:bookmarkEnd w:id="16"/>
-    </w:p>
     <w:p/>
     <w:p/>
-    <w:p/>
+    <w:p>
+      <w:pPr>
+        <w:pStyle w:val="Heading2"/>
+        <w:spacing w:before="200" w:after="100"/>
+      </w:pPr>
+      <w:r>
+        <w:t>4.4  Wireframes and User Interface Design</w:t>
+      </w:r>
+    </w:p>
+    <w:p>
+      <w:pPr>
+        <w:spacing w:after="120" w:line="360" w:lineRule="auto"/>
+        <w:jc w:val="both"/>
+      </w:pPr>
+      <w:r>
+        <w:t>These wireframes created in Figma unveil the entire SavePlate web app's high-fidelity screen designs. Wireframes not only illustrate six primary use cases but also include their related functional requirements. A design system featuring a fresh, food-photography-inspired look and a green primary palette (#4CAF50) highlights the app's sustainability theme. Besides, all screens are compliant with WCAG 2.1 Level AA contrast guidelines (NFR08) and are made for 1440px desktop width with responsive scaling to 390px mobile width (NFR07).</w:t>
+      </w:r>
+    </w:p>
+    <w:p>
+      <w:pPr>
+        <w:pStyle w:val="Heading3"/>
+        <w:spacing w:before="160" w:after="80"/>
+      </w:pPr>
+      <w:bookmarkStart w:id="16" w:name="_heading=h.ama1ncstkuip" w:colFirst="0" w:colLast="0"/>
+      <w:bookmarkEnd w:id="16"/>
+      <w:r>
+        <w:t>4.4.1  Landing Page (Screen 1)</w:t>
+      </w:r>
+    </w:p>
+    <w:p>
+      <w:pPr>
+        <w:spacing w:after="120" w:line="360" w:lineRule="auto"/>
+        <w:jc w:val="both"/>
+      </w:pPr>
+      <w:r>
+        <w:t>On the landing page (figures 4-7), the SavePlate value proposition is conveyed through a hero section that features a food-photography background, a list of feature highlights, a guide on "How SavePlate Works" with step-by-step instructions, a section with social proofs, and a call-to-action footer. The design puts emphasis on conversion by putting the "Register Free" button in an obvious place on the hero. This screen is compliant with FR17 (privacy settings access) as it brings a direct link to the registration journey.</w:t>
+      </w:r>
+    </w:p>
+    <w:p>
+      <w:pPr>
+        <w:spacing w:before="120" w:after="60"/>
+        <w:jc w:val="center"/>
+      </w:pPr>
+      <w:r>
+        <w:rPr>
+          <w:noProof/>
+        </w:rPr>
+        <w:drawing>
+          <wp:inline distT="0" distB="0" distL="0" distR="0" wp14:anchorId="1D476D25" wp14:editId="5832DD89">
+            <wp:extent cx="4572000" cy="1990725"/>
+            <wp:effectExtent l="0" t="0" r="0" b="0"/>
+            <wp:docPr id="11" name="image20.png" descr="image4.png"/>
+            <wp:cNvGraphicFramePr/>
+            <a:graphic xmlns:a="http://schemas.openxmlformats.org/drawingml/2006/main">
+              <a:graphicData uri="http://schemas.openxmlformats.org/drawingml/2006/picture">
+                <pic:pic xmlns:pic="http://schemas.openxmlformats.org/drawingml/2006/picture">
+                  <pic:nvPicPr>
+                    <pic:cNvPr id="0" name="image20.png" descr="image4.png"/>
+                    <pic:cNvPicPr preferRelativeResize="0"/>
+                  </pic:nvPicPr>
+                  <pic:blipFill>
+                    <a:blip r:embed="rId8"/>
+                    <a:srcRect/>
+                    <a:stretch>
+                      <a:fillRect/>
+                    </a:stretch>
+                  </pic:blipFill>
+                  <pic:spPr>
+                    <a:xfrm>
+                      <a:off x="0" y="0"/>
+                      <a:ext cx="4572000" cy="1990725"/>
+                    </a:xfrm>
+                    <a:prstGeom prst="rect">
+                      <a:avLst/>
+                    </a:prstGeom>
+                    <a:ln/>
+                  </pic:spPr>
+                </pic:pic>
+              </a:graphicData>
+            </a:graphic>
+          </wp:inline>
+        </w:drawing>
+      </w:r>
+    </w:p>
+    <w:p>
+      <w:pPr>
+        <w:spacing w:before="60" w:after="120"/>
+        <w:jc w:val="center"/>
+        <w:rPr>
+          <w:i/>
+          <w:iCs/>
+        </w:rPr>
+      </w:pPr>
+      <w:r>
+        <w:rPr>
+          <w:i/>
+          <w:iCs/>
+        </w:rPr>
+        <w:t>Figure 4: Landing Page – Hero Section (Screen 1a)</w:t>
+      </w:r>
+    </w:p>
+    <w:p>
+      <w:pPr>
+        <w:spacing w:before="120" w:after="60"/>
+        <w:jc w:val="center"/>
+      </w:pPr>
+      <w:r>
+        <w:rPr>
+          <w:noProof/>
+        </w:rPr>
+        <w:drawing>
+          <wp:inline distT="0" distB="0" distL="0" distR="0" wp14:anchorId="3269BA58" wp14:editId="1D1E9930">
+            <wp:extent cx="4572000" cy="1676400"/>
+            <wp:effectExtent l="0" t="0" r="0" b="0"/>
+            <wp:docPr id="10" name="image4.png" descr="image5.png"/>
+            <wp:cNvGraphicFramePr/>
+            <a:graphic xmlns:a="http://schemas.openxmlformats.org/drawingml/2006/main">
+              <a:graphicData uri="http://schemas.openxmlformats.org/drawingml/2006/picture">
+                <pic:pic xmlns:pic="http://schemas.openxmlformats.org/drawingml/2006/picture">
+                  <pic:nvPicPr>
+                    <pic:cNvPr id="0" name="image4.png" descr="image5.png"/>
+                    <pic:cNvPicPr preferRelativeResize="0"/>
+                  </pic:nvPicPr>
+                  <pic:blipFill>
+                    <a:blip r:embed="rId9"/>
+                    <a:srcRect/>
+                    <a:stretch>
+                      <a:fillRect/>
+                    </a:stretch>
+                  </pic:blipFill>
+                  <pic:spPr>
+                    <a:xfrm>
+                      <a:off x="0" y="0"/>
+                      <a:ext cx="4572000" cy="1676400"/>
+                    </a:xfrm>
+                    <a:prstGeom prst="rect">
+                      <a:avLst/>
+                    </a:prstGeom>
+                    <a:ln/>
+                  </pic:spPr>
+                </pic:pic>
+              </a:graphicData>
+            </a:graphic>
+          </wp:inline>
+        </w:drawing>
+      </w:r>
+    </w:p>
+    <w:p>
+      <w:pPr>
+        <w:spacing w:before="60" w:after="120"/>
+        <w:jc w:val="center"/>
+        <w:rPr>
+          <w:i/>
+          <w:iCs/>
+        </w:rPr>
+      </w:pPr>
+      <w:r>
+        <w:rPr>
+          <w:i/>
+          <w:iCs/>
+        </w:rPr>
+        <w:t>Figure 5: Landing Page – Features Section (Screen 1b)</w:t>
+      </w:r>
+    </w:p>
+    <w:p>
+      <w:pPr>
+        <w:spacing w:before="120" w:after="60"/>
+        <w:jc w:val="center"/>
+      </w:pPr>
+      <w:r>
+        <w:rPr>
+          <w:noProof/>
+        </w:rPr>
+        <w:drawing>
+          <wp:inline distT="0" distB="0" distL="0" distR="0" wp14:anchorId="39E78A66" wp14:editId="02B53B3B">
+            <wp:extent cx="4572000" cy="1533525"/>
+            <wp:effectExtent l="0" t="0" r="0" b="0"/>
+            <wp:docPr id="13" name="image12.png" descr="image6.png"/>
+            <wp:cNvGraphicFramePr/>
+            <a:graphic xmlns:a="http://schemas.openxmlformats.org/drawingml/2006/main">
+              <a:graphicData uri="http://schemas.openxmlformats.org/drawingml/2006/picture">
+                <pic:pic xmlns:pic="http://schemas.openxmlformats.org/drawingml/2006/picture">
+                  <pic:nvPicPr>
+                    <pic:cNvPr id="0" name="image12.png" descr="image6.png"/>
+                    <pic:cNvPicPr preferRelativeResize="0"/>
+                  </pic:nvPicPr>
+                  <pic:blipFill>
+                    <a:blip r:embed="rId10"/>
+                    <a:srcRect/>
+                    <a:stretch>
+                      <a:fillRect/>
+                    </a:stretch>
+                  </pic:blipFill>
+                  <pic:spPr>
+                    <a:xfrm>
+                      <a:off x="0" y="0"/>
+                      <a:ext cx="4572000" cy="1533525"/>
+                    </a:xfrm>
+                    <a:prstGeom prst="rect">
+                      <a:avLst/>
+                    </a:prstGeom>
+                    <a:ln/>
+                  </pic:spPr>
+                </pic:pic>
+              </a:graphicData>
+            </a:graphic>
+          </wp:inline>
+        </w:drawing>
+      </w:r>
+    </w:p>
+    <w:p>
+      <w:pPr>
+        <w:spacing w:before="60" w:after="120"/>
+        <w:jc w:val="center"/>
+        <w:rPr>
+          <w:i/>
+          <w:iCs/>
+        </w:rPr>
+      </w:pPr>
+      <w:r>
+        <w:rPr>
+          <w:i/>
+          <w:iCs/>
+        </w:rPr>
+        <w:t>Figure 6: Landing Page – How It Works Section (Screen 1c)</w:t>
+      </w:r>
+    </w:p>
+    <w:p>
+      <w:pPr>
+        <w:spacing w:before="120" w:after="60"/>
+        <w:jc w:val="center"/>
+      </w:pPr>
+      <w:r>
+        <w:rPr>
+          <w:noProof/>
+        </w:rPr>
+        <w:drawing>
+          <wp:inline distT="0" distB="0" distL="0" distR="0" wp14:anchorId="7DAE078B" wp14:editId="186459C9">
+            <wp:extent cx="4572000" cy="1619250"/>
+            <wp:effectExtent l="0" t="0" r="0" b="0"/>
+            <wp:docPr id="12" name="image14.png" descr="image7.png"/>
+            <wp:cNvGraphicFramePr/>
+            <a:graphic xmlns:a="http://schemas.openxmlformats.org/drawingml/2006/main">
+              <a:graphicData uri="http://schemas.openxmlformats.org/drawingml/2006/picture">
+                <pic:pic xmlns:pic="http://schemas.openxmlformats.org/drawingml/2006/picture">
+                  <pic:nvPicPr>
+                    <pic:cNvPr id="0" name="image14.png" descr="image7.png"/>
+                    <pic:cNvPicPr preferRelativeResize="0"/>
+                  </pic:nvPicPr>
+                  <pic:blipFill>
+                    <a:blip r:embed="rId11"/>
+                    <a:srcRect/>
+                    <a:stretch>
+                      <a:fillRect/>
+                    </a:stretch>
+                  </pic:blipFill>
+                  <pic:spPr>
+                    <a:xfrm>
+                      <a:off x="0" y="0"/>
+                      <a:ext cx="4572000" cy="1619250"/>
+                    </a:xfrm>
+                    <a:prstGeom prst="rect">
+                      <a:avLst/>
+                    </a:prstGeom>
+                    <a:ln/>
+                  </pic:spPr>
+                </pic:pic>
+              </a:graphicData>
+            </a:graphic>
+          </wp:inline>
+        </w:drawing>
+      </w:r>
+    </w:p>
+    <w:p>
+      <w:pPr>
+        <w:spacing w:before="60" w:after="120"/>
+        <w:jc w:val="center"/>
+        <w:rPr>
+          <w:i/>
+          <w:iCs/>
+        </w:rPr>
+      </w:pPr>
+      <w:r>
+        <w:rPr>
+          <w:i/>
+          <w:iCs/>
+        </w:rPr>
+        <w:t>Figure 7: Landing Page – Why Households Choose SavePlate (Screen 1d)</w:t>
+      </w:r>
+    </w:p>
+    <w:p>
+      <w:pPr>
+        <w:spacing w:before="120" w:after="60"/>
+        <w:jc w:val="center"/>
+      </w:pPr>
+      <w:r>
+        <w:rPr>
+          <w:noProof/>
+        </w:rPr>
+        <w:drawing>
+          <wp:inline distT="0" distB="0" distL="0" distR="0" wp14:anchorId="5CD528FE" wp14:editId="78928238">
+            <wp:extent cx="4572000" cy="1085850"/>
+            <wp:effectExtent l="0" t="0" r="0" b="0"/>
+            <wp:docPr id="15" name="image5.png" descr="image8.png"/>
+            <wp:cNvGraphicFramePr/>
+            <a:graphic xmlns:a="http://schemas.openxmlformats.org/drawingml/2006/main">
+              <a:graphicData uri="http://schemas.openxmlformats.org/drawingml/2006/picture">
+                <pic:pic xmlns:pic="http://schemas.openxmlformats.org/drawingml/2006/picture">
+                  <pic:nvPicPr>
+                    <pic:cNvPr id="0" name="image5.png" descr="image8.png"/>
+                    <pic:cNvPicPr preferRelativeResize="0"/>
+                  </pic:nvPicPr>
+                  <pic:blipFill>
+                    <a:blip r:embed="rId12"/>
+                    <a:srcRect/>
+                    <a:stretch>
+                      <a:fillRect/>
+                    </a:stretch>
+                  </pic:blipFill>
+                  <pic:spPr>
+                    <a:xfrm>
+                      <a:off x="0" y="0"/>
+                      <a:ext cx="4572000" cy="1085850"/>
+                    </a:xfrm>
+                    <a:prstGeom prst="rect">
+                      <a:avLst/>
+                    </a:prstGeom>
+                    <a:ln/>
+                  </pic:spPr>
+                </pic:pic>
+              </a:graphicData>
+            </a:graphic>
+          </wp:inline>
+        </w:drawing>
+      </w:r>
+    </w:p>
+    <w:p>
+      <w:pPr>
+        <w:spacing w:before="60" w:after="120"/>
+        <w:jc w:val="center"/>
+        <w:rPr>
+          <w:i/>
+          <w:iCs/>
+        </w:rPr>
+      </w:pPr>
+      <w:r>
+        <w:rPr>
+          <w:i/>
+          <w:iCs/>
+        </w:rPr>
+        <w:t>Figure 8: Landing Page – Footer CTA (Screen 1e)</w:t>
+      </w:r>
+    </w:p>
+    <w:p>
+      <w:bookmarkStart w:id="17" w:name="_GoBack"/>
+      <w:bookmarkEnd w:id="17"/>
+    </w:p>
     <w:p/>
     <w:p/>
     <w:p/>

</xml_diff>

<commit_message>
Added : Wireframes and User Interface Design of Authentication Screens &Dashboard Screen
</commit_message>
<xml_diff>
--- a/BIT 216 Assignment 1 (Task 2).docx
+++ b/BIT 216 Assignment 1 (Task 2).docx
@@ -10115,8 +10115,267 @@
       </w:r>
     </w:p>
     <w:p>
-      <w:bookmarkStart w:id="17" w:name="_GoBack"/>
+      <w:pPr>
+        <w:spacing w:before="60" w:after="120"/>
+        <w:jc w:val="center"/>
+        <w:rPr>
+          <w:i/>
+          <w:iCs/>
+        </w:rPr>
+      </w:pPr>
+    </w:p>
+    <w:p>
+      <w:pPr>
+        <w:spacing w:before="60" w:after="120"/>
+        <w:jc w:val="center"/>
+        <w:rPr>
+          <w:i/>
+          <w:iCs/>
+        </w:rPr>
+      </w:pPr>
+    </w:p>
+    <w:p>
+      <w:pPr>
+        <w:pStyle w:val="Heading3"/>
+        <w:spacing w:before="160" w:after="80"/>
+      </w:pPr>
+      <w:bookmarkStart w:id="17" w:name="_heading=h.1z4jx4ys4wpb" w:colFirst="0" w:colLast="0"/>
       <w:bookmarkEnd w:id="17"/>
+      <w:r>
+        <w:t>4.4.2  Authentication Screens (Screens 2–5)</w:t>
+      </w:r>
+    </w:p>
+    <w:p>
+      <w:pPr>
+        <w:spacing w:after="120" w:line="360" w:lineRule="auto"/>
+        <w:jc w:val="both"/>
+      </w:pPr>
+      <w:r>
+        <w:t>The authentication wireframes (Figures 9–10) illustrate the end-to-end user registration, email verification, login, and password reset processes. The registration form (Screen 2) asks for the user's full name, email password, confirmation of password, and household size which is optional. Email format and password strength are checked using inline validation and feedback is given immediately (FR01). The email verification screen (Screen 3) reveals a 6-digit OTP input box plus a countdown timer (FR02). On the login screen (Screen 4), users can sign in by entering their email and password, and there is a toggle for "Remember me for 30 days" as well as a "Forgot Password" link. The password reset screen (Screen 5) follows a secure email-based reset link pattern (FR03). These screens are a direct match for UC1 requirements and Epic 1 user stories.</w:t>
+      </w:r>
+    </w:p>
+    <w:p>
+      <w:pPr>
+        <w:spacing w:before="120" w:after="60"/>
+        <w:jc w:val="center"/>
+      </w:pPr>
+      <w:r>
+        <w:rPr>
+          <w:noProof/>
+        </w:rPr>
+        <w:drawing>
+          <wp:inline distT="0" distB="0" distL="0" distR="0" wp14:anchorId="74BBA106" wp14:editId="5D1D5320">
+            <wp:extent cx="4286250" cy="2914650"/>
+            <wp:effectExtent l="0" t="0" r="0" b="0"/>
+            <wp:docPr id="14" name="image16.png" descr="image9.png"/>
+            <wp:cNvGraphicFramePr/>
+            <a:graphic xmlns:a="http://schemas.openxmlformats.org/drawingml/2006/main">
+              <a:graphicData uri="http://schemas.openxmlformats.org/drawingml/2006/picture">
+                <pic:pic xmlns:pic="http://schemas.openxmlformats.org/drawingml/2006/picture">
+                  <pic:nvPicPr>
+                    <pic:cNvPr id="0" name="image16.png" descr="image9.png"/>
+                    <pic:cNvPicPr preferRelativeResize="0"/>
+                  </pic:nvPicPr>
+                  <pic:blipFill>
+                    <a:blip r:embed="rId13"/>
+                    <a:srcRect/>
+                    <a:stretch>
+                      <a:fillRect/>
+                    </a:stretch>
+                  </pic:blipFill>
+                  <pic:spPr>
+                    <a:xfrm>
+                      <a:off x="0" y="0"/>
+                      <a:ext cx="4286250" cy="2914650"/>
+                    </a:xfrm>
+                    <a:prstGeom prst="rect">
+                      <a:avLst/>
+                    </a:prstGeom>
+                    <a:ln/>
+                  </pic:spPr>
+                </pic:pic>
+              </a:graphicData>
+            </a:graphic>
+          </wp:inline>
+        </w:drawing>
+      </w:r>
+    </w:p>
+    <w:p>
+      <w:pPr>
+        <w:spacing w:before="60" w:after="120"/>
+        <w:jc w:val="center"/>
+        <w:rPr>
+          <w:i/>
+          <w:iCs/>
+        </w:rPr>
+      </w:pPr>
+      <w:r>
+        <w:rPr>
+          <w:i/>
+          <w:iCs/>
+        </w:rPr>
+        <w:t>Figure 9: Registration and Email Verification Screens (Screens 2–3)</w:t>
+      </w:r>
+    </w:p>
+    <w:p>
+      <w:pPr>
+        <w:spacing w:before="120" w:after="60"/>
+        <w:jc w:val="center"/>
+      </w:pPr>
+      <w:r>
+        <w:rPr>
+          <w:noProof/>
+        </w:rPr>
+        <w:drawing>
+          <wp:inline distT="0" distB="0" distL="0" distR="0" wp14:anchorId="490ACB6A" wp14:editId="3E2A84B7">
+            <wp:extent cx="4286250" cy="2095500"/>
+            <wp:effectExtent l="0" t="0" r="0" b="0"/>
+            <wp:docPr id="18" name="image1.png" descr="image10.png"/>
+            <wp:cNvGraphicFramePr/>
+            <a:graphic xmlns:a="http://schemas.openxmlformats.org/drawingml/2006/main">
+              <a:graphicData uri="http://schemas.openxmlformats.org/drawingml/2006/picture">
+                <pic:pic xmlns:pic="http://schemas.openxmlformats.org/drawingml/2006/picture">
+                  <pic:nvPicPr>
+                    <pic:cNvPr id="0" name="image1.png" descr="image10.png"/>
+                    <pic:cNvPicPr preferRelativeResize="0"/>
+                  </pic:nvPicPr>
+                  <pic:blipFill>
+                    <a:blip r:embed="rId14"/>
+                    <a:srcRect/>
+                    <a:stretch>
+                      <a:fillRect/>
+                    </a:stretch>
+                  </pic:blipFill>
+                  <pic:spPr>
+                    <a:xfrm>
+                      <a:off x="0" y="0"/>
+                      <a:ext cx="4286250" cy="2095500"/>
+                    </a:xfrm>
+                    <a:prstGeom prst="rect">
+                      <a:avLst/>
+                    </a:prstGeom>
+                    <a:ln/>
+                  </pic:spPr>
+                </pic:pic>
+              </a:graphicData>
+            </a:graphic>
+          </wp:inline>
+        </w:drawing>
+      </w:r>
+    </w:p>
+    <w:p>
+      <w:pPr>
+        <w:spacing w:before="60" w:after="120"/>
+        <w:jc w:val="center"/>
+        <w:rPr>
+          <w:i/>
+          <w:iCs/>
+        </w:rPr>
+      </w:pPr>
+      <w:r>
+        <w:rPr>
+          <w:i/>
+          <w:iCs/>
+        </w:rPr>
+        <w:t>Figure 10: Login and Password Reset Screens (Screens 4–5)</w:t>
+      </w:r>
+    </w:p>
+    <w:p>
+      <w:pPr>
+        <w:spacing w:before="60" w:after="120"/>
+        <w:jc w:val="center"/>
+        <w:rPr>
+          <w:i/>
+          <w:iCs/>
+        </w:rPr>
+      </w:pPr>
+    </w:p>
+    <w:p>
+      <w:pPr>
+        <w:pStyle w:val="Heading3"/>
+        <w:spacing w:before="160" w:after="80"/>
+      </w:pPr>
+      <w:bookmarkStart w:id="18" w:name="_heading=h.ejb4nz833u0c" w:colFirst="0" w:colLast="0"/>
+      <w:bookmarkEnd w:id="18"/>
+      <w:r>
+        <w:t>4.4.3  Dashboard (Screen 6)</w:t>
+      </w:r>
+    </w:p>
+    <w:p>
+      <w:pPr>
+        <w:spacing w:after="120" w:line="360" w:lineRule="auto"/>
+        <w:jc w:val="both"/>
+      </w:pPr>
+      <w:r>
+        <w:t>Once you log in, the main dashboard (Figure 11) is your "go to" place since it is the primary point from which to navigate the system. The first thing you see there are summary statistics cards indicating the total number of items, how many items are expiring soon, the number of donations made, and the percentage of waste prevented. Also, a "Items Saved Count" bar chart delivers a simple visual summary of recent performance. A "Category Breakdown" pie chart and an "Upcoming Expiry" list take up secondary panels. A permanent left navigation sidebar allows you to reach all the major areas. The "Recent Activity" feed displayed on the right side indicates the last five user actions. This screen fulfils the requirements of FR09 (Food Analytics summary), FR11 (expiry visibility), and the Dashboard from UC4.</w:t>
+      </w:r>
+    </w:p>
+    <w:p>
+      <w:pPr>
+        <w:spacing w:before="120" w:after="60"/>
+        <w:jc w:val="center"/>
+      </w:pPr>
+      <w:r>
+        <w:rPr>
+          <w:noProof/>
+        </w:rPr>
+        <w:drawing>
+          <wp:inline distT="0" distB="0" distL="0" distR="0" wp14:anchorId="003226D8" wp14:editId="1F08CF17">
+            <wp:extent cx="4762500" cy="2066925"/>
+            <wp:effectExtent l="0" t="0" r="0" b="0"/>
+            <wp:docPr id="16" name="image11.png" descr="image11.png"/>
+            <wp:cNvGraphicFramePr/>
+            <a:graphic xmlns:a="http://schemas.openxmlformats.org/drawingml/2006/main">
+              <a:graphicData uri="http://schemas.openxmlformats.org/drawingml/2006/picture">
+                <pic:pic xmlns:pic="http://schemas.openxmlformats.org/drawingml/2006/picture">
+                  <pic:nvPicPr>
+                    <pic:cNvPr id="0" name="image11.png" descr="image11.png"/>
+                    <pic:cNvPicPr preferRelativeResize="0"/>
+                  </pic:nvPicPr>
+                  <pic:blipFill>
+                    <a:blip r:embed="rId15"/>
+                    <a:srcRect/>
+                    <a:stretch>
+                      <a:fillRect/>
+                    </a:stretch>
+                  </pic:blipFill>
+                  <pic:spPr>
+                    <a:xfrm>
+                      <a:off x="0" y="0"/>
+                      <a:ext cx="4762500" cy="2066925"/>
+                    </a:xfrm>
+                    <a:prstGeom prst="rect">
+                      <a:avLst/>
+                    </a:prstGeom>
+                    <a:ln/>
+                  </pic:spPr>
+                </pic:pic>
+              </a:graphicData>
+            </a:graphic>
+          </wp:inline>
+        </w:drawing>
+      </w:r>
+    </w:p>
+    <w:p>
+      <w:pPr>
+        <w:spacing w:before="60" w:after="120"/>
+        <w:jc w:val="center"/>
+        <w:rPr>
+          <w:i/>
+          <w:iCs/>
+        </w:rPr>
+      </w:pPr>
+      <w:r>
+        <w:rPr>
+          <w:i/>
+          <w:iCs/>
+        </w:rPr>
+        <w:t>Figure 11: Main Dashboard (Screen 6)</w:t>
+      </w:r>
+    </w:p>
+    <w:p>
+      <w:bookmarkStart w:id="19" w:name="_GoBack"/>
+      <w:bookmarkEnd w:id="19"/>
     </w:p>
     <w:p/>
     <w:p/>

</xml_diff>

<commit_message>
Added : Wireframes and User Interface Design of Food Inventory Screen
</commit_message>
<xml_diff>
--- a/BIT 216 Assignment 1 (Task 2).docx
+++ b/BIT 216 Assignment 1 (Task 2).docx
@@ -10373,9 +10373,186 @@
         <w:t>Figure 11: Main Dashboard (Screen 6)</w:t>
       </w:r>
     </w:p>
+    <w:p/>
     <w:p>
-      <w:bookmarkStart w:id="19" w:name="_GoBack"/>
+      <w:pPr>
+        <w:spacing w:before="60" w:after="120"/>
+        <w:jc w:val="center"/>
+        <w:rPr>
+          <w:i/>
+          <w:iCs/>
+        </w:rPr>
+      </w:pPr>
+    </w:p>
+    <w:p>
+      <w:pPr>
+        <w:spacing w:before="60" w:after="120"/>
+        <w:jc w:val="center"/>
+        <w:rPr>
+          <w:i/>
+          <w:iCs/>
+        </w:rPr>
+      </w:pPr>
+    </w:p>
+    <w:p>
+      <w:pPr>
+        <w:pStyle w:val="Heading3"/>
+        <w:spacing w:before="160" w:after="80"/>
+      </w:pPr>
+      <w:bookmarkStart w:id="19" w:name="_heading=h.hlipfrwnp1db" w:colFirst="0" w:colLast="0"/>
       <w:bookmarkEnd w:id="19"/>
+      <w:r>
+        <w:t>4.4.4  Food Inventory (Screens 7–11)</w:t>
+      </w:r>
+    </w:p>
+    <w:p>
+      <w:pPr>
+        <w:spacing w:after="120" w:line="360" w:lineRule="auto"/>
+        <w:jc w:val="both"/>
+      </w:pPr>
+      <w:r>
+        <w:t>The food inventory screens (Figures 12-13) execute UC2 (Manage Food Inventory). The inventory list view (Screen 7) displays a paginated table of all food items with columns for item name category quantity, expiry date, storage location, status badge (Fresh/Expiring/Expired), and action buttons. The filter bar gives sorting and filtering options by category, storage type, and status. The "Add Food Item" modal (Screen 8) complies with FR04 using all necessary fields. The "Edit" and "Delete" modals (Screen 9-10) correspond to FR05. The "Convert to Donation" panel (Screen 11) is a visual representation of FR06, depicted as a right-side panel sliding in over the inventory list to obtain pickup location and availability details. These screens are directly aligned with all user stories in Epic 3.</w:t>
+      </w:r>
+    </w:p>
+    <w:p>
+      <w:pPr>
+        <w:spacing w:before="120" w:after="60"/>
+        <w:jc w:val="center"/>
+      </w:pPr>
+      <w:r>
+        <w:rPr>
+          <w:noProof/>
+        </w:rPr>
+        <w:drawing>
+          <wp:inline distT="0" distB="0" distL="0" distR="0" wp14:anchorId="3C0BD1C1" wp14:editId="2C7AA5D7">
+            <wp:extent cx="4762500" cy="2066925"/>
+            <wp:effectExtent l="0" t="0" r="0" b="0"/>
+            <wp:docPr id="17" name="image6.png" descr="image12.png"/>
+            <wp:cNvGraphicFramePr/>
+            <a:graphic xmlns:a="http://schemas.openxmlformats.org/drawingml/2006/main">
+              <a:graphicData uri="http://schemas.openxmlformats.org/drawingml/2006/picture">
+                <pic:pic xmlns:pic="http://schemas.openxmlformats.org/drawingml/2006/picture">
+                  <pic:nvPicPr>
+                    <pic:cNvPr id="0" name="image6.png" descr="image12.png"/>
+                    <pic:cNvPicPr preferRelativeResize="0"/>
+                  </pic:nvPicPr>
+                  <pic:blipFill>
+                    <a:blip r:embed="rId16"/>
+                    <a:srcRect/>
+                    <a:stretch>
+                      <a:fillRect/>
+                    </a:stretch>
+                  </pic:blipFill>
+                  <pic:spPr>
+                    <a:xfrm>
+                      <a:off x="0" y="0"/>
+                      <a:ext cx="4762500" cy="2066925"/>
+                    </a:xfrm>
+                    <a:prstGeom prst="rect">
+                      <a:avLst/>
+                    </a:prstGeom>
+                    <a:ln/>
+                  </pic:spPr>
+                </pic:pic>
+              </a:graphicData>
+            </a:graphic>
+          </wp:inline>
+        </w:drawing>
+      </w:r>
+    </w:p>
+    <w:p>
+      <w:pPr>
+        <w:spacing w:before="60" w:after="120"/>
+        <w:jc w:val="center"/>
+        <w:rPr>
+          <w:i/>
+          <w:iCs/>
+        </w:rPr>
+      </w:pPr>
+      <w:r>
+        <w:rPr>
+          <w:i/>
+          <w:iCs/>
+        </w:rPr>
+        <w:t>Figure 12: Food Inventory List View (Screen 7)</w:t>
+      </w:r>
+    </w:p>
+    <w:p>
+      <w:pPr>
+        <w:spacing w:before="60" w:after="120"/>
+        <w:jc w:val="center"/>
+        <w:rPr>
+          <w:i/>
+          <w:iCs/>
+        </w:rPr>
+      </w:pPr>
+    </w:p>
+    <w:p>
+      <w:pPr>
+        <w:spacing w:before="120" w:after="60"/>
+        <w:jc w:val="center"/>
+      </w:pPr>
+      <w:r>
+        <w:rPr>
+          <w:noProof/>
+        </w:rPr>
+        <w:drawing>
+          <wp:inline distT="0" distB="0" distL="0" distR="0" wp14:anchorId="783902F1" wp14:editId="3E32CF96">
+            <wp:extent cx="4762500" cy="2066925"/>
+            <wp:effectExtent l="0" t="0" r="0" b="0"/>
+            <wp:docPr id="19" name="image17.png" descr="image13.png"/>
+            <wp:cNvGraphicFramePr/>
+            <a:graphic xmlns:a="http://schemas.openxmlformats.org/drawingml/2006/main">
+              <a:graphicData uri="http://schemas.openxmlformats.org/drawingml/2006/picture">
+                <pic:pic xmlns:pic="http://schemas.openxmlformats.org/drawingml/2006/picture">
+                  <pic:nvPicPr>
+                    <pic:cNvPr id="0" name="image17.png" descr="image13.png"/>
+                    <pic:cNvPicPr preferRelativeResize="0"/>
+                  </pic:nvPicPr>
+                  <pic:blipFill>
+                    <a:blip r:embed="rId17"/>
+                    <a:srcRect/>
+                    <a:stretch>
+                      <a:fillRect/>
+                    </a:stretch>
+                  </pic:blipFill>
+                  <pic:spPr>
+                    <a:xfrm>
+                      <a:off x="0" y="0"/>
+                      <a:ext cx="4762500" cy="2066925"/>
+                    </a:xfrm>
+                    <a:prstGeom prst="rect">
+                      <a:avLst/>
+                    </a:prstGeom>
+                    <a:ln/>
+                  </pic:spPr>
+                </pic:pic>
+              </a:graphicData>
+            </a:graphic>
+          </wp:inline>
+        </w:drawing>
+      </w:r>
+    </w:p>
+    <w:p>
+      <w:pPr>
+        <w:spacing w:before="60" w:after="120"/>
+        <w:jc w:val="center"/>
+        <w:rPr>
+          <w:i/>
+          <w:iCs/>
+        </w:rPr>
+      </w:pPr>
+      <w:r>
+        <w:rPr>
+          <w:i/>
+          <w:iCs/>
+        </w:rPr>
+        <w:t>Figure 13: Add Food Item, Delete Confirmation, and Convert to Donation Modals (Screens 8–11)</w:t>
+      </w:r>
+    </w:p>
+    <w:p>
+      <w:bookmarkStart w:id="20" w:name="_GoBack"/>
+      <w:bookmarkEnd w:id="20"/>
     </w:p>
     <w:p/>
     <w:p/>

</xml_diff>